<commit_message>
metodologia completa e resultados iniciados
</commit_message>
<xml_diff>
--- a/TCC_rtheodoro.docx
+++ b/TCC_rtheodoro.docx
@@ -15,19 +15,7 @@
         <w:rPr>
           <w:b/>
         </w:rPr>
-        <w:t xml:space="preserve">Bacenr: pacote em R para download e </w:t>
-      </w:r>
-      <w:r>
-        <w:rPr>
-          <w:b/>
-        </w:rPr>
-        <w:t>tratamento</w:t>
-      </w:r>
-      <w:r>
-        <w:rPr>
-          <w:b/>
-        </w:rPr>
-        <w:t xml:space="preserve"> de dados do Banco Central do Brasil</w:t>
+        <w:t>Bacenr: pacote em R para download e tratamento de dados do Banco Central do Brasil</w:t>
       </w:r>
     </w:p>
     <w:p>
@@ -68,11 +56,11 @@
         <w:rPr>
           <w:vertAlign w:val="superscript"/>
         </w:rPr>
-        <w:t xml:space="preserve"> </w:t>
-      </w:r>
-      <w:r>
-        <w:rPr/>
-        <w:t>nome completo Walter Mesquita Filho</w:t>
+        <w:t xml:space="preserve">  </w:t>
+      </w:r>
+      <w:r>
+        <w:rPr/>
+        <w:t>Walter Mesquita Filho</w:t>
       </w:r>
       <w:r>
         <w:rPr>
@@ -513,19 +501,7 @@
         <w:rPr>
           <w:b/>
         </w:rPr>
-        <w:t xml:space="preserve">Bacenr: pacote em R para download e </w:t>
-      </w:r>
-      <w:r>
-        <w:rPr>
-          <w:b/>
-        </w:rPr>
-        <w:t>tratamento</w:t>
-      </w:r>
-      <w:r>
-        <w:rPr>
-          <w:b/>
-        </w:rPr>
-        <w:t xml:space="preserve"> de dados do Banco Central do Brasil</w:t>
+        <w:t>Bacenr: pacote em R para download e tratamento de dados do Banco Central do Brasil</w:t>
       </w:r>
     </w:p>
     <w:p>
@@ -647,27 +623,7 @@
           <w:color w:val="000000"/>
           <w:shd w:fill="FFFFFF" w:val="clear"/>
         </w:rPr>
-        <w:t xml:space="preserve">A pesquisa acadêmica sobre bancos e cooperativas de crédito depende fundamentalmente do acesso a dados financeiros confiáveis, granulares e atualizados, pois são esses dados que permitem investigar eficiência, desempenho, risco e competitividade dessas instituições dentro do sistema financeiro nacional. Diversos estudos já evidenciaram que a análise quantitativa, amparada em bases extensas e precisas, é o meio mais robusto para identificar padrões, testar hipóteses e propor soluções voltadas para o desenvolvimento e regulação do setor bancário e cooperativista. O uso intensivo de dados provenientes de fontes institucionais, como o Banco Central do Brasil </w:t>
-      </w:r>
-      <w:r>
-        <w:rPr>
-          <w:rStyle w:val="normaltextrun"/>
-          <w:b w:val="false"/>
-          <w:bCs w:val="false"/>
-          <w:color w:val="000000"/>
-          <w:shd w:fill="FFFFFF" w:val="clear"/>
-        </w:rPr>
-        <w:t>[Bacen]</w:t>
-      </w:r>
-      <w:r>
-        <w:rPr>
-          <w:rStyle w:val="normaltextrun"/>
-          <w:b w:val="false"/>
-          <w:bCs w:val="false"/>
-          <w:color w:val="000000"/>
-          <w:shd w:fill="FFFFFF" w:val="clear"/>
-        </w:rPr>
-        <w:t>, possibilita pesquisas sobre influências das cooperativas de crédito em taxas de juros, análise de liquidez, avaliação de concentração bancária, fusões e incorporações, entre outras questões relevantes para o ambiente financeiro nacional.</w:t>
+        <w:t>A pesquisa acadêmica sobre bancos e cooperativas de crédito depende fundamentalmente do acesso a dados financeiros confiáveis, granulares e atualizados, pois são esses dados que permitem investigar eficiência, desempenho, risco e competitividade dessas instituições dentro do sistema financeiro nacional. Diversos estudos já evidenciaram que a análise quantitativa, amparada em bases extensas e precisas, é o meio mais robusto para identificar padrões, testar hipóteses e propor soluções voltadas para o desenvolvimento e regulação do setor bancário e cooperativista. O uso intensivo de dados provenientes de fontes institucionais, como o Banco Central do Brasil [Bacen], possibilita pesquisas sobre influências das cooperativas de crédito em taxas de juros, análise de liquidez, avaliação de concentração bancária, fusões e incorporações, entre outras questões relevantes para o ambiente financeiro nacional.</w:t>
       </w:r>
     </w:p>
     <w:p>
@@ -752,47 +708,43 @@
       </w:r>
       <w:r>
         <w:rPr/>
-        <w:t xml:space="preserve"> já prontos para análise emerge como uma iniciativa de grande relevância acadêmica e social. Além de automatizar rotinas de coleta e transformação, um pacote bem documentado, com manual de uso e exemplos concretos, amplia o acesso de pesquisadores com pouca experiência técnica, fomenta trabalhos inovadores e garante que a análise dos dados seja realizada de maneira padronizada e confiável. </w:t>
-      </w:r>
-      <w:r>
-        <w:rPr/>
-        <w:t>Isso faz com que o pesquisador possa despender mais tempo analisando os dados do que coletando.</w:t>
-      </w:r>
-      <w:r>
-        <w:rPr/>
-        <w:t xml:space="preserve"> Referências como o </w:t>
-      </w:r>
-      <w:commentRangeStart w:id="0"/>
-      <w:r>
-        <w:rPr/>
-        <w:t xml:space="preserve">BacenAPI e o BETS </w:t>
-      </w:r>
-      <w:r>
-        <w:rPr/>
-      </w:r>
-      <w:commentRangeEnd w:id="0"/>
-      <w:r>
-        <w:commentReference w:id="0"/>
-      </w:r>
-      <w:r>
-        <w:rPr/>
-        <w:t xml:space="preserve">já demonstram </w:t>
-      </w:r>
-      <w:r>
-        <w:rPr/>
-        <w:t xml:space="preserve">que existe uma necessidade </w:t>
-      </w:r>
-      <w:r>
-        <w:rPr/>
-        <w:t xml:space="preserve">de soluções “open source” </w:t>
-      </w:r>
-      <w:r>
-        <w:rPr/>
-        <w:t xml:space="preserve">para a </w:t>
-      </w:r>
-      <w:r>
-        <w:rPr/>
-        <w:t>pesquisa econômica e financeira nacional. O acesso facilitado aos dados permite que mais pessoas investiguem problemas importantes, contribuam para o avanço do conhecimento e subsidiem políticas públicas, mesmo sem profundo conhecimento em programação ou ciência de dados.</w:t>
+        <w:t xml:space="preserve"> já prontos para análise emerge como uma iniciativa de grande relevância acadêmica e social. Além de automatizar rotinas de coleta e transformação, um pacote bem documentado, com manual de uso e exemplos concretos, amplia o acesso de pesquisadores com pouca experiência técnica, fomenta trabalhos inovadores e garante que a análise dos dados seja realizada de maneira padronizada e confiável. Isso faz com que o pesquisador possa despender mais tempo analisando os dados do que coletando. </w:t>
+      </w:r>
+      <w:r>
+        <w:rPr/>
+        <w:t>Pacotes já existentes</w:t>
+      </w:r>
+      <w:r>
+        <w:rPr/>
+        <w:t xml:space="preserve"> como o BacenAPI</w:t>
+      </w:r>
+      <w:r>
+        <w:rPr>
+          <w:rStyle w:val="FootnoteReference"/>
+        </w:rPr>
+        <w:footnoteReference w:id="2"/>
+      </w:r>
+      <w:r>
+        <w:rPr/>
+        <w:t xml:space="preserve"> e o BETS</w:t>
+      </w:r>
+      <w:r>
+        <w:rPr>
+          <w:rStyle w:val="FootnoteReference"/>
+        </w:rPr>
+        <w:footnoteReference w:id="3"/>
+      </w:r>
+      <w:r>
+        <w:rPr/>
+        <w:t xml:space="preserve"> já demonstram que existe uma necessidade de soluções “open source” para a pesquisa econômica e financeira nacional. O acesso facilitado aos dados permite que mais pessoas investiguem problemas importantes, contribuam para o avanço do conhecimento e </w:t>
+      </w:r>
+      <w:r>
+        <w:rPr/>
+        <w:t>geram resultados com potenciais de pautar</w:t>
+      </w:r>
+      <w:r>
+        <w:rPr/>
+        <w:t xml:space="preserve"> políticas públicas, mesmo sem profundo conhecimento em programação.</w:t>
       </w:r>
     </w:p>
     <w:p>
@@ -807,7 +759,47 @@
       </w:pPr>
       <w:r>
         <w:rPr/>
-        <w:t xml:space="preserve">Tendo em vista estes pontos, o objetivo deste trabalho foi criar um pacote em R para baixar informações sobre Instruções Normativas de instituições financeiras e os Balanços e Balancetes destas instituições, de forma que os dados baixados sejam facilmente tratados e organizados. </w:t>
+        <w:t xml:space="preserve">Tendo em vista </w:t>
+      </w:r>
+      <w:r>
+        <w:rPr/>
+        <w:t>os</w:t>
+      </w:r>
+      <w:r>
+        <w:rPr/>
+        <w:t xml:space="preserve"> pontos </w:t>
+      </w:r>
+      <w:r>
+        <w:rPr/>
+        <w:t>apresentados</w:t>
+      </w:r>
+      <w:r>
+        <w:rPr/>
+        <w:t xml:space="preserve">, o objetivo deste trabalho foi criar um pacote em R, </w:t>
+      </w:r>
+      <w:r>
+        <w:rPr/>
+        <w:t>nomeado de bacenR,</w:t>
+      </w:r>
+      <w:r>
+        <w:rPr/>
+        <w:t xml:space="preserve"> para baixar informações sobre Instruções Normativas </w:t>
+      </w:r>
+      <w:r>
+        <w:rPr/>
+        <w:t>que regem a regulação e fiscalização das</w:t>
+      </w:r>
+      <w:r>
+        <w:rPr/>
+        <w:t xml:space="preserve"> instituições financeiras e os Balanços e Balancetes d</w:t>
+      </w:r>
+      <w:r>
+        <w:rPr/>
+        <w:t>as mesmas</w:t>
+      </w:r>
+      <w:r>
+        <w:rPr/>
+        <w:t xml:space="preserve">, de forma que os dados baixados sejam facilmente tratados e organizados. </w:t>
       </w:r>
     </w:p>
     <w:p>
@@ -848,22 +840,12 @@
     </w:p>
     <w:p>
       <w:pPr>
-        <w:pStyle w:val="Normal"/>
+        <w:pStyle w:val="BodyText"/>
         <w:shd w:val="clear" w:color="auto" w:fill="FFFFFF"/>
         <w:spacing w:lineRule="auto" w:line="360"/>
         <w:ind w:firstLine="709"/>
-        <w:rPr>
-          <w:rFonts w:eastAsia="Times New Roman"/>
-          <w:lang w:eastAsia="pt-BR"/>
-        </w:rPr>
-      </w:pPr>
-      <w:r>
-        <w:rPr>
-          <w:rFonts w:eastAsia="Times New Roman"/>
-          <w:lang w:eastAsia="pt-BR"/>
-        </w:rPr>
-        <w:t xml:space="preserve">A metologia base será baseada nos passos de </w:t>
-      </w:r>
+        <w:rPr/>
+      </w:pPr>
       <w:r>
         <w:rPr>
           <w:rFonts w:eastAsia="Times New Roman"/>
@@ -871,68 +853,327 @@
           <w:bCs w:val="false"/>
           <w:lang w:eastAsia="pt-BR"/>
         </w:rPr>
-        <w:t>Wickham e Bryan (2023), que mostram o passo-a-passo de como se criar um pacote em R. A</w:t>
-      </w:r>
-      <w:r>
+        <w:t>A metodologia adotada fundamentou-se nas orientações de Wickham e Bryan (2023), que descrevem de forma sistemática o processo de concepção e desenvolvimento de pacotes no ambiente R. Complementarmente, utilizaram-se como referência as obras de Grolemund (2014), Marwick et al. (2018a; 2018b), Silge (2018), Wickham (2021) e Wickham et al. (2023). Esses materiais foram essenciais por abordarem diferentes perspectivas de programação em R, enfatizando princípios de boas práticas, reprodutibilidade, testabilidade e legibilidade do código.</w:t>
+      </w:r>
+    </w:p>
+    <w:p>
+      <w:pPr>
+        <w:pStyle w:val="BodyText"/>
+        <w:widowControl/>
+        <w:suppressAutoHyphens w:val="true"/>
+        <w:bidi w:val="0"/>
+        <w:spacing w:lineRule="auto" w:line="360" w:before="0" w:after="140"/>
+        <w:ind w:firstLine="680" w:left="0" w:right="0"/>
+        <w:jc w:val="both"/>
+        <w:rPr/>
+      </w:pPr>
+      <w:r>
+        <w:rPr/>
+        <w:t>O desenvolvimento do pacote ocorreu em etapas. Inicialmente, definiu-se o escopo do projeto, contemplando o idioma a ser utilizado, as principais funcionalidades a serem implementadas e o cronograma de execução. Em seguida, criou-se um “</w:t>
+      </w:r>
+      <w:r>
+        <w:rPr>
+          <w:rStyle w:val="Emphasis"/>
+          <w:i w:val="false"/>
+          <w:iCs w:val="false"/>
+        </w:rPr>
+        <w:t>GitHub Project”</w:t>
+      </w:r>
+      <w:r>
+        <w:rPr>
+          <w:rStyle w:val="Emphasis"/>
+          <w:rStyle w:val="FootnoteReference"/>
+          <w:i w:val="false"/>
+          <w:iCs w:val="false"/>
+        </w:rPr>
+        <w:footnoteReference w:id="4"/>
+      </w:r>
+      <w:r>
+        <w:rPr/>
+        <w:t xml:space="preserve"> com o propósito de aprimorar a gestão do desenvolvimento, distribuir as tarefas, acompanhar o progresso das implementações e planejar as próximas etapas.</w:t>
+      </w:r>
+    </w:p>
+    <w:p>
+      <w:pPr>
+        <w:pStyle w:val="BodyText"/>
+        <w:widowControl/>
+        <w:suppressAutoHyphens w:val="true"/>
+        <w:bidi w:val="0"/>
+        <w:spacing w:lineRule="auto" w:line="360" w:before="0" w:after="140"/>
+        <w:ind w:firstLine="680" w:left="0" w:right="0"/>
+        <w:jc w:val="both"/>
+        <w:rPr/>
+      </w:pPr>
+      <w:r>
+        <w:rPr/>
+        <w:t>Com a estrutura organizacional estabelecida, iniciou-se a fase de codificação do pacote. As funções previstas tinham como finalidades: (1) realizar o “download” das normas publicadas pelo Banco Central do Brasil e de suas respectivas alterações; (2) extrair o texto integral dessas normas; (3) obter os balanços e balancetes das instituições financeiras; e (4) processar esses dados, preparando-os para posterior análise.</w:t>
+      </w:r>
+    </w:p>
+    <w:p>
+      <w:pPr>
+        <w:pStyle w:val="BodyText"/>
+        <w:widowControl/>
+        <w:suppressAutoHyphens w:val="true"/>
+        <w:bidi w:val="0"/>
+        <w:spacing w:lineRule="auto" w:line="360" w:before="0" w:after="140"/>
+        <w:ind w:firstLine="680" w:left="0" w:right="0"/>
+        <w:jc w:val="both"/>
+        <w:rPr/>
+      </w:pPr>
+      <w:r>
+        <w:rPr/>
+        <w:t xml:space="preserve">Na sequência, procedeu-se à análise dos componentes estruturais do pacote, </w:t>
+      </w:r>
+      <w:r>
+        <w:rPr/>
+        <w:t xml:space="preserve">que são compostos pelo </w:t>
+      </w:r>
+      <w:r>
+        <w:rPr/>
+        <w:t xml:space="preserve">código-fonte, </w:t>
+      </w:r>
+      <w:r>
+        <w:rPr/>
+        <w:t xml:space="preserve">pela </w:t>
+      </w:r>
+      <w:r>
+        <w:rPr/>
+        <w:t xml:space="preserve">bases de dados, </w:t>
+      </w:r>
+      <w:r>
+        <w:rPr/>
+        <w:t xml:space="preserve">pelos </w:t>
+      </w:r>
+      <w:r>
+        <w:rPr/>
+        <w:t xml:space="preserve">diretórios e </w:t>
+      </w:r>
+      <w:r>
+        <w:rPr/>
+        <w:t xml:space="preserve">pelas </w:t>
+      </w:r>
+      <w:r>
+        <w:rPr/>
+        <w:t xml:space="preserve">referências bibliográficas, a fim de assegurar sua consistência e coerência interna. Concluída essa verificação, elaboraram-se os metadados, que contemplaram a descrição detalhada do pacote, suas dependências, a estrutura organizacional do projeto conforme as boas práticas de desenvolvimento e a definição da licença de uso. </w:t>
+      </w:r>
+      <w:r>
+        <w:rPr/>
+        <w:t>Como, por exemplo, os pacotes que o usuário precisa ter instalado para que o bacenR funcione, são:</w:t>
+      </w:r>
+      <w:r>
+        <w:rPr/>
+        <w:t xml:space="preserve"> `dplyr`, `fs`, `glue`, `httr`, `janitor`,  `jsonlite`, `lifecycle`, `purrr`, `readr`, `rlang`, `stringr`, `tibble`, `tidyr`, `tools`, `utils` </w:t>
+      </w:r>
+      <w:r>
+        <w:rPr/>
+        <w:t>e `</w:t>
+      </w:r>
+      <w:r>
+        <w:rPr/>
+        <w:t xml:space="preserve">xml2`. </w:t>
+      </w:r>
+      <w:r>
+        <w:rPr/>
+        <w:t>Além disso, o R precisa estar na versão 4.1 ou superior.</w:t>
+      </w:r>
+    </w:p>
+    <w:p>
+      <w:pPr>
+        <w:pStyle w:val="BodyText"/>
+        <w:widowControl/>
+        <w:suppressAutoHyphens w:val="true"/>
+        <w:bidi w:val="0"/>
+        <w:spacing w:lineRule="auto" w:line="360" w:before="0" w:after="140"/>
+        <w:ind w:firstLine="680" w:left="0" w:right="0"/>
+        <w:jc w:val="both"/>
+        <w:rPr/>
+      </w:pPr>
+      <w:r>
+        <w:rPr/>
+        <w:t xml:space="preserve">Com a estrutura final consolidada, iniciou-se a fase de testes. Cada função foi submetida a </w:t>
+      </w:r>
+      <w:r>
+        <w:rPr/>
+        <w:t>testes</w:t>
+      </w:r>
+      <w:r>
+        <w:rPr/>
+        <w:t xml:space="preserve"> individuais </w:t>
+      </w:r>
+      <w:r>
+        <w:rPr/>
+        <w:t>com a utilização dos pacotes `testethat` e `devtools`</w:t>
+      </w:r>
+      <w:r>
+        <w:rPr/>
+        <w:t>, utilizando diferentes parâmetros com o objetivo de verificar a robustez e o comportamento do código. Os erros identificados foram corrigidos iterativamente, implicando ajustes tanto na codificação quanto na documentação e nas dependências declaradas. Após a aprovação em todos os testes, incluindo o “</w:t>
+      </w:r>
+      <w:r>
+        <w:rPr>
+          <w:rStyle w:val="Emphasis"/>
+          <w:i w:val="false"/>
+          <w:iCs w:val="false"/>
+        </w:rPr>
+        <w:t>R CMD CHECK”</w:t>
+      </w:r>
+      <w:r>
+        <w:rPr/>
+        <w:t xml:space="preserve"> executado por meio da integração com o “GitHub”, iniciou-se o processo de documentação formal, </w:t>
+      </w:r>
+      <w:r>
+        <w:rPr/>
+        <w:t>com a ajuda do pacote `usethis`</w:t>
+      </w:r>
+      <w:r>
+        <w:rPr/>
+        <w:t>. Todas as funções foram descritas detalhadamente, com a exposição de seus objetivos, parâmetros, resultados esperados e respectivas fontes de dados, de modo a garantir total transparência e compreensibilidade ao usuário final.</w:t>
+      </w:r>
+    </w:p>
+    <w:p>
+      <w:pPr>
+        <w:pStyle w:val="BodyText"/>
+        <w:widowControl/>
+        <w:suppressAutoHyphens w:val="true"/>
+        <w:bidi w:val="0"/>
+        <w:spacing w:lineRule="auto" w:line="360" w:before="0" w:after="140"/>
+        <w:ind w:firstLine="680" w:left="0" w:right="0"/>
+        <w:jc w:val="both"/>
+        <w:rPr/>
+      </w:pPr>
+      <w:r>
+        <w:rPr/>
+        <w:t>Com o pacote finalizado, procedeu-se à sua disponibilização no “</w:t>
+      </w:r>
+      <w:r>
+        <w:rPr>
+          <w:rStyle w:val="Emphasis"/>
+          <w:i w:val="false"/>
+          <w:iCs w:val="false"/>
+        </w:rPr>
+        <w:t>GitHub”</w:t>
+      </w:r>
+      <w:r>
+        <w:rPr>
+          <w:rStyle w:val="Emphasis"/>
+          <w:rStyle w:val="FootnoteReference"/>
+          <w:i w:val="false"/>
+          <w:iCs w:val="false"/>
+        </w:rPr>
+        <w:footnoteReference w:id="5"/>
+      </w:r>
+      <w:r>
+        <w:rPr/>
+        <w:t xml:space="preserve">, acompanhada de um arquivo </w:t>
+      </w:r>
+      <w:r>
+        <w:rPr>
+          <w:rStyle w:val="Emphasis"/>
+          <w:i w:val="false"/>
+          <w:iCs w:val="false"/>
+        </w:rPr>
+        <w:t>README.md</w:t>
+      </w:r>
+      <w:r>
+        <w:rPr/>
+        <w:t xml:space="preserve"> contendo instruções para instalação, explicação sobre o funcionamento e exemplos de uso das funções implementadas. A versão lançada, denominada </w:t>
+      </w:r>
+      <w:r>
+        <w:rPr>
+          <w:rStyle w:val="Strong"/>
+          <w:b w:val="false"/>
+          <w:bCs w:val="false"/>
+        </w:rPr>
+        <w:t>bacenR v0.1.0 – Beta Test</w:t>
+      </w:r>
+      <w:r>
+        <w:rPr/>
+        <w:t xml:space="preserve">, foi classificada como versão beta, uma vez que, apesar dos testes realizados, ainda poderiam ser identificados erros residuais. Para ampliar a fase de validação, o pacote foi também divulgado em redes sociais (WhatsApp, Twitter/X e LinkedIn), juntamente com um formulário destinado à coleta das primeiras impressões dos usuários. As informações obtidas por meio desse instrumento servirão de subsídio para a identificação de falhas, proposição de melhorias e definição de novas funcionalidades a serem incorporadas. </w:t>
+      </w:r>
+      <w:r>
+        <w:rPr/>
+        <w:t>O usuário também pode dar sua opinião, tirar dúvidas e sugerir melhorias através das “issues” do “Github”</w:t>
+      </w:r>
+      <w:r>
+        <w:rPr>
+          <w:rStyle w:val="FootnoteReference"/>
+        </w:rPr>
+        <w:footnoteReference w:id="6"/>
+      </w:r>
+      <w:r>
+        <w:rPr/>
+        <w:t>.</w:t>
+      </w:r>
+    </w:p>
+    <w:p>
+      <w:pPr>
+        <w:pStyle w:val="BodyText"/>
+        <w:widowControl/>
+        <w:suppressAutoHyphens w:val="true"/>
+        <w:bidi w:val="0"/>
+        <w:spacing w:lineRule="auto" w:line="360" w:before="0" w:after="140"/>
+        <w:ind w:firstLine="680" w:left="0" w:right="0"/>
+        <w:jc w:val="both"/>
+        <w:rPr/>
+      </w:pPr>
+      <w:r>
+        <w:rPr/>
+        <w:t>Mesmo em fase beta, o pacote foi submetido à avaliação do “</w:t>
+      </w:r>
+      <w:r>
+        <w:rPr>
+          <w:rStyle w:val="Strong"/>
+          <w:b w:val="false"/>
+          <w:bCs w:val="false"/>
+        </w:rPr>
+        <w:t xml:space="preserve">Comprehensive R Archive Network” </w:t>
+      </w:r>
+      <w:r>
+        <w:rPr>
+          <w:rStyle w:val="Strong"/>
+          <w:b w:val="false"/>
+          <w:bCs w:val="false"/>
+        </w:rPr>
+        <w:t>[</w:t>
+      </w:r>
+      <w:r>
+        <w:rPr>
+          <w:rStyle w:val="Strong"/>
+          <w:b w:val="false"/>
+          <w:bCs w:val="false"/>
+        </w:rPr>
+        <w:t>CRAN</w:t>
+      </w:r>
+      <w:r>
+        <w:rPr>
+          <w:rStyle w:val="Strong"/>
+          <w:b w:val="false"/>
+          <w:bCs w:val="false"/>
+        </w:rPr>
+        <w:t>]</w:t>
+      </w:r>
+      <w:r>
+        <w:rPr/>
+        <w:t xml:space="preserve">, repositório oficial da linguagem R, </w:t>
+      </w:r>
+      <w:r>
+        <w:rPr/>
+        <w:t xml:space="preserve">utilizando o pacote `rhub`, </w:t>
+      </w:r>
+      <w:r>
+        <w:rPr/>
+        <w:t>com vistas à sua futura publicação e disseminação formal junto à comunidade científica e técnica.</w:t>
+      </w:r>
+    </w:p>
+    <w:p>
+      <w:pPr>
+        <w:pStyle w:val="Normal"/>
+        <w:shd w:val="clear" w:color="auto" w:fill="FFFFFF"/>
+        <w:spacing w:lineRule="auto" w:line="360"/>
+        <w:ind w:firstLine="709"/>
         <w:rPr>
           <w:rFonts w:eastAsia="Times New Roman"/>
           <w:lang w:eastAsia="pt-BR"/>
         </w:rPr>
-        <w:t xml:space="preserve">lém deste material,  também foram importantes os livros </w:t>
-      </w:r>
-      <w:r>
-        <w:rPr>
-          <w:rFonts w:eastAsia="Times New Roman"/>
-          <w:b w:val="false"/>
-          <w:bCs w:val="false"/>
-          <w:lang w:eastAsia="pt-BR"/>
-        </w:rPr>
-        <w:t xml:space="preserve">Grolemund (2014), Marwick et. al (2018a), Marwick et al (2018b), Silge (2018), Wickham (2021) e Wickham et. al (2023), em que cada um deles apresentava uma forma de programar em R, seja criando novas funções de acordo com as “boas práticas”,  de forma que elas possam ser testes, reproduzidas e de fácil compreensão. </w:t>
-      </w:r>
-    </w:p>
-    <w:p>
-      <w:pPr>
-        <w:pStyle w:val="Normal"/>
-        <w:shd w:val="clear" w:color="auto" w:fill="FFFFFF"/>
-        <w:spacing w:lineRule="auto" w:line="360"/>
-        <w:ind w:firstLine="709"/>
-        <w:rPr>
-          <w:rFonts w:eastAsia="Times New Roman"/>
-          <w:lang w:eastAsia="pt-BR"/>
-        </w:rPr>
-      </w:pPr>
-      <w:r>
-        <w:rPr>
-          <w:rFonts w:eastAsia="Times New Roman"/>
-          <w:lang w:eastAsia="pt-BR"/>
-        </w:rPr>
-      </w:r>
-    </w:p>
-    <w:p>
-      <w:pPr>
-        <w:pStyle w:val="Normal"/>
-        <w:shd w:val="clear" w:color="auto" w:fill="FFFFFF"/>
-        <w:spacing w:lineRule="auto" w:line="360"/>
-        <w:ind w:firstLine="709"/>
-        <w:rPr>
-          <w:rFonts w:eastAsia="Times New Roman"/>
-          <w:lang w:eastAsia="pt-BR"/>
-        </w:rPr>
-      </w:pPr>
-      <w:r>
-        <w:rPr>
-          <w:rFonts w:eastAsia="Times New Roman"/>
-          <w:lang w:eastAsia="pt-BR"/>
-        </w:rPr>
-      </w:r>
-    </w:p>
-    <w:p>
-      <w:pPr>
-        <w:pStyle w:val="Normal"/>
-        <w:spacing w:lineRule="auto" w:line="360"/>
-        <w:rPr>
-          <w:color w:val="000000"/>
-        </w:rPr>
       </w:pPr>
       <w:r>
         <w:rPr>
@@ -969,7 +1210,8 @@
       </w:pPr>
       <w:r>
         <w:rPr>
-          <w:b/>
+          <w:color w:val="000000"/>
+          <w:shd w:fill="FFFFFF" w:val="clear"/>
         </w:rPr>
       </w:r>
     </w:p>
@@ -986,16 +1228,1192 @@
       </w:pPr>
       <w:r>
         <w:rPr>
-          <w:color w:val="000000"/>
-          <w:shd w:fill="FFFFFF" w:val="clear"/>
-        </w:rPr>
-      </w:r>
-    </w:p>
-    <w:p>
-      <w:pPr>
-        <w:pStyle w:val="Normal"/>
-        <w:spacing w:lineRule="auto" w:line="360"/>
-        <w:rPr>
+          <w:rStyle w:val="normaltextrun"/>
+          <w:color w:val="000000"/>
+          <w:shd w:fill="FFFFFF" w:val="clear"/>
+        </w:rPr>
+        <w:t>Como o primeiro passo foi a criação de um “Github Projects”, a Figura 1 apresenta algumas “issues” criadas para auxiliar na organização e desenvolvimento do pacote. Desta forma o usuário poderá ver se a função que ele precisa já está em desenvolvimento ou se é necessário solicitar. Também é possível que o próprio usuário contribua com a criação do pacote.</w:t>
+      </w:r>
+    </w:p>
+    <w:p>
+      <w:pPr>
+        <w:pStyle w:val="ListParagraph"/>
+        <w:spacing w:lineRule="auto" w:line="360"/>
+        <w:ind w:firstLine="709" w:left="0"/>
+        <w:rPr>
+          <w:rStyle w:val="normaltextrun"/>
+          <w:color w:val="000000"/>
+          <w:shd w:fill="FFFFFF" w:val="clear"/>
+        </w:rPr>
+      </w:pPr>
+      <w:r>
+        <w:drawing>
+          <wp:anchor behindDoc="0" distT="0" distB="0" distL="0" distR="0" simplePos="0" locked="0" layoutInCell="0" allowOverlap="1" relativeHeight="21">
+            <wp:simplePos x="0" y="0"/>
+            <wp:positionH relativeFrom="column">
+              <wp:align>center</wp:align>
+            </wp:positionH>
+            <wp:positionV relativeFrom="paragraph">
+              <wp:posOffset>635</wp:posOffset>
+            </wp:positionV>
+            <wp:extent cx="5759450" cy="2867025"/>
+            <wp:effectExtent l="0" t="0" r="0" b="0"/>
+            <wp:wrapSquare wrapText="largest"/>
+            <wp:docPr id="1" name="Figura1" descr=""/>
+            <wp:cNvGraphicFramePr>
+              <a:graphicFrameLocks xmlns:a="http://schemas.openxmlformats.org/drawingml/2006/main" noChangeAspect="1"/>
+            </wp:cNvGraphicFramePr>
+            <a:graphic xmlns:a="http://schemas.openxmlformats.org/drawingml/2006/main">
+              <a:graphicData uri="http://schemas.openxmlformats.org/drawingml/2006/picture">
+                <pic:pic xmlns:pic="http://schemas.openxmlformats.org/drawingml/2006/picture">
+                  <pic:nvPicPr>
+                    <pic:cNvPr id="1" name="Figura1" descr=""/>
+                    <pic:cNvPicPr>
+                      <a:picLocks noChangeAspect="1" noChangeArrowheads="1"/>
+                    </pic:cNvPicPr>
+                  </pic:nvPicPr>
+                  <pic:blipFill>
+                    <a:blip r:embed="rId2"/>
+                    <a:stretch>
+                      <a:fillRect/>
+                    </a:stretch>
+                  </pic:blipFill>
+                  <pic:spPr bwMode="auto">
+                    <a:xfrm>
+                      <a:off x="0" y="0"/>
+                      <a:ext cx="5759450" cy="2867025"/>
+                    </a:xfrm>
+                    <a:prstGeom prst="rect">
+                      <a:avLst/>
+                    </a:prstGeom>
+                  </pic:spPr>
+                </pic:pic>
+              </a:graphicData>
+            </a:graphic>
+          </wp:anchor>
+        </w:drawing>
+      </w:r>
+      <w:r>
+        <w:rPr>
+          <w:rStyle w:val="normaltextrun"/>
+          <w:color w:val="000000"/>
+          <w:shd w:fill="FFFFFF" w:val="clear"/>
+        </w:rPr>
+        <w:t>Figura 1. Tabela de atividades do projeto no “Github Projects”</w:t>
+      </w:r>
+      <w:r>
+        <w:rPr>
+          <w:rStyle w:val="normaltextrun"/>
+          <w:rStyle w:val="FootnoteReference"/>
+          <w:color w:val="000000"/>
+          <w:shd w:fill="FFFFFF" w:val="clear"/>
+        </w:rPr>
+        <w:footnoteReference w:id="7"/>
+      </w:r>
+    </w:p>
+    <w:p>
+      <w:pPr>
+        <w:pStyle w:val="ListParagraph"/>
+        <w:spacing w:lineRule="auto" w:line="360"/>
+        <w:ind w:firstLine="709" w:left="0"/>
+        <w:rPr>
+          <w:rStyle w:val="normaltextrun"/>
+          <w:color w:val="000000"/>
+          <w:shd w:fill="FFFFFF" w:val="clear"/>
+        </w:rPr>
+      </w:pPr>
+      <w:r>
+        <w:rPr>
+          <w:rStyle w:val="normaltextrun"/>
+          <w:color w:val="000000"/>
+          <w:shd w:fill="FFFFFF" w:val="clear"/>
+        </w:rPr>
+        <w:t>Fonte: Resultados originais da pesquisa.</w:t>
+      </w:r>
+    </w:p>
+    <w:p>
+      <w:pPr>
+        <w:pStyle w:val="ListParagraph"/>
+        <w:spacing w:lineRule="auto" w:line="360"/>
+        <w:ind w:firstLine="709" w:left="0"/>
+        <w:rPr>
+          <w:rStyle w:val="normaltextrun"/>
+          <w:color w:val="000000"/>
+          <w:shd w:fill="FFFFFF" w:val="clear"/>
+        </w:rPr>
+      </w:pPr>
+      <w:r>
+        <w:rPr>
+          <w:rStyle w:val="normaltextrun"/>
+          <w:color w:val="000000"/>
+          <w:shd w:fill="FFFFFF" w:val="clear"/>
+        </w:rPr>
+        <w:t>Como pode ser observado, todas as tarefas já foram classificadas com os “Status” de “Todo” (a fazer), “In Progress” (em progresso) e “Done” (feito). Também foram adicionadas características utilizadas para gerenciar uma equipe, como “Priority” (prioridade), “Size” (tamanho), “Estimate” (tempo estimado), “Start date” (data de início) e “End date” (data final). Essas informações, além de auxiliar ao mantedor em qual etapa do desenvolvimento está, também serão utilizadas para auxiliar caso tenha uma equipe de contribuidores.</w:t>
+      </w:r>
+    </w:p>
+    <w:p>
+      <w:pPr>
+        <w:pStyle w:val="ListParagraph"/>
+        <w:spacing w:lineRule="auto" w:line="360"/>
+        <w:ind w:firstLine="709" w:left="0"/>
+        <w:rPr>
+          <w:rStyle w:val="normaltextrun"/>
+          <w:color w:val="000000"/>
+          <w:shd w:fill="FFFFFF" w:val="clear"/>
+        </w:rPr>
+      </w:pPr>
+      <w:r>
+        <w:rPr>
+          <w:rStyle w:val="normaltextrun"/>
+          <w:color w:val="000000"/>
+          <w:shd w:fill="FFFFFF" w:val="clear"/>
+        </w:rPr>
+        <w:t>Como pode ser observado, idioma escolhido para o pacote foi o inglês, pois foi considerado que através dele seria possível alcançar um maior número de pessoas. Entretanto, as mensagens de erro, e algumas instruções também foram adicionadas em português para facilitar o uso de brasileiros.</w:t>
+      </w:r>
+    </w:p>
+    <w:p>
+      <w:pPr>
+        <w:pStyle w:val="ListParagraph"/>
+        <w:bidi w:val="0"/>
+        <w:spacing w:lineRule="auto" w:line="360"/>
+        <w:ind w:firstLine="709" w:left="0"/>
+        <w:jc w:val="both"/>
+        <w:rPr/>
+      </w:pPr>
+      <w:r>
+        <w:rPr>
+          <w:rStyle w:val="normaltextrun"/>
+          <w:color w:val="000000"/>
+          <w:shd w:fill="FFFFFF" w:val="clear"/>
+        </w:rPr>
+        <w:t xml:space="preserve">Seguindo o que foi estipulado pelo </w:t>
+      </w:r>
+      <w:r>
+        <w:rPr>
+          <w:rStyle w:val="normaltextrun"/>
+          <w:color w:val="000000"/>
+          <w:shd w:fill="FFFFFF" w:val="clear"/>
+        </w:rPr>
+        <w:t>cronograma das tarefas, as primeiras funções desenvolvidas foram: `download_normative_data()`, `download_normative_txt()`, `</w:t>
+      </w:r>
+      <w:r>
+        <w:rPr>
+          <w:rStyle w:val="normaltextrun"/>
+        </w:rPr>
+        <w:t>download_balance_sheets</w:t>
+      </w:r>
+      <w:r>
+        <w:rPr>
+          <w:rStyle w:val="normaltextrun"/>
+        </w:rPr>
+        <w:t>()` e</w:t>
+      </w:r>
+      <w:r>
+        <w:rPr>
+          <w:rStyle w:val="normaltextrun"/>
+          <w:color w:val="000000"/>
+          <w:shd w:fill="FFFFFF" w:val="clear"/>
+        </w:rPr>
+        <w:t xml:space="preserve"> `treatment_balance_sheets</w:t>
+      </w:r>
+      <w:r>
+        <w:rPr>
+          <w:rStyle w:val="normaltextrun"/>
+          <w:color w:val="000000"/>
+          <w:shd w:fill="FFFFFF" w:val="clear"/>
+        </w:rPr>
+        <w:t>()`. Após o pacote ser instalado, a documentação de cada função poderá ser dentro do próprio R, conforme exemplo da Figura 2.</w:t>
+      </w:r>
+    </w:p>
+    <w:p>
+      <w:pPr>
+        <w:pStyle w:val="ListParagraph"/>
+        <w:spacing w:lineRule="auto" w:line="360"/>
+        <w:ind w:firstLine="709" w:left="0"/>
+        <w:jc w:val="both"/>
+        <w:rPr/>
+      </w:pPr>
+      <w:r>
+        <w:rPr/>
+        <w:drawing>
+          <wp:anchor behindDoc="0" distT="0" distB="0" distL="0" distR="0" simplePos="0" locked="0" layoutInCell="0" allowOverlap="1" relativeHeight="22">
+            <wp:simplePos x="0" y="0"/>
+            <wp:positionH relativeFrom="column">
+              <wp:posOffset>1316990</wp:posOffset>
+            </wp:positionH>
+            <wp:positionV relativeFrom="paragraph">
+              <wp:posOffset>147955</wp:posOffset>
+            </wp:positionV>
+            <wp:extent cx="3684905" cy="4376420"/>
+            <wp:effectExtent l="0" t="0" r="0" b="0"/>
+            <wp:wrapSquare wrapText="largest"/>
+            <wp:docPr id="2" name="Figura3" descr=""/>
+            <wp:cNvGraphicFramePr>
+              <a:graphicFrameLocks xmlns:a="http://schemas.openxmlformats.org/drawingml/2006/main" noChangeAspect="1"/>
+            </wp:cNvGraphicFramePr>
+            <a:graphic xmlns:a="http://schemas.openxmlformats.org/drawingml/2006/main">
+              <a:graphicData uri="http://schemas.openxmlformats.org/drawingml/2006/picture">
+                <pic:pic xmlns:pic="http://schemas.openxmlformats.org/drawingml/2006/picture">
+                  <pic:nvPicPr>
+                    <pic:cNvPr id="2" name="Figura3" descr=""/>
+                    <pic:cNvPicPr>
+                      <a:picLocks noChangeAspect="1" noChangeArrowheads="1"/>
+                    </pic:cNvPicPr>
+                  </pic:nvPicPr>
+                  <pic:blipFill>
+                    <a:blip r:embed="rId3"/>
+                    <a:srcRect l="0" t="9436" r="0" b="0"/>
+                    <a:stretch>
+                      <a:fillRect/>
+                    </a:stretch>
+                  </pic:blipFill>
+                  <pic:spPr bwMode="auto">
+                    <a:xfrm>
+                      <a:off x="0" y="0"/>
+                      <a:ext cx="3684905" cy="4376420"/>
+                    </a:xfrm>
+                    <a:prstGeom prst="rect">
+                      <a:avLst/>
+                    </a:prstGeom>
+                  </pic:spPr>
+                </pic:pic>
+              </a:graphicData>
+            </a:graphic>
+          </wp:anchor>
+        </w:drawing>
+      </w:r>
+    </w:p>
+    <w:p>
+      <w:pPr>
+        <w:pStyle w:val="ListParagraph"/>
+        <w:spacing w:lineRule="auto" w:line="360"/>
+        <w:ind w:firstLine="709" w:left="0"/>
+        <w:rPr>
+          <w:rStyle w:val="normaltextrun"/>
+          <w:color w:val="000000"/>
+          <w:shd w:fill="FFFFFF" w:val="clear"/>
+        </w:rPr>
+      </w:pPr>
+      <w:r>
+        <w:rPr>
+          <w:color w:val="000000"/>
+          <w:shd w:fill="FFFFFF" w:val="clear"/>
+        </w:rPr>
+      </w:r>
+    </w:p>
+    <w:p>
+      <w:pPr>
+        <w:pStyle w:val="ListParagraph"/>
+        <w:spacing w:lineRule="auto" w:line="360"/>
+        <w:ind w:firstLine="709" w:left="0"/>
+        <w:rPr>
+          <w:rStyle w:val="normaltextrun"/>
+          <w:color w:val="000000"/>
+          <w:shd w:fill="FFFFFF" w:val="clear"/>
+        </w:rPr>
+      </w:pPr>
+      <w:r>
+        <w:rPr>
+          <w:color w:val="000000"/>
+          <w:shd w:fill="FFFFFF" w:val="clear"/>
+        </w:rPr>
+      </w:r>
+    </w:p>
+    <w:p>
+      <w:pPr>
+        <w:pStyle w:val="ListParagraph"/>
+        <w:spacing w:lineRule="auto" w:line="360"/>
+        <w:ind w:firstLine="709" w:left="0"/>
+        <w:rPr>
+          <w:rStyle w:val="normaltextrun"/>
+          <w:color w:val="000000"/>
+          <w:shd w:fill="FFFFFF" w:val="clear"/>
+        </w:rPr>
+      </w:pPr>
+      <w:r>
+        <w:rPr>
+          <w:color w:val="000000"/>
+          <w:shd w:fill="FFFFFF" w:val="clear"/>
+        </w:rPr>
+      </w:r>
+    </w:p>
+    <w:p>
+      <w:pPr>
+        <w:pStyle w:val="ListParagraph"/>
+        <w:spacing w:lineRule="auto" w:line="360"/>
+        <w:ind w:firstLine="709" w:left="0"/>
+        <w:rPr>
+          <w:rStyle w:val="normaltextrun"/>
+          <w:color w:val="000000"/>
+          <w:shd w:fill="FFFFFF" w:val="clear"/>
+        </w:rPr>
+      </w:pPr>
+      <w:r>
+        <w:rPr>
+          <w:color w:val="000000"/>
+          <w:shd w:fill="FFFFFF" w:val="clear"/>
+        </w:rPr>
+      </w:r>
+    </w:p>
+    <w:p>
+      <w:pPr>
+        <w:pStyle w:val="ListParagraph"/>
+        <w:spacing w:lineRule="auto" w:line="360"/>
+        <w:ind w:firstLine="709" w:left="0"/>
+        <w:rPr>
+          <w:rStyle w:val="normaltextrun"/>
+          <w:color w:val="000000"/>
+          <w:shd w:fill="FFFFFF" w:val="clear"/>
+        </w:rPr>
+      </w:pPr>
+      <w:r>
+        <w:rPr>
+          <w:color w:val="000000"/>
+          <w:shd w:fill="FFFFFF" w:val="clear"/>
+        </w:rPr>
+      </w:r>
+    </w:p>
+    <w:p>
+      <w:pPr>
+        <w:pStyle w:val="ListParagraph"/>
+        <w:spacing w:lineRule="auto" w:line="360"/>
+        <w:ind w:firstLine="709" w:left="0"/>
+        <w:rPr>
+          <w:rStyle w:val="normaltextrun"/>
+          <w:color w:val="000000"/>
+          <w:shd w:fill="FFFFFF" w:val="clear"/>
+        </w:rPr>
+      </w:pPr>
+      <w:r>
+        <w:rPr>
+          <w:color w:val="000000"/>
+          <w:shd w:fill="FFFFFF" w:val="clear"/>
+        </w:rPr>
+      </w:r>
+    </w:p>
+    <w:p>
+      <w:pPr>
+        <w:pStyle w:val="ListParagraph"/>
+        <w:spacing w:lineRule="auto" w:line="360"/>
+        <w:ind w:firstLine="709" w:left="0"/>
+        <w:rPr>
+          <w:rStyle w:val="normaltextrun"/>
+          <w:color w:val="000000"/>
+          <w:shd w:fill="FFFFFF" w:val="clear"/>
+        </w:rPr>
+      </w:pPr>
+      <w:r>
+        <w:rPr>
+          <w:color w:val="000000"/>
+          <w:shd w:fill="FFFFFF" w:val="clear"/>
+        </w:rPr>
+      </w:r>
+    </w:p>
+    <w:p>
+      <w:pPr>
+        <w:pStyle w:val="ListParagraph"/>
+        <w:spacing w:lineRule="auto" w:line="360"/>
+        <w:ind w:firstLine="709" w:left="0"/>
+        <w:rPr>
+          <w:rStyle w:val="normaltextrun"/>
+          <w:color w:val="000000"/>
+          <w:shd w:fill="FFFFFF" w:val="clear"/>
+        </w:rPr>
+      </w:pPr>
+      <w:r>
+        <w:rPr>
+          <w:color w:val="000000"/>
+          <w:shd w:fill="FFFFFF" w:val="clear"/>
+        </w:rPr>
+      </w:r>
+    </w:p>
+    <w:p>
+      <w:pPr>
+        <w:pStyle w:val="ListParagraph"/>
+        <w:spacing w:lineRule="auto" w:line="360"/>
+        <w:ind w:firstLine="709" w:left="0"/>
+        <w:rPr>
+          <w:rStyle w:val="normaltextrun"/>
+          <w:color w:val="000000"/>
+          <w:shd w:fill="FFFFFF" w:val="clear"/>
+        </w:rPr>
+      </w:pPr>
+      <w:r>
+        <w:rPr>
+          <w:color w:val="000000"/>
+          <w:shd w:fill="FFFFFF" w:val="clear"/>
+        </w:rPr>
+      </w:r>
+    </w:p>
+    <w:p>
+      <w:pPr>
+        <w:pStyle w:val="ListParagraph"/>
+        <w:spacing w:lineRule="auto" w:line="360"/>
+        <w:ind w:firstLine="709" w:left="0"/>
+        <w:rPr>
+          <w:rStyle w:val="normaltextrun"/>
+          <w:color w:val="000000"/>
+          <w:shd w:fill="FFFFFF" w:val="clear"/>
+        </w:rPr>
+      </w:pPr>
+      <w:r>
+        <w:rPr>
+          <w:color w:val="000000"/>
+          <w:shd w:fill="FFFFFF" w:val="clear"/>
+        </w:rPr>
+      </w:r>
+    </w:p>
+    <w:p>
+      <w:pPr>
+        <w:pStyle w:val="ListParagraph"/>
+        <w:spacing w:lineRule="auto" w:line="360"/>
+        <w:ind w:firstLine="709" w:left="0"/>
+        <w:rPr>
+          <w:rStyle w:val="normaltextrun"/>
+          <w:color w:val="000000"/>
+          <w:shd w:fill="FFFFFF" w:val="clear"/>
+        </w:rPr>
+      </w:pPr>
+      <w:r>
+        <w:rPr>
+          <w:color w:val="000000"/>
+          <w:shd w:fill="FFFFFF" w:val="clear"/>
+        </w:rPr>
+      </w:r>
+    </w:p>
+    <w:p>
+      <w:pPr>
+        <w:pStyle w:val="ListParagraph"/>
+        <w:spacing w:lineRule="auto" w:line="360"/>
+        <w:ind w:firstLine="709" w:left="0"/>
+        <w:rPr>
+          <w:rStyle w:val="normaltextrun"/>
+          <w:color w:val="000000"/>
+          <w:shd w:fill="FFFFFF" w:val="clear"/>
+        </w:rPr>
+      </w:pPr>
+      <w:r>
+        <w:rPr>
+          <w:color w:val="000000"/>
+          <w:shd w:fill="FFFFFF" w:val="clear"/>
+        </w:rPr>
+      </w:r>
+    </w:p>
+    <w:p>
+      <w:pPr>
+        <w:pStyle w:val="ListParagraph"/>
+        <w:spacing w:lineRule="auto" w:line="360"/>
+        <w:ind w:firstLine="709" w:left="0"/>
+        <w:rPr>
+          <w:rStyle w:val="normaltextrun"/>
+          <w:color w:val="000000"/>
+          <w:shd w:fill="FFFFFF" w:val="clear"/>
+        </w:rPr>
+      </w:pPr>
+      <w:r>
+        <w:rPr>
+          <w:color w:val="000000"/>
+          <w:shd w:fill="FFFFFF" w:val="clear"/>
+        </w:rPr>
+      </w:r>
+    </w:p>
+    <w:p>
+      <w:pPr>
+        <w:pStyle w:val="ListParagraph"/>
+        <w:spacing w:lineRule="auto" w:line="360"/>
+        <w:ind w:firstLine="709" w:left="0"/>
+        <w:rPr>
+          <w:rStyle w:val="normaltextrun"/>
+          <w:color w:val="000000"/>
+          <w:shd w:fill="FFFFFF" w:val="clear"/>
+        </w:rPr>
+      </w:pPr>
+      <w:r>
+        <w:rPr>
+          <w:color w:val="000000"/>
+          <w:shd w:fill="FFFFFF" w:val="clear"/>
+        </w:rPr>
+      </w:r>
+    </w:p>
+    <w:p>
+      <w:pPr>
+        <w:pStyle w:val="ListParagraph"/>
+        <w:spacing w:lineRule="auto" w:line="360"/>
+        <w:ind w:firstLine="709" w:left="0"/>
+        <w:rPr>
+          <w:rStyle w:val="normaltextrun"/>
+          <w:color w:val="000000"/>
+          <w:shd w:fill="FFFFFF" w:val="clear"/>
+        </w:rPr>
+      </w:pPr>
+      <w:r>
+        <w:rPr>
+          <w:color w:val="000000"/>
+          <w:shd w:fill="FFFFFF" w:val="clear"/>
+        </w:rPr>
+      </w:r>
+    </w:p>
+    <w:p>
+      <w:pPr>
+        <w:pStyle w:val="ListParagraph"/>
+        <w:spacing w:lineRule="auto" w:line="360"/>
+        <w:ind w:firstLine="709" w:left="0"/>
+        <w:rPr>
+          <w:rStyle w:val="normaltextrun"/>
+          <w:color w:val="000000"/>
+          <w:shd w:fill="FFFFFF" w:val="clear"/>
+        </w:rPr>
+      </w:pPr>
+      <w:r>
+        <w:rPr>
+          <w:color w:val="000000"/>
+          <w:shd w:fill="FFFFFF" w:val="clear"/>
+        </w:rPr>
+      </w:r>
+    </w:p>
+    <w:p>
+      <w:pPr>
+        <w:pStyle w:val="ListParagraph"/>
+        <w:spacing w:lineRule="auto" w:line="360"/>
+        <w:ind w:firstLine="709" w:left="0"/>
+        <w:rPr>
+          <w:rStyle w:val="normaltextrun"/>
+          <w:color w:val="000000"/>
+          <w:shd w:fill="FFFFFF" w:val="clear"/>
+        </w:rPr>
+      </w:pPr>
+      <w:r>
+        <w:rPr>
+          <w:color w:val="000000"/>
+          <w:shd w:fill="FFFFFF" w:val="clear"/>
+        </w:rPr>
+      </w:r>
+    </w:p>
+    <w:p>
+      <w:pPr>
+        <w:pStyle w:val="ListParagraph"/>
+        <w:spacing w:lineRule="auto" w:line="360"/>
+        <w:ind w:firstLine="709" w:left="0"/>
+        <w:rPr>
+          <w:rStyle w:val="normaltextrun"/>
+          <w:color w:val="000000"/>
+          <w:shd w:fill="FFFFFF" w:val="clear"/>
+        </w:rPr>
+      </w:pPr>
+      <w:r>
+        <w:rPr>
+          <w:color w:val="000000"/>
+          <w:shd w:fill="FFFFFF" w:val="clear"/>
+        </w:rPr>
+      </w:r>
+    </w:p>
+    <w:p>
+      <w:pPr>
+        <w:pStyle w:val="ListParagraph"/>
+        <w:spacing w:lineRule="auto" w:line="360"/>
+        <w:ind w:firstLine="709" w:left="0"/>
+        <w:rPr>
+          <w:rStyle w:val="normaltextrun"/>
+          <w:color w:val="000000"/>
+          <w:shd w:fill="FFFFFF" w:val="clear"/>
+        </w:rPr>
+      </w:pPr>
+      <w:r>
+        <w:rPr>
+          <w:rStyle w:val="normaltextrun"/>
+          <w:color w:val="000000"/>
+          <w:shd w:fill="FFFFFF" w:val="clear"/>
+        </w:rPr>
+        <w:t>Figura 2. Exemplo da documentação da função `download_normative_data()`</w:t>
+      </w:r>
+    </w:p>
+    <w:p>
+      <w:pPr>
+        <w:pStyle w:val="ListParagraph"/>
+        <w:spacing w:lineRule="auto" w:line="360"/>
+        <w:ind w:firstLine="709" w:left="0"/>
+        <w:rPr>
+          <w:rStyle w:val="normaltextrun"/>
+          <w:color w:val="000000"/>
+          <w:shd w:fill="FFFFFF" w:val="clear"/>
+        </w:rPr>
+      </w:pPr>
+      <w:r>
+        <w:rPr>
+          <w:rStyle w:val="normaltextrun"/>
+          <w:color w:val="000000"/>
+          <w:shd w:fill="FFFFFF" w:val="clear"/>
+        </w:rPr>
+        <w:t>Fonte: Resultados originais da pesquisa</w:t>
+      </w:r>
+    </w:p>
+    <w:p>
+      <w:pPr>
+        <w:pStyle w:val="ListParagraph"/>
+        <w:spacing w:lineRule="auto" w:line="360"/>
+        <w:ind w:firstLine="709" w:left="0"/>
+        <w:rPr>
+          <w:rStyle w:val="normaltextrun"/>
+          <w:color w:val="000000"/>
+          <w:shd w:fill="FFFFFF" w:val="clear"/>
+        </w:rPr>
+      </w:pPr>
+      <w:r>
+        <w:rPr>
+          <w:color w:val="000000"/>
+          <w:shd w:fill="FFFFFF" w:val="clear"/>
+        </w:rPr>
+      </w:r>
+    </w:p>
+    <w:p>
+      <w:pPr>
+        <w:pStyle w:val="ListParagraph"/>
+        <w:spacing w:lineRule="auto" w:line="360"/>
+        <w:ind w:firstLine="709" w:left="0"/>
+        <w:rPr>
+          <w:rStyle w:val="normaltextrun"/>
+          <w:color w:val="000000"/>
+          <w:shd w:fill="FFFFFF" w:val="clear"/>
+        </w:rPr>
+      </w:pPr>
+      <w:r>
+        <w:rPr>
+          <w:rStyle w:val="normaltextrun"/>
+          <w:color w:val="000000"/>
+          <w:shd w:fill="FFFFFF" w:val="clear"/>
+        </w:rPr>
+        <w:t>Desta forma é possível que o usuário visualize o objetivo da função, a fonte de coleta de dados, quais os parâmetros necessários e um exemplo de utilização. Esta mesma documentação foi utilizada para as outras 3 funções.</w:t>
+      </w:r>
+    </w:p>
+    <w:p>
+      <w:pPr>
+        <w:pStyle w:val="ListParagraph"/>
+        <w:spacing w:lineRule="auto" w:line="360"/>
+        <w:ind w:firstLine="709" w:left="0"/>
+        <w:rPr>
+          <w:rStyle w:val="normaltextrun"/>
+          <w:color w:val="000000"/>
+          <w:shd w:fill="FFFFFF" w:val="clear"/>
+        </w:rPr>
+      </w:pPr>
+      <w:r>
+        <w:rPr>
+          <w:rStyle w:val="normaltextrun"/>
+          <w:color w:val="000000"/>
+          <w:shd w:fill="FFFFFF" w:val="clear"/>
+        </w:rPr>
+        <w:t>O nome da cada função, já descreve o que ela faz, entretanto nas documentações foram descritos como:</w:t>
+      </w:r>
+    </w:p>
+    <w:p>
+      <w:pPr>
+        <w:pStyle w:val="ListParagraph"/>
+        <w:numPr>
+          <w:ilvl w:val="0"/>
+          <w:numId w:val="1"/>
+        </w:numPr>
+        <w:bidi w:val="0"/>
+        <w:spacing w:lineRule="auto" w:line="360"/>
+        <w:jc w:val="both"/>
+        <w:rPr/>
+      </w:pPr>
+      <w:r>
+        <w:rPr>
+          <w:rStyle w:val="normaltextrun"/>
+        </w:rPr>
+        <w:t>`download_normative_data()`:  Baixa os atos normativos do Banco Central do Brasil (BCB) por termos e janela de datas.</w:t>
+      </w:r>
+    </w:p>
+    <w:p>
+      <w:pPr>
+        <w:pStyle w:val="ListParagraph"/>
+        <w:numPr>
+          <w:ilvl w:val="0"/>
+          <w:numId w:val="1"/>
+        </w:numPr>
+        <w:bidi w:val="0"/>
+        <w:spacing w:lineRule="auto" w:line="360"/>
+        <w:jc w:val="both"/>
+        <w:rPr/>
+      </w:pPr>
+      <w:r>
+        <w:rPr>
+          <w:rStyle w:val="normaltextrun"/>
+        </w:rPr>
+        <w:t>`download_normative_txt()`: Baixa o texto dos atos normativos do Banco Central do Brasil (BCB), de acordo o data.frame gerado pela função [download_normative_data()]</w:t>
+      </w:r>
+    </w:p>
+    <w:p>
+      <w:pPr>
+        <w:pStyle w:val="ListParagraph"/>
+        <w:numPr>
+          <w:ilvl w:val="0"/>
+          <w:numId w:val="1"/>
+        </w:numPr>
+        <w:bidi w:val="0"/>
+        <w:spacing w:lineRule="auto" w:line="360"/>
+        <w:jc w:val="both"/>
+        <w:rPr/>
+      </w:pPr>
+      <w:r>
+        <w:rPr>
+          <w:rStyle w:val="normaltextrun"/>
+        </w:rPr>
+        <w:t>`</w:t>
+      </w:r>
+      <w:r>
+        <w:rPr>
+          <w:rStyle w:val="normaltextrun"/>
+        </w:rPr>
+        <w:t>download_balance_sheets</w:t>
+      </w:r>
+      <w:r>
+        <w:rPr>
+          <w:rStyle w:val="normaltextrun"/>
+        </w:rPr>
+        <w:t>()`: Baixa os balanços e balancetes das instituições financeiras, por ano e mês e tipo do documento, presentes no Banco Central do Brasil (BCB)</w:t>
+      </w:r>
+    </w:p>
+    <w:p>
+      <w:pPr>
+        <w:pStyle w:val="ListParagraph"/>
+        <w:numPr>
+          <w:ilvl w:val="0"/>
+          <w:numId w:val="1"/>
+        </w:numPr>
+        <w:bidi w:val="0"/>
+        <w:spacing w:lineRule="auto" w:line="360"/>
+        <w:jc w:val="both"/>
+        <w:rPr/>
+      </w:pPr>
+      <w:r>
+        <w:rPr>
+          <w:rStyle w:val="normaltextrun"/>
+        </w:rPr>
+        <w:t>`treatment_balance_sheets</w:t>
+      </w:r>
+      <w:r>
+        <w:rPr>
+          <w:rStyle w:val="normaltextrun"/>
+        </w:rPr>
+        <w:t>()`: Processa e organiza os balanços baixados do BCB pela função [download_balance_sheets()]</w:t>
+      </w:r>
+    </w:p>
+    <w:p>
+      <w:pPr>
+        <w:pStyle w:val="ListParagraph"/>
+        <w:bidi w:val="0"/>
+        <w:spacing w:lineRule="auto" w:line="360"/>
+        <w:jc w:val="both"/>
+        <w:rPr>
+          <w:rStyle w:val="normaltextrun"/>
+        </w:rPr>
+      </w:pPr>
+      <w:r>
+        <w:rPr/>
+      </w:r>
+    </w:p>
+    <w:p>
+      <w:pPr>
+        <w:pStyle w:val="ListParagraph"/>
+        <w:widowControl/>
+        <w:suppressAutoHyphens w:val="true"/>
+        <w:bidi w:val="0"/>
+        <w:spacing w:lineRule="auto" w:line="360" w:before="0" w:after="0"/>
+        <w:ind w:firstLine="680" w:left="0" w:right="0"/>
+        <w:contextualSpacing/>
+        <w:jc w:val="both"/>
+        <w:rPr/>
+      </w:pPr>
+      <w:r>
+        <w:rPr>
+          <w:rStyle w:val="normaltextrun"/>
+        </w:rPr>
+        <w:t>A licença escolhida para o pacote, foi a “</w:t>
+      </w:r>
+      <w:r>
+        <w:rPr>
+          <w:rStyle w:val="normaltextrun"/>
+        </w:rPr>
+        <w:t xml:space="preserve">General Public License” </w:t>
+      </w:r>
+      <w:r>
+        <w:rPr>
+          <w:rStyle w:val="normaltextrun"/>
+        </w:rPr>
+        <w:t>3 [</w:t>
+      </w:r>
+      <w:r>
+        <w:rPr>
+          <w:rStyle w:val="normaltextrun"/>
+        </w:rPr>
+        <w:t>GPL-3.0</w:t>
+      </w:r>
+      <w:r>
+        <w:rPr>
+          <w:rStyle w:val="normaltextrun"/>
+        </w:rPr>
+        <w:t>]</w:t>
+      </w:r>
+      <w:r>
+        <w:rPr>
+          <w:rStyle w:val="normaltextrun"/>
+          <w:rStyle w:val="FootnoteReference"/>
+        </w:rPr>
+        <w:footnoteReference w:id="8"/>
+      </w:r>
+      <w:r>
+        <w:rPr>
+          <w:rStyle w:val="normaltextrun"/>
+        </w:rPr>
+        <w:t>, que permite que o pacote e suas funções sejam utilizados em outros pacotes e programas, desde que a distribuição destes também seja livre. Então, os testes das funções foram realizados, elas passaram, e foi realizado o “upload” do pacote para o “Github”, com a  criação de um README.md com um texto de apresentação, conforme Figura 3.</w:t>
+      </w:r>
+    </w:p>
+    <w:p>
+      <w:pPr>
+        <w:pStyle w:val="ListParagraph"/>
+        <w:bidi w:val="0"/>
+        <w:spacing w:lineRule="auto" w:line="360"/>
+        <w:jc w:val="both"/>
+        <w:rPr/>
+      </w:pPr>
+      <w:r>
+        <w:drawing>
+          <wp:anchor behindDoc="0" distT="0" distB="0" distL="0" distR="0" simplePos="0" locked="0" layoutInCell="0" allowOverlap="1" relativeHeight="23">
+            <wp:simplePos x="0" y="0"/>
+            <wp:positionH relativeFrom="column">
+              <wp:align>center</wp:align>
+            </wp:positionH>
+            <wp:positionV relativeFrom="paragraph">
+              <wp:posOffset>635</wp:posOffset>
+            </wp:positionV>
+            <wp:extent cx="4128770" cy="4225290"/>
+            <wp:effectExtent l="0" t="0" r="0" b="0"/>
+            <wp:wrapSquare wrapText="largest"/>
+            <wp:docPr id="3" name="Figura4" descr=""/>
+            <wp:cNvGraphicFramePr>
+              <a:graphicFrameLocks xmlns:a="http://schemas.openxmlformats.org/drawingml/2006/main" noChangeAspect="1"/>
+            </wp:cNvGraphicFramePr>
+            <a:graphic xmlns:a="http://schemas.openxmlformats.org/drawingml/2006/main">
+              <a:graphicData uri="http://schemas.openxmlformats.org/drawingml/2006/picture">
+                <pic:pic xmlns:pic="http://schemas.openxmlformats.org/drawingml/2006/picture">
+                  <pic:nvPicPr>
+                    <pic:cNvPr id="3" name="Figura4" descr=""/>
+                    <pic:cNvPicPr>
+                      <a:picLocks noChangeAspect="1" noChangeArrowheads="1"/>
+                    </pic:cNvPicPr>
+                  </pic:nvPicPr>
+                  <pic:blipFill>
+                    <a:blip r:embed="rId4"/>
+                    <a:stretch>
+                      <a:fillRect/>
+                    </a:stretch>
+                  </pic:blipFill>
+                  <pic:spPr bwMode="auto">
+                    <a:xfrm>
+                      <a:off x="0" y="0"/>
+                      <a:ext cx="4128770" cy="4225290"/>
+                    </a:xfrm>
+                    <a:prstGeom prst="rect">
+                      <a:avLst/>
+                    </a:prstGeom>
+                  </pic:spPr>
+                </pic:pic>
+              </a:graphicData>
+            </a:graphic>
+          </wp:anchor>
+        </w:drawing>
+      </w:r>
+      <w:r>
+        <w:rPr>
+          <w:rStyle w:val="normaltextrun"/>
+        </w:rPr>
+        <w:t>Figura 3. README.md do pacote bacenR, com descrição e instruções de instalação e uso</w:t>
+      </w:r>
+    </w:p>
+    <w:p>
+      <w:pPr>
+        <w:pStyle w:val="ListParagraph"/>
+        <w:bidi w:val="0"/>
+        <w:spacing w:lineRule="auto" w:line="360"/>
+        <w:jc w:val="both"/>
+        <w:rPr/>
+      </w:pPr>
+      <w:r>
+        <w:rPr>
+          <w:rStyle w:val="normaltextrun"/>
+        </w:rPr>
+        <w:t>Fonte: Resultados originais da pesquisa</w:t>
+      </w:r>
+    </w:p>
+    <w:p>
+      <w:pPr>
+        <w:pStyle w:val="ListParagraph"/>
+        <w:bidi w:val="0"/>
+        <w:spacing w:lineRule="auto" w:line="360"/>
+        <w:jc w:val="both"/>
+        <w:rPr>
+          <w:rStyle w:val="normaltextrun"/>
+        </w:rPr>
+      </w:pPr>
+      <w:r>
+        <w:rPr/>
+      </w:r>
+    </w:p>
+    <w:p>
+      <w:pPr>
+        <w:pStyle w:val="ListParagraph"/>
+        <w:spacing w:lineRule="auto" w:line="360"/>
+        <w:ind w:firstLine="709" w:left="0"/>
+        <w:jc w:val="both"/>
+        <w:rPr>
+          <w:rStyle w:val="normaltextrun"/>
+          <w:color w:val="000000"/>
+          <w:shd w:fill="FFFFFF" w:val="clear"/>
+        </w:rPr>
+      </w:pPr>
+      <w:r>
+        <w:rPr>
+          <w:rStyle w:val="normaltextrun"/>
+          <w:color w:val="000000"/>
+          <w:shd w:fill="FFFFFF" w:val="clear"/>
+        </w:rPr>
+        <w:t>Caso o pacote seja utilizado para elaboração de algum artigo, trabalho ou livro, ele deverá ser referenciado de conforme .bib abaixo:</w:t>
+        <w:br/>
+        <w:br/>
+        <w:t>bibentry(</w:t>
+      </w:r>
+    </w:p>
+    <w:p>
+      <w:pPr>
+        <w:pStyle w:val="ListParagraph"/>
+        <w:spacing w:lineRule="auto" w:line="360"/>
+        <w:ind w:firstLine="709" w:left="0"/>
+        <w:rPr>
+          <w:rStyle w:val="normaltextrun"/>
+          <w:color w:val="000000"/>
+          <w:shd w:fill="FFFFFF" w:val="clear"/>
+        </w:rPr>
+      </w:pPr>
+      <w:r>
+        <w:rPr>
+          <w:rStyle w:val="normaltextrun"/>
+          <w:color w:val="000000"/>
+          <w:shd w:fill="FFFFFF" w:val="clear"/>
+        </w:rPr>
+        <w:t xml:space="preserve">  </w:t>
+      </w:r>
+      <w:r>
+        <w:rPr>
+          <w:rStyle w:val="normaltextrun"/>
+          <w:color w:val="000000"/>
+          <w:shd w:fill="FFFFFF" w:val="clear"/>
+        </w:rPr>
+        <w:t>bibtype = "Article",</w:t>
+      </w:r>
+    </w:p>
+    <w:p>
+      <w:pPr>
+        <w:pStyle w:val="ListParagraph"/>
+        <w:spacing w:lineRule="auto" w:line="360"/>
+        <w:ind w:firstLine="709" w:left="0"/>
+        <w:rPr>
+          <w:rStyle w:val="normaltextrun"/>
+          <w:color w:val="000000"/>
+          <w:shd w:fill="FFFFFF" w:val="clear"/>
+        </w:rPr>
+      </w:pPr>
+      <w:r>
+        <w:rPr>
+          <w:rStyle w:val="normaltextrun"/>
+          <w:color w:val="000000"/>
+          <w:shd w:fill="FFFFFF" w:val="clear"/>
+        </w:rPr>
+        <w:t xml:space="preserve">  </w:t>
+      </w:r>
+      <w:r>
+        <w:rPr>
+          <w:rStyle w:val="normaltextrun"/>
+          <w:color w:val="000000"/>
+          <w:shd w:fill="FFFFFF" w:val="clear"/>
+        </w:rPr>
+        <w:t>title = "bacenR: Tools to Access Data from Banco Central do Brasil",</w:t>
+      </w:r>
+    </w:p>
+    <w:p>
+      <w:pPr>
+        <w:pStyle w:val="ListParagraph"/>
+        <w:spacing w:lineRule="auto" w:line="360"/>
+        <w:ind w:firstLine="709" w:left="0"/>
+        <w:rPr>
+          <w:rStyle w:val="normaltextrun"/>
+          <w:color w:val="000000"/>
+          <w:shd w:fill="FFFFFF" w:val="clear"/>
+        </w:rPr>
+      </w:pPr>
+      <w:r>
+        <w:rPr>
+          <w:rStyle w:val="normaltextrun"/>
+          <w:color w:val="000000"/>
+          <w:shd w:fill="FFFFFF" w:val="clear"/>
+        </w:rPr>
+        <w:t xml:space="preserve">  </w:t>
+      </w:r>
+      <w:r>
+        <w:rPr>
+          <w:rStyle w:val="normaltextrun"/>
+          <w:color w:val="000000"/>
+          <w:shd w:fill="FFFFFF" w:val="clear"/>
+        </w:rPr>
+        <w:t>author = "Ricardo Theodoro",</w:t>
+      </w:r>
+    </w:p>
+    <w:p>
+      <w:pPr>
+        <w:pStyle w:val="ListParagraph"/>
+        <w:spacing w:lineRule="auto" w:line="360"/>
+        <w:ind w:firstLine="709" w:left="0"/>
+        <w:rPr>
+          <w:rStyle w:val="normaltextrun"/>
+          <w:color w:val="000000"/>
+          <w:shd w:fill="FFFFFF" w:val="clear"/>
+        </w:rPr>
+      </w:pPr>
+      <w:r>
+        <w:rPr>
+          <w:rStyle w:val="normaltextrun"/>
+          <w:color w:val="000000"/>
+          <w:shd w:fill="FFFFFF" w:val="clear"/>
+        </w:rPr>
+        <w:t xml:space="preserve">  </w:t>
+      </w:r>
+      <w:r>
+        <w:rPr>
+          <w:rStyle w:val="normaltextrun"/>
+          <w:color w:val="000000"/>
+          <w:shd w:fill="FFFFFF" w:val="clear"/>
+        </w:rPr>
+        <w:t>journal = "github",</w:t>
+      </w:r>
+    </w:p>
+    <w:p>
+      <w:pPr>
+        <w:pStyle w:val="ListParagraph"/>
+        <w:spacing w:lineRule="auto" w:line="360"/>
+        <w:ind w:firstLine="709" w:left="0"/>
+        <w:rPr>
+          <w:rStyle w:val="normaltextrun"/>
+          <w:color w:val="000000"/>
+          <w:shd w:fill="FFFFFF" w:val="clear"/>
+        </w:rPr>
+      </w:pPr>
+      <w:r>
+        <w:rPr>
+          <w:rStyle w:val="normaltextrun"/>
+          <w:color w:val="000000"/>
+          <w:shd w:fill="FFFFFF" w:val="clear"/>
+        </w:rPr>
+        <w:t xml:space="preserve">  </w:t>
+      </w:r>
+      <w:r>
+        <w:rPr>
+          <w:rStyle w:val="normaltextrun"/>
+          <w:color w:val="000000"/>
+          <w:shd w:fill="FFFFFF" w:val="clear"/>
+        </w:rPr>
+        <w:t>year = "2025",</w:t>
+      </w:r>
+    </w:p>
+    <w:p>
+      <w:pPr>
+        <w:pStyle w:val="ListParagraph"/>
+        <w:spacing w:lineRule="auto" w:line="360"/>
+        <w:ind w:firstLine="709" w:left="0"/>
+        <w:rPr>
+          <w:rStyle w:val="normaltextrun"/>
+          <w:color w:val="000000"/>
+          <w:shd w:fill="FFFFFF" w:val="clear"/>
+        </w:rPr>
+      </w:pPr>
+      <w:r>
+        <w:rPr>
+          <w:rStyle w:val="normaltextrun"/>
+          <w:color w:val="000000"/>
+          <w:shd w:fill="FFFFFF" w:val="clear"/>
+        </w:rPr>
+        <w:t xml:space="preserve">  </w:t>
+      </w:r>
+      <w:r>
+        <w:rPr>
+          <w:rStyle w:val="normaltextrun"/>
+          <w:color w:val="000000"/>
+          <w:shd w:fill="FFFFFF" w:val="clear"/>
+        </w:rPr>
+        <w:t>url = "https://github.com/rtheodoro/bacenR"</w:t>
+      </w:r>
+    </w:p>
+    <w:p>
+      <w:pPr>
+        <w:pStyle w:val="ListParagraph"/>
+        <w:spacing w:lineRule="auto" w:line="360"/>
+        <w:ind w:firstLine="709" w:left="0"/>
+        <w:rPr>
+          <w:rStyle w:val="normaltextrun"/>
+          <w:color w:val="000000"/>
+          <w:shd w:fill="FFFFFF" w:val="clear"/>
+        </w:rPr>
+      </w:pPr>
+      <w:r>
+        <w:rPr>
+          <w:rStyle w:val="normaltextrun"/>
+          <w:color w:val="000000"/>
+          <w:shd w:fill="FFFFFF" w:val="clear"/>
+        </w:rPr>
+        <w:t>)</w:t>
+      </w:r>
+    </w:p>
+    <w:p>
+      <w:pPr>
+        <w:pStyle w:val="ListParagraph"/>
+        <w:spacing w:lineRule="auto" w:line="360"/>
+        <w:ind w:hanging="0" w:left="0"/>
+        <w:rPr>
+          <w:color w:val="000000"/>
+          <w:shd w:fill="FFFFFF" w:val="clear"/>
+        </w:rPr>
+      </w:pPr>
+      <w:r>
+        <w:rPr>
+          <w:color w:val="000000"/>
+          <w:shd w:fill="FFFFFF" w:val="clear"/>
+        </w:rPr>
+      </w:r>
+    </w:p>
+    <w:p>
+      <w:pPr>
+        <w:pStyle w:val="ListParagraph"/>
+        <w:spacing w:lineRule="auto" w:line="360"/>
+        <w:ind w:hanging="0" w:left="0"/>
+        <w:rPr>
+          <w:color w:val="000000"/>
+          <w:shd w:fill="FFFFFF" w:val="clear"/>
+        </w:rPr>
+      </w:pPr>
+      <w:r>
+        <w:rPr>
+          <w:color w:val="000000"/>
+          <w:shd w:fill="FFFFFF" w:val="clear"/>
+        </w:rPr>
+        <w:t>Agora serão apresentados alguns exemplos de uso do pacote.</w:t>
+      </w:r>
+    </w:p>
+    <w:p>
+      <w:pPr>
+        <w:pStyle w:val="ListParagraph"/>
+        <w:spacing w:lineRule="auto" w:line="360"/>
+        <w:ind w:firstLine="709" w:left="0"/>
+        <w:rPr>
+          <w:rStyle w:val="normaltextrun"/>
           <w:color w:val="000000"/>
           <w:shd w:fill="FFFFFF" w:val="clear"/>
         </w:rPr>
@@ -1122,63 +2540,7 @@
           <w:b w:val="false"/>
           <w:bCs w:val="false"/>
         </w:rPr>
-        <w:t xml:space="preserve">Marwick, B., Boettiger, </w:t>
-      </w:r>
-      <w:r>
-        <w:rPr>
-          <w:b w:val="false"/>
-          <w:bCs w:val="false"/>
-        </w:rPr>
-        <w:t>C.</w:t>
-      </w:r>
-      <w:r>
-        <w:rPr>
-          <w:b w:val="false"/>
-          <w:bCs w:val="false"/>
-        </w:rPr>
-        <w:t xml:space="preserve">, and Mullen, </w:t>
-      </w:r>
-      <w:r>
-        <w:rPr>
-          <w:b w:val="false"/>
-          <w:bCs w:val="false"/>
-        </w:rPr>
-        <w:t>L</w:t>
-      </w:r>
-      <w:r>
-        <w:rPr>
-          <w:b w:val="false"/>
-          <w:bCs w:val="false"/>
-        </w:rPr>
-        <w:t xml:space="preserve">. </w:t>
-      </w:r>
-      <w:r>
-        <w:rPr>
-          <w:b w:val="false"/>
-          <w:bCs w:val="false"/>
-        </w:rPr>
-        <w:t>(</w:t>
-      </w:r>
-      <w:r>
-        <w:rPr>
-          <w:b w:val="false"/>
-          <w:bCs w:val="false"/>
-        </w:rPr>
-        <w:t>2018a</w:t>
-      </w:r>
-      <w:r>
-        <w:rPr>
-          <w:b w:val="false"/>
-          <w:bCs w:val="false"/>
-        </w:rPr>
-        <w:t>)</w:t>
-      </w:r>
-      <w:r>
-        <w:rPr>
-          <w:b w:val="false"/>
-          <w:bCs w:val="false"/>
-        </w:rPr>
-        <w:t xml:space="preserve">. “Packaging Data Analytical Work Reproducibly Using r (and Friends).” </w:t>
+        <w:t xml:space="preserve">Marwick, B., Boettiger, C., and Mullen, L. (2018a). “Packaging Data Analytical Work Reproducibly Using r (and Friends).” </w:t>
       </w:r>
       <w:r>
         <w:rPr>
@@ -1195,7 +2557,7 @@
         </w:rPr>
         <w:t xml:space="preserve"> 72 (1): 80–88. </w:t>
       </w:r>
-      <w:hyperlink r:id="rId2">
+      <w:hyperlink r:id="rId5">
         <w:r>
           <w:rPr>
             <w:rStyle w:val="Hyperlink"/>
@@ -1224,35 +2586,7 @@
           <w:b w:val="false"/>
           <w:bCs w:val="false"/>
         </w:rPr>
-        <w:t>.</w:t>
-      </w:r>
-      <w:r>
-        <w:rPr>
-          <w:b w:val="false"/>
-          <w:bCs w:val="false"/>
-        </w:rPr>
-        <w:t>(</w:t>
-      </w:r>
-      <w:r>
-        <w:rPr>
-          <w:b w:val="false"/>
-          <w:bCs w:val="false"/>
-        </w:rPr>
-        <w:t>2018b</w:t>
-      </w:r>
-      <w:r>
-        <w:rPr>
-          <w:b w:val="false"/>
-          <w:bCs w:val="false"/>
-        </w:rPr>
-        <w:t>)</w:t>
-      </w:r>
-      <w:r>
-        <w:rPr>
-          <w:b w:val="false"/>
-          <w:bCs w:val="false"/>
-        </w:rPr>
-        <w:t xml:space="preserve">. “Packaging Data Analytical Work Reproducibly Using r (and Friends).” </w:t>
+        <w:t xml:space="preserve">.(2018b). “Packaging Data Analytical Work Reproducibly Using r (and Friends).” </w:t>
       </w:r>
       <w:r>
         <w:rPr>
@@ -1269,7 +2603,7 @@
         </w:rPr>
         <w:t xml:space="preserve"> 6 (March): e3192v2. </w:t>
       </w:r>
-      <w:hyperlink r:id="rId3">
+      <w:hyperlink r:id="rId6">
         <w:r>
           <w:rPr>
             <w:rStyle w:val="Hyperlink"/>
@@ -1298,63 +2632,7 @@
           <w:b w:val="false"/>
           <w:bCs w:val="false"/>
         </w:rPr>
-        <w:t xml:space="preserve">Silge, J., Nash, </w:t>
-      </w:r>
-      <w:r>
-        <w:rPr>
-          <w:b w:val="false"/>
-          <w:bCs w:val="false"/>
-        </w:rPr>
-        <w:t>J. C.</w:t>
-      </w:r>
-      <w:r>
-        <w:rPr>
-          <w:b w:val="false"/>
-          <w:bCs w:val="false"/>
-        </w:rPr>
-        <w:t xml:space="preserve"> and Graves, </w:t>
-      </w:r>
-      <w:r>
-        <w:rPr>
-          <w:b w:val="false"/>
-          <w:bCs w:val="false"/>
-        </w:rPr>
-        <w:t>S</w:t>
-      </w:r>
-      <w:r>
-        <w:rPr>
-          <w:b w:val="false"/>
-          <w:bCs w:val="false"/>
-        </w:rPr>
-        <w:t xml:space="preserve">. </w:t>
-      </w:r>
-      <w:r>
-        <w:rPr>
-          <w:b w:val="false"/>
-          <w:bCs w:val="false"/>
-        </w:rPr>
-        <w:t>(</w:t>
-      </w:r>
-      <w:r>
-        <w:rPr>
-          <w:b w:val="false"/>
-          <w:bCs w:val="false"/>
-        </w:rPr>
-        <w:t>2018</w:t>
-      </w:r>
-      <w:r>
-        <w:rPr>
-          <w:b w:val="false"/>
-          <w:bCs w:val="false"/>
-        </w:rPr>
-        <w:t>)</w:t>
-      </w:r>
-      <w:r>
-        <w:rPr>
-          <w:b w:val="false"/>
-          <w:bCs w:val="false"/>
-        </w:rPr>
-        <w:t xml:space="preserve">. “Navigating the R Package Universe.” </w:t>
+        <w:t xml:space="preserve">Silge, J., Nash, J. C. and Graves, S. (2018). “Navigating the R Package Universe.” </w:t>
       </w:r>
       <w:r>
         <w:rPr>
@@ -1371,7 +2649,7 @@
         </w:rPr>
         <w:t xml:space="preserve"> 10 (2): 558–63. </w:t>
       </w:r>
-      <w:hyperlink r:id="rId4">
+      <w:hyperlink r:id="rId7">
         <w:r>
           <w:rPr>
             <w:rStyle w:val="Hyperlink"/>
@@ -1638,12 +2916,15 @@
       </w:r>
     </w:p>
     <w:sectPr>
-      <w:headerReference w:type="even" r:id="rId5"/>
-      <w:headerReference w:type="default" r:id="rId6"/>
-      <w:headerReference w:type="first" r:id="rId7"/>
-      <w:footerReference w:type="even" r:id="rId8"/>
-      <w:footerReference w:type="default" r:id="rId9"/>
-      <w:footerReference w:type="first" r:id="rId10"/>
+      <w:headerReference w:type="even" r:id="rId8"/>
+      <w:headerReference w:type="default" r:id="rId9"/>
+      <w:headerReference w:type="first" r:id="rId10"/>
+      <w:footerReference w:type="even" r:id="rId11"/>
+      <w:footerReference w:type="default" r:id="rId12"/>
+      <w:footerReference w:type="first" r:id="rId13"/>
+      <w:footnotePr>
+        <w:numFmt w:val="decimal"/>
+      </w:footnotePr>
       <w:type w:val="nextPage"/>
       <w:pgSz w:w="11906" w:h="16838"/>
       <w:pgMar w:left="1418" w:right="1418" w:gutter="0" w:header="709" w:top="1418" w:footer="709" w:bottom="1418"/>
@@ -1654,30 +2935,6 @@
     </w:sectPr>
   </w:body>
 </w:document>
-</file>
-
-<file path=word/comments.xml><?xml version="1.0" encoding="utf-8"?>
-<w:comments xmlns:o="urn:schemas-microsoft-com:office:office" xmlns:r="http://schemas.openxmlformats.org/officeDocument/2006/relationships" xmlns:v="urn:schemas-microsoft-com:vml" xmlns:w="http://schemas.openxmlformats.org/wordprocessingml/2006/main" xmlns:w10="urn:schemas-microsoft-com:office:word" xmlns:wp="http://schemas.openxmlformats.org/drawingml/2006/wordprocessingDrawing" xmlns:wps="http://schemas.microsoft.com/office/word/2010/wordprocessingShape" xmlns:wpg="http://schemas.microsoft.com/office/word/2010/wordprocessingGroup" xmlns:mc="http://schemas.openxmlformats.org/markup-compatibility/2006" xmlns:wp14="http://schemas.microsoft.com/office/word/2010/wordprocessingDrawing" xmlns:w14="http://schemas.microsoft.com/office/word/2010/wordml" xmlns:w15="http://schemas.microsoft.com/office/word/2012/wordml" mc:Ignorable="w14 wp14 w15">
-  <w:comment w:id="0" w:author="Autor desconhecido" w:date="2025-12-30T07:48:50Z" w:initials="">
-    <w:p>
-      <w:pPr>
-        <w:overflowPunct w:val="false"/>
-        <w:spacing w:lineRule="auto" w:line="240"/>
-        <w:jc w:val="left"/>
-        <w:rPr/>
-      </w:pPr>
-      <w:r>
-        <w:rPr>
-          <w:rFonts w:ascii="Liberation Serif" w:hAnsi="Liberation Serif" w:eastAsia="DejaVu Sans" w:cs="Noto Sans Arabic UI"/>
-          <w:sz w:val="24"/>
-          <w:szCs w:val="24"/>
-          <w:lang w:val="en-US" w:eastAsia="en-US" w:bidi="en-US"/>
-        </w:rPr>
-        <w:t>Adicionar notas de rodapé com os links</w:t>
-      </w:r>
-    </w:p>
-  </w:comment>
-</w:comments>
 </file>
 
 <file path=word/footer1.xml><?xml version="1.0" encoding="utf-8"?>
@@ -1731,7 +2988,7 @@
         <w:sz w:val="18"/>
         <w:szCs w:val="18"/>
       </w:rPr>
-      <w:t>2</w:t>
+      <w:t>9</w:t>
     </w:r>
     <w:r>
       <w:rPr>
@@ -1790,7 +3047,7 @@
         <w:sz w:val="18"/>
         <w:szCs w:val="18"/>
       </w:rPr>
-      <w:t>2</w:t>
+      <w:t>9</w:t>
     </w:r>
     <w:r>
       <w:rPr>
@@ -1810,6 +3067,196 @@
     </w:r>
   </w:p>
 </w:ftr>
+</file>
+
+<file path=word/footnotes.xml><?xml version="1.0" encoding="utf-8"?>
+<w:footnotes xmlns:o="urn:schemas-microsoft-com:office:office" xmlns:r="http://schemas.openxmlformats.org/officeDocument/2006/relationships" xmlns:v="urn:schemas-microsoft-com:vml" xmlns:w="http://schemas.openxmlformats.org/wordprocessingml/2006/main" xmlns:w10="urn:schemas-microsoft-com:office:word" xmlns:wp="http://schemas.openxmlformats.org/drawingml/2006/wordprocessingDrawing" xmlns:wps="http://schemas.microsoft.com/office/word/2010/wordprocessingShape" xmlns:wpg="http://schemas.microsoft.com/office/word/2010/wordprocessingGroup" xmlns:mc="http://schemas.openxmlformats.org/markup-compatibility/2006" xmlns:wp14="http://schemas.microsoft.com/office/word/2010/wordprocessingDrawing" xmlns:w14="http://schemas.microsoft.com/office/word/2010/wordml" xmlns:w15="http://schemas.microsoft.com/office/word/2012/wordml" mc:Ignorable="w14 wp14 w15">
+  <w:footnote w:id="0" w:type="separator">
+    <w:p>
+      <w:pPr>
+        <w:rPr>
+          <w:sz w:val="12"/>
+        </w:rPr>
+      </w:pPr>
+      <w:r>
+        <w:separator/>
+      </w:r>
+    </w:p>
+  </w:footnote>
+  <w:footnote w:id="1" w:type="continuationSeparator">
+    <w:p>
+      <w:pPr>
+        <w:rPr>
+          <w:sz w:val="12"/>
+        </w:rPr>
+      </w:pPr>
+      <w:r>
+        <w:continuationSeparator/>
+      </w:r>
+    </w:p>
+  </w:footnote>
+  <w:footnote w:id="2">
+    <w:p>
+      <w:pPr>
+        <w:pStyle w:val="FootnoteText"/>
+        <w:rPr/>
+      </w:pPr>
+      <w:r>
+        <w:rPr>
+          <w:rStyle w:val="Caracteresdenotaderodap"/>
+        </w:rPr>
+        <w:footnoteRef/>
+      </w:r>
+      <w:hyperlink r:id="rId1">
+        <w:r>
+          <w:rPr>
+            <w:rStyle w:val="Hyperlink"/>
+          </w:rPr>
+          <w:tab/>
+          <w:t>https://cran.r-project.org/web/packages/BacenAPI/index.html</w:t>
+        </w:r>
+      </w:hyperlink>
+    </w:p>
+  </w:footnote>
+  <w:footnote w:id="3">
+    <w:p>
+      <w:pPr>
+        <w:pStyle w:val="FootnoteText"/>
+        <w:rPr/>
+      </w:pPr>
+      <w:r>
+        <w:rPr>
+          <w:rStyle w:val="Caracteresdenotaderodap"/>
+        </w:rPr>
+        <w:footnoteRef/>
+      </w:r>
+      <w:hyperlink r:id="rId2">
+        <w:r>
+          <w:rPr>
+            <w:rStyle w:val="Hyperlink"/>
+          </w:rPr>
+          <w:tab/>
+          <w:t>https://cran.r-project.org/web/packages/BETS/index.html</w:t>
+        </w:r>
+      </w:hyperlink>
+    </w:p>
+  </w:footnote>
+  <w:footnote w:id="4">
+    <w:p>
+      <w:pPr>
+        <w:pStyle w:val="FootnoteText"/>
+        <w:rPr/>
+      </w:pPr>
+      <w:r>
+        <w:rPr>
+          <w:rStyle w:val="Caracteresdenotaderodap"/>
+        </w:rPr>
+        <w:footnoteRef/>
+      </w:r>
+      <w:hyperlink r:id="rId3">
+        <w:r>
+          <w:rPr>
+            <w:rStyle w:val="Hyperlink"/>
+          </w:rPr>
+          <w:tab/>
+          <w:t>https://github.com/users/rtheodoro/projects/1</w:t>
+        </w:r>
+      </w:hyperlink>
+    </w:p>
+  </w:footnote>
+  <w:footnote w:id="5">
+    <w:p>
+      <w:pPr>
+        <w:pStyle w:val="FootnoteText"/>
+        <w:rPr/>
+      </w:pPr>
+      <w:r>
+        <w:rPr>
+          <w:rStyle w:val="Caracteresdenotaderodap"/>
+        </w:rPr>
+        <w:footnoteRef/>
+      </w:r>
+      <w:hyperlink r:id="rId4">
+        <w:r>
+          <w:rPr>
+            <w:rStyle w:val="Hyperlink"/>
+          </w:rPr>
+          <w:tab/>
+          <w:t>https://github.com/rtheodoro/bacenR</w:t>
+        </w:r>
+      </w:hyperlink>
+    </w:p>
+  </w:footnote>
+  <w:footnote w:id="6">
+    <w:p>
+      <w:pPr>
+        <w:pStyle w:val="FootnoteText"/>
+        <w:rPr/>
+      </w:pPr>
+      <w:r>
+        <w:rPr>
+          <w:rStyle w:val="Caracteresdenotaderodap"/>
+        </w:rPr>
+        <w:footnoteRef/>
+      </w:r>
+      <w:hyperlink r:id="rId5">
+        <w:r>
+          <w:rPr>
+            <w:rStyle w:val="Hyperlink"/>
+          </w:rPr>
+          <w:tab/>
+          <w:t>https://github.com/rtheodoro/bacenR/issues</w:t>
+        </w:r>
+      </w:hyperlink>
+    </w:p>
+  </w:footnote>
+  <w:footnote w:id="7">
+    <w:p>
+      <w:pPr>
+        <w:pStyle w:val="FootnoteText"/>
+        <w:rPr/>
+      </w:pPr>
+      <w:r>
+        <w:rPr>
+          <w:rStyle w:val="Caracteresdenotaderodap"/>
+        </w:rPr>
+        <w:footnoteRef/>
+      </w:r>
+      <w:hyperlink r:id="rId6">
+        <w:r>
+          <w:rPr>
+            <w:rStyle w:val="Hyperlink"/>
+          </w:rPr>
+          <w:tab/>
+          <w:t>https://github.com/users/rtheodoro/projects/1/views/3</w:t>
+        </w:r>
+      </w:hyperlink>
+    </w:p>
+  </w:footnote>
+  <w:footnote w:id="8">
+    <w:p>
+      <w:pPr>
+        <w:pStyle w:val="FootnoteText"/>
+        <w:rPr/>
+      </w:pPr>
+      <w:r>
+        <w:rPr>
+          <w:rStyle w:val="Caracteresdenotaderodap"/>
+        </w:rPr>
+        <w:footnoteRef/>
+      </w:r>
+      <w:hyperlink r:id="rId7">
+        <w:r>
+          <w:rPr>
+            <w:rStyle w:val="Hyperlink"/>
+          </w:rPr>
+          <w:tab/>
+          <w:t>https://github.com/rtheodoro/bacenR?tab=GPL-3.0-1-ov-file</w:t>
+        </w:r>
+      </w:hyperlink>
+    </w:p>
+  </w:footnote>
+</w:footnotes>
 </file>
 
 <file path=word/header1.xml><?xml version="1.0" encoding="utf-8"?>
@@ -1839,7 +3286,7 @@
     </w:pPr>
     <w:r>
       <w:drawing>
-        <wp:anchor behindDoc="0" distT="0" distB="0" distL="114300" distR="114300" simplePos="0" locked="0" layoutInCell="0" allowOverlap="1" relativeHeight="10">
+        <wp:anchor behindDoc="0" distT="0" distB="0" distL="114300" distR="114300" simplePos="0" locked="0" layoutInCell="0" allowOverlap="1" relativeHeight="20">
           <wp:simplePos x="0" y="0"/>
           <wp:positionH relativeFrom="margin">
             <wp:posOffset>5029200</wp:posOffset>
@@ -1851,14 +3298,14 @@
           <wp:effectExtent l="0" t="0" r="0" b="0"/>
           <wp:wrapThrough wrapText="bothSides">
             <wp:wrapPolygon edited="0">
-              <wp:start x="-6" y="0"/>
-              <wp:lineTo x="-6" y="20677"/>
-              <wp:lineTo x="21026" y="20677"/>
-              <wp:lineTo x="21026" y="0"/>
-              <wp:lineTo x="-6" y="0"/>
+              <wp:start x="-8" y="0"/>
+              <wp:lineTo x="-8" y="20675"/>
+              <wp:lineTo x="21023" y="20675"/>
+              <wp:lineTo x="21023" y="0"/>
+              <wp:lineTo x="-8" y="0"/>
             </wp:wrapPolygon>
           </wp:wrapThrough>
-          <wp:docPr id="1" name="Imagem 1803984902" descr="Desenho com traços pretos em fundo branco&#10;&#10;Descrição gerada automaticamente com confiança média"/>
+          <wp:docPr id="4" name="Imagem 1803984902" descr="Desenho com traços pretos em fundo branco&#10;&#10;Descrição gerada automaticamente com confiança média"/>
           <wp:cNvGraphicFramePr>
             <a:graphicFrameLocks xmlns:a="http://schemas.openxmlformats.org/drawingml/2006/main" noChangeAspect="1"/>
           </wp:cNvGraphicFramePr>
@@ -1866,7 +3313,7 @@
             <a:graphicData uri="http://schemas.openxmlformats.org/drawingml/2006/picture">
               <pic:pic xmlns:pic="http://schemas.openxmlformats.org/drawingml/2006/picture">
                 <pic:nvPicPr>
-                  <pic:cNvPr id="1" name="Imagem 1803984902" descr="Desenho com traços pretos em fundo branco&#10;&#10;Descrição gerada automaticamente com confiança média"/>
+                  <pic:cNvPr id="4" name="Imagem 1803984902" descr="Desenho com traços pretos em fundo branco&#10;&#10;Descrição gerada automaticamente com confiança média"/>
                   <pic:cNvPicPr>
                     <a:picLocks noChangeAspect="1" noChangeArrowheads="1"/>
                   </pic:cNvPicPr>
@@ -1914,7 +3361,7 @@
       <mc:AlternateContent>
         <mc:Choice Requires="wps">
           <w:drawing>
-            <wp:anchor behindDoc="1" distT="1905" distB="1905" distL="1905" distR="1905" simplePos="0" locked="0" layoutInCell="0" allowOverlap="1" relativeHeight="6" wp14:anchorId="34FDC6CC">
+            <wp:anchor behindDoc="1" distT="1905" distB="1905" distL="1905" distR="1905" simplePos="0" locked="0" layoutInCell="0" allowOverlap="1" relativeHeight="11" wp14:anchorId="34FDC6CC">
               <wp:simplePos x="0" y="0"/>
               <wp:positionH relativeFrom="margin">
                 <wp:align>right</wp:align>
@@ -1925,7 +3372,7 @@
               <wp:extent cx="5753100" cy="0"/>
               <wp:effectExtent l="1905" t="1905" r="1905" b="1905"/>
               <wp:wrapNone/>
-              <wp:docPr id="2" name="Conector reto 844941520"/>
+              <wp:docPr id="5" name="Conector reto 844941520"/>
               <a:graphic xmlns:a="http://schemas.openxmlformats.org/drawingml/2006/main">
                 <a:graphicData uri="http://schemas.microsoft.com/office/word/2010/wordprocessingShape">
                   <wps:wsp>
@@ -2005,7 +3452,7 @@
     </w:pPr>
     <w:r>
       <w:drawing>
-        <wp:anchor behindDoc="0" distT="0" distB="0" distL="114300" distR="114300" simplePos="0" locked="0" layoutInCell="0" allowOverlap="1" relativeHeight="10">
+        <wp:anchor behindDoc="0" distT="0" distB="0" distL="114300" distR="114300" simplePos="0" locked="0" layoutInCell="0" allowOverlap="1" relativeHeight="20">
           <wp:simplePos x="0" y="0"/>
           <wp:positionH relativeFrom="margin">
             <wp:posOffset>5029200</wp:posOffset>
@@ -2017,14 +3464,14 @@
           <wp:effectExtent l="0" t="0" r="0" b="0"/>
           <wp:wrapThrough wrapText="bothSides">
             <wp:wrapPolygon edited="0">
-              <wp:start x="-6" y="0"/>
-              <wp:lineTo x="-6" y="20677"/>
-              <wp:lineTo x="21026" y="20677"/>
-              <wp:lineTo x="21026" y="0"/>
-              <wp:lineTo x="-6" y="0"/>
+              <wp:start x="-8" y="0"/>
+              <wp:lineTo x="-8" y="20675"/>
+              <wp:lineTo x="21023" y="20675"/>
+              <wp:lineTo x="21023" y="0"/>
+              <wp:lineTo x="-8" y="0"/>
             </wp:wrapPolygon>
           </wp:wrapThrough>
-          <wp:docPr id="3" name="Imagem 1803984902" descr="Desenho com traços pretos em fundo branco&#10;&#10;Descrição gerada automaticamente com confiança média"/>
+          <wp:docPr id="6" name="Imagem 1803984902" descr="Desenho com traços pretos em fundo branco&#10;&#10;Descrição gerada automaticamente com confiança média"/>
           <wp:cNvGraphicFramePr>
             <a:graphicFrameLocks xmlns:a="http://schemas.openxmlformats.org/drawingml/2006/main" noChangeAspect="1"/>
           </wp:cNvGraphicFramePr>
@@ -2032,7 +3479,7 @@
             <a:graphicData uri="http://schemas.openxmlformats.org/drawingml/2006/picture">
               <pic:pic xmlns:pic="http://schemas.openxmlformats.org/drawingml/2006/picture">
                 <pic:nvPicPr>
-                  <pic:cNvPr id="3" name="Imagem 1803984902" descr="Desenho com traços pretos em fundo branco&#10;&#10;Descrição gerada automaticamente com confiança média"/>
+                  <pic:cNvPr id="6" name="Imagem 1803984902" descr="Desenho com traços pretos em fundo branco&#10;&#10;Descrição gerada automaticamente com confiança média"/>
                   <pic:cNvPicPr>
                     <a:picLocks noChangeAspect="1" noChangeArrowheads="1"/>
                   </pic:cNvPicPr>
@@ -2080,7 +3527,7 @@
       <mc:AlternateContent>
         <mc:Choice Requires="wps">
           <w:drawing>
-            <wp:anchor behindDoc="1" distT="1905" distB="1905" distL="1905" distR="1905" simplePos="0" locked="0" layoutInCell="0" allowOverlap="1" relativeHeight="6" wp14:anchorId="34FDC6CC">
+            <wp:anchor behindDoc="1" distT="1905" distB="1905" distL="1905" distR="1905" simplePos="0" locked="0" layoutInCell="0" allowOverlap="1" relativeHeight="11" wp14:anchorId="34FDC6CC">
               <wp:simplePos x="0" y="0"/>
               <wp:positionH relativeFrom="margin">
                 <wp:align>right</wp:align>
@@ -2091,7 +3538,7 @@
               <wp:extent cx="5753100" cy="0"/>
               <wp:effectExtent l="1905" t="1905" r="1905" b="1905"/>
               <wp:wrapNone/>
-              <wp:docPr id="4" name="Conector reto 844941520"/>
+              <wp:docPr id="7" name="Conector reto 844941520"/>
               <a:graphic xmlns:a="http://schemas.openxmlformats.org/drawingml/2006/main">
                 <a:graphicData uri="http://schemas.microsoft.com/office/word/2010/wordprocessingShape">
                   <wps:wsp>
@@ -2156,6 +3603,274 @@
     </w:r>
   </w:p>
 </w:hdr>
+</file>
+
+<file path=word/numbering.xml><?xml version="1.0" encoding="utf-8"?>
+<w:numbering xmlns:w="http://schemas.openxmlformats.org/wordprocessingml/2006/main" xmlns:o="urn:schemas-microsoft-com:office:office" xmlns:r="http://schemas.openxmlformats.org/officeDocument/2006/relationships" xmlns:v="urn:schemas-microsoft-com:vml" xmlns:mc="http://schemas.openxmlformats.org/markup-compatibility/2006" xmlns:w14="http://schemas.microsoft.com/office/word/2010/wordml" mc:Ignorable="w14">
+  <w:abstractNum w:abstractNumId="1">
+    <w:lvl w:ilvl="0">
+      <w:start w:val="1"/>
+      <w:numFmt w:val="bullet"/>
+      <w:lvlText w:val=""/>
+      <w:lvlJc w:val="left"/>
+      <w:pPr>
+        <w:tabs>
+          <w:tab w:val="num" w:pos="720"/>
+        </w:tabs>
+        <w:ind w:left="720" w:hanging="360"/>
+      </w:pPr>
+      <w:rPr>
+        <w:rFonts w:ascii="Symbol" w:hAnsi="Symbol" w:cs="Symbol" w:hint="default"/>
+      </w:rPr>
+    </w:lvl>
+    <w:lvl w:ilvl="1">
+      <w:start w:val="1"/>
+      <w:numFmt w:val="bullet"/>
+      <w:lvlText w:val="◦"/>
+      <w:lvlJc w:val="left"/>
+      <w:pPr>
+        <w:tabs>
+          <w:tab w:val="num" w:pos="1080"/>
+        </w:tabs>
+        <w:ind w:left="1080" w:hanging="360"/>
+      </w:pPr>
+      <w:rPr>
+        <w:rFonts w:ascii="OpenSymbol" w:hAnsi="OpenSymbol" w:cs="OpenSymbol" w:hint="default"/>
+      </w:rPr>
+    </w:lvl>
+    <w:lvl w:ilvl="2">
+      <w:start w:val="1"/>
+      <w:numFmt w:val="bullet"/>
+      <w:lvlText w:val="▪"/>
+      <w:lvlJc w:val="left"/>
+      <w:pPr>
+        <w:tabs>
+          <w:tab w:val="num" w:pos="1440"/>
+        </w:tabs>
+        <w:ind w:left="1440" w:hanging="360"/>
+      </w:pPr>
+      <w:rPr>
+        <w:rFonts w:ascii="OpenSymbol" w:hAnsi="OpenSymbol" w:cs="OpenSymbol" w:hint="default"/>
+      </w:rPr>
+    </w:lvl>
+    <w:lvl w:ilvl="3">
+      <w:start w:val="1"/>
+      <w:numFmt w:val="bullet"/>
+      <w:lvlText w:val=""/>
+      <w:lvlJc w:val="left"/>
+      <w:pPr>
+        <w:tabs>
+          <w:tab w:val="num" w:pos="1800"/>
+        </w:tabs>
+        <w:ind w:left="1800" w:hanging="360"/>
+      </w:pPr>
+      <w:rPr>
+        <w:rFonts w:ascii="Symbol" w:hAnsi="Symbol" w:cs="Symbol" w:hint="default"/>
+      </w:rPr>
+    </w:lvl>
+    <w:lvl w:ilvl="4">
+      <w:start w:val="1"/>
+      <w:numFmt w:val="bullet"/>
+      <w:lvlText w:val="◦"/>
+      <w:lvlJc w:val="left"/>
+      <w:pPr>
+        <w:tabs>
+          <w:tab w:val="num" w:pos="2160"/>
+        </w:tabs>
+        <w:ind w:left="2160" w:hanging="360"/>
+      </w:pPr>
+      <w:rPr>
+        <w:rFonts w:ascii="OpenSymbol" w:hAnsi="OpenSymbol" w:cs="OpenSymbol" w:hint="default"/>
+      </w:rPr>
+    </w:lvl>
+    <w:lvl w:ilvl="5">
+      <w:start w:val="1"/>
+      <w:numFmt w:val="bullet"/>
+      <w:lvlText w:val="▪"/>
+      <w:lvlJc w:val="left"/>
+      <w:pPr>
+        <w:tabs>
+          <w:tab w:val="num" w:pos="2520"/>
+        </w:tabs>
+        <w:ind w:left="2520" w:hanging="360"/>
+      </w:pPr>
+      <w:rPr>
+        <w:rFonts w:ascii="OpenSymbol" w:hAnsi="OpenSymbol" w:cs="OpenSymbol" w:hint="default"/>
+      </w:rPr>
+    </w:lvl>
+    <w:lvl w:ilvl="6">
+      <w:start w:val="1"/>
+      <w:numFmt w:val="bullet"/>
+      <w:lvlText w:val=""/>
+      <w:lvlJc w:val="left"/>
+      <w:pPr>
+        <w:tabs>
+          <w:tab w:val="num" w:pos="2880"/>
+        </w:tabs>
+        <w:ind w:left="2880" w:hanging="360"/>
+      </w:pPr>
+      <w:rPr>
+        <w:rFonts w:ascii="Symbol" w:hAnsi="Symbol" w:cs="Symbol" w:hint="default"/>
+      </w:rPr>
+    </w:lvl>
+    <w:lvl w:ilvl="7">
+      <w:start w:val="1"/>
+      <w:numFmt w:val="bullet"/>
+      <w:lvlText w:val="◦"/>
+      <w:lvlJc w:val="left"/>
+      <w:pPr>
+        <w:tabs>
+          <w:tab w:val="num" w:pos="3240"/>
+        </w:tabs>
+        <w:ind w:left="3240" w:hanging="360"/>
+      </w:pPr>
+      <w:rPr>
+        <w:rFonts w:ascii="OpenSymbol" w:hAnsi="OpenSymbol" w:cs="OpenSymbol" w:hint="default"/>
+      </w:rPr>
+    </w:lvl>
+    <w:lvl w:ilvl="8">
+      <w:start w:val="1"/>
+      <w:numFmt w:val="bullet"/>
+      <w:lvlText w:val="▪"/>
+      <w:lvlJc w:val="left"/>
+      <w:pPr>
+        <w:tabs>
+          <w:tab w:val="num" w:pos="3600"/>
+        </w:tabs>
+        <w:ind w:left="3600" w:hanging="360"/>
+      </w:pPr>
+      <w:rPr>
+        <w:rFonts w:ascii="OpenSymbol" w:hAnsi="OpenSymbol" w:cs="OpenSymbol" w:hint="default"/>
+      </w:rPr>
+    </w:lvl>
+  </w:abstractNum>
+  <w:abstractNum w:abstractNumId="2">
+    <w:lvl w:ilvl="0">
+      <w:start w:val="1"/>
+      <w:pStyle w:val="Heading1"/>
+      <w:numFmt w:val="none"/>
+      <w:suff w:val="nothing"/>
+      <w:lvlText w:val=""/>
+      <w:lvlJc w:val="left"/>
+      <w:pPr>
+        <w:tabs>
+          <w:tab w:val="num" w:pos="0"/>
+        </w:tabs>
+        <w:ind w:left="0" w:hanging="0"/>
+      </w:pPr>
+    </w:lvl>
+    <w:lvl w:ilvl="1">
+      <w:start w:val="1"/>
+      <w:numFmt w:val="none"/>
+      <w:suff w:val="nothing"/>
+      <w:lvlText w:val=""/>
+      <w:lvlJc w:val="left"/>
+      <w:pPr>
+        <w:tabs>
+          <w:tab w:val="num" w:pos="0"/>
+        </w:tabs>
+        <w:ind w:left="0" w:hanging="0"/>
+      </w:pPr>
+    </w:lvl>
+    <w:lvl w:ilvl="2">
+      <w:start w:val="1"/>
+      <w:numFmt w:val="none"/>
+      <w:suff w:val="nothing"/>
+      <w:lvlText w:val=""/>
+      <w:lvlJc w:val="left"/>
+      <w:pPr>
+        <w:tabs>
+          <w:tab w:val="num" w:pos="0"/>
+        </w:tabs>
+        <w:ind w:left="0" w:hanging="0"/>
+      </w:pPr>
+    </w:lvl>
+    <w:lvl w:ilvl="3">
+      <w:start w:val="1"/>
+      <w:numFmt w:val="none"/>
+      <w:suff w:val="nothing"/>
+      <w:lvlText w:val=""/>
+      <w:lvlJc w:val="left"/>
+      <w:pPr>
+        <w:tabs>
+          <w:tab w:val="num" w:pos="0"/>
+        </w:tabs>
+        <w:ind w:left="0" w:hanging="0"/>
+      </w:pPr>
+    </w:lvl>
+    <w:lvl w:ilvl="4">
+      <w:start w:val="1"/>
+      <w:numFmt w:val="none"/>
+      <w:suff w:val="nothing"/>
+      <w:lvlText w:val=""/>
+      <w:lvlJc w:val="left"/>
+      <w:pPr>
+        <w:tabs>
+          <w:tab w:val="num" w:pos="0"/>
+        </w:tabs>
+        <w:ind w:left="0" w:hanging="0"/>
+      </w:pPr>
+    </w:lvl>
+    <w:lvl w:ilvl="5">
+      <w:start w:val="1"/>
+      <w:numFmt w:val="none"/>
+      <w:suff w:val="nothing"/>
+      <w:lvlText w:val=""/>
+      <w:lvlJc w:val="left"/>
+      <w:pPr>
+        <w:tabs>
+          <w:tab w:val="num" w:pos="0"/>
+        </w:tabs>
+        <w:ind w:left="0" w:hanging="0"/>
+      </w:pPr>
+    </w:lvl>
+    <w:lvl w:ilvl="6">
+      <w:start w:val="1"/>
+      <w:numFmt w:val="none"/>
+      <w:suff w:val="nothing"/>
+      <w:lvlText w:val=""/>
+      <w:lvlJc w:val="left"/>
+      <w:pPr>
+        <w:tabs>
+          <w:tab w:val="num" w:pos="0"/>
+        </w:tabs>
+        <w:ind w:left="0" w:hanging="0"/>
+      </w:pPr>
+    </w:lvl>
+    <w:lvl w:ilvl="7">
+      <w:start w:val="1"/>
+      <w:numFmt w:val="none"/>
+      <w:suff w:val="nothing"/>
+      <w:lvlText w:val=""/>
+      <w:lvlJc w:val="left"/>
+      <w:pPr>
+        <w:tabs>
+          <w:tab w:val="num" w:pos="0"/>
+        </w:tabs>
+        <w:ind w:left="0" w:hanging="0"/>
+      </w:pPr>
+    </w:lvl>
+    <w:lvl w:ilvl="8">
+      <w:start w:val="1"/>
+      <w:numFmt w:val="none"/>
+      <w:suff w:val="nothing"/>
+      <w:lvlText w:val=""/>
+      <w:lvlJc w:val="left"/>
+      <w:pPr>
+        <w:tabs>
+          <w:tab w:val="num" w:pos="0"/>
+        </w:tabs>
+        <w:ind w:left="0" w:hanging="0"/>
+      </w:pPr>
+    </w:lvl>
+  </w:abstractNum>
+  <w:num w:numId="1">
+    <w:abstractNumId w:val="1"/>
+  </w:num>
+  <w:num w:numId="2">
+    <w:abstractNumId w:val="2"/>
+  </w:num>
+</w:numbering>
 </file>
 
 <file path=word/styles.xml><?xml version="1.0" encoding="utf-8"?>
@@ -2572,6 +4287,23 @@
       <w:lang w:val="pt-BR" w:eastAsia="en-US" w:bidi="ar-SA"/>
     </w:rPr>
   </w:style>
+  <w:style w:type="paragraph" w:styleId="Heading1">
+    <w:name w:val="Heading 1"/>
+    <w:basedOn w:val="Ttulo"/>
+    <w:next w:val="BodyText"/>
+    <w:qFormat/>
+    <w:pPr>
+      <w:spacing w:before="240" w:after="120"/>
+      <w:outlineLvl w:val="0"/>
+    </w:pPr>
+    <w:rPr>
+      <w:rFonts w:ascii="Liberation Serif" w:hAnsi="Liberation Serif" w:eastAsia="DejaVu Sans" w:cs="Noto Sans Arabic UI"/>
+      <w:b/>
+      <w:bCs/>
+      <w:sz w:val="48"/>
+      <w:szCs w:val="48"/>
+    </w:rPr>
+  </w:style>
   <w:style w:type="paragraph" w:styleId="Heading2">
     <w:name w:val="Heading 2"/>
     <w:basedOn w:val="Normal"/>
@@ -2712,6 +4444,43 @@
     <w:rPr>
       <w:i/>
       <w:iCs/>
+    </w:rPr>
+  </w:style>
+  <w:style w:type="character" w:styleId="Caracteresdenotaderodap">
+    <w:name w:val="Caracteres de nota de rodapé"/>
+    <w:qFormat/>
+    <w:rPr/>
+  </w:style>
+  <w:style w:type="character" w:styleId="FootnoteReference">
+    <w:name w:val="Footnote Reference"/>
+    <w:rPr>
+      <w:vertAlign w:val="superscript"/>
+    </w:rPr>
+  </w:style>
+  <w:style w:type="character" w:styleId="EndnoteReference">
+    <w:name w:val="Endnote Reference"/>
+    <w:rPr>
+      <w:vertAlign w:val="superscript"/>
+    </w:rPr>
+  </w:style>
+  <w:style w:type="character" w:styleId="Caracteresdenotadefim">
+    <w:name w:val="Caracteres de nota de fim"/>
+    <w:qFormat/>
+    <w:rPr/>
+  </w:style>
+  <w:style w:type="character" w:styleId="Strong">
+    <w:name w:val="Strong"/>
+    <w:qFormat/>
+    <w:rPr>
+      <w:b/>
+      <w:bCs/>
+    </w:rPr>
+  </w:style>
+  <w:style w:type="character" w:styleId="Marcadores">
+    <w:name w:val="Marcadores"/>
+    <w:qFormat/>
+    <w:rPr>
+      <w:rFonts w:ascii="OpenSymbol" w:hAnsi="OpenSymbol" w:eastAsia="OpenSymbol" w:cs="OpenSymbol"/>
     </w:rPr>
   </w:style>
   <w:style w:type="paragraph" w:styleId="Ttulo">
@@ -2892,6 +4661,18 @@
     <w:basedOn w:val="Normal"/>
     <w:qFormat/>
     <w:pPr/>
+    <w:rPr>
+      <w:sz w:val="20"/>
+      <w:szCs w:val="20"/>
+    </w:rPr>
+  </w:style>
+  <w:style w:type="paragraph" w:styleId="FootnoteText">
+    <w:name w:val="Footnote Text"/>
+    <w:basedOn w:val="Normal"/>
+    <w:pPr>
+      <w:suppressLineNumbers/>
+      <w:ind w:hanging="340" w:left="340"/>
+    </w:pPr>
     <w:rPr>
       <w:sz w:val="20"/>
       <w:szCs w:val="20"/>

</xml_diff>

<commit_message>
sugestoes do orientador para serem adicionadas
</commit_message>
<xml_diff>
--- a/TCC_rtheodoro.docx
+++ b/TCC_rtheodoro.docx
@@ -131,20 +131,37 @@
       </w:pPr>
       <w:r>
         <w:rPr>
+          <w:rFonts w:eastAsiaTheme="minorHAnsi"/>
           <w:sz w:val="18"/>
           <w:szCs w:val="18"/>
-          <w:shd w:fill="FFFF00" w:val="clear"/>
+          <w:shd w:fill="auto" w:val="clear"/>
           <w:vertAlign w:val="superscript"/>
         </w:rPr>
         <w:t xml:space="preserve">2 </w:t>
       </w:r>
       <w:r>
         <w:rPr>
+          <w:rFonts w:ascii="Arial;sans-serif" w:hAnsi="Arial;sans-serif"/>
           <w:sz w:val="18"/>
           <w:szCs w:val="18"/>
-          <w:shd w:fill="FFFF00" w:val="clear"/>
-        </w:rPr>
-        <w:t>Nome da Empresa ou Instituição (opcional). Titulação ou função ou departamento. Endereço completo (pessoal ou profissional) – Bairro; 00000-000    Cidade, Estado, País</w:t>
+          <w:shd w:fill="auto" w:val="clear"/>
+        </w:rPr>
+        <w:t xml:space="preserve">Pecege. </w:t>
+      </w:r>
+      <w:r>
+        <w:rPr>
+          <w:rFonts w:ascii="Arial;sans-serif" w:hAnsi="Arial;sans-serif"/>
+          <w:sz w:val="18"/>
+          <w:shd w:fill="auto" w:val="clear"/>
+        </w:rPr>
+        <w:t>P</w:t>
+      </w:r>
+      <w:r>
+        <w:rPr>
+          <w:rFonts w:ascii="Arial;sans-serif" w:hAnsi="Arial;sans-serif"/>
+          <w:sz w:val="18"/>
+        </w:rPr>
+        <w:t>rofessor Orientador. Parque Tecnológico, Rua Cezira Giovanoni Moretti, 600 – Santa Rosa; 13418-Piracicaba, São Paulo, Brasil</w:t>
       </w:r>
     </w:p>
     <w:p>
@@ -153,6 +170,20 @@
         <w:spacing w:lineRule="auto" w:line="240"/>
         <w:jc w:val="left"/>
         <w:rPr>
+          <w:highlight w:val="none"/>
+          <w:shd w:fill="FFFF00" w:val="clear"/>
+        </w:rPr>
+      </w:pPr>
+      <w:r>
+        <w:rPr/>
+      </w:r>
+    </w:p>
+    <w:p>
+      <w:pPr>
+        <w:pStyle w:val="Normal"/>
+        <w:spacing w:lineRule="auto" w:line="240"/>
+        <w:jc w:val="left"/>
+        <w:rPr>
           <w:sz w:val="18"/>
           <w:szCs w:val="18"/>
         </w:rPr>
@@ -589,11 +620,21 @@
           <w:b/>
         </w:rPr>
       </w:pPr>
+      <w:commentRangeStart w:id="0"/>
       <w:r>
         <w:rPr>
           <w:b/>
         </w:rPr>
         <w:t>Introdução</w:t>
+      </w:r>
+      <w:commentRangeEnd w:id="0"/>
+      <w:r>
+        <w:commentReference w:id="0"/>
+      </w:r>
+      <w:r>
+        <w:rPr>
+          <w:b/>
+        </w:rPr>
       </w:r>
     </w:p>
     <w:p>
@@ -708,15 +749,7 @@
       </w:r>
       <w:r>
         <w:rPr/>
-        <w:t xml:space="preserve"> já prontos para análise emerge como uma iniciativa de grande relevância acadêmica e social. Além de automatizar rotinas de coleta e transformação, um pacote bem documentado, com manual de uso e exemplos concretos, amplia o acesso de pesquisadores com pouca experiência técnica, fomenta trabalhos inovadores e garante que a análise dos dados seja realizada de maneira padronizada e confiável. Isso faz com que o pesquisador possa despender mais tempo analisando os dados do que coletando. </w:t>
-      </w:r>
-      <w:r>
-        <w:rPr/>
-        <w:t>Pacotes já existentes</w:t>
-      </w:r>
-      <w:r>
-        <w:rPr/>
-        <w:t xml:space="preserve"> como o BacenAPI</w:t>
+        <w:t xml:space="preserve"> já prontos para análise emerge como uma iniciativa de grande relevância acadêmica e social. Além de automatizar rotinas de coleta e transformação, um pacote bem documentado, com manual de uso e exemplos concretos, amplia o acesso de pesquisadores com pouca experiência técnica, fomenta trabalhos inovadores e garante que a análise dos dados seja realizada de maneira padronizada e confiável. Isso faz com que o pesquisador possa despender mais tempo analisando os dados do que coletando. Pacotes já existentes como o BacenAPI</w:t>
       </w:r>
       <w:r>
         <w:rPr>
@@ -726,7 +759,11 @@
       </w:r>
       <w:r>
         <w:rPr/>
-        <w:t xml:space="preserve"> e o BETS</w:t>
+        <w:t xml:space="preserve">, </w:t>
+      </w:r>
+      <w:r>
+        <w:rPr/>
+        <w:t>rbcb</w:t>
       </w:r>
       <w:r>
         <w:rPr>
@@ -736,15 +773,21 @@
       </w:r>
       <w:r>
         <w:rPr/>
-        <w:t xml:space="preserve"> já demonstram que existe uma necessidade de soluções “open source” para a pesquisa econômica e financeira nacional. O acesso facilitado aos dados permite que mais pessoas investiguem problemas importantes, contribuam para o avanço do conhecimento e </w:t>
-      </w:r>
-      <w:r>
-        <w:rPr/>
-        <w:t>geram resultados com potenciais de pautar</w:t>
-      </w:r>
-      <w:r>
-        <w:rPr/>
-        <w:t xml:space="preserve"> políticas públicas, mesmo sem profundo conhecimento em programação.</w:t>
+        <w:t xml:space="preserve"> </w:t>
+      </w:r>
+      <w:r>
+        <w:rPr/>
+        <w:t>e o BETS</w:t>
+      </w:r>
+      <w:r>
+        <w:rPr>
+          <w:rStyle w:val="FootnoteReference"/>
+        </w:rPr>
+        <w:footnoteReference w:id="4"/>
+      </w:r>
+      <w:r>
+        <w:rPr/>
+        <w:t xml:space="preserve"> já demonstram que existe uma necessidade de soluções “open source” para a pesquisa econômica e financeira nacional. O acesso facilitado aos dados permite que mais pessoas investiguem problemas importantes, contribuam para o avanço do conhecimento e geram resultados com potenciais de pautar políticas públicas, mesmo sem profundo conhecimento em programação.</w:t>
       </w:r>
     </w:p>
     <w:p>
@@ -759,47 +802,7 @@
       </w:pPr>
       <w:r>
         <w:rPr/>
-        <w:t xml:space="preserve">Tendo em vista </w:t>
-      </w:r>
-      <w:r>
-        <w:rPr/>
-        <w:t>os</w:t>
-      </w:r>
-      <w:r>
-        <w:rPr/>
-        <w:t xml:space="preserve"> pontos </w:t>
-      </w:r>
-      <w:r>
-        <w:rPr/>
-        <w:t>apresentados</w:t>
-      </w:r>
-      <w:r>
-        <w:rPr/>
-        <w:t xml:space="preserve">, o objetivo deste trabalho foi criar um pacote em R, </w:t>
-      </w:r>
-      <w:r>
-        <w:rPr/>
-        <w:t>nomeado de bacenR,</w:t>
-      </w:r>
-      <w:r>
-        <w:rPr/>
-        <w:t xml:space="preserve"> para baixar informações sobre Instruções Normativas </w:t>
-      </w:r>
-      <w:r>
-        <w:rPr/>
-        <w:t>que regem a regulação e fiscalização das</w:t>
-      </w:r>
-      <w:r>
-        <w:rPr/>
-        <w:t xml:space="preserve"> instituições financeiras e os Balanços e Balancetes d</w:t>
-      </w:r>
-      <w:r>
-        <w:rPr/>
-        <w:t>as mesmas</w:t>
-      </w:r>
-      <w:r>
-        <w:rPr/>
-        <w:t xml:space="preserve">, de forma que os dados baixados sejam facilmente tratados e organizados. </w:t>
+        <w:t xml:space="preserve">Tendo em vista os pontos apresentados, o objetivo deste trabalho foi criar um pacote em R, nomeado de bacenR, para baixar informações sobre Instruções Normativas que regem a regulação e fiscalização das instituições financeiras e os Balanços e Balancetes das mesmas, de forma que os dados baixados sejam facilmente tratados e organizados. </w:t>
       </w:r>
     </w:p>
     <w:p>
@@ -881,12 +884,11 @@
       </w:r>
       <w:r>
         <w:rPr>
-          <w:rStyle w:val="Emphasis"/>
           <w:rStyle w:val="FootnoteReference"/>
           <w:i w:val="false"/>
           <w:iCs w:val="false"/>
         </w:rPr>
-        <w:footnoteReference w:id="4"/>
+        <w:footnoteReference w:id="5"/>
       </w:r>
       <w:r>
         <w:rPr/>
@@ -922,59 +924,7 @@
       </w:pPr>
       <w:r>
         <w:rPr/>
-        <w:t xml:space="preserve">Na sequência, procedeu-se à análise dos componentes estruturais do pacote, </w:t>
-      </w:r>
-      <w:r>
-        <w:rPr/>
-        <w:t xml:space="preserve">que são compostos pelo </w:t>
-      </w:r>
-      <w:r>
-        <w:rPr/>
-        <w:t xml:space="preserve">código-fonte, </w:t>
-      </w:r>
-      <w:r>
-        <w:rPr/>
-        <w:t xml:space="preserve">pela </w:t>
-      </w:r>
-      <w:r>
-        <w:rPr/>
-        <w:t xml:space="preserve">bases de dados, </w:t>
-      </w:r>
-      <w:r>
-        <w:rPr/>
-        <w:t xml:space="preserve">pelos </w:t>
-      </w:r>
-      <w:r>
-        <w:rPr/>
-        <w:t xml:space="preserve">diretórios e </w:t>
-      </w:r>
-      <w:r>
-        <w:rPr/>
-        <w:t xml:space="preserve">pelas </w:t>
-      </w:r>
-      <w:r>
-        <w:rPr/>
-        <w:t xml:space="preserve">referências bibliográficas, a fim de assegurar sua consistência e coerência interna. Concluída essa verificação, elaboraram-se os metadados, que contemplaram a descrição detalhada do pacote, suas dependências, a estrutura organizacional do projeto conforme as boas práticas de desenvolvimento e a definição da licença de uso. </w:t>
-      </w:r>
-      <w:r>
-        <w:rPr/>
-        <w:t>Como, por exemplo, os pacotes que o usuário precisa ter instalado para que o bacenR funcione, são:</w:t>
-      </w:r>
-      <w:r>
-        <w:rPr/>
-        <w:t xml:space="preserve"> `dplyr`, `fs`, `glue`, `httr`, `janitor`,  `jsonlite`, `lifecycle`, `purrr`, `readr`, `rlang`, `stringr`, `tibble`, `tidyr`, `tools`, `utils` </w:t>
-      </w:r>
-      <w:r>
-        <w:rPr/>
-        <w:t>e `</w:t>
-      </w:r>
-      <w:r>
-        <w:rPr/>
-        <w:t xml:space="preserve">xml2`. </w:t>
-      </w:r>
-      <w:r>
-        <w:rPr/>
-        <w:t>Além disso, o R precisa estar na versão 4.1 ou superior.</w:t>
+        <w:t>Na sequência, procedeu-se à análise dos componentes estruturais do pacote, que são compostos pelo código-fonte, pela bases de dados, pelos diretórios e pelas referências bibliográficas, a fim de assegurar sua consistência e coerência interna. Concluída essa verificação, elaboraram-se os metadados, que contemplaram a descrição detalhada do pacote, suas dependências, a estrutura organizacional do projeto conforme as boas práticas de desenvolvimento e a definição da licença de uso. Como, por exemplo, os pacotes que o usuário precisa ter instalado para que o bacenR funcione, são: `dplyr`, `fs`, `glue`, `httr`, `janitor`,  `jsonlite`, `lifecycle`, `purrr`, `readr`, `rlang`, `stringr`, `tibble`, `tidyr`, `tools`, `utils` e `xml2`. Além disso, o R precisa estar na versão 4.1 ou superior.</w:t>
       </w:r>
     </w:p>
     <w:p>
@@ -990,23 +940,7 @@
       </w:pPr>
       <w:r>
         <w:rPr/>
-        <w:t xml:space="preserve">Com a estrutura final consolidada, iniciou-se a fase de testes. Cada função foi submetida a </w:t>
-      </w:r>
-      <w:r>
-        <w:rPr/>
-        <w:t>testes</w:t>
-      </w:r>
-      <w:r>
-        <w:rPr/>
-        <w:t xml:space="preserve"> individuais </w:t>
-      </w:r>
-      <w:r>
-        <w:rPr/>
-        <w:t>com a utilização dos pacotes `testethat` e `devtools`</w:t>
-      </w:r>
-      <w:r>
-        <w:rPr/>
-        <w:t>, utilizando diferentes parâmetros com o objetivo de verificar a robustez e o comportamento do código. Os erros identificados foram corrigidos iterativamente, implicando ajustes tanto na codificação quanto na documentação e nas dependências declaradas. Após a aprovação em todos os testes, incluindo o “</w:t>
+        <w:t>Com a estrutura final consolidada, iniciou-se a fase de testes. Cada função foi submetida a testes individuais com a utilização dos pacotes `testethat` e `devtools`, utilizando diferentes parâmetros com o objetivo de verificar a robustez e o comportamento do código. Os erros identificados foram corrigidos iterativamente, implicando ajustes tanto na codificação quanto na documentação e nas dependências declaradas. Após a aprovação em todos os testes, incluindo o “</w:t>
       </w:r>
       <w:r>
         <w:rPr>
@@ -1018,15 +952,7 @@
       </w:r>
       <w:r>
         <w:rPr/>
-        <w:t xml:space="preserve"> executado por meio da integração com o “GitHub”, iniciou-se o processo de documentação formal, </w:t>
-      </w:r>
-      <w:r>
-        <w:rPr/>
-        <w:t>com a ajuda do pacote `usethis`</w:t>
-      </w:r>
-      <w:r>
-        <w:rPr/>
-        <w:t>. Todas as funções foram descritas detalhadamente, com a exposição de seus objetivos, parâmetros, resultados esperados e respectivas fontes de dados, de modo a garantir total transparência e compreensibilidade ao usuário final.</w:t>
+        <w:t xml:space="preserve"> executado por meio da integração com o “GitHub”, iniciou-se o processo de documentação formal, com a ajuda do pacote `usethis`. Todas as funções foram descritas detalhadamente, com a exposição de seus objetivos, parâmetros, resultados esperados e respectivas fontes de dados, de modo a garantir total transparência e compreensibilidade ao usuário final.</w:t>
       </w:r>
     </w:p>
     <w:p>
@@ -1054,12 +980,11 @@
       </w:r>
       <w:r>
         <w:rPr>
-          <w:rStyle w:val="Emphasis"/>
           <w:rStyle w:val="FootnoteReference"/>
           <w:i w:val="false"/>
           <w:iCs w:val="false"/>
         </w:rPr>
-        <w:footnoteReference w:id="5"/>
+        <w:footnoteReference w:id="6"/>
       </w:r>
       <w:r>
         <w:rPr/>
@@ -1087,17 +1012,13 @@
       </w:r>
       <w:r>
         <w:rPr/>
-        <w:t xml:space="preserve">, foi classificada como versão beta, uma vez que, apesar dos testes realizados, ainda poderiam ser identificados erros residuais. Para ampliar a fase de validação, o pacote foi também divulgado em redes sociais (WhatsApp, Twitter/X e LinkedIn), juntamente com um formulário destinado à coleta das primeiras impressões dos usuários. As informações obtidas por meio desse instrumento servirão de subsídio para a identificação de falhas, proposição de melhorias e definição de novas funcionalidades a serem incorporadas. </w:t>
-      </w:r>
-      <w:r>
-        <w:rPr/>
-        <w:t>O usuário também pode dar sua opinião, tirar dúvidas e sugerir melhorias através das “issues” do “Github”</w:t>
+        <w:t>, foi classificada como versão beta, uma vez que, apesar dos testes realizados, ainda poderiam ser identificados erros residuais. Para ampliar a fase de validação, o pacote foi também divulgado em redes sociais (WhatsApp, Twitter/X e LinkedIn), juntamente com um formulário destinado à coleta das primeiras impressões dos usuários. As informações obtidas por meio desse instrumento servirão de subsídio para a identificação de falhas, proposição de melhorias e definição de novas funcionalidades a serem incorporadas. O usuário também pode dar sua opinião, tirar dúvidas e sugerir melhorias através das “issues” do “Github”</w:t>
       </w:r>
       <w:r>
         <w:rPr>
           <w:rStyle w:val="FootnoteReference"/>
         </w:rPr>
-        <w:footnoteReference w:id="6"/>
+        <w:footnoteReference w:id="7"/>
       </w:r>
       <w:r>
         <w:rPr/>
@@ -1125,43 +1046,11 @@
           <w:b w:val="false"/>
           <w:bCs w:val="false"/>
         </w:rPr>
-        <w:t xml:space="preserve">Comprehensive R Archive Network” </w:t>
-      </w:r>
-      <w:r>
-        <w:rPr>
-          <w:rStyle w:val="Strong"/>
-          <w:b w:val="false"/>
-          <w:bCs w:val="false"/>
-        </w:rPr>
-        <w:t>[</w:t>
-      </w:r>
-      <w:r>
-        <w:rPr>
-          <w:rStyle w:val="Strong"/>
-          <w:b w:val="false"/>
-          <w:bCs w:val="false"/>
-        </w:rPr>
-        <w:t>CRAN</w:t>
-      </w:r>
-      <w:r>
-        <w:rPr>
-          <w:rStyle w:val="Strong"/>
-          <w:b w:val="false"/>
-          <w:bCs w:val="false"/>
-        </w:rPr>
-        <w:t>]</w:t>
-      </w:r>
-      <w:r>
-        <w:rPr/>
-        <w:t xml:space="preserve">, repositório oficial da linguagem R, </w:t>
-      </w:r>
-      <w:r>
-        <w:rPr/>
-        <w:t xml:space="preserve">utilizando o pacote `rhub`, </w:t>
-      </w:r>
-      <w:r>
-        <w:rPr/>
-        <w:t>com vistas à sua futura publicação e disseminação formal junto à comunidade científica e técnica.</w:t>
+        <w:t>Comprehensive R Archive Network” [CRAN]</w:t>
+      </w:r>
+      <w:r>
+        <w:rPr/>
+        <w:t>, repositório oficial da linguagem R, utilizando o pacote `rhub`, com vistas à sua futura publicação e disseminação formal junto à comunidade científica e técnica.</w:t>
       </w:r>
     </w:p>
     <w:p>
@@ -1177,7 +1066,8 @@
       </w:pPr>
       <w:r>
         <w:rPr>
-          <w:color w:val="000000"/>
+          <w:rFonts w:eastAsia="Times New Roman"/>
+          <w:lang w:eastAsia="pt-BR"/>
         </w:rPr>
       </w:r>
     </w:p>
@@ -1210,8 +1100,7 @@
       </w:pPr>
       <w:r>
         <w:rPr>
-          <w:color w:val="000000"/>
-          <w:shd w:fill="FFFFFF" w:val="clear"/>
+          <w:b/>
         </w:rPr>
       </w:r>
     </w:p>
@@ -1303,12 +1192,11 @@
       </w:r>
       <w:r>
         <w:rPr>
-          <w:rStyle w:val="normaltextrun"/>
           <w:rStyle w:val="FootnoteReference"/>
           <w:color w:val="000000"/>
           <w:shd w:fill="FFFFFF" w:val="clear"/>
         </w:rPr>
-        <w:footnoteReference w:id="7"/>
+        <w:footnoteReference w:id="8"/>
       </w:r>
     </w:p>
     <w:p>
@@ -1386,43 +1274,21 @@
           <w:color w:val="000000"/>
           <w:shd w:fill="FFFFFF" w:val="clear"/>
         </w:rPr>
-        <w:t xml:space="preserve">Seguindo o que foi estipulado pelo </w:t>
-      </w:r>
-      <w:r>
-        <w:rPr>
-          <w:rStyle w:val="normaltextrun"/>
-          <w:color w:val="000000"/>
-          <w:shd w:fill="FFFFFF" w:val="clear"/>
-        </w:rPr>
-        <w:t>cronograma das tarefas, as primeiras funções desenvolvidas foram: `download_normative_data()`, `download_normative_txt()`, `</w:t>
-      </w:r>
-      <w:r>
-        <w:rPr>
-          <w:rStyle w:val="normaltextrun"/>
-        </w:rPr>
-        <w:t>download_balance_sheets</w:t>
-      </w:r>
-      <w:r>
-        <w:rPr>
-          <w:rStyle w:val="normaltextrun"/>
-        </w:rPr>
-        <w:t>()` e</w:t>
-      </w:r>
-      <w:r>
-        <w:rPr>
-          <w:rStyle w:val="normaltextrun"/>
-          <w:color w:val="000000"/>
-          <w:shd w:fill="FFFFFF" w:val="clear"/>
-        </w:rPr>
-        <w:t xml:space="preserve"> `treatment_balance_sheets</w:t>
-      </w:r>
-      <w:r>
-        <w:rPr>
-          <w:rStyle w:val="normaltextrun"/>
-          <w:color w:val="000000"/>
-          <w:shd w:fill="FFFFFF" w:val="clear"/>
-        </w:rPr>
-        <w:t>()`. Após o pacote ser instalado, a documentação de cada função poderá ser dentro do próprio R, conforme exemplo da Figura 2.</w:t>
+        <w:t>Seguindo o que foi estipulado pelo cronograma das tarefas, as primeiras funções desenvolvidas foram: `download_normative_data()`, `download_normative_txt()`, `</w:t>
+      </w:r>
+      <w:r>
+        <w:rPr>
+          <w:rStyle w:val="normaltextrun"/>
+        </w:rPr>
+        <w:t>download_balance_sheets()` e</w:t>
+      </w:r>
+      <w:r>
+        <w:rPr>
+          <w:rStyle w:val="normaltextrun"/>
+          <w:color w:val="000000"/>
+          <w:shd w:fill="FFFFFF" w:val="clear"/>
+        </w:rPr>
+        <w:t xml:space="preserve"> `treatment_balance_sheets()`. Após o pacote ser instalado, a documentação de cada função poderá ser dentro do próprio R, conforme exemplo da Figura 2.</w:t>
       </w:r>
     </w:p>
     <w:p>
@@ -1921,7 +1787,19 @@
         <w:rPr>
           <w:rStyle w:val="normaltextrun"/>
         </w:rPr>
-        <w:t>`download_normative_data()`:  Baixa os atos normativos do Banco Central do Brasil (BCB) por termos e janela de datas.</w:t>
+        <w:t xml:space="preserve">`download_normative_data()`:  Baixa os atos normativos do </w:t>
+      </w:r>
+      <w:r>
+        <w:rPr>
+          <w:rStyle w:val="normaltextrun"/>
+        </w:rPr>
+        <w:t>Bacen</w:t>
+      </w:r>
+      <w:r>
+        <w:rPr>
+          <w:rStyle w:val="normaltextrun"/>
+        </w:rPr>
+        <w:t xml:space="preserve"> por termos e janela de datas.</w:t>
       </w:r>
     </w:p>
     <w:p>
@@ -1940,7 +1818,19 @@
         <w:rPr>
           <w:rStyle w:val="normaltextrun"/>
         </w:rPr>
-        <w:t>`download_normative_txt()`: Baixa o texto dos atos normativos do Banco Central do Brasil (BCB), de acordo o data.frame gerado pela função [download_normative_data()]</w:t>
+        <w:t xml:space="preserve">`download_normative_txt()`: Baixa o texto dos atos normativos do </w:t>
+      </w:r>
+      <w:r>
+        <w:rPr>
+          <w:rStyle w:val="normaltextrun"/>
+        </w:rPr>
+        <w:t>Bacen</w:t>
+      </w:r>
+      <w:r>
+        <w:rPr>
+          <w:rStyle w:val="normaltextrun"/>
+        </w:rPr>
+        <w:t>, de acordo o data.frame gerado pela função [download_normative_data()]</w:t>
       </w:r>
     </w:p>
     <w:p>
@@ -1959,19 +1849,13 @@
         <w:rPr>
           <w:rStyle w:val="normaltextrun"/>
         </w:rPr>
-        <w:t>`</w:t>
-      </w:r>
-      <w:r>
-        <w:rPr>
-          <w:rStyle w:val="normaltextrun"/>
-        </w:rPr>
-        <w:t>download_balance_sheets</w:t>
-      </w:r>
-      <w:r>
-        <w:rPr>
-          <w:rStyle w:val="normaltextrun"/>
-        </w:rPr>
-        <w:t>()`: Baixa os balanços e balancetes das instituições financeiras, por ano e mês e tipo do documento, presentes no Banco Central do Brasil (BCB)</w:t>
+        <w:t xml:space="preserve">`download_balance_sheets()`: Baixa os balanços e balancetes das instituições financeiras, por ano e mês e tipo do documento, presentes no </w:t>
+      </w:r>
+      <w:r>
+        <w:rPr>
+          <w:rStyle w:val="normaltextrun"/>
+        </w:rPr>
+        <w:t>Bacen</w:t>
       </w:r>
     </w:p>
     <w:p>
@@ -1990,13 +1874,19 @@
         <w:rPr>
           <w:rStyle w:val="normaltextrun"/>
         </w:rPr>
-        <w:t>`treatment_balance_sheets</w:t>
-      </w:r>
-      <w:r>
-        <w:rPr>
-          <w:rStyle w:val="normaltextrun"/>
-        </w:rPr>
-        <w:t>()`: Processa e organiza os balanços baixados do BCB pela função [download_balance_sheets()]</w:t>
+        <w:t xml:space="preserve">`treatment_balance_sheets()`: Processa e organiza os balanços baixados do </w:t>
+      </w:r>
+      <w:r>
+        <w:rPr>
+          <w:rStyle w:val="normaltextrun"/>
+        </w:rPr>
+        <w:t>Bacen</w:t>
+      </w:r>
+      <w:r>
+        <w:rPr>
+          <w:rStyle w:val="normaltextrun"/>
+        </w:rPr>
+        <w:t xml:space="preserve"> pela função [download_balance_sheets()]</w:t>
       </w:r>
     </w:p>
     <w:p>
@@ -2029,38 +1919,13 @@
         <w:rPr>
           <w:rStyle w:val="normaltextrun"/>
         </w:rPr>
-        <w:t>A licença escolhida para o pacote, foi a “</w:t>
-      </w:r>
-      <w:r>
-        <w:rPr>
-          <w:rStyle w:val="normaltextrun"/>
-        </w:rPr>
-        <w:t xml:space="preserve">General Public License” </w:t>
-      </w:r>
-      <w:r>
-        <w:rPr>
-          <w:rStyle w:val="normaltextrun"/>
-        </w:rPr>
-        <w:t>3 [</w:t>
-      </w:r>
-      <w:r>
-        <w:rPr>
-          <w:rStyle w:val="normaltextrun"/>
-        </w:rPr>
-        <w:t>GPL-3.0</w:t>
-      </w:r>
-      <w:r>
-        <w:rPr>
-          <w:rStyle w:val="normaltextrun"/>
-        </w:rPr>
-        <w:t>]</w:t>
-      </w:r>
-      <w:r>
-        <w:rPr>
-          <w:rStyle w:val="normaltextrun"/>
+        <w:t>A licença escolhida para o pacote, foi a “General Public License” 3 [GPL-3.0]</w:t>
+      </w:r>
+      <w:r>
+        <w:rPr>
           <w:rStyle w:val="FootnoteReference"/>
         </w:rPr>
-        <w:footnoteReference w:id="8"/>
+        <w:footnoteReference w:id="9"/>
       </w:r>
       <w:r>
         <w:rPr>
@@ -2179,9 +2044,6 @@
           <w:shd w:fill="FFFFFF" w:val="clear"/>
         </w:rPr>
         <w:t>Caso o pacote seja utilizado para elaboração de algum artigo, trabalho ou livro, ele deverá ser referenciado de conforme .bib abaixo:</w:t>
-        <w:br/>
-        <w:br/>
-        <w:t>bibentry(</w:t>
       </w:r>
     </w:p>
     <w:p>
@@ -2189,27 +2051,15 @@
         <w:pStyle w:val="ListParagraph"/>
         <w:spacing w:lineRule="auto" w:line="360"/>
         <w:ind w:firstLine="709" w:left="0"/>
-        <w:rPr>
-          <w:rStyle w:val="normaltextrun"/>
-          <w:color w:val="000000"/>
-          <w:shd w:fill="FFFFFF" w:val="clear"/>
-        </w:rPr>
-      </w:pPr>
-      <w:r>
-        <w:rPr>
-          <w:rStyle w:val="normaltextrun"/>
-          <w:color w:val="000000"/>
-          <w:shd w:fill="FFFFFF" w:val="clear"/>
-        </w:rPr>
-        <w:t xml:space="preserve">  </w:t>
-      </w:r>
-      <w:r>
-        <w:rPr>
-          <w:rStyle w:val="normaltextrun"/>
-          <w:color w:val="000000"/>
-          <w:shd w:fill="FFFFFF" w:val="clear"/>
-        </w:rPr>
-        <w:t>bibtype = "Article",</w:t>
+        <w:jc w:val="both"/>
+        <w:rPr>
+          <w:rStyle w:val="normaltextrun"/>
+          <w:color w:val="000000"/>
+          <w:shd w:fill="FFFFFF" w:val="clear"/>
+        </w:rPr>
+      </w:pPr>
+      <w:r>
+        <w:rPr/>
       </w:r>
     </w:p>
     <w:p>
@@ -2217,159 +2067,15 @@
         <w:pStyle w:val="ListParagraph"/>
         <w:spacing w:lineRule="auto" w:line="360"/>
         <w:ind w:firstLine="709" w:left="0"/>
-        <w:rPr>
-          <w:rStyle w:val="normaltextrun"/>
-          <w:color w:val="000000"/>
-          <w:shd w:fill="FFFFFF" w:val="clear"/>
-        </w:rPr>
-      </w:pPr>
-      <w:r>
-        <w:rPr>
-          <w:rStyle w:val="normaltextrun"/>
-          <w:color w:val="000000"/>
-          <w:shd w:fill="FFFFFF" w:val="clear"/>
-        </w:rPr>
-        <w:t xml:space="preserve">  </w:t>
-      </w:r>
-      <w:r>
-        <w:rPr>
-          <w:rStyle w:val="normaltextrun"/>
-          <w:color w:val="000000"/>
-          <w:shd w:fill="FFFFFF" w:val="clear"/>
-        </w:rPr>
-        <w:t>title = "bacenR: Tools to Access Data from Banco Central do Brasil",</w:t>
-      </w:r>
-    </w:p>
-    <w:p>
-      <w:pPr>
-        <w:pStyle w:val="ListParagraph"/>
-        <w:spacing w:lineRule="auto" w:line="360"/>
-        <w:ind w:firstLine="709" w:left="0"/>
-        <w:rPr>
-          <w:rStyle w:val="normaltextrun"/>
-          <w:color w:val="000000"/>
-          <w:shd w:fill="FFFFFF" w:val="clear"/>
-        </w:rPr>
-      </w:pPr>
-      <w:r>
-        <w:rPr>
-          <w:rStyle w:val="normaltextrun"/>
-          <w:color w:val="000000"/>
-          <w:shd w:fill="FFFFFF" w:val="clear"/>
-        </w:rPr>
-        <w:t xml:space="preserve">  </w:t>
-      </w:r>
-      <w:r>
-        <w:rPr>
-          <w:rStyle w:val="normaltextrun"/>
-          <w:color w:val="000000"/>
-          <w:shd w:fill="FFFFFF" w:val="clear"/>
-        </w:rPr>
-        <w:t>author = "Ricardo Theodoro",</w:t>
-      </w:r>
-    </w:p>
-    <w:p>
-      <w:pPr>
-        <w:pStyle w:val="ListParagraph"/>
-        <w:spacing w:lineRule="auto" w:line="360"/>
-        <w:ind w:firstLine="709" w:left="0"/>
-        <w:rPr>
-          <w:rStyle w:val="normaltextrun"/>
-          <w:color w:val="000000"/>
-          <w:shd w:fill="FFFFFF" w:val="clear"/>
-        </w:rPr>
-      </w:pPr>
-      <w:r>
-        <w:rPr>
-          <w:rStyle w:val="normaltextrun"/>
-          <w:color w:val="000000"/>
-          <w:shd w:fill="FFFFFF" w:val="clear"/>
-        </w:rPr>
-        <w:t xml:space="preserve">  </w:t>
-      </w:r>
-      <w:r>
-        <w:rPr>
-          <w:rStyle w:val="normaltextrun"/>
-          <w:color w:val="000000"/>
-          <w:shd w:fill="FFFFFF" w:val="clear"/>
-        </w:rPr>
-        <w:t>journal = "github",</w:t>
-      </w:r>
-    </w:p>
-    <w:p>
-      <w:pPr>
-        <w:pStyle w:val="ListParagraph"/>
-        <w:spacing w:lineRule="auto" w:line="360"/>
-        <w:ind w:firstLine="709" w:left="0"/>
-        <w:rPr>
-          <w:rStyle w:val="normaltextrun"/>
-          <w:color w:val="000000"/>
-          <w:shd w:fill="FFFFFF" w:val="clear"/>
-        </w:rPr>
-      </w:pPr>
-      <w:r>
-        <w:rPr>
-          <w:rStyle w:val="normaltextrun"/>
-          <w:color w:val="000000"/>
-          <w:shd w:fill="FFFFFF" w:val="clear"/>
-        </w:rPr>
-        <w:t xml:space="preserve">  </w:t>
-      </w:r>
-      <w:r>
-        <w:rPr>
-          <w:rStyle w:val="normaltextrun"/>
-          <w:color w:val="000000"/>
-          <w:shd w:fill="FFFFFF" w:val="clear"/>
-        </w:rPr>
-        <w:t>year = "2025",</w:t>
-      </w:r>
-    </w:p>
-    <w:p>
-      <w:pPr>
-        <w:pStyle w:val="ListParagraph"/>
-        <w:spacing w:lineRule="auto" w:line="360"/>
-        <w:ind w:firstLine="709" w:left="0"/>
-        <w:rPr>
-          <w:rStyle w:val="normaltextrun"/>
-          <w:color w:val="000000"/>
-          <w:shd w:fill="FFFFFF" w:val="clear"/>
-        </w:rPr>
-      </w:pPr>
-      <w:r>
-        <w:rPr>
-          <w:rStyle w:val="normaltextrun"/>
-          <w:color w:val="000000"/>
-          <w:shd w:fill="FFFFFF" w:val="clear"/>
-        </w:rPr>
-        <w:t xml:space="preserve">  </w:t>
-      </w:r>
-      <w:r>
-        <w:rPr>
-          <w:rStyle w:val="normaltextrun"/>
-          <w:color w:val="000000"/>
-          <w:shd w:fill="FFFFFF" w:val="clear"/>
-        </w:rPr>
-        <w:t>url = "https://github.com/rtheodoro/bacenR"</w:t>
-      </w:r>
-    </w:p>
-    <w:p>
-      <w:pPr>
-        <w:pStyle w:val="ListParagraph"/>
-        <w:spacing w:lineRule="auto" w:line="360"/>
-        <w:ind w:firstLine="709" w:left="0"/>
-        <w:rPr>
-          <w:rStyle w:val="normaltextrun"/>
-          <w:color w:val="000000"/>
-          <w:shd w:fill="FFFFFF" w:val="clear"/>
-        </w:rPr>
-      </w:pPr>
-      <w:r>
-        <w:rPr>
-          <w:rStyle w:val="normaltextrun"/>
-          <w:color w:val="000000"/>
-          <w:shd w:fill="FFFFFF" w:val="clear"/>
-        </w:rPr>
-        <w:t>)</w:t>
+        <w:jc w:val="both"/>
+        <w:rPr>
+          <w:rStyle w:val="normaltextrun"/>
+          <w:color w:val="000000"/>
+          <w:shd w:fill="FFFFFF" w:val="clear"/>
+        </w:rPr>
+      </w:pPr>
+      <w:r>
+        <w:rPr/>
       </w:r>
     </w:p>
     <w:p>
@@ -2935,6 +2641,57 @@
     </w:sectPr>
   </w:body>
 </w:document>
+</file>
+
+<file path=word/comments.xml><?xml version="1.0" encoding="utf-8"?>
+<w:comments xmlns:o="urn:schemas-microsoft-com:office:office" xmlns:r="http://schemas.openxmlformats.org/officeDocument/2006/relationships" xmlns:v="urn:schemas-microsoft-com:vml" xmlns:w="http://schemas.openxmlformats.org/wordprocessingml/2006/main" xmlns:w10="urn:schemas-microsoft-com:office:word" xmlns:wp="http://schemas.openxmlformats.org/drawingml/2006/wordprocessingDrawing" xmlns:wps="http://schemas.microsoft.com/office/word/2010/wordprocessingShape" xmlns:wpg="http://schemas.microsoft.com/office/word/2010/wordprocessingGroup" xmlns:mc="http://schemas.openxmlformats.org/markup-compatibility/2006" xmlns:wp14="http://schemas.microsoft.com/office/word/2010/wordprocessingDrawing" xmlns:w14="http://schemas.microsoft.com/office/word/2010/wordml" xmlns:w15="http://schemas.microsoft.com/office/word/2012/wordml" mc:Ignorable="w14 wp14 w15">
+  <w:comment w:id="0" w:author="Autor desconhecido" w:date="2026-01-12T10:37:59Z" w:initials="">
+    <w:p>
+      <w:pPr>
+        <w:overflowPunct w:val="false"/>
+        <w:spacing w:before="238" w:after="198" w:lineRule="auto" w:line="240"/>
+        <w:jc w:val="left"/>
+        <w:rPr/>
+      </w:pPr>
+      <w:r>
+        <w:rPr>
+          <w:rFonts w:ascii="Liberation Serif" w:hAnsi="Liberation Serif" w:eastAsia="DejaVu Sans" w:cs="Noto Sans Arabic UI"/>
+          <w:sz w:val="20"/>
+          <w:szCs w:val="20"/>
+          <w:lang w:val="en-US" w:eastAsia="en-US" w:bidi="en-US"/>
+        </w:rPr>
+        <w:t>- Qual a diferença para outros pacotes/APIS do Bacen (é só o BacenAPI)?</w:t>
+      </w:r>
+      <w:r>
+        <w:rPr>
+          <w:rFonts w:ascii="Liberation Serif" w:hAnsi="Liberation Serif" w:eastAsia="DejaVu Sans" w:cs="Noto Sans Arabic UI"/>
+          <w:sz w:val="20"/>
+          <w:szCs w:val="20"/>
+          <w:lang w:val="en-US" w:eastAsia="en-US" w:bidi="en-US"/>
+        </w:rPr>
+        <w:br/>
+      </w:r>
+      <w:r>
+        <w:rPr>
+          <w:rFonts w:ascii="Liberation Serif" w:hAnsi="Liberation Serif" w:eastAsia="DejaVu Sans" w:cs="Noto Sans Arabic UI"/>
+          <w:sz w:val="20"/>
+          <w:szCs w:val="20"/>
+          <w:lang w:val="en-US" w:eastAsia="en-US" w:bidi="en-US"/>
+        </w:rPr>
+        <w:br/>
+      </w:r>
+      <w:r>
+        <w:rPr>
+          <w:rFonts w:ascii="Liberation Serif" w:hAnsi="Liberation Serif" w:eastAsia="DejaVu Sans" w:cs="Noto Sans Arabic UI"/>
+          <w:sz w:val="20"/>
+          <w:szCs w:val="20"/>
+          <w:lang w:val="en-US" w:eastAsia="en-US" w:bidi="en-US"/>
+        </w:rPr>
+        <w:t> - há muitos pacotes desenvolvidos para fins específicos de diferentes bancos de dados. Talvez avaliar se consegue ver citações/usos desses pacotes na literatura, para mostrar a importância/impacto dessa disponibilidade para uso dessas ferramentas.</w:t>
+      </w:r>
+    </w:p>
+  </w:comment>
+</w:comments>
 </file>
 
 <file path=word/footer1.xml><?xml version="1.0" encoding="utf-8"?>
@@ -3136,12 +2893,35 @@
             <w:rStyle w:val="Hyperlink"/>
           </w:rPr>
           <w:tab/>
+          <w:t>https://cloud.r-project.org/web/packages/rbcb/index.html</w:t>
+        </w:r>
+      </w:hyperlink>
+    </w:p>
+  </w:footnote>
+  <w:footnote w:id="4">
+    <w:p>
+      <w:pPr>
+        <w:pStyle w:val="FootnoteText"/>
+        <w:rPr/>
+      </w:pPr>
+      <w:r>
+        <w:rPr>
+          <w:rStyle w:val="Caracteresdenotaderodap"/>
+        </w:rPr>
+        <w:footnoteRef/>
+      </w:r>
+      <w:hyperlink r:id="rId3">
+        <w:r>
+          <w:rPr>
+            <w:rStyle w:val="Hyperlink"/>
+          </w:rPr>
+          <w:tab/>
           <w:t>https://cran.r-project.org/web/packages/BETS/index.html</w:t>
         </w:r>
       </w:hyperlink>
     </w:p>
   </w:footnote>
-  <w:footnote w:id="4">
+  <w:footnote w:id="5">
     <w:p>
       <w:pPr>
         <w:pStyle w:val="FootnoteText"/>
@@ -3153,7 +2933,7 @@
         </w:rPr>
         <w:footnoteRef/>
       </w:r>
-      <w:hyperlink r:id="rId3">
+      <w:hyperlink r:id="rId4">
         <w:r>
           <w:rPr>
             <w:rStyle w:val="Hyperlink"/>
@@ -3164,7 +2944,7 @@
       </w:hyperlink>
     </w:p>
   </w:footnote>
-  <w:footnote w:id="5">
+  <w:footnote w:id="6">
     <w:p>
       <w:pPr>
         <w:pStyle w:val="FootnoteText"/>
@@ -3176,7 +2956,7 @@
         </w:rPr>
         <w:footnoteRef/>
       </w:r>
-      <w:hyperlink r:id="rId4">
+      <w:hyperlink r:id="rId5">
         <w:r>
           <w:rPr>
             <w:rStyle w:val="Hyperlink"/>
@@ -3187,7 +2967,7 @@
       </w:hyperlink>
     </w:p>
   </w:footnote>
-  <w:footnote w:id="6">
+  <w:footnote w:id="7">
     <w:p>
       <w:pPr>
         <w:pStyle w:val="FootnoteText"/>
@@ -3199,7 +2979,7 @@
         </w:rPr>
         <w:footnoteRef/>
       </w:r>
-      <w:hyperlink r:id="rId5">
+      <w:hyperlink r:id="rId6">
         <w:r>
           <w:rPr>
             <w:rStyle w:val="Hyperlink"/>
@@ -3210,7 +2990,7 @@
       </w:hyperlink>
     </w:p>
   </w:footnote>
-  <w:footnote w:id="7">
+  <w:footnote w:id="8">
     <w:p>
       <w:pPr>
         <w:pStyle w:val="FootnoteText"/>
@@ -3222,7 +3002,7 @@
         </w:rPr>
         <w:footnoteRef/>
       </w:r>
-      <w:hyperlink r:id="rId6">
+      <w:hyperlink r:id="rId7">
         <w:r>
           <w:rPr>
             <w:rStyle w:val="Hyperlink"/>
@@ -3233,7 +3013,7 @@
       </w:hyperlink>
     </w:p>
   </w:footnote>
-  <w:footnote w:id="8">
+  <w:footnote w:id="9">
     <w:p>
       <w:pPr>
         <w:pStyle w:val="FootnoteText"/>
@@ -3245,7 +3025,7 @@
         </w:rPr>
         <w:footnoteRef/>
       </w:r>
-      <w:hyperlink r:id="rId7">
+      <w:hyperlink r:id="rId8">
         <w:r>
           <w:rPr>
             <w:rStyle w:val="Hyperlink"/>
@@ -3299,9 +3079,9 @@
           <wp:wrapThrough wrapText="bothSides">
             <wp:wrapPolygon edited="0">
               <wp:start x="-8" y="0"/>
-              <wp:lineTo x="-8" y="20675"/>
-              <wp:lineTo x="21023" y="20675"/>
-              <wp:lineTo x="21023" y="0"/>
+              <wp:lineTo x="-8" y="20673"/>
+              <wp:lineTo x="21020" y="20673"/>
+              <wp:lineTo x="21020" y="0"/>
               <wp:lineTo x="-8" y="0"/>
             </wp:wrapPolygon>
           </wp:wrapThrough>
@@ -3465,9 +3245,9 @@
           <wp:wrapThrough wrapText="bothSides">
             <wp:wrapPolygon edited="0">
               <wp:start x="-8" y="0"/>
-              <wp:lineTo x="-8" y="20675"/>
-              <wp:lineTo x="21023" y="20675"/>
-              <wp:lineTo x="21023" y="0"/>
+              <wp:lineTo x="-8" y="20673"/>
+              <wp:lineTo x="21020" y="20673"/>
+              <wp:lineTo x="21020" y="0"/>
               <wp:lineTo x="-8" y="0"/>
             </wp:wrapPolygon>
           </wp:wrapThrough>
@@ -3747,7 +3527,6 @@
   <w:abstractNum w:abstractNumId="2">
     <w:lvl w:ilvl="0">
       <w:start w:val="1"/>
-      <w:pStyle w:val="Heading1"/>
       <w:numFmt w:val="none"/>
       <w:suff w:val="nothing"/>
       <w:lvlText w:val=""/>
@@ -4449,16 +4228,12 @@
   <w:style w:type="character" w:styleId="Caracteresdenotaderodap">
     <w:name w:val="Caracteres de nota de rodapé"/>
     <w:qFormat/>
-    <w:rPr/>
-  </w:style>
-  <w:style w:type="character" w:styleId="FootnoteReference">
-    <w:name w:val="Footnote Reference"/>
     <w:rPr>
       <w:vertAlign w:val="superscript"/>
     </w:rPr>
   </w:style>
-  <w:style w:type="character" w:styleId="EndnoteReference">
-    <w:name w:val="Endnote Reference"/>
+  <w:style w:type="character" w:styleId="FootnoteReference">
+    <w:name w:val="Footnote Reference"/>
     <w:rPr>
       <w:vertAlign w:val="superscript"/>
     </w:rPr>
@@ -4467,6 +4242,12 @@
     <w:name w:val="Caracteres de nota de fim"/>
     <w:qFormat/>
     <w:rPr/>
+  </w:style>
+  <w:style w:type="character" w:styleId="EndnoteReference">
+    <w:name w:val="Endnote Reference"/>
+    <w:rPr>
+      <w:vertAlign w:val="superscript"/>
+    </w:rPr>
   </w:style>
   <w:style w:type="character" w:styleId="Strong">
     <w:name w:val="Strong"/>

</xml_diff>

<commit_message>
sugestao de artigos sobre pacotes
</commit_message>
<xml_diff>
--- a/TCC_rtheodoro.docx
+++ b/TCC_rtheodoro.docx
@@ -131,7 +131,7 @@
       </w:pPr>
       <w:r>
         <w:rPr>
-          <w:rFonts w:eastAsiaTheme="minorHAnsi"/>
+          <w:rFonts w:eastAsia="Calibri" w:eastAsiaTheme="minorHAnsi"/>
           <w:sz w:val="18"/>
           <w:szCs w:val="18"/>
           <w:shd w:fill="auto" w:val="clear"/>
@@ -175,7 +175,9 @@
         </w:rPr>
       </w:pPr>
       <w:r>
-        <w:rPr/>
+        <w:rPr>
+          <w:shd w:fill="FFFF00" w:val="clear"/>
+        </w:rPr>
       </w:r>
     </w:p>
     <w:p>
@@ -759,11 +761,7 @@
       </w:r>
       <w:r>
         <w:rPr/>
-        <w:t xml:space="preserve">, </w:t>
-      </w:r>
-      <w:r>
-        <w:rPr/>
-        <w:t>rbcb</w:t>
+        <w:t>, rbcb</w:t>
       </w:r>
       <w:r>
         <w:rPr>
@@ -773,11 +771,7 @@
       </w:r>
       <w:r>
         <w:rPr/>
-        <w:t xml:space="preserve"> </w:t>
-      </w:r>
-      <w:r>
-        <w:rPr/>
-        <w:t>e o BETS</w:t>
+        <w:t xml:space="preserve"> e o BETS</w:t>
       </w:r>
       <w:r>
         <w:rPr>
@@ -1787,19 +1781,7 @@
         <w:rPr>
           <w:rStyle w:val="normaltextrun"/>
         </w:rPr>
-        <w:t xml:space="preserve">`download_normative_data()`:  Baixa os atos normativos do </w:t>
-      </w:r>
-      <w:r>
-        <w:rPr>
-          <w:rStyle w:val="normaltextrun"/>
-        </w:rPr>
-        <w:t>Bacen</w:t>
-      </w:r>
-      <w:r>
-        <w:rPr>
-          <w:rStyle w:val="normaltextrun"/>
-        </w:rPr>
-        <w:t xml:space="preserve"> por termos e janela de datas.</w:t>
+        <w:t>`download_normative_data()`:  Baixa os atos normativos do Bacen por termos e janela de datas.</w:t>
       </w:r>
     </w:p>
     <w:p>
@@ -1818,19 +1800,7 @@
         <w:rPr>
           <w:rStyle w:val="normaltextrun"/>
         </w:rPr>
-        <w:t xml:space="preserve">`download_normative_txt()`: Baixa o texto dos atos normativos do </w:t>
-      </w:r>
-      <w:r>
-        <w:rPr>
-          <w:rStyle w:val="normaltextrun"/>
-        </w:rPr>
-        <w:t>Bacen</w:t>
-      </w:r>
-      <w:r>
-        <w:rPr>
-          <w:rStyle w:val="normaltextrun"/>
-        </w:rPr>
-        <w:t>, de acordo o data.frame gerado pela função [download_normative_data()]</w:t>
+        <w:t>`download_normative_txt()`: Baixa o texto dos atos normativos do Bacen, de acordo o data.frame gerado pela função [download_normative_data()]</w:t>
       </w:r>
     </w:p>
     <w:p>
@@ -1849,13 +1819,7 @@
         <w:rPr>
           <w:rStyle w:val="normaltextrun"/>
         </w:rPr>
-        <w:t xml:space="preserve">`download_balance_sheets()`: Baixa os balanços e balancetes das instituições financeiras, por ano e mês e tipo do documento, presentes no </w:t>
-      </w:r>
-      <w:r>
-        <w:rPr>
-          <w:rStyle w:val="normaltextrun"/>
-        </w:rPr>
-        <w:t>Bacen</w:t>
+        <w:t>`download_balance_sheets()`: Baixa os balanços e balancetes das instituições financeiras, por ano e mês e tipo do documento, presentes no Bacen</w:t>
       </w:r>
     </w:p>
     <w:p>
@@ -1874,19 +1838,7 @@
         <w:rPr>
           <w:rStyle w:val="normaltextrun"/>
         </w:rPr>
-        <w:t xml:space="preserve">`treatment_balance_sheets()`: Processa e organiza os balanços baixados do </w:t>
-      </w:r>
-      <w:r>
-        <w:rPr>
-          <w:rStyle w:val="normaltextrun"/>
-        </w:rPr>
-        <w:t>Bacen</w:t>
-      </w:r>
-      <w:r>
-        <w:rPr>
-          <w:rStyle w:val="normaltextrun"/>
-        </w:rPr>
-        <w:t xml:space="preserve"> pela função [download_balance_sheets()]</w:t>
+        <w:t>`treatment_balance_sheets()`: Processa e organiza os balanços baixados do Bacen pela função [download_balance_sheets()]</w:t>
       </w:r>
     </w:p>
     <w:p>
@@ -2059,7 +2011,10 @@
         </w:rPr>
       </w:pPr>
       <w:r>
-        <w:rPr/>
+        <w:rPr>
+          <w:color w:val="000000"/>
+          <w:shd w:fill="FFFFFF" w:val="clear"/>
+        </w:rPr>
       </w:r>
     </w:p>
     <w:p>
@@ -2075,7 +2030,10 @@
         </w:rPr>
       </w:pPr>
       <w:r>
-        <w:rPr/>
+        <w:rPr>
+          <w:color w:val="000000"/>
+          <w:shd w:fill="FFFFFF" w:val="clear"/>
+        </w:rPr>
       </w:r>
     </w:p>
     <w:p>
@@ -2649,7 +2607,7 @@
     <w:p>
       <w:pPr>
         <w:overflowPunct w:val="false"/>
-        <w:spacing w:before="238" w:after="198" w:lineRule="auto" w:line="240"/>
+        <w:spacing w:lineRule="auto" w:line="240"/>
         <w:jc w:val="left"/>
         <w:rPr/>
       </w:pPr>
@@ -2662,6 +2620,30 @@
         </w:rPr>
         <w:t>- Qual a diferença para outros pacotes/APIS do Bacen (é só o BacenAPI)?</w:t>
       </w:r>
+    </w:p>
+    <w:p>
+      <w:pPr>
+        <w:overflowPunct w:val="false"/>
+        <w:spacing w:lineRule="auto" w:line="240"/>
+        <w:jc w:val="left"/>
+        <w:rPr/>
+      </w:pPr>
+      <w:r>
+        <w:rPr>
+          <w:rFonts w:ascii="Liberation Serif" w:hAnsi="Liberation Serif" w:eastAsia="DejaVu Sans" w:cs="Noto Sans Arabic UI"/>
+          <w:sz w:val="24"/>
+          <w:szCs w:val="24"/>
+          <w:lang w:val="en-US" w:eastAsia="en-US" w:bidi="en-US"/>
+        </w:rPr>
+      </w:r>
+    </w:p>
+    <w:p>
+      <w:pPr>
+        <w:overflowPunct w:val="false"/>
+        <w:spacing w:lineRule="auto" w:line="240"/>
+        <w:jc w:val="left"/>
+        <w:rPr/>
+      </w:pPr>
       <w:r>
         <w:rPr>
           <w:rFonts w:ascii="Liberation Serif" w:hAnsi="Liberation Serif" w:eastAsia="DejaVu Sans" w:cs="Noto Sans Arabic UI"/>
@@ -2669,7 +2651,7 @@
           <w:szCs w:val="20"/>
           <w:lang w:val="en-US" w:eastAsia="en-US" w:bidi="en-US"/>
         </w:rPr>
-        <w:br/>
+        <w:t> - há muitos pacotes desenvolvidos para fins específicos de diferentes bancos de dados. Talvez avaliar se consegue ver citações/usos desses pacotes na literatura, para mostrar a importância/impacto dessa disponibilidade para uso dessas ferramentas.</w:t>
       </w:r>
       <w:r>
         <w:rPr>
@@ -2687,7 +2669,82 @@
           <w:szCs w:val="20"/>
           <w:lang w:val="en-US" w:eastAsia="en-US" w:bidi="en-US"/>
         </w:rPr>
-        <w:t> - há muitos pacotes desenvolvidos para fins específicos de diferentes bancos de dados. Talvez avaliar se consegue ver citações/usos desses pacotes na literatura, para mostrar a importância/impacto dessa disponibilidade para uso dessas ferramentas.</w:t>
+        <w:br/>
+      </w:r>
+      <w:r>
+        <w:rPr>
+          <w:rFonts w:ascii="Liberation Serif" w:hAnsi="Liberation Serif" w:eastAsia="DejaVu Sans" w:cs="Noto Sans Arabic UI"/>
+          <w:sz w:val="20"/>
+          <w:szCs w:val="20"/>
+          <w:lang w:val="en-US" w:eastAsia="en-US" w:bidi="en-US"/>
+        </w:rPr>
+        <w:t xml:space="preserve">Usar de exemplo: </w:t>
+      </w:r>
+      <w:hyperlink r:id="rId1">
+        <w:r>
+          <w:rPr>
+            <w:rFonts w:ascii="Liberation Serif" w:hAnsi="Liberation Serif" w:eastAsia="DejaVu Sans" w:cs="Noto Sans Arabic UI"/>
+            <w:sz w:val="20"/>
+            <w:szCs w:val="20"/>
+            <w:lang w:val="en-US" w:eastAsia="en-US" w:bidi="en-US"/>
+          </w:rPr>
+          <w:t>https://link.springer.com/article/10.1186/s12859-024-05826-2</w:t>
+        </w:r>
+      </w:hyperlink>
+      <w:r>
+        <w:rPr>
+          <w:rFonts w:ascii="Liberation Serif" w:hAnsi="Liberation Serif" w:eastAsia="DejaVu Sans" w:cs="Noto Sans Arabic UI"/>
+          <w:sz w:val="20"/>
+          <w:szCs w:val="20"/>
+          <w:lang w:val="en-US" w:eastAsia="en-US" w:bidi="en-US"/>
+        </w:rPr>
+        <w:br/>
+      </w:r>
+      <w:r>
+        <w:rPr>
+          <w:rFonts w:ascii="Liberation Serif" w:hAnsi="Liberation Serif" w:eastAsia="DejaVu Sans" w:cs="Noto Sans Arabic UI"/>
+          <w:sz w:val="20"/>
+          <w:szCs w:val="20"/>
+          <w:lang w:val="en-US" w:eastAsia="en-US" w:bidi="en-US"/>
+        </w:rPr>
+        <w:br/>
+      </w:r>
+      <w:hyperlink r:id="rId2">
+        <w:r>
+          <w:rPr>
+            <w:rFonts w:ascii="Liberation Serif" w:hAnsi="Liberation Serif" w:eastAsia="DejaVu Sans" w:cs="Noto Sans Arabic UI"/>
+            <w:sz w:val="20"/>
+            <w:szCs w:val="20"/>
+            <w:lang w:val="en-US" w:eastAsia="en-US" w:bidi="en-US"/>
+          </w:rPr>
+          <w:t>https://www.jstatsoft.org/article/view/v111i09</w:t>
+        </w:r>
+      </w:hyperlink>
+    </w:p>
+    <w:p>
+      <w:pPr>
+        <w:overflowPunct w:val="false"/>
+        <w:spacing w:lineRule="auto" w:line="240"/>
+        <w:jc w:val="left"/>
+        <w:rPr/>
+      </w:pPr>
+      <w:r>
+        <w:rPr>
+          <w:rFonts w:ascii="Liberation Serif" w:hAnsi="Liberation Serif" w:eastAsia="DejaVu Sans" w:cs="Noto Sans Arabic UI"/>
+          <w:sz w:val="20"/>
+          <w:szCs w:val="20"/>
+          <w:lang w:val="en-US" w:eastAsia="en-US" w:bidi="en-US"/>
+        </w:rPr>
+        <w:br/>
+      </w:r>
+      <w:r>
+        <w:rPr>
+          <w:rFonts w:ascii="Liberation Serif" w:hAnsi="Liberation Serif" w:eastAsia="DejaVu Sans" w:cs="Noto Sans Arabic UI"/>
+          <w:sz w:val="20"/>
+          <w:szCs w:val="20"/>
+          <w:lang w:val="en-US" w:eastAsia="en-US" w:bidi="en-US"/>
+        </w:rPr>
+        <w:br/>
       </w:r>
     </w:p>
   </w:comment>
@@ -3079,9 +3136,9 @@
           <wp:wrapThrough wrapText="bothSides">
             <wp:wrapPolygon edited="0">
               <wp:start x="-8" y="0"/>
-              <wp:lineTo x="-8" y="20673"/>
-              <wp:lineTo x="21020" y="20673"/>
-              <wp:lineTo x="21020" y="0"/>
+              <wp:lineTo x="-8" y="20671"/>
+              <wp:lineTo x="21017" y="20671"/>
+              <wp:lineTo x="21017" y="0"/>
               <wp:lineTo x="-8" y="0"/>
             </wp:wrapPolygon>
           </wp:wrapThrough>
@@ -3245,9 +3302,9 @@
           <wp:wrapThrough wrapText="bothSides">
             <wp:wrapPolygon edited="0">
               <wp:start x="-8" y="0"/>
-              <wp:lineTo x="-8" y="20673"/>
-              <wp:lineTo x="21020" y="20673"/>
-              <wp:lineTo x="21020" y="0"/>
+              <wp:lineTo x="-8" y="20671"/>
+              <wp:lineTo x="21017" y="20671"/>
+              <wp:lineTo x="21017" y="0"/>
               <wp:lineTo x="-8" y="0"/>
             </wp:wrapPolygon>
           </wp:wrapThrough>
@@ -4241,7 +4298,9 @@
   <w:style w:type="character" w:styleId="Caracteresdenotadefim">
     <w:name w:val="Caracteres de nota de fim"/>
     <w:qFormat/>
-    <w:rPr/>
+    <w:rPr>
+      <w:vertAlign w:val="superscript"/>
+    </w:rPr>
   </w:style>
   <w:style w:type="character" w:styleId="EndnoteReference">
     <w:name w:val="Endnote Reference"/>

</xml_diff>

<commit_message>
versao 1 finalizada, faltam duas referencias
</commit_message>
<xml_diff>
--- a/TCC_rtheodoro.docx
+++ b/TCC_rtheodoro.docx
@@ -15,7 +15,25 @@
         <w:rPr>
           <w:b/>
         </w:rPr>
-        <w:t>Bacenr: pacote em R para download e tratamento de dados do Banco Central do Brasil</w:t>
+        <w:t>b</w:t>
+      </w:r>
+      <w:r>
+        <w:rPr>
+          <w:b/>
+        </w:rPr>
+        <w:t>acen</w:t>
+      </w:r>
+      <w:r>
+        <w:rPr>
+          <w:b/>
+        </w:rPr>
+        <w:t>R</w:t>
+      </w:r>
+      <w:r>
+        <w:rPr>
+          <w:b/>
+        </w:rPr>
+        <w:t>: pacote em R para download e tratamento de dados do Banco Central do Brasil</w:t>
       </w:r>
     </w:p>
     <w:p>
@@ -571,17 +589,25 @@
     <w:p>
       <w:pPr>
         <w:pStyle w:val="Normal"/>
-        <w:spacing w:lineRule="auto" w:line="240"/>
-        <w:rPr>
-          <w:b/>
-          <w:u w:val="double"/>
-        </w:rPr>
-      </w:pPr>
-      <w:r>
-        <w:rPr>
-          <w:b/>
-          <w:u w:val="double"/>
-        </w:rPr>
+        <w:widowControl/>
+        <w:suppressAutoHyphens w:val="true"/>
+        <w:bidi w:val="0"/>
+        <w:spacing w:lineRule="auto" w:line="240" w:before="0" w:after="0"/>
+        <w:ind w:firstLine="737" w:left="0" w:right="0"/>
+        <w:jc w:val="both"/>
+        <w:rPr>
+          <w:b w:val="false"/>
+          <w:bCs w:val="false"/>
+          <w:u w:val="none"/>
+        </w:rPr>
+      </w:pPr>
+      <w:r>
+        <w:rPr>
+          <w:b w:val="false"/>
+          <w:bCs w:val="false"/>
+          <w:u w:val="none"/>
+        </w:rPr>
+        <w:t>Para que uma pesquisa apresente qualidade, é essencial que os dados utilizados também sejam confiáveis e bem estruturados. O Banco Central do Brasil [Bacen] disponibiliza uma ampla série de dados, cuja coleta manual pode demandar tempo e esforço significativos. Nesse contexto, o pacote bacenR surge como uma ferramenta que facilita o acesso a informações de instituições financeiras disponibilizadas pelo Bacen, sendo elas balanços, dados cadastrais, atos normativos e carteiras de crédito. Atualmente, o pacote conta com uma versão estável disponível no CRAN e uma versão em desenvolvimento no GitHub. Sua aplicação demonstra eficiência no processo de download e tratamento de dados, permitindo a obtenção de grandes volumes de informações com poucas linhas de código, o que reduz o tempo dedicado à coleta e amplia o tempo disponível para a análise dos resultados.</w:t>
       </w:r>
     </w:p>
     <w:p>
@@ -589,13 +615,26 @@
         <w:pStyle w:val="Normal"/>
         <w:spacing w:lineRule="auto" w:line="240"/>
         <w:rPr>
-          <w:color w:val="000000"/>
-        </w:rPr>
-      </w:pPr>
-      <w:r>
-        <w:rPr>
-          <w:color w:val="000000"/>
-        </w:rPr>
+          <w:b/>
+          <w:bCs/>
+          <w:color w:val="000000"/>
+        </w:rPr>
+      </w:pPr>
+      <w:r>
+        <w:rPr>
+          <w:b/>
+          <w:bCs/>
+          <w:color w:val="000000"/>
+        </w:rPr>
+        <w:t>Palavras-chave:</w:t>
+      </w:r>
+      <w:r>
+        <w:rPr>
+          <w:b w:val="false"/>
+          <w:bCs w:val="false"/>
+          <w:color w:val="000000"/>
+        </w:rPr>
+        <w:t xml:space="preserve"> Bacen; webscraping; dados; ifdata; instituições financeiras</w:t>
       </w:r>
     </w:p>
     <w:p>
@@ -781,7 +820,15 @@
       </w:r>
       <w:r>
         <w:rPr/>
-        <w:t xml:space="preserve"> já demonstram que existe uma necessidade de soluções “open source” para a pesquisa econômica e financeira nacional. O acesso facilitado aos dados permite que mais pessoas investiguem problemas importantes, contribuam para o avanço do conhecimento e geram resultados com potenciais de pautar políticas públicas, mesmo sem profundo conhecimento em programação.</w:t>
+        <w:t xml:space="preserve"> </w:t>
+      </w:r>
+      <w:r>
+        <w:rPr/>
+        <w:t>(que são focados em dados do IPCA, SELIC, PIB e Débitos do Governo, por exemplo)</w:t>
+      </w:r>
+      <w:r>
+        <w:rPr/>
+        <w:t xml:space="preserve"> já demonstram que existe uma necessidade de soluções “open source” para a pesquisa econômica e financeira nacional. </w:t>
       </w:r>
     </w:p>
     <w:p>
@@ -796,12 +843,52 @@
       </w:pPr>
       <w:r>
         <w:rPr/>
-        <w:t xml:space="preserve">Tendo em vista os pontos apresentados, o objetivo deste trabalho foi criar um pacote em R, nomeado de bacenR, para baixar informações sobre Instruções Normativas que regem a regulação e fiscalização das instituições financeiras e os Balanços e Balancetes das mesmas, de forma que os dados baixados sejam facilmente tratados e organizados. </w:t>
+        <w:t xml:space="preserve">O acesso facilitado aos dados permite que mais pessoas investiguem problemas importantes, contribuam para o avanço do conhecimento e gerem resultados com potenciais de pautar políticas públicas, mesmo sem profundo conhecimento em programação. </w:t>
+      </w:r>
+      <w:r>
+        <w:rPr/>
+        <w:t>Entretanto, dado a grande disponibilidade de dados pelo Bacen, estes três pacotes não cobrem todos, surgindo a necessidade de um pacote para baixar dados como os balanços das instituições financeiras, organizar estes balanços para que facilitar seu uso e baixar as instruções normativas emitidas pela Comissão de Valores Mobiliários [CVM] e disponibilizadas pelo Bacen.</w:t>
       </w:r>
     </w:p>
     <w:p>
       <w:pPr>
         <w:pStyle w:val="BodyText"/>
+        <w:widowControl/>
+        <w:bidi w:val="0"/>
+        <w:spacing w:lineRule="auto" w:line="360" w:before="0" w:after="140"/>
+        <w:ind w:firstLine="737" w:left="0" w:right="0"/>
+        <w:jc w:val="both"/>
+        <w:rPr/>
+      </w:pPr>
+      <w:r>
+        <w:rPr/>
+        <w:t xml:space="preserve">Tendo em vista os pontos apresentados, o objetivo deste trabalho foi criar um pacote em R, nomeado de bacenR, para baixar informações sobre Instruções Normativas que regem a regulação e fiscalização das instituições financeiras, os Balanços e Balancetes das mesmas, </w:t>
+      </w:r>
+      <w:r>
+        <w:rPr/>
+        <w:t xml:space="preserve">informações sobre as carteiras de crédito ativas de cada instituição e dados sobre o endereço das instituições financeiras ativas em cada período, </w:t>
+      </w:r>
+      <w:r>
+        <w:rPr/>
+        <w:t xml:space="preserve">de forma que os dados </w:t>
+      </w:r>
+      <w:r>
+        <w:rPr/>
+        <w:t xml:space="preserve">obtidos </w:t>
+      </w:r>
+      <w:r>
+        <w:rPr/>
+        <w:t xml:space="preserve">sejam facilmente tratados e organizados. </w:t>
+      </w:r>
+    </w:p>
+    <w:p>
+      <w:pPr>
+        <w:pStyle w:val="BodyText"/>
+        <w:widowControl/>
+        <w:bidi w:val="0"/>
+        <w:spacing w:lineRule="auto" w:line="360" w:before="0" w:after="140"/>
+        <w:ind w:firstLine="737" w:left="0" w:right="0"/>
+        <w:jc w:val="both"/>
         <w:rPr/>
       </w:pPr>
       <w:r>
@@ -1002,11 +1089,11 @@
           <w:b w:val="false"/>
           <w:bCs w:val="false"/>
         </w:rPr>
-        <w:t>bacenR v0.1.0 – Beta Test</w:t>
-      </w:r>
-      <w:r>
-        <w:rPr/>
-        <w:t>, foi classificada como versão beta, uma vez que, apesar dos testes realizados, ainda poderiam ser identificados erros residuais. Para ampliar a fase de validação, o pacote foi também divulgado em redes sociais (WhatsApp, Twitter/X e LinkedIn), juntamente com um formulário destinado à coleta das primeiras impressões dos usuários. As informações obtidas por meio desse instrumento servirão de subsídio para a identificação de falhas, proposição de melhorias e definição de novas funcionalidades a serem incorporadas. O usuário também pode dar sua opinião, tirar dúvidas e sugerir melhorias através das “issues” do “Github”</w:t>
+        <w:t>bacenR v0.1.0</w:t>
+      </w:r>
+      <w:r>
+        <w:rPr/>
+        <w:t>, foi classificada como versão beta, uma vez que, apesar dos testes realizados, ainda poderiam ser identificados erros residuais. Para ampliar a fase de validação, o pacote foi também divulgado em redes sociais (WhatsApp, Twitter/X e LinkedIn). Com várias pessoas utilizando, foi possível obter feedbacks para a identificar falhas, propor melhorias e definir novas funcionalidades a serem incorporadas. O usuário também pode dar sua opinião, tirar dúvidas e sugerir melhorias através das “issues” do “Github”</w:t>
       </w:r>
       <w:r>
         <w:rPr>
@@ -1032,7 +1119,41 @@
       </w:pPr>
       <w:r>
         <w:rPr/>
-        <w:t>Mesmo em fase beta, o pacote foi submetido à avaliação do “</w:t>
+        <w:t>Após os feedbacks, as funções foram ajustadas e novas funções foram adicionadas, seguindo a necessidade dos usuários. Estas novas funçõ</w:t>
+      </w:r>
+      <w:r>
+        <w:rPr/>
+        <w:t>es</w:t>
+      </w:r>
+      <w:r>
+        <w:rPr/>
+        <w:t xml:space="preserve"> possuíam o objetivo de coletar dados do IFdata</w:t>
+      </w:r>
+      <w:r>
+        <w:rPr>
+          <w:rStyle w:val="FootnoteReference"/>
+        </w:rPr>
+        <w:footnoteReference w:id="8"/>
+      </w:r>
+      <w:r>
+        <w:rPr/>
+        <w:t xml:space="preserve"> sobre as carteiras de crédito ativas das instituições financeiras e o endereço das instituições autorizadas.</w:t>
+      </w:r>
+    </w:p>
+    <w:p>
+      <w:pPr>
+        <w:pStyle w:val="BodyText"/>
+        <w:widowControl/>
+        <w:suppressAutoHyphens w:val="true"/>
+        <w:bidi w:val="0"/>
+        <w:spacing w:lineRule="auto" w:line="360" w:before="0" w:after="140"/>
+        <w:ind w:firstLine="680" w:left="0" w:right="0"/>
+        <w:jc w:val="both"/>
+        <w:rPr/>
+      </w:pPr>
+      <w:r>
+        <w:rPr/>
+        <w:t>Após uma série de testes e melhorias, já na versão 0.3.1, o pacote foi submetido à avaliação do “</w:t>
       </w:r>
       <w:r>
         <w:rPr>
@@ -1043,8 +1164,16 @@
         <w:t>Comprehensive R Archive Network” [CRAN]</w:t>
       </w:r>
       <w:r>
-        <w:rPr/>
-        <w:t>, repositório oficial da linguagem R, utilizando o pacote `rhub`, com vistas à sua futura publicação e disseminação formal junto à comunidade científica e técnica.</w:t>
+        <w:rPr>
+          <w:rStyle w:val="FootnoteReference"/>
+          <w:b w:val="false"/>
+          <w:bCs w:val="false"/>
+        </w:rPr>
+        <w:footnoteReference w:id="9"/>
+      </w:r>
+      <w:r>
+        <w:rPr/>
+        <w:t>, repositório oficial da linguagem R, com vistas à sua futura publicação e disseminação formal junto à comunidade científica e técnica.</w:t>
       </w:r>
     </w:p>
     <w:p>
@@ -1115,7 +1244,15 @@
           <w:color w:val="000000"/>
           <w:shd w:fill="FFFFFF" w:val="clear"/>
         </w:rPr>
-        <w:t>Como o primeiro passo foi a criação de um “Github Projects”, a Figura 1 apresenta algumas “issues” criadas para auxiliar na organização e desenvolvimento do pacote. Desta forma o usuário poderá ver se a função que ele precisa já está em desenvolvimento ou se é necessário solicitar. Também é possível que o próprio usuário contribua com a criação do pacote.</w:t>
+        <w:t xml:space="preserve">Como o primeiro passo foi a criação de um “Github Projects”, a Figura 1 apresenta algumas “issues” criadas para auxiliar na organização e desenvolvimento do pacote. Desta forma o usuário poderá ver se a função que ele precisa já está em desenvolvimento ou se é necessário solicitar. Também é possível que o próprio usuário contribua com </w:t>
+      </w:r>
+      <w:r>
+        <w:rPr>
+          <w:rStyle w:val="normaltextrun"/>
+          <w:color w:val="000000"/>
+          <w:shd w:fill="FFFFFF" w:val="clear"/>
+        </w:rPr>
+        <w:t>com o pacote, criando uma função que precisa e compartilhando para que outras pessoas possam utilizar.</w:t>
       </w:r>
     </w:p>
     <w:p>
@@ -1131,7 +1268,7 @@
       </w:pPr>
       <w:r>
         <w:drawing>
-          <wp:anchor behindDoc="0" distT="0" distB="0" distL="0" distR="0" simplePos="0" locked="0" layoutInCell="0" allowOverlap="1" relativeHeight="21">
+          <wp:anchor behindDoc="0" distT="0" distB="0" distL="0" distR="0" simplePos="0" locked="0" layoutInCell="0" allowOverlap="1" relativeHeight="35">
             <wp:simplePos x="0" y="0"/>
             <wp:positionH relativeFrom="column">
               <wp:align>center</wp:align>
@@ -1190,7 +1327,7 @@
           <w:color w:val="000000"/>
           <w:shd w:fill="FFFFFF" w:val="clear"/>
         </w:rPr>
-        <w:footnoteReference w:id="8"/>
+        <w:footnoteReference w:id="10"/>
       </w:r>
     </w:p>
     <w:p>
@@ -1250,7 +1387,23 @@
           <w:color w:val="000000"/>
           <w:shd w:fill="FFFFFF" w:val="clear"/>
         </w:rPr>
-        <w:t>Como pode ser observado, idioma escolhido para o pacote foi o inglês, pois foi considerado que através dele seria possível alcançar um maior número de pessoas. Entretanto, as mensagens de erro, e algumas instruções também foram adicionadas em português para facilitar o uso de brasileiros.</w:t>
+        <w:t>O</w:t>
+      </w:r>
+      <w:r>
+        <w:rPr>
+          <w:rStyle w:val="normaltextrun"/>
+          <w:color w:val="000000"/>
+          <w:shd w:fill="FFFFFF" w:val="clear"/>
+        </w:rPr>
+        <w:t xml:space="preserve"> idioma escolhido para o pacote foi o inglês, pois foi considerado que através dele seria possível alcançar um maior número de pessoas. Entretanto, as mensagens de erro, e algumas instruções também foram adicionadas em português para facilitar o uso de brasileiros. </w:t>
+      </w:r>
+      <w:r>
+        <w:rPr>
+          <w:rStyle w:val="normaltextrun"/>
+          <w:color w:val="000000"/>
+          <w:shd w:fill="FFFFFF" w:val="clear"/>
+        </w:rPr>
+        <w:t>Outras informações em português são os parâmetros de cada função.</w:t>
       </w:r>
     </w:p>
     <w:p>
@@ -1268,21 +1421,93 @@
           <w:color w:val="000000"/>
           <w:shd w:fill="FFFFFF" w:val="clear"/>
         </w:rPr>
-        <w:t>Seguindo o que foi estipulado pelo cronograma das tarefas, as primeiras funções desenvolvidas foram: `download_normative_data()`, `download_normative_txt()`, `</w:t>
-      </w:r>
-      <w:r>
-        <w:rPr>
-          <w:rStyle w:val="normaltextrun"/>
-        </w:rPr>
-        <w:t>download_balance_sheets()` e</w:t>
-      </w:r>
-      <w:r>
-        <w:rPr>
-          <w:rStyle w:val="normaltextrun"/>
-          <w:color w:val="000000"/>
-          <w:shd w:fill="FFFFFF" w:val="clear"/>
-        </w:rPr>
-        <w:t xml:space="preserve"> `treatment_balance_sheets()`. Após o pacote ser instalado, a documentação de cada função poderá ser dentro do próprio R, conforme exemplo da Figura 2.</w:t>
+        <w:t>Seguindo o que foi estipulado pelo cronograma das tarefas, as primeiras funções desenvolvidas foram: `</w:t>
+      </w:r>
+      <w:r>
+        <w:rPr>
+          <w:rStyle w:val="normaltextrun"/>
+          <w:color w:val="000000"/>
+          <w:shd w:fill="FFFFFF" w:val="clear"/>
+        </w:rPr>
+        <w:t>get</w:t>
+      </w:r>
+      <w:r>
+        <w:rPr>
+          <w:rStyle w:val="normaltextrun"/>
+          <w:color w:val="000000"/>
+          <w:shd w:fill="FFFFFF" w:val="clear"/>
+        </w:rPr>
+        <w:t>_normative_data()`, `</w:t>
+      </w:r>
+      <w:r>
+        <w:rPr>
+          <w:rStyle w:val="normaltextrun"/>
+          <w:color w:val="000000"/>
+          <w:shd w:fill="FFFFFF" w:val="clear"/>
+        </w:rPr>
+        <w:t>get</w:t>
+      </w:r>
+      <w:r>
+        <w:rPr>
+          <w:rStyle w:val="normaltextrun"/>
+          <w:color w:val="000000"/>
+          <w:shd w:fill="FFFFFF" w:val="clear"/>
+        </w:rPr>
+        <w:t>_normative_txt()`, `</w:t>
+      </w:r>
+      <w:r>
+        <w:rPr>
+          <w:rStyle w:val="normaltextrun"/>
+          <w:color w:val="000000"/>
+          <w:shd w:fill="FFFFFF" w:val="clear"/>
+        </w:rPr>
+        <w:t>get</w:t>
+      </w:r>
+      <w:r>
+        <w:rPr>
+          <w:rStyle w:val="normaltextrun"/>
+        </w:rPr>
+        <w:t>_balance_sheets()` e</w:t>
+      </w:r>
+      <w:r>
+        <w:rPr>
+          <w:rStyle w:val="normaltextrun"/>
+          <w:color w:val="000000"/>
+          <w:shd w:fill="FFFFFF" w:val="clear"/>
+        </w:rPr>
+        <w:t xml:space="preserve"> `</w:t>
+      </w:r>
+      <w:r>
+        <w:rPr>
+          <w:rStyle w:val="normaltextrun"/>
+          <w:color w:val="000000"/>
+          <w:shd w:fill="FFFFFF" w:val="clear"/>
+        </w:rPr>
+        <w:t>tidy</w:t>
+      </w:r>
+      <w:r>
+        <w:rPr>
+          <w:rStyle w:val="normaltextrun"/>
+          <w:color w:val="000000"/>
+          <w:shd w:fill="FFFFFF" w:val="clear"/>
+        </w:rPr>
+        <w:t xml:space="preserve">_balance_sheets()`. Após o pacote ser instalado, a documentação de cada função poderá ser dentro do próprio R, conforme exemplo da Figura 2, </w:t>
+      </w:r>
+      <w:r>
+        <w:rPr>
+          <w:rStyle w:val="normaltextrun"/>
+          <w:color w:val="000000"/>
+          <w:shd w:fill="FFFFFF" w:val="clear"/>
+        </w:rPr>
+        <w:t>usando o formato “??get_normative_data”</w:t>
+      </w:r>
+      <w:r>
+        <w:rPr>
+          <w:rStyle w:val="normaltextrun"/>
+          <w:color w:val="000000"/>
+          <w:shd w:fill="FFFFFF" w:val="clear"/>
+        </w:rPr>
+        <w:t>.</w:t>
       </w:r>
     </w:p>
     <w:p>
@@ -1295,19 +1520,87 @@
       </w:pPr>
       <w:r>
         <w:rPr/>
+      </w:r>
+    </w:p>
+    <w:p>
+      <w:pPr>
+        <w:pStyle w:val="ListParagraph"/>
+        <w:spacing w:lineRule="auto" w:line="360"/>
+        <w:ind w:firstLine="709" w:left="0"/>
+        <w:rPr>
+          <w:rStyle w:val="normaltextrun"/>
+          <w:color w:val="000000"/>
+          <w:shd w:fill="FFFFFF" w:val="clear"/>
+        </w:rPr>
+      </w:pPr>
+      <w:r>
+        <w:rPr>
+          <w:color w:val="000000"/>
+          <w:shd w:fill="FFFFFF" w:val="clear"/>
+        </w:rPr>
+      </w:r>
+    </w:p>
+    <w:p>
+      <w:pPr>
+        <w:pStyle w:val="ListParagraph"/>
+        <w:spacing w:lineRule="auto" w:line="360"/>
+        <w:ind w:firstLine="709" w:left="0"/>
+        <w:rPr>
+          <w:rStyle w:val="normaltextrun"/>
+          <w:color w:val="000000"/>
+          <w:shd w:fill="FFFFFF" w:val="clear"/>
+        </w:rPr>
+      </w:pPr>
+      <w:r>
+        <w:rPr>
+          <w:color w:val="000000"/>
+          <w:shd w:fill="FFFFFF" w:val="clear"/>
+        </w:rPr>
+      </w:r>
+    </w:p>
+    <w:p>
+      <w:pPr>
+        <w:pStyle w:val="ListParagraph"/>
+        <w:spacing w:lineRule="auto" w:line="360"/>
+        <w:ind w:firstLine="709" w:left="0"/>
+        <w:rPr>
+          <w:rStyle w:val="normaltextrun"/>
+          <w:color w:val="000000"/>
+          <w:shd w:fill="FFFFFF" w:val="clear"/>
+        </w:rPr>
+      </w:pPr>
+      <w:r>
+        <w:rPr>
+          <w:color w:val="000000"/>
+          <w:shd w:fill="FFFFFF" w:val="clear"/>
+        </w:rPr>
+      </w:r>
+    </w:p>
+    <w:p>
+      <w:pPr>
+        <w:pStyle w:val="ListParagraph"/>
+        <w:spacing w:lineRule="auto" w:line="360"/>
+        <w:ind w:firstLine="709" w:left="0"/>
+        <w:rPr>
+          <w:rStyle w:val="normaltextrun"/>
+          <w:color w:val="000000"/>
+          <w:shd w:fill="FFFFFF" w:val="clear"/>
+        </w:rPr>
+      </w:pPr>
+      <w:r>
         <w:drawing>
-          <wp:anchor behindDoc="0" distT="0" distB="0" distL="0" distR="0" simplePos="0" locked="0" layoutInCell="0" allowOverlap="1" relativeHeight="22">
+          <wp:anchor behindDoc="0" distT="0" distB="0" distL="0" distR="0" simplePos="0" locked="0" layoutInCell="0" allowOverlap="1" relativeHeight="37">
             <wp:simplePos x="0" y="0"/>
             <wp:positionH relativeFrom="column">
-              <wp:posOffset>1316990</wp:posOffset>
+              <wp:align>center</wp:align>
             </wp:positionH>
             <wp:positionV relativeFrom="paragraph">
-              <wp:posOffset>147955</wp:posOffset>
+              <wp:posOffset>635</wp:posOffset>
             </wp:positionV>
-            <wp:extent cx="3684905" cy="4376420"/>
+            <wp:extent cx="5759450" cy="2829560"/>
             <wp:effectExtent l="0" t="0" r="0" b="0"/>
             <wp:wrapSquare wrapText="largest"/>
-            <wp:docPr id="2" name="Figura3" descr=""/>
+            <wp:docPr id="2" name="Image1" descr=""/>
             <wp:cNvGraphicFramePr>
               <a:graphicFrameLocks xmlns:a="http://schemas.openxmlformats.org/drawingml/2006/main" noChangeAspect="1"/>
             </wp:cNvGraphicFramePr>
@@ -1315,14 +1608,13 @@
               <a:graphicData uri="http://schemas.openxmlformats.org/drawingml/2006/picture">
                 <pic:pic xmlns:pic="http://schemas.openxmlformats.org/drawingml/2006/picture">
                   <pic:nvPicPr>
-                    <pic:cNvPr id="2" name="Figura3" descr=""/>
+                    <pic:cNvPr id="2" name="Image1" descr=""/>
                     <pic:cNvPicPr>
                       <a:picLocks noChangeAspect="1" noChangeArrowheads="1"/>
                     </pic:cNvPicPr>
                   </pic:nvPicPr>
                   <pic:blipFill>
                     <a:blip r:embed="rId3"/>
-                    <a:srcRect l="0" t="9436" r="0" b="0"/>
                     <a:stretch>
                       <a:fillRect/>
                     </a:stretch>
@@ -1330,7 +1622,7 @@
                   <pic:spPr bwMode="auto">
                     <a:xfrm>
                       <a:off x="0" y="0"/>
-                      <a:ext cx="3684905" cy="4376420"/>
+                      <a:ext cx="5759450" cy="2829560"/>
                     </a:xfrm>
                     <a:prstGeom prst="rect">
                       <a:avLst/>
@@ -1342,349 +1634,29 @@
           </wp:anchor>
         </w:drawing>
       </w:r>
-    </w:p>
-    <w:p>
-      <w:pPr>
-        <w:pStyle w:val="ListParagraph"/>
-        <w:spacing w:lineRule="auto" w:line="360"/>
-        <w:ind w:firstLine="709" w:left="0"/>
-        <w:rPr>
-          <w:rStyle w:val="normaltextrun"/>
-          <w:color w:val="000000"/>
-          <w:shd w:fill="FFFFFF" w:val="clear"/>
-        </w:rPr>
-      </w:pPr>
-      <w:r>
-        <w:rPr>
-          <w:color w:val="000000"/>
-          <w:shd w:fill="FFFFFF" w:val="clear"/>
-        </w:rPr>
-      </w:r>
-    </w:p>
-    <w:p>
-      <w:pPr>
-        <w:pStyle w:val="ListParagraph"/>
-        <w:spacing w:lineRule="auto" w:line="360"/>
-        <w:ind w:firstLine="709" w:left="0"/>
-        <w:rPr>
-          <w:rStyle w:val="normaltextrun"/>
-          <w:color w:val="000000"/>
-          <w:shd w:fill="FFFFFF" w:val="clear"/>
-        </w:rPr>
-      </w:pPr>
-      <w:r>
-        <w:rPr>
-          <w:color w:val="000000"/>
-          <w:shd w:fill="FFFFFF" w:val="clear"/>
-        </w:rPr>
-      </w:r>
-    </w:p>
-    <w:p>
-      <w:pPr>
-        <w:pStyle w:val="ListParagraph"/>
-        <w:spacing w:lineRule="auto" w:line="360"/>
-        <w:ind w:firstLine="709" w:left="0"/>
-        <w:rPr>
-          <w:rStyle w:val="normaltextrun"/>
-          <w:color w:val="000000"/>
-          <w:shd w:fill="FFFFFF" w:val="clear"/>
-        </w:rPr>
-      </w:pPr>
-      <w:r>
-        <w:rPr>
-          <w:color w:val="000000"/>
-          <w:shd w:fill="FFFFFF" w:val="clear"/>
-        </w:rPr>
-      </w:r>
-    </w:p>
-    <w:p>
-      <w:pPr>
-        <w:pStyle w:val="ListParagraph"/>
-        <w:spacing w:lineRule="auto" w:line="360"/>
-        <w:ind w:firstLine="709" w:left="0"/>
-        <w:rPr>
-          <w:rStyle w:val="normaltextrun"/>
-          <w:color w:val="000000"/>
-          <w:shd w:fill="FFFFFF" w:val="clear"/>
-        </w:rPr>
-      </w:pPr>
-      <w:r>
-        <w:rPr>
-          <w:color w:val="000000"/>
-          <w:shd w:fill="FFFFFF" w:val="clear"/>
-        </w:rPr>
-      </w:r>
-    </w:p>
-    <w:p>
-      <w:pPr>
-        <w:pStyle w:val="ListParagraph"/>
-        <w:spacing w:lineRule="auto" w:line="360"/>
-        <w:ind w:firstLine="709" w:left="0"/>
-        <w:rPr>
-          <w:rStyle w:val="normaltextrun"/>
-          <w:color w:val="000000"/>
-          <w:shd w:fill="FFFFFF" w:val="clear"/>
-        </w:rPr>
-      </w:pPr>
-      <w:r>
-        <w:rPr>
-          <w:color w:val="000000"/>
-          <w:shd w:fill="FFFFFF" w:val="clear"/>
-        </w:rPr>
-      </w:r>
-    </w:p>
-    <w:p>
-      <w:pPr>
-        <w:pStyle w:val="ListParagraph"/>
-        <w:spacing w:lineRule="auto" w:line="360"/>
-        <w:ind w:firstLine="709" w:left="0"/>
-        <w:rPr>
-          <w:rStyle w:val="normaltextrun"/>
-          <w:color w:val="000000"/>
-          <w:shd w:fill="FFFFFF" w:val="clear"/>
-        </w:rPr>
-      </w:pPr>
-      <w:r>
-        <w:rPr>
-          <w:color w:val="000000"/>
-          <w:shd w:fill="FFFFFF" w:val="clear"/>
-        </w:rPr>
-      </w:r>
-    </w:p>
-    <w:p>
-      <w:pPr>
-        <w:pStyle w:val="ListParagraph"/>
-        <w:spacing w:lineRule="auto" w:line="360"/>
-        <w:ind w:firstLine="709" w:left="0"/>
-        <w:rPr>
-          <w:rStyle w:val="normaltextrun"/>
-          <w:color w:val="000000"/>
-          <w:shd w:fill="FFFFFF" w:val="clear"/>
-        </w:rPr>
-      </w:pPr>
-      <w:r>
-        <w:rPr>
-          <w:color w:val="000000"/>
-          <w:shd w:fill="FFFFFF" w:val="clear"/>
-        </w:rPr>
-      </w:r>
-    </w:p>
-    <w:p>
-      <w:pPr>
-        <w:pStyle w:val="ListParagraph"/>
-        <w:spacing w:lineRule="auto" w:line="360"/>
-        <w:ind w:firstLine="709" w:left="0"/>
-        <w:rPr>
-          <w:rStyle w:val="normaltextrun"/>
-          <w:color w:val="000000"/>
-          <w:shd w:fill="FFFFFF" w:val="clear"/>
-        </w:rPr>
-      </w:pPr>
-      <w:r>
-        <w:rPr>
-          <w:color w:val="000000"/>
-          <w:shd w:fill="FFFFFF" w:val="clear"/>
-        </w:rPr>
-      </w:r>
-    </w:p>
-    <w:p>
-      <w:pPr>
-        <w:pStyle w:val="ListParagraph"/>
-        <w:spacing w:lineRule="auto" w:line="360"/>
-        <w:ind w:firstLine="709" w:left="0"/>
-        <w:rPr>
-          <w:rStyle w:val="normaltextrun"/>
-          <w:color w:val="000000"/>
-          <w:shd w:fill="FFFFFF" w:val="clear"/>
-        </w:rPr>
-      </w:pPr>
-      <w:r>
-        <w:rPr>
-          <w:color w:val="000000"/>
-          <w:shd w:fill="FFFFFF" w:val="clear"/>
-        </w:rPr>
-      </w:r>
-    </w:p>
-    <w:p>
-      <w:pPr>
-        <w:pStyle w:val="ListParagraph"/>
-        <w:spacing w:lineRule="auto" w:line="360"/>
-        <w:ind w:firstLine="709" w:left="0"/>
-        <w:rPr>
-          <w:rStyle w:val="normaltextrun"/>
-          <w:color w:val="000000"/>
-          <w:shd w:fill="FFFFFF" w:val="clear"/>
-        </w:rPr>
-      </w:pPr>
-      <w:r>
-        <w:rPr>
-          <w:color w:val="000000"/>
-          <w:shd w:fill="FFFFFF" w:val="clear"/>
-        </w:rPr>
-      </w:r>
-    </w:p>
-    <w:p>
-      <w:pPr>
-        <w:pStyle w:val="ListParagraph"/>
-        <w:spacing w:lineRule="auto" w:line="360"/>
-        <w:ind w:firstLine="709" w:left="0"/>
-        <w:rPr>
-          <w:rStyle w:val="normaltextrun"/>
-          <w:color w:val="000000"/>
-          <w:shd w:fill="FFFFFF" w:val="clear"/>
-        </w:rPr>
-      </w:pPr>
-      <w:r>
-        <w:rPr>
-          <w:color w:val="000000"/>
-          <w:shd w:fill="FFFFFF" w:val="clear"/>
-        </w:rPr>
-      </w:r>
-    </w:p>
-    <w:p>
-      <w:pPr>
-        <w:pStyle w:val="ListParagraph"/>
-        <w:spacing w:lineRule="auto" w:line="360"/>
-        <w:ind w:firstLine="709" w:left="0"/>
-        <w:rPr>
-          <w:rStyle w:val="normaltextrun"/>
-          <w:color w:val="000000"/>
-          <w:shd w:fill="FFFFFF" w:val="clear"/>
-        </w:rPr>
-      </w:pPr>
-      <w:r>
-        <w:rPr>
-          <w:color w:val="000000"/>
-          <w:shd w:fill="FFFFFF" w:val="clear"/>
-        </w:rPr>
-      </w:r>
-    </w:p>
-    <w:p>
-      <w:pPr>
-        <w:pStyle w:val="ListParagraph"/>
-        <w:spacing w:lineRule="auto" w:line="360"/>
-        <w:ind w:firstLine="709" w:left="0"/>
-        <w:rPr>
-          <w:rStyle w:val="normaltextrun"/>
-          <w:color w:val="000000"/>
-          <w:shd w:fill="FFFFFF" w:val="clear"/>
-        </w:rPr>
-      </w:pPr>
-      <w:r>
-        <w:rPr>
-          <w:color w:val="000000"/>
-          <w:shd w:fill="FFFFFF" w:val="clear"/>
-        </w:rPr>
-      </w:r>
-    </w:p>
-    <w:p>
-      <w:pPr>
-        <w:pStyle w:val="ListParagraph"/>
-        <w:spacing w:lineRule="auto" w:line="360"/>
-        <w:ind w:firstLine="709" w:left="0"/>
-        <w:rPr>
-          <w:rStyle w:val="normaltextrun"/>
-          <w:color w:val="000000"/>
-          <w:shd w:fill="FFFFFF" w:val="clear"/>
-        </w:rPr>
-      </w:pPr>
-      <w:r>
-        <w:rPr>
-          <w:color w:val="000000"/>
-          <w:shd w:fill="FFFFFF" w:val="clear"/>
-        </w:rPr>
-      </w:r>
-    </w:p>
-    <w:p>
-      <w:pPr>
-        <w:pStyle w:val="ListParagraph"/>
-        <w:spacing w:lineRule="auto" w:line="360"/>
-        <w:ind w:firstLine="709" w:left="0"/>
-        <w:rPr>
-          <w:rStyle w:val="normaltextrun"/>
-          <w:color w:val="000000"/>
-          <w:shd w:fill="FFFFFF" w:val="clear"/>
-        </w:rPr>
-      </w:pPr>
-      <w:r>
-        <w:rPr>
-          <w:color w:val="000000"/>
-          <w:shd w:fill="FFFFFF" w:val="clear"/>
-        </w:rPr>
-      </w:r>
-    </w:p>
-    <w:p>
-      <w:pPr>
-        <w:pStyle w:val="ListParagraph"/>
-        <w:spacing w:lineRule="auto" w:line="360"/>
-        <w:ind w:firstLine="709" w:left="0"/>
-        <w:rPr>
-          <w:rStyle w:val="normaltextrun"/>
-          <w:color w:val="000000"/>
-          <w:shd w:fill="FFFFFF" w:val="clear"/>
-        </w:rPr>
-      </w:pPr>
-      <w:r>
-        <w:rPr>
-          <w:color w:val="000000"/>
-          <w:shd w:fill="FFFFFF" w:val="clear"/>
-        </w:rPr>
-      </w:r>
-    </w:p>
-    <w:p>
-      <w:pPr>
-        <w:pStyle w:val="ListParagraph"/>
-        <w:spacing w:lineRule="auto" w:line="360"/>
-        <w:ind w:firstLine="709" w:left="0"/>
-        <w:rPr>
-          <w:rStyle w:val="normaltextrun"/>
-          <w:color w:val="000000"/>
-          <w:shd w:fill="FFFFFF" w:val="clear"/>
-        </w:rPr>
-      </w:pPr>
-      <w:r>
-        <w:rPr>
-          <w:color w:val="000000"/>
-          <w:shd w:fill="FFFFFF" w:val="clear"/>
-        </w:rPr>
-      </w:r>
-    </w:p>
-    <w:p>
-      <w:pPr>
-        <w:pStyle w:val="ListParagraph"/>
-        <w:spacing w:lineRule="auto" w:line="360"/>
-        <w:ind w:firstLine="709" w:left="0"/>
-        <w:rPr>
-          <w:rStyle w:val="normaltextrun"/>
-          <w:color w:val="000000"/>
-          <w:shd w:fill="FFFFFF" w:val="clear"/>
-        </w:rPr>
-      </w:pPr>
-      <w:r>
-        <w:rPr>
-          <w:color w:val="000000"/>
-          <w:shd w:fill="FFFFFF" w:val="clear"/>
-        </w:rPr>
-      </w:r>
-    </w:p>
-    <w:p>
-      <w:pPr>
-        <w:pStyle w:val="ListParagraph"/>
-        <w:spacing w:lineRule="auto" w:line="360"/>
-        <w:ind w:firstLine="709" w:left="0"/>
-        <w:rPr>
-          <w:rStyle w:val="normaltextrun"/>
-          <w:color w:val="000000"/>
-          <w:shd w:fill="FFFFFF" w:val="clear"/>
-        </w:rPr>
-      </w:pPr>
-      <w:r>
-        <w:rPr>
-          <w:rStyle w:val="normaltextrun"/>
-          <w:color w:val="000000"/>
-          <w:shd w:fill="FFFFFF" w:val="clear"/>
-        </w:rPr>
-        <w:t>Figura 2. Exemplo da documentação da função `download_normative_data()`</w:t>
+      <w:r>
+        <w:rPr>
+          <w:rStyle w:val="normaltextrun"/>
+          <w:color w:val="000000"/>
+          <w:shd w:fill="FFFFFF" w:val="clear"/>
+        </w:rPr>
+        <w:t>Figura 2. Exemplo da documentação da função `</w:t>
+      </w:r>
+      <w:r>
+        <w:rPr>
+          <w:rStyle w:val="normaltextrun"/>
+          <w:color w:val="000000"/>
+          <w:shd w:fill="FFFFFF" w:val="clear"/>
+        </w:rPr>
+        <w:t>get</w:t>
+      </w:r>
+      <w:r>
+        <w:rPr>
+          <w:rStyle w:val="normaltextrun"/>
+          <w:color w:val="000000"/>
+          <w:shd w:fill="FFFFFF" w:val="clear"/>
+        </w:rPr>
+        <w:t>_normative_data()`</w:t>
       </w:r>
     </w:p>
     <w:p>
@@ -1781,7 +1753,19 @@
         <w:rPr>
           <w:rStyle w:val="normaltextrun"/>
         </w:rPr>
-        <w:t>`download_normative_data()`:  Baixa os atos normativos do Bacen por termos e janela de datas.</w:t>
+        <w:t>`</w:t>
+      </w:r>
+      <w:r>
+        <w:rPr>
+          <w:rStyle w:val="normaltextrun"/>
+        </w:rPr>
+        <w:t>get</w:t>
+      </w:r>
+      <w:r>
+        <w:rPr>
+          <w:rStyle w:val="normaltextrun"/>
+        </w:rPr>
+        <w:t>_normative_data()`:  Baixa os atos normativos do Bacen por termos e janela de datas.</w:t>
       </w:r>
     </w:p>
     <w:p>
@@ -1800,7 +1784,31 @@
         <w:rPr>
           <w:rStyle w:val="normaltextrun"/>
         </w:rPr>
-        <w:t>`download_normative_txt()`: Baixa o texto dos atos normativos do Bacen, de acordo o data.frame gerado pela função [download_normative_data()]</w:t>
+        <w:t>`</w:t>
+      </w:r>
+      <w:r>
+        <w:rPr>
+          <w:rStyle w:val="normaltextrun"/>
+        </w:rPr>
+        <w:t>get</w:t>
+      </w:r>
+      <w:r>
+        <w:rPr>
+          <w:rStyle w:val="normaltextrun"/>
+        </w:rPr>
+        <w:t>_normative_txt()`: Baixa o texto dos atos normativos do Bacen, de acordo o data.frame gerado pela função [</w:t>
+      </w:r>
+      <w:r>
+        <w:rPr>
+          <w:rStyle w:val="normaltextrun"/>
+        </w:rPr>
+        <w:t>get</w:t>
+      </w:r>
+      <w:r>
+        <w:rPr>
+          <w:rStyle w:val="normaltextrun"/>
+        </w:rPr>
+        <w:t>_normative_data()]</w:t>
       </w:r>
     </w:p>
     <w:p>
@@ -1819,7 +1827,19 @@
         <w:rPr>
           <w:rStyle w:val="normaltextrun"/>
         </w:rPr>
-        <w:t>`download_balance_sheets()`: Baixa os balanços e balancetes das instituições financeiras, por ano e mês e tipo do documento, presentes no Bacen</w:t>
+        <w:t>`</w:t>
+      </w:r>
+      <w:r>
+        <w:rPr>
+          <w:rStyle w:val="normaltextrun"/>
+        </w:rPr>
+        <w:t>get</w:t>
+      </w:r>
+      <w:r>
+        <w:rPr>
+          <w:rStyle w:val="normaltextrun"/>
+        </w:rPr>
+        <w:t>_balance_sheets()`: Baixa os balanços e balancetes das instituições financeiras, por ano e mês e tipo do documento, presentes no Bacen</w:t>
       </w:r>
     </w:p>
     <w:p>
@@ -1838,7 +1858,31 @@
         <w:rPr>
           <w:rStyle w:val="normaltextrun"/>
         </w:rPr>
-        <w:t>`treatment_balance_sheets()`: Processa e organiza os balanços baixados do Bacen pela função [download_balance_sheets()]</w:t>
+        <w:t>`t</w:t>
+      </w:r>
+      <w:r>
+        <w:rPr>
+          <w:rStyle w:val="normaltextrun"/>
+        </w:rPr>
+        <w:t>idy</w:t>
+      </w:r>
+      <w:r>
+        <w:rPr>
+          <w:rStyle w:val="normaltextrun"/>
+        </w:rPr>
+        <w:t>_balance_sheets()`: Processa e organiza os balanços baixados do Bacen pela função [</w:t>
+      </w:r>
+      <w:r>
+        <w:rPr>
+          <w:rStyle w:val="normaltextrun"/>
+        </w:rPr>
+        <w:t>get</w:t>
+      </w:r>
+      <w:r>
+        <w:rPr>
+          <w:rStyle w:val="normaltextrun"/>
+        </w:rPr>
+        <w:t>_balance_sheets()]</w:t>
       </w:r>
     </w:p>
     <w:p>
@@ -1877,7 +1921,7 @@
         <w:rPr>
           <w:rStyle w:val="FootnoteReference"/>
         </w:rPr>
-        <w:footnoteReference w:id="9"/>
+        <w:footnoteReference w:id="11"/>
       </w:r>
       <w:r>
         <w:rPr>
@@ -1896,7 +1940,7 @@
       </w:pPr>
       <w:r>
         <w:drawing>
-          <wp:anchor behindDoc="0" distT="0" distB="0" distL="0" distR="0" simplePos="0" locked="0" layoutInCell="0" allowOverlap="1" relativeHeight="23">
+          <wp:anchor behindDoc="0" distT="0" distB="0" distL="0" distR="0" simplePos="0" locked="0" layoutInCell="0" allowOverlap="1" relativeHeight="36">
             <wp:simplePos x="0" y="0"/>
             <wp:positionH relativeFrom="column">
               <wp:align>center</wp:align>
@@ -1995,7 +2039,24 @@
           <w:color w:val="000000"/>
           <w:shd w:fill="FFFFFF" w:val="clear"/>
         </w:rPr>
-        <w:t>Caso o pacote seja utilizado para elaboração de algum artigo, trabalho ou livro, ele deverá ser referenciado de conforme .bib abaixo:</w:t>
+        <w:t>O README.md contém uma breve apresentação do pacote, sugestões de pacotes semelhantes (como o BacenAPI e o rbcb), como instalar, usos básicos, lista de tarefas futuras, sobre o autor, como citar e como apoiar. Também existe uma página que serve como guia para que outras pessoas possam contribuir com o pacote</w:t>
+      </w:r>
+      <w:r>
+        <w:rPr>
+          <w:rStyle w:val="normaltextrun"/>
+          <w:rStyle w:val="FootnoteReference"/>
+          <w:color w:val="000000"/>
+          <w:shd w:fill="FFFFFF" w:val="clear"/>
+        </w:rPr>
+        <w:footnoteReference w:id="12"/>
+      </w:r>
+      <w:r>
+        <w:rPr>
+          <w:rStyle w:val="normaltextrun"/>
+          <w:color w:val="000000"/>
+          <w:shd w:fill="FFFFFF" w:val="clear"/>
+        </w:rPr>
+        <w:t>.</w:t>
       </w:r>
     </w:p>
     <w:p>
@@ -2012,9 +2073,11 @@
       </w:pPr>
       <w:r>
         <w:rPr>
-          <w:color w:val="000000"/>
-          <w:shd w:fill="FFFFFF" w:val="clear"/>
-        </w:rPr>
+          <w:rStyle w:val="normaltextrun"/>
+          <w:color w:val="000000"/>
+          <w:shd w:fill="FFFFFF" w:val="clear"/>
+        </w:rPr>
+        <w:t>A partir deste ponto, o pacote foi considerado em sua versão 0.1.0, chamada Beta, e foi compartilhada nas redes sociais: Linkedin, Twitter/X e Instagram. As postagens tiveram uma média de 150 curtidas  e 3.000 impressões/visualizações, o que mostra interesse do público pelo fácil acesso a estes dados.</w:t>
       </w:r>
     </w:p>
     <w:p>
@@ -2031,9 +2094,499 @@
       </w:pPr>
       <w:r>
         <w:rPr>
-          <w:color w:val="000000"/>
-          <w:shd w:fill="FFFFFF" w:val="clear"/>
-        </w:rPr>
+          <w:rStyle w:val="normaltextrun"/>
+          <w:color w:val="000000"/>
+          <w:shd w:fill="FFFFFF" w:val="clear"/>
+        </w:rPr>
+        <w:t>Após o compartilhamento, foram recebidos alguns feedbacks e foram solicitadas novas funções, que foram get_ifdata_reports(), get_ifdata_registry(), get_institutions() e tidy_institutions(). As funções foram desenvolvidas e devidamente documentadas.</w:t>
+      </w:r>
+    </w:p>
+    <w:p>
+      <w:pPr>
+        <w:pStyle w:val="ListParagraph"/>
+        <w:spacing w:lineRule="auto" w:line="360"/>
+        <w:ind w:firstLine="709" w:left="0"/>
+        <w:jc w:val="both"/>
+        <w:rPr>
+          <w:rStyle w:val="normaltextrun"/>
+          <w:color w:val="000000"/>
+          <w:shd w:fill="FFFFFF" w:val="clear"/>
+        </w:rPr>
+      </w:pPr>
+      <w:r>
+        <w:rPr>
+          <w:rStyle w:val="normaltextrun"/>
+          <w:color w:val="000000"/>
+          <w:shd w:fill="FFFFFF" w:val="clear"/>
+        </w:rPr>
+        <w:t xml:space="preserve">Com a adição destas funções, o pacote foi considerado com conteúdo suficiente para ser lançado em sua versão oficial através do CRAN. Para isso, foi criado um “vignettes”, que é um arquivo com a descrição do pacote e exemplos de uso, assim como o README.md do Github. </w:t>
+      </w:r>
+      <w:r>
+        <w:rPr>
+          <w:rStyle w:val="normaltextrun"/>
+          <w:color w:val="000000"/>
+          <w:shd w:fill="FFFFFF" w:val="clear"/>
+        </w:rPr>
+        <w:t>Desta forma, a árvore de diretório final está representada na Figura  4.</w:t>
+      </w:r>
+    </w:p>
+    <w:p>
+      <w:pPr>
+        <w:pStyle w:val="ListParagraph"/>
+        <w:spacing w:lineRule="auto" w:line="360"/>
+        <w:ind w:firstLine="709" w:left="0"/>
+        <w:jc w:val="both"/>
+        <w:rPr>
+          <w:rStyle w:val="normaltextrun"/>
+          <w:color w:val="000000"/>
+          <w:shd w:fill="FFFFFF" w:val="clear"/>
+        </w:rPr>
+      </w:pPr>
+      <w:r>
+        <w:rPr>
+          <w:rStyle w:val="normaltextrun"/>
+          <w:color w:val="000000"/>
+          <w:shd w:fill="FFFFFF" w:val="clear"/>
+        </w:rPr>
+        <w:drawing>
+          <wp:inline distT="0" distB="0" distL="0" distR="0">
+            <wp:extent cx="2105660" cy="6156960"/>
+            <wp:effectExtent l="0" t="0" r="0" b="0"/>
+            <wp:docPr id="4" name="Image3" descr=""/>
+            <wp:cNvGraphicFramePr>
+              <a:graphicFrameLocks xmlns:a="http://schemas.openxmlformats.org/drawingml/2006/main" noChangeAspect="1"/>
+            </wp:cNvGraphicFramePr>
+            <a:graphic xmlns:a="http://schemas.openxmlformats.org/drawingml/2006/main">
+              <a:graphicData uri="http://schemas.openxmlformats.org/drawingml/2006/picture">
+                <pic:pic xmlns:pic="http://schemas.openxmlformats.org/drawingml/2006/picture">
+                  <pic:nvPicPr>
+                    <pic:cNvPr id="4" name="Image3" descr=""/>
+                    <pic:cNvPicPr>
+                      <a:picLocks noChangeAspect="1" noChangeArrowheads="1"/>
+                    </pic:cNvPicPr>
+                  </pic:nvPicPr>
+                  <pic:blipFill>
+                    <a:blip r:embed="rId5"/>
+                    <a:stretch>
+                      <a:fillRect/>
+                    </a:stretch>
+                  </pic:blipFill>
+                  <pic:spPr bwMode="auto">
+                    <a:xfrm>
+                      <a:off x="0" y="0"/>
+                      <a:ext cx="2105660" cy="6156960"/>
+                    </a:xfrm>
+                    <a:prstGeom prst="rect">
+                      <a:avLst/>
+                    </a:prstGeom>
+                  </pic:spPr>
+                </pic:pic>
+              </a:graphicData>
+            </a:graphic>
+          </wp:inline>
+        </w:drawing>
+      </w:r>
+    </w:p>
+    <w:p>
+      <w:pPr>
+        <w:pStyle w:val="ListParagraph"/>
+        <w:spacing w:lineRule="auto" w:line="360"/>
+        <w:ind w:firstLine="709" w:left="0"/>
+        <w:jc w:val="both"/>
+        <w:rPr>
+          <w:rStyle w:val="normaltextrun"/>
+          <w:color w:val="000000"/>
+          <w:shd w:fill="FFFFFF" w:val="clear"/>
+        </w:rPr>
+      </w:pPr>
+      <w:r>
+        <w:rPr>
+          <w:rStyle w:val="normaltextrun"/>
+          <w:color w:val="000000"/>
+          <w:shd w:fill="FFFFFF" w:val="clear"/>
+        </w:rPr>
+        <w:t>Figura 4. Árvore de diretório do pacote bacenR</w:t>
+      </w:r>
+    </w:p>
+    <w:p>
+      <w:pPr>
+        <w:pStyle w:val="ListParagraph"/>
+        <w:spacing w:lineRule="auto" w:line="360"/>
+        <w:ind w:firstLine="709" w:left="0"/>
+        <w:jc w:val="both"/>
+        <w:rPr>
+          <w:rStyle w:val="normaltextrun"/>
+          <w:color w:val="000000"/>
+          <w:shd w:fill="FFFFFF" w:val="clear"/>
+        </w:rPr>
+      </w:pPr>
+      <w:r>
+        <w:rPr>
+          <w:rStyle w:val="normaltextrun"/>
+          <w:color w:val="000000"/>
+          <w:shd w:fill="FFFFFF" w:val="clear"/>
+        </w:rPr>
+        <w:t>Fonte: Resultados originais da pesquisa.</w:t>
+      </w:r>
+    </w:p>
+    <w:p>
+      <w:pPr>
+        <w:pStyle w:val="ListParagraph"/>
+        <w:spacing w:lineRule="auto" w:line="360"/>
+        <w:ind w:firstLine="709" w:left="0"/>
+        <w:jc w:val="both"/>
+        <w:rPr>
+          <w:rStyle w:val="normaltextrun"/>
+          <w:color w:val="000000"/>
+          <w:shd w:fill="FFFFFF" w:val="clear"/>
+        </w:rPr>
+      </w:pPr>
+      <w:r>
+        <w:rPr>
+          <w:color w:val="000000"/>
+          <w:shd w:fill="FFFFFF" w:val="clear"/>
+        </w:rPr>
+      </w:r>
+    </w:p>
+    <w:p>
+      <w:pPr>
+        <w:pStyle w:val="ListParagraph"/>
+        <w:spacing w:lineRule="auto" w:line="360"/>
+        <w:ind w:firstLine="709" w:left="0"/>
+        <w:jc w:val="both"/>
+        <w:rPr>
+          <w:rStyle w:val="normaltextrun"/>
+          <w:color w:val="000000"/>
+          <w:shd w:fill="FFFFFF" w:val="clear"/>
+        </w:rPr>
+      </w:pPr>
+      <w:r>
+        <w:rPr>
+          <w:rStyle w:val="normaltextrun"/>
+          <w:color w:val="000000"/>
+          <w:shd w:fill="FFFFFF" w:val="clear"/>
+        </w:rPr>
+        <w:t xml:space="preserve">Com o pacote aceito pelo </w:t>
+      </w:r>
+      <w:r>
+        <w:rPr>
+          <w:rStyle w:val="normaltextrun"/>
+          <w:b w:val="false"/>
+          <w:bCs w:val="false"/>
+          <w:color w:val="000000"/>
+          <w:u w:val="none"/>
+          <w:shd w:fill="FFFFFF" w:val="clear"/>
+        </w:rPr>
+        <w:t>CRAN</w:t>
+      </w:r>
+      <w:r>
+        <w:rPr>
+          <w:rStyle w:val="normaltextrun"/>
+          <w:rStyle w:val="FootnoteReference"/>
+          <w:color w:val="000000"/>
+          <w:shd w:fill="FFFFFF" w:val="clear"/>
+        </w:rPr>
+        <w:footnoteReference w:id="13"/>
+      </w:r>
+      <w:r>
+        <w:rPr>
+          <w:rStyle w:val="normaltextrun"/>
+          <w:color w:val="000000"/>
+          <w:shd w:fill="FFFFFF" w:val="clear"/>
+        </w:rPr>
+        <w:t>, seu vignettes</w:t>
+      </w:r>
+      <w:r>
+        <w:rPr>
+          <w:rStyle w:val="normaltextrun"/>
+          <w:rStyle w:val="FootnoteReference"/>
+          <w:color w:val="000000"/>
+          <w:shd w:fill="FFFFFF" w:val="clear"/>
+        </w:rPr>
+        <w:footnoteReference w:id="14"/>
+      </w:r>
+      <w:r>
+        <w:rPr>
+          <w:rStyle w:val="normaltextrun"/>
+          <w:color w:val="000000"/>
+          <w:shd w:fill="FFFFFF" w:val="clear"/>
+        </w:rPr>
+        <w:t xml:space="preserve"> ficou de acordo com a Figura 5.</w:t>
+      </w:r>
+    </w:p>
+    <w:p>
+      <w:pPr>
+        <w:pStyle w:val="ListParagraph"/>
+        <w:spacing w:lineRule="auto" w:line="360"/>
+        <w:ind w:firstLine="709" w:left="0"/>
+        <w:jc w:val="both"/>
+        <w:rPr>
+          <w:rStyle w:val="normaltextrun"/>
+          <w:color w:val="000000"/>
+          <w:shd w:fill="FFFFFF" w:val="clear"/>
+        </w:rPr>
+      </w:pPr>
+      <w:r>
+        <w:drawing>
+          <wp:anchor behindDoc="0" distT="0" distB="0" distL="0" distR="0" simplePos="0" locked="0" layoutInCell="0" allowOverlap="1" relativeHeight="39">
+            <wp:simplePos x="0" y="0"/>
+            <wp:positionH relativeFrom="column">
+              <wp:align>center</wp:align>
+            </wp:positionH>
+            <wp:positionV relativeFrom="paragraph">
+              <wp:posOffset>635</wp:posOffset>
+            </wp:positionV>
+            <wp:extent cx="5759450" cy="4700270"/>
+            <wp:effectExtent l="0" t="0" r="0" b="0"/>
+            <wp:wrapSquare wrapText="largest"/>
+            <wp:docPr id="5" name="Image4" descr=""/>
+            <wp:cNvGraphicFramePr>
+              <a:graphicFrameLocks xmlns:a="http://schemas.openxmlformats.org/drawingml/2006/main" noChangeAspect="1"/>
+            </wp:cNvGraphicFramePr>
+            <a:graphic xmlns:a="http://schemas.openxmlformats.org/drawingml/2006/main">
+              <a:graphicData uri="http://schemas.openxmlformats.org/drawingml/2006/picture">
+                <pic:pic xmlns:pic="http://schemas.openxmlformats.org/drawingml/2006/picture">
+                  <pic:nvPicPr>
+                    <pic:cNvPr id="5" name="Image4" descr=""/>
+                    <pic:cNvPicPr>
+                      <a:picLocks noChangeAspect="1" noChangeArrowheads="1"/>
+                    </pic:cNvPicPr>
+                  </pic:nvPicPr>
+                  <pic:blipFill>
+                    <a:blip r:embed="rId6"/>
+                    <a:stretch>
+                      <a:fillRect/>
+                    </a:stretch>
+                  </pic:blipFill>
+                  <pic:spPr bwMode="auto">
+                    <a:xfrm>
+                      <a:off x="0" y="0"/>
+                      <a:ext cx="5759450" cy="4700270"/>
+                    </a:xfrm>
+                    <a:prstGeom prst="rect">
+                      <a:avLst/>
+                    </a:prstGeom>
+                  </pic:spPr>
+                </pic:pic>
+              </a:graphicData>
+            </a:graphic>
+          </wp:anchor>
+        </w:drawing>
+      </w:r>
+      <w:r>
+        <w:rPr>
+          <w:rStyle w:val="normaltextrun"/>
+          <w:color w:val="000000"/>
+          <w:shd w:fill="FFFFFF" w:val="clear"/>
+        </w:rPr>
+        <w:t xml:space="preserve">Figura 5. Vignettes do pacote bacenR no </w:t>
+      </w:r>
+      <w:r>
+        <w:rPr>
+          <w:rStyle w:val="normaltextrun"/>
+          <w:b w:val="false"/>
+          <w:bCs w:val="false"/>
+          <w:color w:val="000000"/>
+          <w:u w:val="none"/>
+          <w:shd w:fill="FFFFFF" w:val="clear"/>
+        </w:rPr>
+        <w:t>CRAN</w:t>
+      </w:r>
+      <w:r>
+        <w:rPr>
+          <w:rStyle w:val="normaltextrun"/>
+          <w:color w:val="000000"/>
+          <w:shd w:fill="FFFFFF" w:val="clear"/>
+        </w:rPr>
+        <w:t>.</w:t>
+      </w:r>
+    </w:p>
+    <w:p>
+      <w:pPr>
+        <w:pStyle w:val="ListParagraph"/>
+        <w:spacing w:lineRule="auto" w:line="360"/>
+        <w:ind w:firstLine="709" w:left="0"/>
+        <w:jc w:val="both"/>
+        <w:rPr>
+          <w:rStyle w:val="normaltextrun"/>
+          <w:color w:val="000000"/>
+          <w:shd w:fill="FFFFFF" w:val="clear"/>
+        </w:rPr>
+      </w:pPr>
+      <w:r>
+        <w:rPr>
+          <w:rStyle w:val="normaltextrun"/>
+          <w:color w:val="000000"/>
+          <w:shd w:fill="FFFFFF" w:val="clear"/>
+        </w:rPr>
+        <w:t>Fonte: Resultados originais da pesquisa</w:t>
+      </w:r>
+    </w:p>
+    <w:p>
+      <w:pPr>
+        <w:pStyle w:val="ListParagraph"/>
+        <w:spacing w:lineRule="auto" w:line="360"/>
+        <w:ind w:firstLine="709" w:left="0"/>
+        <w:jc w:val="both"/>
+        <w:rPr>
+          <w:rStyle w:val="normaltextrun"/>
+          <w:color w:val="000000"/>
+          <w:shd w:fill="FFFFFF" w:val="clear"/>
+        </w:rPr>
+      </w:pPr>
+      <w:r>
+        <w:rPr>
+          <w:color w:val="000000"/>
+          <w:shd w:fill="FFFFFF" w:val="clear"/>
+        </w:rPr>
+      </w:r>
+    </w:p>
+    <w:p>
+      <w:pPr>
+        <w:pStyle w:val="ListParagraph"/>
+        <w:spacing w:lineRule="auto" w:line="360"/>
+        <w:ind w:firstLine="709" w:left="0"/>
+        <w:jc w:val="both"/>
+        <w:rPr>
+          <w:rStyle w:val="normaltextrun"/>
+          <w:color w:val="000000"/>
+          <w:shd w:fill="FFFFFF" w:val="clear"/>
+        </w:rPr>
+      </w:pPr>
+      <w:r>
+        <w:rPr>
+          <w:rStyle w:val="normaltextrun"/>
+          <w:color w:val="000000"/>
+          <w:shd w:fill="FFFFFF" w:val="clear"/>
+        </w:rPr>
+        <w:t xml:space="preserve">Enquanto o README.md do GitHub do pacote está de acordo com a Figura 6. Foi adicionada a instrução de que a instalação da versão estável deverá ser realizada através do comando install.packages(“bacenR”), para que seja instalada a versão disponibilizada no </w:t>
+      </w:r>
+      <w:r>
+        <w:rPr>
+          <w:rStyle w:val="normaltextrun"/>
+          <w:b w:val="false"/>
+          <w:bCs w:val="false"/>
+          <w:color w:val="000000"/>
+          <w:u w:val="none"/>
+          <w:shd w:fill="FFFFFF" w:val="clear"/>
+        </w:rPr>
+        <w:t>CRAN</w:t>
+      </w:r>
+      <w:r>
+        <w:rPr>
+          <w:rStyle w:val="normaltextrun"/>
+          <w:color w:val="000000"/>
+          <w:shd w:fill="FFFFFF" w:val="clear"/>
+        </w:rPr>
+        <w:t>, enquanto a do GitHub é considerada uma versão em desenvolvimento.</w:t>
+      </w:r>
+    </w:p>
+    <w:p>
+      <w:pPr>
+        <w:pStyle w:val="ListParagraph"/>
+        <w:spacing w:lineRule="auto" w:line="360"/>
+        <w:ind w:firstLine="709" w:left="0"/>
+        <w:jc w:val="both"/>
+        <w:rPr>
+          <w:rStyle w:val="normaltextrun"/>
+          <w:color w:val="000000"/>
+          <w:shd w:fill="FFFFFF" w:val="clear"/>
+        </w:rPr>
+      </w:pPr>
+      <w:r>
+        <w:rPr>
+          <w:color w:val="000000"/>
+          <w:shd w:fill="FFFFFF" w:val="clear"/>
+        </w:rPr>
+      </w:r>
+    </w:p>
+    <w:p>
+      <w:pPr>
+        <w:pStyle w:val="ListParagraph"/>
+        <w:spacing w:lineRule="auto" w:line="360"/>
+        <w:ind w:firstLine="709" w:left="0"/>
+        <w:jc w:val="both"/>
+        <w:rPr>
+          <w:rStyle w:val="normaltextrun"/>
+          <w:color w:val="000000"/>
+          <w:shd w:fill="FFFFFF" w:val="clear"/>
+        </w:rPr>
+      </w:pPr>
+      <w:r>
+        <w:drawing>
+          <wp:anchor behindDoc="0" distT="0" distB="0" distL="0" distR="0" simplePos="0" locked="0" layoutInCell="0" allowOverlap="1" relativeHeight="40">
+            <wp:simplePos x="0" y="0"/>
+            <wp:positionH relativeFrom="column">
+              <wp:align>center</wp:align>
+            </wp:positionH>
+            <wp:positionV relativeFrom="paragraph">
+              <wp:posOffset>635</wp:posOffset>
+            </wp:positionV>
+            <wp:extent cx="5759450" cy="3338830"/>
+            <wp:effectExtent l="0" t="0" r="0" b="0"/>
+            <wp:wrapSquare wrapText="largest"/>
+            <wp:docPr id="6" name="Image5" descr=""/>
+            <wp:cNvGraphicFramePr>
+              <a:graphicFrameLocks xmlns:a="http://schemas.openxmlformats.org/drawingml/2006/main" noChangeAspect="1"/>
+            </wp:cNvGraphicFramePr>
+            <a:graphic xmlns:a="http://schemas.openxmlformats.org/drawingml/2006/main">
+              <a:graphicData uri="http://schemas.openxmlformats.org/drawingml/2006/picture">
+                <pic:pic xmlns:pic="http://schemas.openxmlformats.org/drawingml/2006/picture">
+                  <pic:nvPicPr>
+                    <pic:cNvPr id="6" name="Image5" descr=""/>
+                    <pic:cNvPicPr>
+                      <a:picLocks noChangeAspect="1" noChangeArrowheads="1"/>
+                    </pic:cNvPicPr>
+                  </pic:nvPicPr>
+                  <pic:blipFill>
+                    <a:blip r:embed="rId7"/>
+                    <a:stretch>
+                      <a:fillRect/>
+                    </a:stretch>
+                  </pic:blipFill>
+                  <pic:spPr bwMode="auto">
+                    <a:xfrm>
+                      <a:off x="0" y="0"/>
+                      <a:ext cx="5759450" cy="3338830"/>
+                    </a:xfrm>
+                    <a:prstGeom prst="rect">
+                      <a:avLst/>
+                    </a:prstGeom>
+                  </pic:spPr>
+                </pic:pic>
+              </a:graphicData>
+            </a:graphic>
+          </wp:anchor>
+        </w:drawing>
+      </w:r>
+      <w:r>
+        <w:rPr>
+          <w:rStyle w:val="normaltextrun"/>
+          <w:color w:val="000000"/>
+          <w:shd w:fill="FFFFFF" w:val="clear"/>
+        </w:rPr>
+        <w:t>Figura 6. README do pacote bacenR em sua versão estável</w:t>
+      </w:r>
+    </w:p>
+    <w:p>
+      <w:pPr>
+        <w:pStyle w:val="ListParagraph"/>
+        <w:spacing w:lineRule="auto" w:line="360"/>
+        <w:ind w:firstLine="709" w:left="0"/>
+        <w:jc w:val="both"/>
+        <w:rPr>
+          <w:rStyle w:val="normaltextrun"/>
+          <w:color w:val="000000"/>
+          <w:shd w:fill="FFFFFF" w:val="clear"/>
+        </w:rPr>
+      </w:pPr>
+      <w:r>
+        <w:rPr>
+          <w:rStyle w:val="normaltextrun"/>
+          <w:color w:val="000000"/>
+          <w:shd w:fill="FFFFFF" w:val="clear"/>
+        </w:rPr>
+        <w:t>Fonte: Resultados originais da pesquisa</w:t>
       </w:r>
     </w:p>
     <w:p>
@@ -2056,19 +2609,63 @@
     <w:p>
       <w:pPr>
         <w:pStyle w:val="ListParagraph"/>
-        <w:spacing w:lineRule="auto" w:line="360"/>
-        <w:ind w:hanging="0" w:left="0"/>
-        <w:rPr>
-          <w:color w:val="000000"/>
-          <w:shd w:fill="FFFFFF" w:val="clear"/>
-        </w:rPr>
-      </w:pPr>
-      <w:r>
-        <w:rPr>
-          <w:color w:val="000000"/>
-          <w:shd w:fill="FFFFFF" w:val="clear"/>
-        </w:rPr>
-        <w:t>Agora serão apresentados alguns exemplos de uso do pacote.</w:t>
+        <w:widowControl/>
+        <w:suppressAutoHyphens w:val="true"/>
+        <w:bidi w:val="0"/>
+        <w:spacing w:lineRule="auto" w:line="360" w:before="0" w:after="0"/>
+        <w:ind w:firstLine="794" w:left="0" w:right="0"/>
+        <w:contextualSpacing/>
+        <w:jc w:val="both"/>
+        <w:rPr>
+          <w:color w:val="000000"/>
+          <w:shd w:fill="FFFFFF" w:val="clear"/>
+        </w:rPr>
+      </w:pPr>
+      <w:r>
+        <w:rPr>
+          <w:color w:val="000000"/>
+          <w:shd w:fill="FFFFFF" w:val="clear"/>
+        </w:rPr>
+        <w:t xml:space="preserve">Agora serão apresentados alguns exemplos de uso do pacote, </w:t>
+      </w:r>
+      <w:r>
+        <w:rPr>
+          <w:color w:val="000000"/>
+          <w:shd w:fill="FFFFFF" w:val="clear"/>
+        </w:rPr>
+        <w:t xml:space="preserve">conforme apresentado nos exemplos mínimos solicitados pelo </w:t>
+      </w:r>
+      <w:r>
+        <w:rPr>
+          <w:b w:val="false"/>
+          <w:bCs w:val="false"/>
+          <w:color w:val="000000"/>
+          <w:u w:val="none"/>
+          <w:shd w:fill="FFFFFF" w:val="clear"/>
+        </w:rPr>
+        <w:t>CRAN</w:t>
+      </w:r>
+      <w:r>
+        <w:rPr>
+          <w:color w:val="000000"/>
+          <w:shd w:fill="FFFFFF" w:val="clear"/>
+        </w:rPr>
+        <w:t xml:space="preserve"> e que podem ser encontrados na função de ajuda de cada função</w:t>
+      </w:r>
+      <w:r>
+        <w:rPr>
+          <w:rStyle w:val="FootnoteReference"/>
+          <w:color w:val="000000"/>
+          <w:shd w:fill="FFFFFF" w:val="clear"/>
+        </w:rPr>
+        <w:footnoteReference w:id="15"/>
+      </w:r>
+      <w:r>
+        <w:rPr>
+          <w:color w:val="000000"/>
+          <w:shd w:fill="FFFFFF" w:val="clear"/>
+        </w:rPr>
+        <w:t>.</w:t>
       </w:r>
     </w:p>
     <w:p>
@@ -2087,6 +2684,1161 @@
           <w:color w:val="000000"/>
           <w:shd w:fill="FFFFFF" w:val="clear"/>
         </w:rPr>
+        <w:t>As primeiras funções apresentadas serão  get_balance_sheets() e tidy_balance_sheets(), que são, respectivamente funções para baixar balancetes</w:t>
+      </w:r>
+      <w:r>
+        <w:rPr>
+          <w:rStyle w:val="FootnoteReference"/>
+          <w:color w:val="000000"/>
+          <w:shd w:fill="FFFFFF" w:val="clear"/>
+        </w:rPr>
+        <w:footnoteReference w:id="16"/>
+      </w:r>
+      <w:r>
+        <w:rPr>
+          <w:color w:val="000000"/>
+          <w:shd w:fill="FFFFFF" w:val="clear"/>
+        </w:rPr>
+        <w:t xml:space="preserve"> e tratá-los para que eles possam ser utilizados sem muito esforço pelo usuário. A Figura 7 apresenta </w:t>
+      </w:r>
+      <w:r>
+        <w:rPr>
+          <w:color w:val="000000"/>
+          <w:shd w:fill="FFFFFF" w:val="clear"/>
+        </w:rPr>
+        <w:t>a descrição de cada parâmetro utilizado e a Figura 8 apresenta o</w:t>
+      </w:r>
+      <w:r>
+        <w:rPr>
+          <w:color w:val="000000"/>
+          <w:shd w:fill="FFFFFF" w:val="clear"/>
+        </w:rPr>
+        <w:t xml:space="preserve"> uso das funções e </w:t>
+      </w:r>
+      <w:r>
+        <w:rPr>
+          <w:color w:val="000000"/>
+          <w:shd w:fill="FFFFFF" w:val="clear"/>
+        </w:rPr>
+        <w:t xml:space="preserve">seus resultados. </w:t>
+      </w:r>
+    </w:p>
+    <w:p>
+      <w:pPr>
+        <w:pStyle w:val="ListParagraph"/>
+        <w:spacing w:lineRule="auto" w:line="360"/>
+        <w:ind w:firstLine="709" w:left="0"/>
+        <w:rPr>
+          <w:rStyle w:val="normaltextrun"/>
+          <w:color w:val="000000"/>
+          <w:shd w:fill="FFFFFF" w:val="clear"/>
+        </w:rPr>
+      </w:pPr>
+      <w:r>
+        <w:drawing>
+          <wp:anchor behindDoc="0" distT="0" distB="0" distL="0" distR="0" simplePos="0" locked="0" layoutInCell="0" allowOverlap="1" relativeHeight="41">
+            <wp:simplePos x="0" y="0"/>
+            <wp:positionH relativeFrom="column">
+              <wp:align>center</wp:align>
+            </wp:positionH>
+            <wp:positionV relativeFrom="paragraph">
+              <wp:posOffset>635</wp:posOffset>
+            </wp:positionV>
+            <wp:extent cx="5759450" cy="1991995"/>
+            <wp:effectExtent l="0" t="0" r="0" b="0"/>
+            <wp:wrapSquare wrapText="largest"/>
+            <wp:docPr id="7" name="Image6" descr=""/>
+            <wp:cNvGraphicFramePr>
+              <a:graphicFrameLocks xmlns:a="http://schemas.openxmlformats.org/drawingml/2006/main" noChangeAspect="1"/>
+            </wp:cNvGraphicFramePr>
+            <a:graphic xmlns:a="http://schemas.openxmlformats.org/drawingml/2006/main">
+              <a:graphicData uri="http://schemas.openxmlformats.org/drawingml/2006/picture">
+                <pic:pic xmlns:pic="http://schemas.openxmlformats.org/drawingml/2006/picture">
+                  <pic:nvPicPr>
+                    <pic:cNvPr id="7" name="Image6" descr=""/>
+                    <pic:cNvPicPr>
+                      <a:picLocks noChangeAspect="1" noChangeArrowheads="1"/>
+                    </pic:cNvPicPr>
+                  </pic:nvPicPr>
+                  <pic:blipFill>
+                    <a:blip r:embed="rId8"/>
+                    <a:stretch>
+                      <a:fillRect/>
+                    </a:stretch>
+                  </pic:blipFill>
+                  <pic:spPr bwMode="auto">
+                    <a:xfrm>
+                      <a:off x="0" y="0"/>
+                      <a:ext cx="5759450" cy="1991995"/>
+                    </a:xfrm>
+                    <a:prstGeom prst="rect">
+                      <a:avLst/>
+                    </a:prstGeom>
+                  </pic:spPr>
+                </pic:pic>
+              </a:graphicData>
+            </a:graphic>
+          </wp:anchor>
+        </w:drawing>
+      </w:r>
+      <w:r>
+        <w:rPr>
+          <w:rStyle w:val="normaltextrun"/>
+          <w:color w:val="000000"/>
+          <w:shd w:fill="FFFFFF" w:val="clear"/>
+        </w:rPr>
+        <w:t>Figura 7. Descrição dos parâmetros da função get_balance_sheets()</w:t>
+      </w:r>
+    </w:p>
+    <w:p>
+      <w:pPr>
+        <w:pStyle w:val="ListParagraph"/>
+        <w:spacing w:lineRule="auto" w:line="360"/>
+        <w:ind w:firstLine="709" w:left="0"/>
+        <w:rPr>
+          <w:rStyle w:val="normaltextrun"/>
+          <w:color w:val="000000"/>
+          <w:shd w:fill="FFFFFF" w:val="clear"/>
+        </w:rPr>
+      </w:pPr>
+      <w:r>
+        <w:rPr>
+          <w:rStyle w:val="normaltextrun"/>
+          <w:color w:val="000000"/>
+          <w:shd w:fill="FFFFFF" w:val="clear"/>
+        </w:rPr>
+        <w:t>Fonte: Resultados originais da pesquisa</w:t>
+      </w:r>
+    </w:p>
+    <w:p>
+      <w:pPr>
+        <w:pStyle w:val="ListParagraph"/>
+        <w:spacing w:lineRule="auto" w:line="360"/>
+        <w:ind w:firstLine="709" w:left="0"/>
+        <w:rPr>
+          <w:rStyle w:val="normaltextrun"/>
+          <w:color w:val="000000"/>
+          <w:shd w:fill="FFFFFF" w:val="clear"/>
+        </w:rPr>
+      </w:pPr>
+      <w:r>
+        <w:drawing>
+          <wp:anchor behindDoc="0" distT="0" distB="0" distL="0" distR="0" simplePos="0" locked="0" layoutInCell="0" allowOverlap="1" relativeHeight="42">
+            <wp:simplePos x="0" y="0"/>
+            <wp:positionH relativeFrom="column">
+              <wp:align>center</wp:align>
+            </wp:positionH>
+            <wp:positionV relativeFrom="paragraph">
+              <wp:posOffset>635</wp:posOffset>
+            </wp:positionV>
+            <wp:extent cx="5759450" cy="4826635"/>
+            <wp:effectExtent l="0" t="0" r="0" b="0"/>
+            <wp:wrapSquare wrapText="largest"/>
+            <wp:docPr id="8" name="Image7" descr=""/>
+            <wp:cNvGraphicFramePr>
+              <a:graphicFrameLocks xmlns:a="http://schemas.openxmlformats.org/drawingml/2006/main" noChangeAspect="1"/>
+            </wp:cNvGraphicFramePr>
+            <a:graphic xmlns:a="http://schemas.openxmlformats.org/drawingml/2006/main">
+              <a:graphicData uri="http://schemas.openxmlformats.org/drawingml/2006/picture">
+                <pic:pic xmlns:pic="http://schemas.openxmlformats.org/drawingml/2006/picture">
+                  <pic:nvPicPr>
+                    <pic:cNvPr id="8" name="Image7" descr=""/>
+                    <pic:cNvPicPr>
+                      <a:picLocks noChangeAspect="1" noChangeArrowheads="1"/>
+                    </pic:cNvPicPr>
+                  </pic:nvPicPr>
+                  <pic:blipFill>
+                    <a:blip r:embed="rId9"/>
+                    <a:stretch>
+                      <a:fillRect/>
+                    </a:stretch>
+                  </pic:blipFill>
+                  <pic:spPr bwMode="auto">
+                    <a:xfrm>
+                      <a:off x="0" y="0"/>
+                      <a:ext cx="5759450" cy="4826635"/>
+                    </a:xfrm>
+                    <a:prstGeom prst="rect">
+                      <a:avLst/>
+                    </a:prstGeom>
+                  </pic:spPr>
+                </pic:pic>
+              </a:graphicData>
+            </a:graphic>
+          </wp:anchor>
+        </w:drawing>
+      </w:r>
+      <w:r>
+        <w:rPr>
+          <w:rStyle w:val="normaltextrun"/>
+          <w:color w:val="000000"/>
+          <w:shd w:fill="FFFFFF" w:val="clear"/>
+        </w:rPr>
+        <w:t>Figura 8. Resultados das funções get_balance_sheets() e tidy_balance_sheets()</w:t>
+      </w:r>
+    </w:p>
+    <w:p>
+      <w:pPr>
+        <w:pStyle w:val="ListParagraph"/>
+        <w:spacing w:lineRule="auto" w:line="360"/>
+        <w:ind w:firstLine="709" w:left="0"/>
+        <w:rPr>
+          <w:rStyle w:val="normaltextrun"/>
+          <w:color w:val="000000"/>
+          <w:shd w:fill="FFFFFF" w:val="clear"/>
+        </w:rPr>
+      </w:pPr>
+      <w:r>
+        <w:rPr>
+          <w:rStyle w:val="normaltextrun"/>
+          <w:color w:val="000000"/>
+          <w:shd w:fill="FFFFFF" w:val="clear"/>
+        </w:rPr>
+        <w:t>Fonte: Resultados originais da pesquisa</w:t>
+      </w:r>
+    </w:p>
+    <w:p>
+      <w:pPr>
+        <w:pStyle w:val="ListParagraph"/>
+        <w:spacing w:lineRule="auto" w:line="360"/>
+        <w:ind w:firstLine="709" w:left="0"/>
+        <w:rPr>
+          <w:rStyle w:val="normaltextrun"/>
+          <w:color w:val="000000"/>
+          <w:shd w:fill="FFFFFF" w:val="clear"/>
+        </w:rPr>
+      </w:pPr>
+      <w:r>
+        <w:rPr>
+          <w:color w:val="000000"/>
+          <w:shd w:fill="FFFFFF" w:val="clear"/>
+        </w:rPr>
+      </w:r>
+    </w:p>
+    <w:p>
+      <w:pPr>
+        <w:pStyle w:val="ListParagraph"/>
+        <w:spacing w:lineRule="auto" w:line="360"/>
+        <w:ind w:firstLine="709" w:left="0"/>
+        <w:rPr>
+          <w:rStyle w:val="normaltextrun"/>
+          <w:color w:val="000000"/>
+          <w:shd w:fill="FFFFFF" w:val="clear"/>
+        </w:rPr>
+      </w:pPr>
+      <w:r>
+        <w:rPr>
+          <w:rStyle w:val="normaltextrun"/>
+          <w:color w:val="000000"/>
+          <w:shd w:fill="FFFFFF" w:val="clear"/>
+        </w:rPr>
+        <w:t>Neste exemplo, é possível observar que foi baixado o balanço de todas as cooperativas de crédito referentes a 12/2023 e filtrados apenas os balancetes de código 4010. Desta forma, os balanços já estão no formato de cada linha uma observação e cada coluna uma informação. Vale destacar que outras formas de uso são possíveis, baixando diversos tipos de instituições, por diversos períodos de uma única vez.</w:t>
+      </w:r>
+    </w:p>
+    <w:p>
+      <w:pPr>
+        <w:pStyle w:val="ListParagraph"/>
+        <w:spacing w:lineRule="auto" w:line="360"/>
+        <w:ind w:firstLine="709" w:left="0"/>
+        <w:rPr>
+          <w:rStyle w:val="normaltextrun"/>
+          <w:color w:val="000000"/>
+          <w:shd w:fill="FFFFFF" w:val="clear"/>
+        </w:rPr>
+      </w:pPr>
+      <w:r>
+        <w:rPr>
+          <w:color w:val="000000"/>
+          <w:shd w:fill="FFFFFF" w:val="clear"/>
+        </w:rPr>
+        <w:t>Referente as funções get_institutions() e tidy_institutions(), ela baixa informações sobre vários tipos de instituições financeiras cadastradas no Bacen</w:t>
+      </w:r>
+      <w:r>
+        <w:rPr>
+          <w:rStyle w:val="FootnoteReference"/>
+          <w:color w:val="000000"/>
+          <w:shd w:fill="FFFFFF" w:val="clear"/>
+        </w:rPr>
+        <w:footnoteReference w:id="17"/>
+      </w:r>
+      <w:r>
+        <w:rPr>
+          <w:color w:val="000000"/>
+          <w:shd w:fill="FFFFFF" w:val="clear"/>
+        </w:rPr>
+        <w:t>. A Figura 9 apresenta os parâmetros utilizados para baixar as informações e a Figura 10 apresenta as variáveis obtidas.</w:t>
+      </w:r>
+    </w:p>
+    <w:p>
+      <w:pPr>
+        <w:pStyle w:val="ListParagraph"/>
+        <w:spacing w:lineRule="auto" w:line="360"/>
+        <w:ind w:firstLine="709" w:left="0"/>
+        <w:rPr>
+          <w:rStyle w:val="normaltextrun"/>
+          <w:color w:val="000000"/>
+          <w:shd w:fill="FFFFFF" w:val="clear"/>
+        </w:rPr>
+      </w:pPr>
+      <w:r>
+        <w:drawing>
+          <wp:anchor behindDoc="0" distT="0" distB="0" distL="0" distR="0" simplePos="0" locked="0" layoutInCell="0" allowOverlap="1" relativeHeight="44">
+            <wp:simplePos x="0" y="0"/>
+            <wp:positionH relativeFrom="column">
+              <wp:align>center</wp:align>
+            </wp:positionH>
+            <wp:positionV relativeFrom="paragraph">
+              <wp:posOffset>635</wp:posOffset>
+            </wp:positionV>
+            <wp:extent cx="5759450" cy="1214120"/>
+            <wp:effectExtent l="0" t="0" r="0" b="0"/>
+            <wp:wrapSquare wrapText="largest"/>
+            <wp:docPr id="9" name="Image9" descr=""/>
+            <wp:cNvGraphicFramePr>
+              <a:graphicFrameLocks xmlns:a="http://schemas.openxmlformats.org/drawingml/2006/main" noChangeAspect="1"/>
+            </wp:cNvGraphicFramePr>
+            <a:graphic xmlns:a="http://schemas.openxmlformats.org/drawingml/2006/main">
+              <a:graphicData uri="http://schemas.openxmlformats.org/drawingml/2006/picture">
+                <pic:pic xmlns:pic="http://schemas.openxmlformats.org/drawingml/2006/picture">
+                  <pic:nvPicPr>
+                    <pic:cNvPr id="9" name="Image9" descr=""/>
+                    <pic:cNvPicPr>
+                      <a:picLocks noChangeAspect="1" noChangeArrowheads="1"/>
+                    </pic:cNvPicPr>
+                  </pic:nvPicPr>
+                  <pic:blipFill>
+                    <a:blip r:embed="rId10"/>
+                    <a:stretch>
+                      <a:fillRect/>
+                    </a:stretch>
+                  </pic:blipFill>
+                  <pic:spPr bwMode="auto">
+                    <a:xfrm>
+                      <a:off x="0" y="0"/>
+                      <a:ext cx="5759450" cy="1214120"/>
+                    </a:xfrm>
+                    <a:prstGeom prst="rect">
+                      <a:avLst/>
+                    </a:prstGeom>
+                  </pic:spPr>
+                </pic:pic>
+              </a:graphicData>
+            </a:graphic>
+          </wp:anchor>
+        </w:drawing>
+      </w:r>
+      <w:r>
+        <w:rPr>
+          <w:color w:val="000000"/>
+          <w:shd w:fill="FFFFFF" w:val="clear"/>
+        </w:rPr>
+        <w:t>Figura 9. Parâmetros da função get_institutions()</w:t>
+      </w:r>
+    </w:p>
+    <w:p>
+      <w:pPr>
+        <w:pStyle w:val="ListParagraph"/>
+        <w:spacing w:lineRule="auto" w:line="360"/>
+        <w:ind w:firstLine="709" w:left="0"/>
+        <w:rPr>
+          <w:rStyle w:val="normaltextrun"/>
+          <w:color w:val="000000"/>
+          <w:shd w:fill="FFFFFF" w:val="clear"/>
+        </w:rPr>
+      </w:pPr>
+      <w:r>
+        <w:rPr>
+          <w:color w:val="000000"/>
+          <w:shd w:fill="FFFFFF" w:val="clear"/>
+        </w:rPr>
+        <w:t>Fonte: Resultados originais da pesquisa</w:t>
+      </w:r>
+    </w:p>
+    <w:p>
+      <w:pPr>
+        <w:pStyle w:val="ListParagraph"/>
+        <w:spacing w:lineRule="auto" w:line="360"/>
+        <w:ind w:firstLine="709" w:left="0"/>
+        <w:rPr>
+          <w:rStyle w:val="normaltextrun"/>
+          <w:color w:val="000000"/>
+          <w:shd w:fill="FFFFFF" w:val="clear"/>
+        </w:rPr>
+      </w:pPr>
+      <w:r>
+        <w:rPr>
+          <w:color w:val="000000"/>
+          <w:shd w:fill="FFFFFF" w:val="clear"/>
+        </w:rPr>
+      </w:r>
+    </w:p>
+    <w:p>
+      <w:pPr>
+        <w:pStyle w:val="ListParagraph"/>
+        <w:spacing w:lineRule="auto" w:line="360"/>
+        <w:ind w:firstLine="709" w:left="0"/>
+        <w:rPr>
+          <w:rStyle w:val="normaltextrun"/>
+          <w:color w:val="000000"/>
+          <w:shd w:fill="FFFFFF" w:val="clear"/>
+        </w:rPr>
+      </w:pPr>
+      <w:r>
+        <w:rPr>
+          <w:rStyle w:val="normaltextrun"/>
+          <w:color w:val="000000"/>
+          <w:shd w:fill="FFFFFF" w:val="clear"/>
+        </w:rPr>
+        <w:t>F</w:t>
+      </w:r>
+      <w:r>
+        <w:drawing>
+          <wp:anchor behindDoc="0" distT="0" distB="0" distL="0" distR="0" simplePos="0" locked="0" layoutInCell="0" allowOverlap="1" relativeHeight="43">
+            <wp:simplePos x="0" y="0"/>
+            <wp:positionH relativeFrom="column">
+              <wp:align>center</wp:align>
+            </wp:positionH>
+            <wp:positionV relativeFrom="paragraph">
+              <wp:posOffset>635</wp:posOffset>
+            </wp:positionV>
+            <wp:extent cx="5759450" cy="1600835"/>
+            <wp:effectExtent l="0" t="0" r="0" b="0"/>
+            <wp:wrapSquare wrapText="largest"/>
+            <wp:docPr id="10" name="Image8" descr=""/>
+            <wp:cNvGraphicFramePr>
+              <a:graphicFrameLocks xmlns:a="http://schemas.openxmlformats.org/drawingml/2006/main" noChangeAspect="1"/>
+            </wp:cNvGraphicFramePr>
+            <a:graphic xmlns:a="http://schemas.openxmlformats.org/drawingml/2006/main">
+              <a:graphicData uri="http://schemas.openxmlformats.org/drawingml/2006/picture">
+                <pic:pic xmlns:pic="http://schemas.openxmlformats.org/drawingml/2006/picture">
+                  <pic:nvPicPr>
+                    <pic:cNvPr id="10" name="Image8" descr=""/>
+                    <pic:cNvPicPr>
+                      <a:picLocks noChangeAspect="1" noChangeArrowheads="1"/>
+                    </pic:cNvPicPr>
+                  </pic:nvPicPr>
+                  <pic:blipFill>
+                    <a:blip r:embed="rId11"/>
+                    <a:stretch>
+                      <a:fillRect/>
+                    </a:stretch>
+                  </pic:blipFill>
+                  <pic:spPr bwMode="auto">
+                    <a:xfrm>
+                      <a:off x="0" y="0"/>
+                      <a:ext cx="5759450" cy="1600835"/>
+                    </a:xfrm>
+                    <a:prstGeom prst="rect">
+                      <a:avLst/>
+                    </a:prstGeom>
+                  </pic:spPr>
+                </pic:pic>
+              </a:graphicData>
+            </a:graphic>
+          </wp:anchor>
+        </w:drawing>
+      </w:r>
+      <w:r>
+        <w:rPr>
+          <w:rStyle w:val="normaltextrun"/>
+          <w:color w:val="000000"/>
+          <w:shd w:fill="FFFFFF" w:val="clear"/>
+        </w:rPr>
+        <w:t>igura 10.  Resultados das funções  get_institutions() e tidy_institutions()</w:t>
+      </w:r>
+    </w:p>
+    <w:p>
+      <w:pPr>
+        <w:pStyle w:val="ListParagraph"/>
+        <w:spacing w:lineRule="auto" w:line="360"/>
+        <w:ind w:firstLine="709" w:left="0"/>
+        <w:rPr>
+          <w:rStyle w:val="normaltextrun"/>
+          <w:color w:val="000000"/>
+          <w:shd w:fill="FFFFFF" w:val="clear"/>
+        </w:rPr>
+      </w:pPr>
+      <w:r>
+        <w:rPr>
+          <w:rStyle w:val="normaltextrun"/>
+          <w:color w:val="000000"/>
+          <w:shd w:fill="FFFFFF" w:val="clear"/>
+        </w:rPr>
+        <w:t>Fonte: Resultados originais da pesquisa</w:t>
+      </w:r>
+    </w:p>
+    <w:p>
+      <w:pPr>
+        <w:pStyle w:val="ListParagraph"/>
+        <w:spacing w:lineRule="auto" w:line="360"/>
+        <w:ind w:firstLine="709" w:left="0"/>
+        <w:rPr>
+          <w:rStyle w:val="normaltextrun"/>
+          <w:color w:val="000000"/>
+          <w:shd w:fill="FFFFFF" w:val="clear"/>
+        </w:rPr>
+      </w:pPr>
+      <w:r>
+        <w:rPr>
+          <w:color w:val="000000"/>
+          <w:shd w:fill="FFFFFF" w:val="clear"/>
+        </w:rPr>
+      </w:r>
+    </w:p>
+    <w:p>
+      <w:pPr>
+        <w:pStyle w:val="ListParagraph"/>
+        <w:spacing w:lineRule="auto" w:line="360"/>
+        <w:ind w:firstLine="709" w:left="0"/>
+        <w:rPr>
+          <w:rStyle w:val="normaltextrun"/>
+          <w:color w:val="000000"/>
+          <w:shd w:fill="FFFFFF" w:val="clear"/>
+        </w:rPr>
+      </w:pPr>
+      <w:r>
+        <w:rPr>
+          <w:rStyle w:val="normaltextrun"/>
+          <w:color w:val="000000"/>
+          <w:shd w:fill="FFFFFF" w:val="clear"/>
+        </w:rPr>
+        <w:t>Os parâmetros das funções get_normative_data() e get_normative_txt() são mais simples, sendo necessários apenas os termos que desejam ser buscados e as datas de início e fim. A Figura 11 apresenta um exemplo de seus usos, mostrando quais são as variáveis baixadas.</w:t>
+      </w:r>
+    </w:p>
+    <w:p>
+      <w:pPr>
+        <w:pStyle w:val="ListParagraph"/>
+        <w:spacing w:lineRule="auto" w:line="360"/>
+        <w:ind w:firstLine="709" w:left="0"/>
+        <w:rPr>
+          <w:rStyle w:val="normaltextrun"/>
+          <w:color w:val="000000"/>
+          <w:shd w:fill="FFFFFF" w:val="clear"/>
+        </w:rPr>
+      </w:pPr>
+      <w:r>
+        <w:drawing>
+          <wp:anchor behindDoc="0" distT="0" distB="0" distL="0" distR="0" simplePos="0" locked="0" layoutInCell="0" allowOverlap="1" relativeHeight="45">
+            <wp:simplePos x="0" y="0"/>
+            <wp:positionH relativeFrom="column">
+              <wp:posOffset>38100</wp:posOffset>
+            </wp:positionH>
+            <wp:positionV relativeFrom="paragraph">
+              <wp:posOffset>2540</wp:posOffset>
+            </wp:positionV>
+            <wp:extent cx="5759450" cy="1821815"/>
+            <wp:effectExtent l="0" t="0" r="0" b="0"/>
+            <wp:wrapSquare wrapText="largest"/>
+            <wp:docPr id="11" name="Image10" descr=""/>
+            <wp:cNvGraphicFramePr>
+              <a:graphicFrameLocks xmlns:a="http://schemas.openxmlformats.org/drawingml/2006/main" noChangeAspect="1"/>
+            </wp:cNvGraphicFramePr>
+            <a:graphic xmlns:a="http://schemas.openxmlformats.org/drawingml/2006/main">
+              <a:graphicData uri="http://schemas.openxmlformats.org/drawingml/2006/picture">
+                <pic:pic xmlns:pic="http://schemas.openxmlformats.org/drawingml/2006/picture">
+                  <pic:nvPicPr>
+                    <pic:cNvPr id="11" name="Image10" descr=""/>
+                    <pic:cNvPicPr>
+                      <a:picLocks noChangeAspect="1" noChangeArrowheads="1"/>
+                    </pic:cNvPicPr>
+                  </pic:nvPicPr>
+                  <pic:blipFill>
+                    <a:blip r:embed="rId12"/>
+                    <a:stretch>
+                      <a:fillRect/>
+                    </a:stretch>
+                  </pic:blipFill>
+                  <pic:spPr bwMode="auto">
+                    <a:xfrm>
+                      <a:off x="0" y="0"/>
+                      <a:ext cx="5759450" cy="1821815"/>
+                    </a:xfrm>
+                    <a:prstGeom prst="rect">
+                      <a:avLst/>
+                    </a:prstGeom>
+                  </pic:spPr>
+                </pic:pic>
+              </a:graphicData>
+            </a:graphic>
+          </wp:anchor>
+        </w:drawing>
+      </w:r>
+      <w:r>
+        <w:rPr>
+          <w:rStyle w:val="normaltextrun"/>
+          <w:color w:val="000000"/>
+          <w:shd w:fill="FFFFFF" w:val="clear"/>
+        </w:rPr>
+        <w:t>Figura 11. Resultados das funções get_normative_data() e get_normative_txt().</w:t>
+      </w:r>
+    </w:p>
+    <w:p>
+      <w:pPr>
+        <w:pStyle w:val="ListParagraph"/>
+        <w:spacing w:lineRule="auto" w:line="360"/>
+        <w:ind w:firstLine="709" w:left="0"/>
+        <w:rPr>
+          <w:rStyle w:val="normaltextrun"/>
+          <w:color w:val="000000"/>
+          <w:shd w:fill="FFFFFF" w:val="clear"/>
+        </w:rPr>
+      </w:pPr>
+      <w:r>
+        <w:rPr>
+          <w:rStyle w:val="normaltextrun"/>
+          <w:color w:val="000000"/>
+          <w:shd w:fill="FFFFFF" w:val="clear"/>
+        </w:rPr>
+        <w:t>Fonte: Resultados originais da pesquisador</w:t>
+      </w:r>
+    </w:p>
+    <w:p>
+      <w:pPr>
+        <w:pStyle w:val="ListParagraph"/>
+        <w:spacing w:lineRule="auto" w:line="360"/>
+        <w:ind w:firstLine="709" w:left="0"/>
+        <w:rPr>
+          <w:rStyle w:val="normaltextrun"/>
+          <w:color w:val="000000"/>
+          <w:shd w:fill="FFFFFF" w:val="clear"/>
+        </w:rPr>
+      </w:pPr>
+      <w:r>
+        <w:rPr>
+          <w:color w:val="000000"/>
+          <w:shd w:fill="FFFFFF" w:val="clear"/>
+        </w:rPr>
+      </w:r>
+    </w:p>
+    <w:p>
+      <w:pPr>
+        <w:pStyle w:val="ListParagraph"/>
+        <w:spacing w:lineRule="auto" w:line="360"/>
+        <w:ind w:firstLine="709" w:left="0"/>
+        <w:rPr>
+          <w:rStyle w:val="normaltextrun"/>
+          <w:color w:val="000000"/>
+          <w:shd w:fill="FFFFFF" w:val="clear"/>
+        </w:rPr>
+      </w:pPr>
+      <w:r>
+        <w:rPr>
+          <w:color w:val="000000"/>
+          <w:shd w:fill="FFFFFF" w:val="clear"/>
+        </w:rPr>
+        <w:t xml:space="preserve">É </w:t>
+      </w:r>
+      <w:r>
+        <w:rPr>
+          <w:color w:val="000000"/>
+          <w:shd w:fill="FFFFFF" w:val="clear"/>
+        </w:rPr>
+        <w:t>possível observar que essas funções possibilitam um acesso fácil a toda norma emitida, entretanto é preciso destacar que o download dos textos é um processo demorado e que se abranger um período grande ou com muitos termos de uma vez, o Bacen limita o acesso e cancela o download.</w:t>
+      </w:r>
+    </w:p>
+    <w:p>
+      <w:pPr>
+        <w:pStyle w:val="ListParagraph"/>
+        <w:spacing w:lineRule="auto" w:line="360"/>
+        <w:ind w:firstLine="709" w:left="0"/>
+        <w:rPr>
+          <w:rStyle w:val="normaltextrun"/>
+          <w:color w:val="000000"/>
+          <w:shd w:fill="FFFFFF" w:val="clear"/>
+        </w:rPr>
+      </w:pPr>
+      <w:r>
+        <w:rPr>
+          <w:color w:val="000000"/>
+          <w:shd w:fill="FFFFFF" w:val="clear"/>
+        </w:rPr>
+      </w:r>
+    </w:p>
+    <w:p>
+      <w:pPr>
+        <w:pStyle w:val="ListParagraph"/>
+        <w:spacing w:lineRule="auto" w:line="360"/>
+        <w:ind w:firstLine="709" w:left="0"/>
+        <w:rPr>
+          <w:rStyle w:val="normaltextrun"/>
+          <w:color w:val="000000"/>
+          <w:shd w:fill="FFFFFF" w:val="clear"/>
+        </w:rPr>
+      </w:pPr>
+      <w:r>
+        <w:rPr>
+          <w:color w:val="000000"/>
+          <w:shd w:fill="FFFFFF" w:val="clear"/>
+        </w:rPr>
+        <w:t>Por fim, serão apresentadas as funções que baixam dados do IFdata, sendo uma delas os relatórios e outra os registros das instituições</w:t>
+      </w:r>
+      <w:r>
+        <w:rPr>
+          <w:rStyle w:val="FootnoteReference"/>
+          <w:color w:val="000000"/>
+          <w:shd w:fill="FFFFFF" w:val="clear"/>
+        </w:rPr>
+        <w:footnoteReference w:id="18"/>
+      </w:r>
+      <w:r>
+        <w:rPr>
+          <w:color w:val="000000"/>
+          <w:shd w:fill="FFFFFF" w:val="clear"/>
+        </w:rPr>
+        <w:t>. Na Figura 12 são apresentados os parâmetros da função get_ifdata_reports.</w:t>
+      </w:r>
+    </w:p>
+    <w:p>
+      <w:pPr>
+        <w:pStyle w:val="ListParagraph"/>
+        <w:spacing w:lineRule="auto" w:line="360"/>
+        <w:ind w:firstLine="709" w:left="0"/>
+        <w:rPr>
+          <w:rStyle w:val="normaltextrun"/>
+          <w:color w:val="000000"/>
+          <w:shd w:fill="FFFFFF" w:val="clear"/>
+        </w:rPr>
+      </w:pPr>
+      <w:r>
+        <w:drawing>
+          <wp:anchor behindDoc="0" distT="0" distB="0" distL="0" distR="0" simplePos="0" locked="0" layoutInCell="0" allowOverlap="1" relativeHeight="47">
+            <wp:simplePos x="0" y="0"/>
+            <wp:positionH relativeFrom="column">
+              <wp:align>center</wp:align>
+            </wp:positionH>
+            <wp:positionV relativeFrom="paragraph">
+              <wp:posOffset>635</wp:posOffset>
+            </wp:positionV>
+            <wp:extent cx="5759450" cy="1367155"/>
+            <wp:effectExtent l="0" t="0" r="0" b="0"/>
+            <wp:wrapSquare wrapText="largest"/>
+            <wp:docPr id="12" name="Image12" descr=""/>
+            <wp:cNvGraphicFramePr>
+              <a:graphicFrameLocks xmlns:a="http://schemas.openxmlformats.org/drawingml/2006/main" noChangeAspect="1"/>
+            </wp:cNvGraphicFramePr>
+            <a:graphic xmlns:a="http://schemas.openxmlformats.org/drawingml/2006/main">
+              <a:graphicData uri="http://schemas.openxmlformats.org/drawingml/2006/picture">
+                <pic:pic xmlns:pic="http://schemas.openxmlformats.org/drawingml/2006/picture">
+                  <pic:nvPicPr>
+                    <pic:cNvPr id="12" name="Image12" descr=""/>
+                    <pic:cNvPicPr>
+                      <a:picLocks noChangeAspect="1" noChangeArrowheads="1"/>
+                    </pic:cNvPicPr>
+                  </pic:nvPicPr>
+                  <pic:blipFill>
+                    <a:blip r:embed="rId13"/>
+                    <a:stretch>
+                      <a:fillRect/>
+                    </a:stretch>
+                  </pic:blipFill>
+                  <pic:spPr bwMode="auto">
+                    <a:xfrm>
+                      <a:off x="0" y="0"/>
+                      <a:ext cx="5759450" cy="1367155"/>
+                    </a:xfrm>
+                    <a:prstGeom prst="rect">
+                      <a:avLst/>
+                    </a:prstGeom>
+                  </pic:spPr>
+                </pic:pic>
+              </a:graphicData>
+            </a:graphic>
+          </wp:anchor>
+        </w:drawing>
+      </w:r>
+      <w:r>
+        <w:rPr>
+          <w:rStyle w:val="normaltextrun"/>
+          <w:color w:val="000000"/>
+          <w:shd w:fill="FFFFFF" w:val="clear"/>
+        </w:rPr>
+        <w:t>Figura 12. Parâmetros da função  get_ifdata_reports</w:t>
+      </w:r>
+    </w:p>
+    <w:p>
+      <w:pPr>
+        <w:pStyle w:val="ListParagraph"/>
+        <w:spacing w:lineRule="auto" w:line="360"/>
+        <w:ind w:firstLine="709" w:left="0"/>
+        <w:rPr>
+          <w:rStyle w:val="normaltextrun"/>
+          <w:color w:val="000000"/>
+          <w:shd w:fill="FFFFFF" w:val="clear"/>
+        </w:rPr>
+      </w:pPr>
+      <w:r>
+        <w:rPr>
+          <w:rStyle w:val="normaltextrun"/>
+          <w:color w:val="000000"/>
+          <w:shd w:fill="FFFFFF" w:val="clear"/>
+        </w:rPr>
+        <w:t>Fonte: Resultados originais da pesquisador</w:t>
+      </w:r>
+    </w:p>
+    <w:p>
+      <w:pPr>
+        <w:pStyle w:val="ListParagraph"/>
+        <w:spacing w:lineRule="auto" w:line="360"/>
+        <w:ind w:firstLine="709" w:left="0"/>
+        <w:rPr>
+          <w:rStyle w:val="normaltextrun"/>
+          <w:color w:val="000000"/>
+          <w:shd w:fill="FFFFFF" w:val="clear"/>
+        </w:rPr>
+      </w:pPr>
+      <w:r>
+        <w:rPr>
+          <w:color w:val="000000"/>
+          <w:shd w:fill="FFFFFF" w:val="clear"/>
+        </w:rPr>
+      </w:r>
+    </w:p>
+    <w:p>
+      <w:pPr>
+        <w:pStyle w:val="ListParagraph"/>
+        <w:spacing w:lineRule="auto" w:line="360"/>
+        <w:ind w:firstLine="709" w:left="0"/>
+        <w:rPr>
+          <w:rStyle w:val="normaltextrun"/>
+          <w:color w:val="000000"/>
+          <w:shd w:fill="FFFFFF" w:val="clear"/>
+        </w:rPr>
+      </w:pPr>
+      <w:r>
+        <w:rPr>
+          <w:color w:val="000000"/>
+          <w:shd w:fill="FFFFFF" w:val="clear"/>
+        </w:rPr>
+        <w:t>Desta forma, é possível observar que existem diversos relatórios para diversos tipos de instituições. Para deixar a função mais simples para o usuário, é possível selecionar apenas um tipo de instituição e um tipo de relatório por vez, enquanto os períodos podem ser baixados vários de uma única vez.</w:t>
+      </w:r>
+    </w:p>
+    <w:p>
+      <w:pPr>
+        <w:pStyle w:val="ListParagraph"/>
+        <w:spacing w:lineRule="auto" w:line="360"/>
+        <w:ind w:firstLine="709" w:left="0"/>
+        <w:rPr>
+          <w:rStyle w:val="normaltextrun"/>
+          <w:color w:val="000000"/>
+          <w:shd w:fill="FFFFFF" w:val="clear"/>
+        </w:rPr>
+      </w:pPr>
+      <w:r>
+        <w:rPr>
+          <w:color w:val="000000"/>
+          <w:shd w:fill="FFFFFF" w:val="clear"/>
+        </w:rPr>
+        <w:t>Quanto ao uso, serão apresentados respectivamente get_ifdata_reports e get_ifdata_registry, na Figura 13 e na Figura 14.</w:t>
+      </w:r>
+    </w:p>
+    <w:p>
+      <w:pPr>
+        <w:pStyle w:val="ListParagraph"/>
+        <w:spacing w:lineRule="auto" w:line="360"/>
+        <w:ind w:firstLine="709" w:left="0"/>
+        <w:rPr>
+          <w:rStyle w:val="normaltextrun"/>
+          <w:color w:val="000000"/>
+          <w:shd w:fill="FFFFFF" w:val="clear"/>
+        </w:rPr>
+      </w:pPr>
+      <w:r>
+        <w:rPr>
+          <w:color w:val="000000"/>
+          <w:shd w:fill="FFFFFF" w:val="clear"/>
+        </w:rPr>
+      </w:r>
+    </w:p>
+    <w:p>
+      <w:pPr>
+        <w:pStyle w:val="ListParagraph"/>
+        <w:spacing w:lineRule="auto" w:line="360"/>
+        <w:ind w:firstLine="709" w:left="0"/>
+        <w:rPr>
+          <w:rStyle w:val="normaltextrun"/>
+          <w:color w:val="000000"/>
+          <w:shd w:fill="FFFFFF" w:val="clear"/>
+        </w:rPr>
+      </w:pPr>
+      <w:r>
+        <w:rPr>
+          <w:color w:val="000000"/>
+          <w:shd w:fill="FFFFFF" w:val="clear"/>
+        </w:rPr>
+      </w:r>
+    </w:p>
+    <w:p>
+      <w:pPr>
+        <w:pStyle w:val="ListParagraph"/>
+        <w:spacing w:lineRule="auto" w:line="360"/>
+        <w:ind w:firstLine="709" w:left="0"/>
+        <w:rPr>
+          <w:rStyle w:val="normaltextrun"/>
+          <w:color w:val="000000"/>
+          <w:shd w:fill="FFFFFF" w:val="clear"/>
+        </w:rPr>
+      </w:pPr>
+      <w:r>
+        <w:rPr>
+          <w:color w:val="000000"/>
+          <w:shd w:fill="FFFFFF" w:val="clear"/>
+        </w:rPr>
+        <w:t>F</w:t>
+      </w:r>
+      <w:r>
+        <w:drawing>
+          <wp:anchor behindDoc="0" distT="0" distB="0" distL="0" distR="0" simplePos="0" locked="0" layoutInCell="0" allowOverlap="1" relativeHeight="48">
+            <wp:simplePos x="0" y="0"/>
+            <wp:positionH relativeFrom="column">
+              <wp:align>center</wp:align>
+            </wp:positionH>
+            <wp:positionV relativeFrom="paragraph">
+              <wp:posOffset>635</wp:posOffset>
+            </wp:positionV>
+            <wp:extent cx="5759450" cy="1202055"/>
+            <wp:effectExtent l="0" t="0" r="0" b="0"/>
+            <wp:wrapSquare wrapText="largest"/>
+            <wp:docPr id="13" name="Image13" descr=""/>
+            <wp:cNvGraphicFramePr>
+              <a:graphicFrameLocks xmlns:a="http://schemas.openxmlformats.org/drawingml/2006/main" noChangeAspect="1"/>
+            </wp:cNvGraphicFramePr>
+            <a:graphic xmlns:a="http://schemas.openxmlformats.org/drawingml/2006/main">
+              <a:graphicData uri="http://schemas.openxmlformats.org/drawingml/2006/picture">
+                <pic:pic xmlns:pic="http://schemas.openxmlformats.org/drawingml/2006/picture">
+                  <pic:nvPicPr>
+                    <pic:cNvPr id="13" name="Image13" descr=""/>
+                    <pic:cNvPicPr>
+                      <a:picLocks noChangeAspect="1" noChangeArrowheads="1"/>
+                    </pic:cNvPicPr>
+                  </pic:nvPicPr>
+                  <pic:blipFill>
+                    <a:blip r:embed="rId14"/>
+                    <a:stretch>
+                      <a:fillRect/>
+                    </a:stretch>
+                  </pic:blipFill>
+                  <pic:spPr bwMode="auto">
+                    <a:xfrm>
+                      <a:off x="0" y="0"/>
+                      <a:ext cx="5759450" cy="1202055"/>
+                    </a:xfrm>
+                    <a:prstGeom prst="rect">
+                      <a:avLst/>
+                    </a:prstGeom>
+                  </pic:spPr>
+                </pic:pic>
+              </a:graphicData>
+            </a:graphic>
+          </wp:anchor>
+        </w:drawing>
+      </w:r>
+      <w:r>
+        <w:rPr>
+          <w:rStyle w:val="normaltextrun"/>
+          <w:color w:val="000000"/>
+          <w:shd w:fill="FFFFFF" w:val="clear"/>
+        </w:rPr>
+        <w:t>igura 14. Resultados da função get_ifdata_reports</w:t>
+      </w:r>
+    </w:p>
+    <w:p>
+      <w:pPr>
+        <w:pStyle w:val="ListParagraph"/>
+        <w:spacing w:lineRule="auto" w:line="360"/>
+        <w:ind w:firstLine="709" w:left="0"/>
+        <w:rPr>
+          <w:color w:val="000000"/>
+          <w:shd w:fill="FFFFFF" w:val="clear"/>
+        </w:rPr>
+      </w:pPr>
+      <w:r>
+        <w:rPr>
+          <w:rStyle w:val="normaltextrun"/>
+          <w:b w:val="false"/>
+          <w:bCs w:val="false"/>
+          <w:color w:val="000000"/>
+          <w:shd w:fill="FFFFFF" w:val="clear"/>
+        </w:rPr>
+        <w:t>Fonte: Resultados originais da pesquisador</w:t>
+      </w:r>
+    </w:p>
+    <w:p>
+      <w:pPr>
+        <w:pStyle w:val="ListParagraph"/>
+        <w:spacing w:lineRule="auto" w:line="360"/>
+        <w:ind w:firstLine="709" w:left="0"/>
+        <w:rPr>
+          <w:rStyle w:val="normaltextrun"/>
+          <w:color w:val="000000"/>
+          <w:shd w:fill="FFFFFF" w:val="clear"/>
+        </w:rPr>
+      </w:pPr>
+      <w:r>
+        <w:rPr>
+          <w:color w:val="000000"/>
+          <w:shd w:fill="FFFFFF" w:val="clear"/>
+        </w:rPr>
+      </w:r>
+    </w:p>
+    <w:p>
+      <w:pPr>
+        <w:pStyle w:val="ListParagraph"/>
+        <w:spacing w:lineRule="auto" w:line="360"/>
+        <w:ind w:firstLine="709" w:left="0"/>
+        <w:rPr>
+          <w:rStyle w:val="normaltextrun"/>
+          <w:color w:val="000000"/>
+          <w:shd w:fill="FFFFFF" w:val="clear"/>
+        </w:rPr>
+      </w:pPr>
+      <w:r>
+        <w:rPr>
+          <w:color w:val="000000"/>
+          <w:shd w:fill="FFFFFF" w:val="clear"/>
+        </w:rPr>
+      </w:r>
+    </w:p>
+    <w:p>
+      <w:pPr>
+        <w:pStyle w:val="ListParagraph"/>
+        <w:spacing w:lineRule="auto" w:line="360"/>
+        <w:ind w:firstLine="709" w:left="0"/>
+        <w:rPr>
+          <w:rStyle w:val="normaltextrun"/>
+          <w:color w:val="000000"/>
+          <w:shd w:fill="FFFFFF" w:val="clear"/>
+        </w:rPr>
+      </w:pPr>
+      <w:r>
+        <w:drawing>
+          <wp:anchor behindDoc="0" distT="0" distB="0" distL="0" distR="0" simplePos="0" locked="0" layoutInCell="0" allowOverlap="1" relativeHeight="46">
+            <wp:simplePos x="0" y="0"/>
+            <wp:positionH relativeFrom="column">
+              <wp:align>center</wp:align>
+            </wp:positionH>
+            <wp:positionV relativeFrom="paragraph">
+              <wp:posOffset>635</wp:posOffset>
+            </wp:positionV>
+            <wp:extent cx="5759450" cy="1026795"/>
+            <wp:effectExtent l="0" t="0" r="0" b="0"/>
+            <wp:wrapSquare wrapText="largest"/>
+            <wp:docPr id="14" name="Image11" descr=""/>
+            <wp:cNvGraphicFramePr>
+              <a:graphicFrameLocks xmlns:a="http://schemas.openxmlformats.org/drawingml/2006/main" noChangeAspect="1"/>
+            </wp:cNvGraphicFramePr>
+            <a:graphic xmlns:a="http://schemas.openxmlformats.org/drawingml/2006/main">
+              <a:graphicData uri="http://schemas.openxmlformats.org/drawingml/2006/picture">
+                <pic:pic xmlns:pic="http://schemas.openxmlformats.org/drawingml/2006/picture">
+                  <pic:nvPicPr>
+                    <pic:cNvPr id="14" name="Image11" descr=""/>
+                    <pic:cNvPicPr>
+                      <a:picLocks noChangeAspect="1" noChangeArrowheads="1"/>
+                    </pic:cNvPicPr>
+                  </pic:nvPicPr>
+                  <pic:blipFill>
+                    <a:blip r:embed="rId15"/>
+                    <a:stretch>
+                      <a:fillRect/>
+                    </a:stretch>
+                  </pic:blipFill>
+                  <pic:spPr bwMode="auto">
+                    <a:xfrm>
+                      <a:off x="0" y="0"/>
+                      <a:ext cx="5759450" cy="1026795"/>
+                    </a:xfrm>
+                    <a:prstGeom prst="rect">
+                      <a:avLst/>
+                    </a:prstGeom>
+                  </pic:spPr>
+                </pic:pic>
+              </a:graphicData>
+            </a:graphic>
+          </wp:anchor>
+        </w:drawing>
+      </w:r>
+      <w:r>
+        <w:rPr>
+          <w:rStyle w:val="normaltextrun"/>
+          <w:color w:val="000000"/>
+          <w:shd w:fill="FFFFFF" w:val="clear"/>
+        </w:rPr>
+        <w:t>Figura 15. Resultados da função get_ifdata_registry</w:t>
+      </w:r>
+    </w:p>
+    <w:p>
+      <w:pPr>
+        <w:pStyle w:val="ListParagraph"/>
+        <w:spacing w:lineRule="auto" w:line="360"/>
+        <w:ind w:firstLine="709" w:left="0"/>
+        <w:rPr>
+          <w:rStyle w:val="normaltextrun"/>
+          <w:color w:val="000000"/>
+          <w:shd w:fill="FFFFFF" w:val="clear"/>
+        </w:rPr>
+      </w:pPr>
+      <w:r>
+        <w:rPr>
+          <w:rStyle w:val="normaltextrun"/>
+          <w:color w:val="000000"/>
+          <w:shd w:fill="FFFFFF" w:val="clear"/>
+        </w:rPr>
+        <w:t>Fonte: Resultados originais da pesquisador</w:t>
+      </w:r>
+    </w:p>
+    <w:p>
+      <w:pPr>
+        <w:pStyle w:val="ListParagraph"/>
+        <w:spacing w:lineRule="auto" w:line="360"/>
+        <w:ind w:firstLine="709" w:left="0"/>
+        <w:rPr>
+          <w:rStyle w:val="normaltextrun"/>
+          <w:color w:val="000000"/>
+          <w:shd w:fill="FFFFFF" w:val="clear"/>
+        </w:rPr>
+      </w:pPr>
+      <w:r>
+        <w:rPr>
+          <w:color w:val="000000"/>
+          <w:shd w:fill="FFFFFF" w:val="clear"/>
+        </w:rPr>
+      </w:r>
+    </w:p>
+    <w:p>
+      <w:pPr>
+        <w:pStyle w:val="ListParagraph"/>
+        <w:spacing w:lineRule="auto" w:line="360"/>
+        <w:ind w:firstLine="709" w:left="0"/>
+        <w:rPr>
+          <w:rStyle w:val="normaltextrun"/>
+          <w:color w:val="000000"/>
+          <w:shd w:fill="FFFFFF" w:val="clear"/>
+        </w:rPr>
+      </w:pPr>
+      <w:r>
+        <w:rPr>
+          <w:rStyle w:val="normaltextrun"/>
+          <w:color w:val="000000"/>
+          <w:shd w:fill="FFFFFF" w:val="clear"/>
+        </w:rPr>
+        <w:t>Como é possível observar nas Figuras 14 e 15, é necessário um dicionário que está no site do IFdata para identificar o que cada coluna significa. Está é uma informação será adicionada ao pacote em futuras atualizações.</w:t>
+      </w:r>
+    </w:p>
+    <w:p>
+      <w:pPr>
+        <w:pStyle w:val="ListParagraph"/>
+        <w:spacing w:lineRule="auto" w:line="360"/>
+        <w:ind w:firstLine="709" w:left="0"/>
+        <w:rPr>
+          <w:rStyle w:val="normaltextrun"/>
+          <w:color w:val="000000"/>
+          <w:shd w:fill="FFFFFF" w:val="clear"/>
+        </w:rPr>
+      </w:pPr>
+      <w:r>
+        <w:rPr>
+          <w:color w:val="000000"/>
+          <w:shd w:fill="FFFFFF" w:val="clear"/>
+        </w:rPr>
       </w:r>
     </w:p>
     <w:p>
@@ -2108,39 +3860,42 @@
     <w:p>
       <w:pPr>
         <w:pStyle w:val="ListParagraph"/>
-        <w:spacing w:lineRule="auto" w:line="360"/>
-        <w:ind w:left="0"/>
-        <w:jc w:val="left"/>
-        <w:rPr/>
-      </w:pPr>
-      <w:r>
-        <w:rPr/>
+        <w:widowControl/>
+        <w:suppressAutoHyphens w:val="true"/>
+        <w:bidi w:val="0"/>
+        <w:spacing w:lineRule="auto" w:line="360" w:before="0" w:after="0"/>
+        <w:ind w:firstLine="737" w:left="0" w:right="0"/>
+        <w:contextualSpacing/>
+        <w:jc w:val="both"/>
+        <w:rPr/>
+      </w:pPr>
+      <w:r>
+        <w:rPr/>
+        <w:t>O pacote bacenR se mostrou útil, permitindo que o usuário colete e trate diversos dados diferentes fornecidos pelo Bacen. Com poucas linhas de código é possível baixar uma quantidade expressiva de dados, o que faz com que o usuário passe menos tempo coletando os dados e mais tempo trabalhando neles. Com a publicação nas redes sociais para divulgar o pacote foi percebido que isso é de interesse principalmente de pesquisadores e pessoas que tem pouco conhecimento em programação.</w:t>
+      </w:r>
+    </w:p>
+    <w:p>
+      <w:pPr>
+        <w:pStyle w:val="ListParagraph"/>
+        <w:widowControl/>
+        <w:suppressAutoHyphens w:val="true"/>
+        <w:bidi w:val="0"/>
+        <w:spacing w:lineRule="auto" w:line="360" w:before="0" w:after="0"/>
+        <w:ind w:firstLine="737" w:left="0" w:right="0"/>
+        <w:contextualSpacing/>
+        <w:jc w:val="both"/>
+        <w:rPr/>
+      </w:pPr>
+      <w:r>
+        <w:rPr/>
+        <w:t>Ainda existe espaço para melhorias no pacote, como melhorar as mensagens de erros e avisos, melhorar textos dos vignettes das funções e trazer um dicionário nativo para alguns dados,  além de outras funções para coletar novos dados.</w:t>
       </w:r>
     </w:p>
     <w:p>
       <w:pPr>
         <w:pStyle w:val="Normal"/>
         <w:spacing w:lineRule="auto" w:line="360"/>
-        <w:ind w:firstLine="708"/>
-        <w:rPr>
-          <w:rStyle w:val="normaltextrun"/>
-          <w:b/>
-          <w:color w:val="000000"/>
-          <w:shd w:fill="FFFFFF" w:val="clear"/>
-        </w:rPr>
-      </w:pPr>
-      <w:r>
-        <w:rPr>
-          <w:b/>
-          <w:color w:val="000000"/>
-          <w:shd w:fill="FFFFFF" w:val="clear"/>
-        </w:rPr>
-      </w:r>
-    </w:p>
-    <w:p>
-      <w:pPr>
-        <w:pStyle w:val="Normal"/>
-        <w:spacing w:lineRule="auto" w:line="360"/>
+        <w:jc w:val="both"/>
         <w:rPr/>
       </w:pPr>
       <w:r>
@@ -2221,7 +3976,7 @@
         </w:rPr>
         <w:t xml:space="preserve"> 72 (1): 80–88. </w:t>
       </w:r>
-      <w:hyperlink r:id="rId5">
+      <w:hyperlink r:id="rId16">
         <w:r>
           <w:rPr>
             <w:rStyle w:val="Hyperlink"/>
@@ -2267,7 +4022,7 @@
         </w:rPr>
         <w:t xml:space="preserve"> 6 (March): e3192v2. </w:t>
       </w:r>
-      <w:hyperlink r:id="rId6">
+      <w:hyperlink r:id="rId17">
         <w:r>
           <w:rPr>
             <w:rStyle w:val="Hyperlink"/>
@@ -2313,7 +4068,7 @@
         </w:rPr>
         <w:t xml:space="preserve"> 10 (2): 558–63. </w:t>
       </w:r>
-      <w:hyperlink r:id="rId7">
+      <w:hyperlink r:id="rId18">
         <w:r>
           <w:rPr>
             <w:rStyle w:val="Hyperlink"/>
@@ -2433,146 +4188,41 @@
     <w:p>
       <w:pPr>
         <w:pStyle w:val="Normal"/>
-        <w:bidi w:val="0"/>
-        <w:spacing w:lineRule="auto" w:line="360"/>
-        <w:rPr>
-          <w:b w:val="false"/>
-          <w:bCs w:val="false"/>
-        </w:rPr>
-      </w:pPr>
-      <w:r>
-        <w:rPr>
-          <w:b w:val="false"/>
-          <w:bCs w:val="false"/>
+        <w:spacing w:lineRule="auto" w:line="360"/>
+        <w:rPr>
+          <w:b/>
+        </w:rPr>
+      </w:pPr>
+      <w:r>
+        <w:rPr>
+          <w:b/>
         </w:rPr>
       </w:r>
     </w:p>
     <w:p>
       <w:pPr>
         <w:pStyle w:val="Normal"/>
-        <w:bidi w:val="0"/>
-        <w:spacing w:lineRule="auto" w:line="360"/>
-        <w:rPr>
-          <w:b w:val="false"/>
-          <w:bCs w:val="false"/>
-        </w:rPr>
-      </w:pPr>
-      <w:r>
-        <w:rPr>
-          <w:b w:val="false"/>
-          <w:bCs w:val="false"/>
+        <w:spacing w:lineRule="auto" w:line="360"/>
+        <w:ind w:firstLine="709"/>
+        <w:rPr>
+          <w:rStyle w:val="normaltextrun"/>
+          <w:b/>
+          <w:color w:val="000000"/>
+          <w:shd w:fill="FFFFFF" w:val="clear"/>
+        </w:rPr>
+      </w:pPr>
+      <w:r>
+        <w:rPr>
+          <w:b/>
+          <w:color w:val="000000"/>
+          <w:shd w:fill="FFFFFF" w:val="clear"/>
         </w:rPr>
       </w:r>
     </w:p>
     <w:p>
       <w:pPr>
         <w:pStyle w:val="Normal"/>
-        <w:bidi w:val="0"/>
-        <w:spacing w:lineRule="auto" w:line="360"/>
-        <w:rPr>
-          <w:b w:val="false"/>
-          <w:bCs w:val="false"/>
-        </w:rPr>
-      </w:pPr>
-      <w:r>
-        <w:rPr>
-          <w:b w:val="false"/>
-          <w:bCs w:val="false"/>
-        </w:rPr>
-      </w:r>
-    </w:p>
-    <w:p>
-      <w:pPr>
-        <w:pStyle w:val="Normal"/>
-        <w:spacing w:lineRule="auto" w:line="360"/>
-        <w:rPr>
-          <w:b/>
-        </w:rPr>
-      </w:pPr>
-      <w:r>
-        <w:rPr>
-          <w:b/>
-        </w:rPr>
-      </w:r>
-    </w:p>
-    <w:p>
-      <w:pPr>
-        <w:pStyle w:val="Normal"/>
-        <w:spacing w:lineRule="auto" w:line="360"/>
-        <w:rPr>
-          <w:b/>
-        </w:rPr>
-      </w:pPr>
-      <w:r>
-        <w:rPr>
-          <w:b/>
-        </w:rPr>
-      </w:r>
-    </w:p>
-    <w:p>
-      <w:pPr>
-        <w:pStyle w:val="Normal"/>
-        <w:spacing w:lineRule="auto" w:line="360"/>
-        <w:ind w:firstLine="709"/>
-        <w:rPr>
-          <w:rStyle w:val="normaltextrun"/>
-          <w:b/>
-          <w:color w:val="000000"/>
-          <w:shd w:fill="FFFFFF" w:val="clear"/>
-        </w:rPr>
-      </w:pPr>
-      <w:r>
-        <w:rPr>
-          <w:b/>
-          <w:color w:val="000000"/>
-          <w:shd w:fill="FFFFFF" w:val="clear"/>
-        </w:rPr>
-      </w:r>
-    </w:p>
-    <w:p>
-      <w:pPr>
-        <w:pStyle w:val="Normal"/>
-        <w:spacing w:lineRule="auto" w:line="360"/>
-        <w:rPr/>
-      </w:pPr>
-      <w:r>
-        <w:rPr/>
-      </w:r>
-    </w:p>
-    <w:p>
-      <w:pPr>
-        <w:pStyle w:val="Normal"/>
-        <w:spacing w:lineRule="auto" w:line="360"/>
-        <w:rPr>
-          <w:b/>
-        </w:rPr>
-      </w:pPr>
-      <w:r>
-        <w:rPr>
-          <w:b/>
-        </w:rPr>
-        <w:t xml:space="preserve">Apêndice ou Anexo </w:t>
-      </w:r>
-      <w:r>
-        <w:rPr/>
-        <w:t>(opcional)</w:t>
-      </w:r>
-    </w:p>
-    <w:p>
-      <w:pPr>
-        <w:pStyle w:val="Normal"/>
-        <w:spacing w:lineRule="auto" w:line="360"/>
-        <w:rPr/>
-      </w:pPr>
-      <w:r>
-        <w:rPr/>
-      </w:r>
-    </w:p>
-    <w:p>
-      <w:pPr>
-        <w:pStyle w:val="Normal"/>
-        <w:spacing w:lineRule="auto" w:line="360"/>
-        <w:ind w:firstLine="709"/>
+        <w:spacing w:lineRule="auto" w:line="360"/>
         <w:rPr/>
       </w:pPr>
       <w:r>
@@ -2580,12 +4230,12 @@
       </w:r>
     </w:p>
     <w:sectPr>
-      <w:headerReference w:type="even" r:id="rId8"/>
-      <w:headerReference w:type="default" r:id="rId9"/>
-      <w:headerReference w:type="first" r:id="rId10"/>
-      <w:footerReference w:type="even" r:id="rId11"/>
-      <w:footerReference w:type="default" r:id="rId12"/>
-      <w:footerReference w:type="first" r:id="rId13"/>
+      <w:headerReference w:type="even" r:id="rId19"/>
+      <w:headerReference w:type="default" r:id="rId20"/>
+      <w:headerReference w:type="first" r:id="rId21"/>
+      <w:footerReference w:type="even" r:id="rId22"/>
+      <w:footerReference w:type="default" r:id="rId23"/>
+      <w:footerReference w:type="first" r:id="rId24"/>
       <w:footnotePr>
         <w:numFmt w:val="decimal"/>
       </w:footnotePr>
@@ -2618,12 +4268,12 @@
           <w:szCs w:val="20"/>
           <w:lang w:val="en-US" w:eastAsia="en-US" w:bidi="en-US"/>
         </w:rPr>
-        <w:t>- Qual a diferença para outros pacotes/APIS do Bacen (é só o BacenAPI)?</w:t>
-      </w:r>
-    </w:p>
-    <w:p>
-      <w:pPr>
-        <w:overflowPunct w:val="false"/>
+        <w:t> - há muitos pacotes desenvolvidos para fins específicos de diferentes bancos de dados. Talvez avaliar se consegue ver citações/usos desses pacotes na literatura, para mostrar a importância/impacto dessa disponibilidade para uso dessas ferramentas.</w:t>
+      </w:r>
+    </w:p>
+    <w:p>
+      <w:pPr>
+        <w:overflowPunct w:val="true"/>
         <w:spacing w:lineRule="auto" w:line="240"/>
         <w:jc w:val="left"/>
         <w:rPr/>
@@ -2639,38 +4289,11 @@
     </w:p>
     <w:p>
       <w:pPr>
-        <w:overflowPunct w:val="false"/>
+        <w:overflowPunct w:val="true"/>
         <w:spacing w:lineRule="auto" w:line="240"/>
         <w:jc w:val="left"/>
         <w:rPr/>
       </w:pPr>
-      <w:r>
-        <w:rPr>
-          <w:rFonts w:ascii="Liberation Serif" w:hAnsi="Liberation Serif" w:eastAsia="DejaVu Sans" w:cs="Noto Sans Arabic UI"/>
-          <w:sz w:val="20"/>
-          <w:szCs w:val="20"/>
-          <w:lang w:val="en-US" w:eastAsia="en-US" w:bidi="en-US"/>
-        </w:rPr>
-        <w:t> - há muitos pacotes desenvolvidos para fins específicos de diferentes bancos de dados. Talvez avaliar se consegue ver citações/usos desses pacotes na literatura, para mostrar a importância/impacto dessa disponibilidade para uso dessas ferramentas.</w:t>
-      </w:r>
-      <w:r>
-        <w:rPr>
-          <w:rFonts w:ascii="Liberation Serif" w:hAnsi="Liberation Serif" w:eastAsia="DejaVu Sans" w:cs="Noto Sans Arabic UI"/>
-          <w:sz w:val="20"/>
-          <w:szCs w:val="20"/>
-          <w:lang w:val="en-US" w:eastAsia="en-US" w:bidi="en-US"/>
-        </w:rPr>
-        <w:br/>
-      </w:r>
-      <w:r>
-        <w:rPr>
-          <w:rFonts w:ascii="Liberation Serif" w:hAnsi="Liberation Serif" w:eastAsia="DejaVu Sans" w:cs="Noto Sans Arabic UI"/>
-          <w:sz w:val="20"/>
-          <w:szCs w:val="20"/>
-          <w:lang w:val="en-US" w:eastAsia="en-US" w:bidi="en-US"/>
-        </w:rPr>
-        <w:br/>
-      </w:r>
       <w:r>
         <w:rPr>
           <w:rFonts w:ascii="Liberation Serif" w:hAnsi="Liberation Serif" w:eastAsia="DejaVu Sans" w:cs="Noto Sans Arabic UI"/>
@@ -2691,24 +4314,30 @@
           <w:t>https://link.springer.com/article/10.1186/s12859-024-05826-2</w:t>
         </w:r>
       </w:hyperlink>
+    </w:p>
+    <w:p>
+      <w:pPr>
+        <w:overflowPunct w:val="true"/>
+        <w:spacing w:lineRule="auto" w:line="240"/>
+        <w:jc w:val="left"/>
+        <w:rPr/>
+      </w:pPr>
       <w:r>
         <w:rPr>
           <w:rFonts w:ascii="Liberation Serif" w:hAnsi="Liberation Serif" w:eastAsia="DejaVu Sans" w:cs="Noto Sans Arabic UI"/>
-          <w:sz w:val="20"/>
-          <w:szCs w:val="20"/>
+          <w:sz w:val="24"/>
+          <w:szCs w:val="24"/>
           <w:lang w:val="en-US" w:eastAsia="en-US" w:bidi="en-US"/>
         </w:rPr>
-        <w:br/>
-      </w:r>
-      <w:r>
-        <w:rPr>
-          <w:rFonts w:ascii="Liberation Serif" w:hAnsi="Liberation Serif" w:eastAsia="DejaVu Sans" w:cs="Noto Sans Arabic UI"/>
-          <w:sz w:val="20"/>
-          <w:szCs w:val="20"/>
-          <w:lang w:val="en-US" w:eastAsia="en-US" w:bidi="en-US"/>
-        </w:rPr>
-        <w:br/>
-      </w:r>
+      </w:r>
+    </w:p>
+    <w:p>
+      <w:pPr>
+        <w:overflowPunct w:val="false"/>
+        <w:spacing w:lineRule="auto" w:line="240"/>
+        <w:jc w:val="left"/>
+        <w:rPr/>
+      </w:pPr>
       <w:hyperlink r:id="rId2">
         <w:r>
           <w:rPr>
@@ -2723,6 +4352,38 @@
     </w:p>
     <w:p>
       <w:pPr>
+        <w:overflowPunct w:val="true"/>
+        <w:spacing w:lineRule="auto" w:line="240"/>
+        <w:jc w:val="left"/>
+        <w:rPr/>
+      </w:pPr>
+      <w:r>
+        <w:rPr>
+          <w:rFonts w:ascii="Liberation Serif" w:hAnsi="Liberation Serif" w:eastAsia="DejaVu Sans" w:cs="Noto Sans Arabic UI"/>
+          <w:sz w:val="24"/>
+          <w:szCs w:val="24"/>
+          <w:lang w:val="en-US" w:eastAsia="en-US" w:bidi="en-US"/>
+        </w:rPr>
+      </w:r>
+    </w:p>
+    <w:p>
+      <w:pPr>
+        <w:overflowPunct w:val="true"/>
+        <w:spacing w:lineRule="auto" w:line="240"/>
+        <w:jc w:val="left"/>
+        <w:rPr/>
+      </w:pPr>
+      <w:r>
+        <w:rPr>
+          <w:rFonts w:ascii="Liberation Serif" w:hAnsi="Liberation Serif" w:eastAsia="DejaVu Sans" w:cs="Noto Sans Arabic UI"/>
+          <w:sz w:val="24"/>
+          <w:szCs w:val="24"/>
+          <w:lang w:val="en-US" w:eastAsia="en-US" w:bidi="en-US"/>
+        </w:rPr>
+      </w:r>
+    </w:p>
+    <w:p>
+      <w:pPr>
         <w:overflowPunct w:val="false"/>
         <w:spacing w:lineRule="auto" w:line="240"/>
         <w:jc w:val="left"/>
@@ -2731,20 +4392,10 @@
       <w:r>
         <w:rPr>
           <w:rFonts w:ascii="Liberation Serif" w:hAnsi="Liberation Serif" w:eastAsia="DejaVu Sans" w:cs="Noto Sans Arabic UI"/>
-          <w:sz w:val="20"/>
-          <w:szCs w:val="20"/>
+          <w:sz w:val="24"/>
+          <w:szCs w:val="24"/>
           <w:lang w:val="en-US" w:eastAsia="en-US" w:bidi="en-US"/>
         </w:rPr>
-        <w:br/>
-      </w:r>
-      <w:r>
-        <w:rPr>
-          <w:rFonts w:ascii="Liberation Serif" w:hAnsi="Liberation Serif" w:eastAsia="DejaVu Sans" w:cs="Noto Sans Arabic UI"/>
-          <w:sz w:val="20"/>
-          <w:szCs w:val="20"/>
-          <w:lang w:val="en-US" w:eastAsia="en-US" w:bidi="en-US"/>
-        </w:rPr>
-        <w:br/>
       </w:r>
     </w:p>
   </w:comment>
@@ -2802,7 +4453,7 @@
         <w:sz w:val="18"/>
         <w:szCs w:val="18"/>
       </w:rPr>
-      <w:t>9</w:t>
+      <w:t>16</w:t>
     </w:r>
     <w:r>
       <w:rPr>
@@ -2861,7 +4512,7 @@
         <w:sz w:val="18"/>
         <w:szCs w:val="18"/>
       </w:rPr>
-      <w:t>9</w:t>
+      <w:t>16</w:t>
     </w:r>
     <w:r>
       <w:rPr>
@@ -2917,7 +4568,7 @@
       </w:pPr>
       <w:r>
         <w:rPr>
-          <w:rStyle w:val="Caracteresdenotaderodap"/>
+          <w:rStyle w:val="FootnoteCharacters"/>
         </w:rPr>
         <w:footnoteRef/>
       </w:r>
@@ -2940,7 +4591,7 @@
       </w:pPr>
       <w:r>
         <w:rPr>
-          <w:rStyle w:val="Caracteresdenotaderodap"/>
+          <w:rStyle w:val="FootnoteCharacters"/>
         </w:rPr>
         <w:footnoteRef/>
       </w:r>
@@ -2963,7 +4614,7 @@
       </w:pPr>
       <w:r>
         <w:rPr>
-          <w:rStyle w:val="Caracteresdenotaderodap"/>
+          <w:rStyle w:val="FootnoteCharacters"/>
         </w:rPr>
         <w:footnoteRef/>
       </w:r>
@@ -2986,7 +4637,7 @@
       </w:pPr>
       <w:r>
         <w:rPr>
-          <w:rStyle w:val="Caracteresdenotaderodap"/>
+          <w:rStyle w:val="FootnoteCharacters"/>
         </w:rPr>
         <w:footnoteRef/>
       </w:r>
@@ -3009,7 +4660,7 @@
       </w:pPr>
       <w:r>
         <w:rPr>
-          <w:rStyle w:val="Caracteresdenotaderodap"/>
+          <w:rStyle w:val="FootnoteCharacters"/>
         </w:rPr>
         <w:footnoteRef/>
       </w:r>
@@ -3032,7 +4683,7 @@
       </w:pPr>
       <w:r>
         <w:rPr>
-          <w:rStyle w:val="Caracteresdenotaderodap"/>
+          <w:rStyle w:val="FootnoteCharacters"/>
         </w:rPr>
         <w:footnoteRef/>
       </w:r>
@@ -3055,11 +4706,57 @@
       </w:pPr>
       <w:r>
         <w:rPr>
-          <w:rStyle w:val="Caracteresdenotaderodap"/>
+          <w:rStyle w:val="FootnoteCharacters"/>
         </w:rPr>
         <w:footnoteRef/>
       </w:r>
       <w:hyperlink r:id="rId7">
+        <w:r>
+          <w:rPr>
+            <w:rStyle w:val="Hyperlink"/>
+          </w:rPr>
+          <w:tab/>
+          <w:t>https://www3.bcb.gov.br/ifdata/index2024.html</w:t>
+        </w:r>
+      </w:hyperlink>
+    </w:p>
+  </w:footnote>
+  <w:footnote w:id="9">
+    <w:p>
+      <w:pPr>
+        <w:pStyle w:val="FootnoteText"/>
+        <w:rPr/>
+      </w:pPr>
+      <w:r>
+        <w:rPr>
+          <w:rStyle w:val="FootnoteCharacters"/>
+        </w:rPr>
+        <w:footnoteRef/>
+      </w:r>
+      <w:hyperlink r:id="rId8">
+        <w:r>
+          <w:rPr>
+            <w:rStyle w:val="Hyperlink"/>
+          </w:rPr>
+          <w:tab/>
+          <w:t>https://cran.r-project.org/</w:t>
+        </w:r>
+      </w:hyperlink>
+    </w:p>
+  </w:footnote>
+  <w:footnote w:id="10">
+    <w:p>
+      <w:pPr>
+        <w:pStyle w:val="FootnoteText"/>
+        <w:rPr/>
+      </w:pPr>
+      <w:r>
+        <w:rPr>
+          <w:rStyle w:val="FootnoteCharacters"/>
+        </w:rPr>
+        <w:footnoteRef/>
+      </w:r>
+      <w:hyperlink r:id="rId9">
         <w:r>
           <w:rPr>
             <w:rStyle w:val="Hyperlink"/>
@@ -3070,7 +4767,7 @@
       </w:hyperlink>
     </w:p>
   </w:footnote>
-  <w:footnote w:id="9">
+  <w:footnote w:id="11">
     <w:p>
       <w:pPr>
         <w:pStyle w:val="FootnoteText"/>
@@ -3078,11 +4775,11 @@
       </w:pPr>
       <w:r>
         <w:rPr>
-          <w:rStyle w:val="Caracteresdenotaderodap"/>
+          <w:rStyle w:val="FootnoteCharacters"/>
         </w:rPr>
         <w:footnoteRef/>
       </w:r>
-      <w:hyperlink r:id="rId8">
+      <w:hyperlink r:id="rId10">
         <w:r>
           <w:rPr>
             <w:rStyle w:val="Hyperlink"/>
@@ -3091,6 +4788,182 @@
           <w:t>https://github.com/rtheodoro/bacenR?tab=GPL-3.0-1-ov-file</w:t>
         </w:r>
       </w:hyperlink>
+    </w:p>
+  </w:footnote>
+  <w:footnote w:id="12">
+    <w:p>
+      <w:pPr>
+        <w:pStyle w:val="FootnoteText"/>
+        <w:rPr/>
+      </w:pPr>
+      <w:r>
+        <w:rPr>
+          <w:rStyle w:val="FootnoteCharacters"/>
+        </w:rPr>
+        <w:footnoteRef/>
+      </w:r>
+      <w:hyperlink r:id="rId11">
+        <w:r>
+          <w:rPr>
+            <w:rStyle w:val="Hyperlink"/>
+          </w:rPr>
+          <w:tab/>
+          <w:t>https://github.com/rtheodoro/bacenR?tab=contributing-ov-file</w:t>
+        </w:r>
+      </w:hyperlink>
+    </w:p>
+  </w:footnote>
+  <w:footnote w:id="13">
+    <w:p>
+      <w:pPr>
+        <w:pStyle w:val="FootnoteText"/>
+        <w:rPr/>
+      </w:pPr>
+      <w:r>
+        <w:rPr>
+          <w:rStyle w:val="FootnoteCharacters"/>
+        </w:rPr>
+        <w:footnoteRef/>
+      </w:r>
+      <w:hyperlink r:id="rId12">
+        <w:r>
+          <w:rPr>
+            <w:rStyle w:val="Hyperlink"/>
+          </w:rPr>
+          <w:tab/>
+          <w:t>https://cran.r-project.org/web/packages/bacenR/index.html</w:t>
+        </w:r>
+      </w:hyperlink>
+    </w:p>
+  </w:footnote>
+  <w:footnote w:id="14">
+    <w:p>
+      <w:pPr>
+        <w:pStyle w:val="FootnoteText"/>
+        <w:rPr/>
+      </w:pPr>
+      <w:r>
+        <w:rPr>
+          <w:rStyle w:val="FootnoteCharacters"/>
+        </w:rPr>
+        <w:footnoteRef/>
+      </w:r>
+      <w:hyperlink r:id="rId13">
+        <w:r>
+          <w:rPr>
+            <w:rStyle w:val="Hyperlink"/>
+          </w:rPr>
+          <w:tab/>
+          <w:t>https://cran.r-project.org/web/packages/bacenR/vignettes/bacenR.html</w:t>
+        </w:r>
+      </w:hyperlink>
+    </w:p>
+  </w:footnote>
+  <w:footnote w:id="15">
+    <w:p>
+      <w:pPr>
+        <w:pStyle w:val="FootnoteText"/>
+        <w:rPr/>
+      </w:pPr>
+      <w:r>
+        <w:rPr>
+          <w:rStyle w:val="FootnoteCharacters"/>
+        </w:rPr>
+        <w:footnoteRef/>
+      </w:r>
+      <w:r>
+        <w:rPr/>
+        <w:tab/>
+        <w:t>Exemplo: ??get_balance_sheets</w:t>
+      </w:r>
+    </w:p>
+  </w:footnote>
+  <w:footnote w:id="16">
+    <w:p>
+      <w:pPr>
+        <w:pStyle w:val="FootnoteText"/>
+        <w:rPr/>
+      </w:pPr>
+      <w:r>
+        <w:rPr>
+          <w:rStyle w:val="FootnoteCharacters"/>
+        </w:rPr>
+        <w:footnoteRef/>
+      </w:r>
+      <w:hyperlink r:id="rId14">
+        <w:r>
+          <w:rPr>
+            <w:rStyle w:val="Hyperlink"/>
+          </w:rPr>
+          <w:tab/>
+          <w:t>https://www.bcb.gov.br/estabilidadefinanceira/balancetesbalancospatrimoniais</w:t>
+        </w:r>
+      </w:hyperlink>
+    </w:p>
+  </w:footnote>
+  <w:footnote w:id="17">
+    <w:p>
+      <w:pPr>
+        <w:pStyle w:val="FootnoteText"/>
+        <w:rPr/>
+      </w:pPr>
+      <w:r>
+        <w:rPr>
+          <w:rStyle w:val="FootnoteCharacters"/>
+        </w:rPr>
+        <w:footnoteRef/>
+      </w:r>
+      <w:hyperlink r:id="rId15">
+        <w:r>
+          <w:rPr>
+            <w:rStyle w:val="Hyperlink"/>
+          </w:rPr>
+          <w:tab/>
+          <w:t>https://www.bcb.gov.br/estabilidadefinanceira/relacao_instituicoes_funcionamento</w:t>
+        </w:r>
+      </w:hyperlink>
+    </w:p>
+  </w:footnote>
+  <w:footnote w:id="18">
+    <w:p>
+      <w:pPr>
+        <w:pStyle w:val="FootnoteText"/>
+        <w:rPr/>
+      </w:pPr>
+      <w:r>
+        <w:rPr>
+          <w:rStyle w:val="FootnoteCharacters"/>
+        </w:rPr>
+        <w:footnoteRef/>
+      </w:r>
+      <w:r>
+        <w:fldChar w:fldCharType="begin"/>
+      </w:r>
+      <w:r>
+        <w:rPr>
+          <w:rStyle w:val="Hyperlink"/>
+        </w:rPr>
+        <w:instrText xml:space="preserve"> HYPERLINK "http://olinda.bcb.gov.br/olinda/servico/IFDATA/versao/v1/aplicacao" \l "!/recursos"</w:instrText>
+      </w:r>
+      <w:r>
+        <w:rPr>
+          <w:rStyle w:val="Hyperlink"/>
+        </w:rPr>
+        <w:fldChar w:fldCharType="separate"/>
+      </w:r>
+      <w:r>
+        <w:rPr>
+          <w:rStyle w:val="Hyperlink"/>
+        </w:rPr>
+        <w:tab/>
+        <w:t>olinda.bcb.gov.br/olinda/servico/IFDATA/versao/v1/aplicacao#!/recursos</w:t>
+      </w:r>
+      <w:r>
+        <w:rPr>
+          <w:rStyle w:val="Hyperlink"/>
+        </w:rPr>
+        <w:fldChar w:fldCharType="end"/>
+      </w:r>
     </w:p>
   </w:footnote>
 </w:footnotes>
@@ -3123,7 +4996,7 @@
     </w:pPr>
     <w:r>
       <w:drawing>
-        <wp:anchor behindDoc="0" distT="0" distB="0" distL="114300" distR="114300" simplePos="0" locked="0" layoutInCell="0" allowOverlap="1" relativeHeight="20">
+        <wp:anchor behindDoc="0" distT="0" distB="0" distL="114300" distR="114300" simplePos="0" locked="0" layoutInCell="0" allowOverlap="1" relativeHeight="34">
           <wp:simplePos x="0" y="0"/>
           <wp:positionH relativeFrom="margin">
             <wp:posOffset>5029200</wp:posOffset>
@@ -3136,13 +5009,13 @@
           <wp:wrapThrough wrapText="bothSides">
             <wp:wrapPolygon edited="0">
               <wp:start x="-8" y="0"/>
-              <wp:lineTo x="-8" y="20671"/>
-              <wp:lineTo x="21017" y="20671"/>
-              <wp:lineTo x="21017" y="0"/>
+              <wp:lineTo x="-8" y="20667"/>
+              <wp:lineTo x="21011" y="20667"/>
+              <wp:lineTo x="21011" y="0"/>
               <wp:lineTo x="-8" y="0"/>
             </wp:wrapPolygon>
           </wp:wrapThrough>
-          <wp:docPr id="4" name="Imagem 1803984902" descr="Desenho com traços pretos em fundo branco&#10;&#10;Descrição gerada automaticamente com confiança média"/>
+          <wp:docPr id="15" name="Imagem 1803984902" descr="Desenho com traços pretos em fundo branco&#10;&#10;Descrição gerada automaticamente com confiança média"/>
           <wp:cNvGraphicFramePr>
             <a:graphicFrameLocks xmlns:a="http://schemas.openxmlformats.org/drawingml/2006/main" noChangeAspect="1"/>
           </wp:cNvGraphicFramePr>
@@ -3150,7 +5023,7 @@
             <a:graphicData uri="http://schemas.openxmlformats.org/drawingml/2006/picture">
               <pic:pic xmlns:pic="http://schemas.openxmlformats.org/drawingml/2006/picture">
                 <pic:nvPicPr>
-                  <pic:cNvPr id="4" name="Imagem 1803984902" descr="Desenho com traços pretos em fundo branco&#10;&#10;Descrição gerada automaticamente com confiança média"/>
+                  <pic:cNvPr id="15" name="Imagem 1803984902" descr="Desenho com traços pretos em fundo branco&#10;&#10;Descrição gerada automaticamente com confiança média"/>
                   <pic:cNvPicPr>
                     <a:picLocks noChangeAspect="1" noChangeArrowheads="1"/>
                   </pic:cNvPicPr>
@@ -3198,7 +5071,7 @@
       <mc:AlternateContent>
         <mc:Choice Requires="wps">
           <w:drawing>
-            <wp:anchor behindDoc="1" distT="1905" distB="1905" distL="1905" distR="1905" simplePos="0" locked="0" layoutInCell="0" allowOverlap="1" relativeHeight="11" wp14:anchorId="34FDC6CC">
+            <wp:anchor behindDoc="1" distT="1905" distB="1905" distL="1905" distR="1905" simplePos="0" locked="0" layoutInCell="0" allowOverlap="1" relativeHeight="18" wp14:anchorId="34FDC6CC">
               <wp:simplePos x="0" y="0"/>
               <wp:positionH relativeFrom="margin">
                 <wp:align>right</wp:align>
@@ -3209,7 +5082,7 @@
               <wp:extent cx="5753100" cy="0"/>
               <wp:effectExtent l="1905" t="1905" r="1905" b="1905"/>
               <wp:wrapNone/>
-              <wp:docPr id="5" name="Conector reto 844941520"/>
+              <wp:docPr id="16" name="Conector reto 844941520"/>
               <a:graphic xmlns:a="http://schemas.openxmlformats.org/drawingml/2006/main">
                 <a:graphicData uri="http://schemas.microsoft.com/office/word/2010/wordprocessingShape">
                   <wps:wsp>
@@ -3289,7 +5162,7 @@
     </w:pPr>
     <w:r>
       <w:drawing>
-        <wp:anchor behindDoc="0" distT="0" distB="0" distL="114300" distR="114300" simplePos="0" locked="0" layoutInCell="0" allowOverlap="1" relativeHeight="20">
+        <wp:anchor behindDoc="0" distT="0" distB="0" distL="114300" distR="114300" simplePos="0" locked="0" layoutInCell="0" allowOverlap="1" relativeHeight="34">
           <wp:simplePos x="0" y="0"/>
           <wp:positionH relativeFrom="margin">
             <wp:posOffset>5029200</wp:posOffset>
@@ -3302,13 +5175,13 @@
           <wp:wrapThrough wrapText="bothSides">
             <wp:wrapPolygon edited="0">
               <wp:start x="-8" y="0"/>
-              <wp:lineTo x="-8" y="20671"/>
-              <wp:lineTo x="21017" y="20671"/>
-              <wp:lineTo x="21017" y="0"/>
+              <wp:lineTo x="-8" y="20667"/>
+              <wp:lineTo x="21011" y="20667"/>
+              <wp:lineTo x="21011" y="0"/>
               <wp:lineTo x="-8" y="0"/>
             </wp:wrapPolygon>
           </wp:wrapThrough>
-          <wp:docPr id="6" name="Imagem 1803984902" descr="Desenho com traços pretos em fundo branco&#10;&#10;Descrição gerada automaticamente com confiança média"/>
+          <wp:docPr id="17" name="Imagem 1803984902" descr="Desenho com traços pretos em fundo branco&#10;&#10;Descrição gerada automaticamente com confiança média"/>
           <wp:cNvGraphicFramePr>
             <a:graphicFrameLocks xmlns:a="http://schemas.openxmlformats.org/drawingml/2006/main" noChangeAspect="1"/>
           </wp:cNvGraphicFramePr>
@@ -3316,7 +5189,7 @@
             <a:graphicData uri="http://schemas.openxmlformats.org/drawingml/2006/picture">
               <pic:pic xmlns:pic="http://schemas.openxmlformats.org/drawingml/2006/picture">
                 <pic:nvPicPr>
-                  <pic:cNvPr id="6" name="Imagem 1803984902" descr="Desenho com traços pretos em fundo branco&#10;&#10;Descrição gerada automaticamente com confiança média"/>
+                  <pic:cNvPr id="17" name="Imagem 1803984902" descr="Desenho com traços pretos em fundo branco&#10;&#10;Descrição gerada automaticamente com confiança média"/>
                   <pic:cNvPicPr>
                     <a:picLocks noChangeAspect="1" noChangeArrowheads="1"/>
                   </pic:cNvPicPr>
@@ -3364,7 +5237,7 @@
       <mc:AlternateContent>
         <mc:Choice Requires="wps">
           <w:drawing>
-            <wp:anchor behindDoc="1" distT="1905" distB="1905" distL="1905" distR="1905" simplePos="0" locked="0" layoutInCell="0" allowOverlap="1" relativeHeight="11" wp14:anchorId="34FDC6CC">
+            <wp:anchor behindDoc="1" distT="1905" distB="1905" distL="1905" distR="1905" simplePos="0" locked="0" layoutInCell="0" allowOverlap="1" relativeHeight="18" wp14:anchorId="34FDC6CC">
               <wp:simplePos x="0" y="0"/>
               <wp:positionH relativeFrom="margin">
                 <wp:align>right</wp:align>
@@ -3375,7 +5248,7 @@
               <wp:extent cx="5753100" cy="0"/>
               <wp:effectExtent l="1905" t="1905" r="1905" b="1905"/>
               <wp:wrapNone/>
-              <wp:docPr id="7" name="Conector reto 844941520"/>
+              <wp:docPr id="18" name="Conector reto 844941520"/>
               <a:graphic xmlns:a="http://schemas.openxmlformats.org/drawingml/2006/main">
                 <a:graphicData uri="http://schemas.microsoft.com/office/word/2010/wordprocessingShape">
                   <wps:wsp>
@@ -4289,6 +6162,13 @@
       <w:vertAlign w:val="superscript"/>
     </w:rPr>
   </w:style>
+  <w:style w:type="character" w:styleId="FootnoteCharacters">
+    <w:name w:val="Footnote Characters"/>
+    <w:qFormat/>
+    <w:rPr>
+      <w:vertAlign w:val="superscript"/>
+    </w:rPr>
+  </w:style>
   <w:style w:type="character" w:styleId="FootnoteReference">
     <w:name w:val="Footnote Reference"/>
     <w:rPr>
@@ -4297,6 +6177,13 @@
   </w:style>
   <w:style w:type="character" w:styleId="Caracteresdenotadefim">
     <w:name w:val="Caracteres de nota de fim"/>
+    <w:qFormat/>
+    <w:rPr>
+      <w:vertAlign w:val="superscript"/>
+    </w:rPr>
+  </w:style>
+  <w:style w:type="character" w:styleId="EndnoteCharacters">
+    <w:name w:val="Endnote Characters"/>
     <w:qFormat/>
     <w:rPr>
       <w:vertAlign w:val="superscript"/>
@@ -4323,8 +6210,8 @@
       <w:rFonts w:ascii="OpenSymbol" w:hAnsi="OpenSymbol" w:eastAsia="OpenSymbol" w:cs="OpenSymbol"/>
     </w:rPr>
   </w:style>
-  <w:style w:type="paragraph" w:styleId="Ttulo">
-    <w:name w:val="Título"/>
+  <w:style w:type="paragraph" w:styleId="Heading">
+    <w:name w:val="Heading"/>
     <w:basedOn w:val="Normal"/>
     <w:next w:val="BodyText"/>
     <w:qFormat/>
@@ -4370,6 +6257,32 @@
       <w:szCs w:val="24"/>
     </w:rPr>
   </w:style>
+  <w:style w:type="paragraph" w:styleId="Index">
+    <w:name w:val="Index"/>
+    <w:basedOn w:val="Normal"/>
+    <w:qFormat/>
+    <w:pPr>
+      <w:suppressLineNumbers/>
+    </w:pPr>
+    <w:rPr>
+      <w:rFonts w:cs="Noto Sans Devanagari"/>
+    </w:rPr>
+  </w:style>
+  <w:style w:type="paragraph" w:styleId="Ttulo">
+    <w:name w:val="Título"/>
+    <w:basedOn w:val="Normal"/>
+    <w:next w:val="BodyText"/>
+    <w:qFormat/>
+    <w:pPr>
+      <w:keepNext w:val="true"/>
+      <w:spacing w:before="240" w:after="120"/>
+    </w:pPr>
+    <w:rPr>
+      <w:rFonts w:ascii="Liberation Sans" w:hAnsi="Liberation Sans" w:eastAsia="Noto Sans CJK SC" w:cs="Noto Sans Devanagari"/>
+      <w:sz w:val="28"/>
+      <w:szCs w:val="28"/>
+    </w:rPr>
+  </w:style>
   <w:style w:type="paragraph" w:styleId="ndice">
     <w:name w:val="Índice"/>
     <w:basedOn w:val="Normal"/>
@@ -4383,6 +6296,13 @@
   </w:style>
   <w:style w:type="paragraph" w:styleId="Cabealhoerodap">
     <w:name w:val="Cabeçalho e rodapé"/>
+    <w:basedOn w:val="Normal"/>
+    <w:qFormat/>
+    <w:pPr/>
+    <w:rPr/>
+  </w:style>
+  <w:style w:type="paragraph" w:styleId="HeaderandFooter">
+    <w:name w:val="Header and Footer"/>
     <w:basedOn w:val="Normal"/>
     <w:qFormat/>
     <w:pPr/>

</xml_diff>

<commit_message>
sugestoes de pesquisa adicionadas
</commit_message>
<xml_diff>
--- a/TCC_rtheodoro.docx
+++ b/TCC_rtheodoro.docx
@@ -589,185 +589,129 @@
           <w:bCs w:val="false"/>
           <w:u w:val="none"/>
         </w:rPr>
-        <w:t xml:space="preserve">Para que uma pesquisa apresente qualidade, é essencial que os dados utilizados também sejam confiáveis e bem estruturados. O Banco Central do Brasil [Bacen] disponibiliza uma ampla série de dados, cuja coleta manual pode demandar tempo e esforço significativos. Nesse contexto, o pacote bacenR surge como uma ferramenta que facilita o acesso a informações de instituições financeiras disponibilizadas pelo Bacen, sendo elas balanços, dados cadastrais, atos normativos e carteiras de crédito. </w:t>
+        <w:t>Para que uma pesquisa apresente qualidade, é essencial que os dados utilizados também sejam confiáveis e bem estruturados. O Banco Central do Brasil [Bacen] disponibiliza uma ampla série de dados, cuja coleta manual pode demandar tempo e esforço significativos. Nesse contexto, o pacote bacenR surge como uma ferramenta que facilita o acesso a informações de instituições financeiras disponibilizadas pelo Bacen, sendo elas balanços, dados cadastrais, atos normativos e carteiras de crédito. Seu desenvolvimento foi elaborado de acordo como o processo de criação de um produto, com definição de escopo, viabilidade, definição de prazos e configurações básicas para lançamento, baseado nas boas normas de desenvolvimento de pacotes em R. Atualmente, o pacote conta com uma versão estável disponível no CRAN e uma versão em desenvolvimento no GitHub. Após ser instalado por ao menos 20 pessoas (segundo o CRAN), seu uso demonstra eficiência no processo de download e tratamento de dados, permitindo a obtenção de grandes volumes de informações com poucas linhas de código, o que reduz o tempo dedicado à coleta e amplia o tempo disponível para a análise dos resultados.</w:t>
+      </w:r>
+    </w:p>
+    <w:p>
+      <w:pPr>
+        <w:pStyle w:val="Normal"/>
+        <w:spacing w:lineRule="auto" w:line="240"/>
+        <w:rPr>
+          <w:b/>
+          <w:bCs/>
+          <w:color w:val="000000"/>
+        </w:rPr>
+      </w:pPr>
+      <w:r>
+        <w:rPr>
+          <w:b/>
+          <w:bCs/>
+          <w:color w:val="000000"/>
+        </w:rPr>
+        <w:t>Palavras-chave:</w:t>
       </w:r>
       <w:r>
         <w:rPr>
           <w:b w:val="false"/>
           <w:bCs w:val="false"/>
-          <w:u w:val="none"/>
-        </w:rPr>
-        <w:t>Seu desenvolvimento foi elaborado de acordo como o processo de criação de um produto, com definição de escopo, viabilidade, definição de prazos e configurações básicas para lançamento, baseado nas boas normas de desenvolvimento de pacotes em R.</w:t>
-      </w:r>
-      <w:r>
-        <w:rPr>
+          <w:color w:val="000000"/>
+        </w:rPr>
+        <w:t xml:space="preserve"> Bacen; balancete; atos normativos; ifdata; instituições financeiras;</w:t>
+      </w:r>
+    </w:p>
+    <w:p>
+      <w:pPr>
+        <w:pStyle w:val="Normal"/>
+        <w:spacing w:lineRule="auto" w:line="360"/>
+        <w:rPr>
+          <w:b/>
+        </w:rPr>
+      </w:pPr>
+      <w:r>
+        <w:rPr>
+          <w:b/>
+        </w:rPr>
+      </w:r>
+    </w:p>
+    <w:p>
+      <w:pPr>
+        <w:pStyle w:val="ListParagraph"/>
+        <w:spacing w:lineRule="auto" w:line="360"/>
+        <w:ind w:left="0"/>
+        <w:jc w:val="left"/>
+        <w:rPr>
+          <w:b/>
+        </w:rPr>
+      </w:pPr>
+      <w:commentRangeStart w:id="0"/>
+      <w:r>
+        <w:rPr>
+          <w:b/>
+        </w:rPr>
+        <w:t>Introdução</w:t>
+      </w:r>
+      <w:commentRangeEnd w:id="0"/>
+      <w:r>
+        <w:commentReference w:id="0"/>
+      </w:r>
+      <w:r>
+        <w:rPr>
+          <w:b/>
+        </w:rPr>
+      </w:r>
+    </w:p>
+    <w:p>
+      <w:pPr>
+        <w:pStyle w:val="ListParagraph"/>
+        <w:spacing w:lineRule="auto" w:line="360"/>
+        <w:ind w:left="0"/>
+        <w:jc w:val="left"/>
+        <w:rPr/>
+      </w:pPr>
+      <w:r>
+        <w:rPr/>
+      </w:r>
+    </w:p>
+    <w:p>
+      <w:pPr>
+        <w:pStyle w:val="Normal"/>
+        <w:spacing w:lineRule="auto" w:line="360"/>
+        <w:ind w:firstLine="709"/>
+        <w:rPr/>
+      </w:pPr>
+      <w:commentRangeStart w:id="1"/>
+      <w:r>
+        <w:rPr>
+          <w:rStyle w:val="normaltextrun"/>
           <w:b w:val="false"/>
           <w:bCs w:val="false"/>
-          <w:u w:val="none"/>
-        </w:rPr>
-        <w:t xml:space="preserve"> Atualmente, o pacote conta com uma versão estável disponível no CRAN e uma versão em desenvolvimento no GitHub. </w:t>
-      </w:r>
-      <w:r>
-        <w:rPr>
+          <w:color w:val="000000"/>
+          <w:shd w:fill="FFFFFF" w:val="clear"/>
+        </w:rPr>
+        <w:t xml:space="preserve">A pesquisa </w:t>
+      </w:r>
+      <w:r>
+        <w:rPr>
+          <w:rStyle w:val="normaltextrun"/>
           <w:b w:val="false"/>
           <w:bCs w:val="false"/>
-          <w:u w:val="none"/>
-        </w:rPr>
-        <w:t>Após ser instalado por ao menos 20 pessoas (segundo o CRAN), seu</w:t>
-      </w:r>
-      <w:r>
-        <w:rPr>
+          <w:color w:val="000000"/>
+          <w:shd w:fill="FFFFFF" w:val="clear"/>
+        </w:rPr>
+      </w:r>
+      <w:commentRangeEnd w:id="1"/>
+      <w:r>
+        <w:commentReference w:id="1"/>
+      </w:r>
+      <w:r>
+        <w:rPr>
+          <w:rStyle w:val="normaltextrun"/>
           <w:b w:val="false"/>
           <w:bCs w:val="false"/>
-          <w:u w:val="none"/>
-        </w:rPr>
-        <w:t xml:space="preserve"> </w:t>
-      </w:r>
-      <w:r>
-        <w:rPr>
-          <w:b w:val="false"/>
-          <w:bCs w:val="false"/>
-          <w:u w:val="none"/>
-        </w:rPr>
-        <w:t xml:space="preserve">uso </w:t>
-      </w:r>
-      <w:r>
-        <w:rPr>
-          <w:b w:val="false"/>
-          <w:bCs w:val="false"/>
-          <w:u w:val="none"/>
-        </w:rPr>
-        <w:t>demonstra eficiência no processo de download e tratamento de dados, permitindo a obtenção de grandes volumes de informações com poucas linhas de código, o que reduz o tempo dedicado à coleta e amplia o tempo disponível para a análise dos resultados.</w:t>
-      </w:r>
-    </w:p>
-    <w:p>
-      <w:pPr>
-        <w:pStyle w:val="Normal"/>
-        <w:spacing w:lineRule="auto" w:line="240"/>
-        <w:rPr>
-          <w:b/>
-          <w:bCs/>
-          <w:color w:val="000000"/>
-        </w:rPr>
-      </w:pPr>
-      <w:r>
-        <w:rPr>
-          <w:b/>
-          <w:bCs/>
-          <w:color w:val="000000"/>
-        </w:rPr>
-        <w:t>Palavras-chave:</w:t>
-      </w:r>
-      <w:r>
-        <w:rPr>
-          <w:b w:val="false"/>
-          <w:bCs w:val="false"/>
-          <w:color w:val="000000"/>
-        </w:rPr>
-        <w:t xml:space="preserve"> Bacen; </w:t>
-      </w:r>
-      <w:r>
-        <w:rPr>
-          <w:b w:val="false"/>
-          <w:bCs w:val="false"/>
-          <w:color w:val="000000"/>
-        </w:rPr>
-        <w:t>balancete</w:t>
-      </w:r>
-      <w:r>
-        <w:rPr>
-          <w:b w:val="false"/>
-          <w:bCs w:val="false"/>
-          <w:color w:val="000000"/>
-        </w:rPr>
-        <w:t xml:space="preserve">; </w:t>
-      </w:r>
-      <w:r>
-        <w:rPr>
-          <w:b w:val="false"/>
-          <w:bCs w:val="false"/>
-          <w:color w:val="000000"/>
-        </w:rPr>
-        <w:t>atos normativos</w:t>
-      </w:r>
-      <w:r>
-        <w:rPr>
-          <w:b w:val="false"/>
-          <w:bCs w:val="false"/>
-          <w:color w:val="000000"/>
-        </w:rPr>
-        <w:t>; ifdata; instituições financeiras;</w:t>
-      </w:r>
-    </w:p>
-    <w:p>
-      <w:pPr>
-        <w:pStyle w:val="Normal"/>
-        <w:spacing w:lineRule="auto" w:line="360"/>
-        <w:rPr>
-          <w:b/>
-        </w:rPr>
-      </w:pPr>
-      <w:r>
-        <w:rPr>
-          <w:b/>
-        </w:rPr>
-      </w:r>
-    </w:p>
-    <w:p>
-      <w:pPr>
-        <w:pStyle w:val="ListParagraph"/>
-        <w:spacing w:lineRule="auto" w:line="360"/>
-        <w:ind w:left="0"/>
-        <w:jc w:val="left"/>
-        <w:rPr>
-          <w:b/>
-        </w:rPr>
-      </w:pPr>
-      <w:commentRangeStart w:id="0"/>
-      <w:r>
-        <w:rPr>
-          <w:b/>
-        </w:rPr>
-        <w:t>Introdução</w:t>
-      </w:r>
-      <w:commentRangeEnd w:id="0"/>
-      <w:r>
-        <w:commentReference w:id="0"/>
-      </w:r>
-      <w:r>
-        <w:rPr>
-          <w:b/>
-        </w:rPr>
-      </w:r>
-    </w:p>
-    <w:p>
-      <w:pPr>
-        <w:pStyle w:val="ListParagraph"/>
-        <w:spacing w:lineRule="auto" w:line="360"/>
-        <w:ind w:left="0"/>
-        <w:jc w:val="left"/>
-        <w:rPr/>
-      </w:pPr>
-      <w:r>
-        <w:rPr/>
-      </w:r>
-    </w:p>
-    <w:p>
-      <w:pPr>
-        <w:pStyle w:val="Normal"/>
-        <w:spacing w:lineRule="auto" w:line="360"/>
-        <w:ind w:firstLine="709"/>
-        <w:rPr/>
-      </w:pPr>
-      <w:r>
-        <w:rPr>
-          <w:rStyle w:val="normaltextrun"/>
-          <w:b w:val="false"/>
-          <w:bCs w:val="false"/>
-          <w:color w:val="000000"/>
-          <w:shd w:fill="FFFFFF" w:val="clear"/>
-        </w:rPr>
-        <w:t>A pesquisa acadêmica sobre bancos e cooperativas de crédito depende fundamentalmente do acesso a dados financeiros confiáveis, granulares e atualizados, pois são esses dados que permitem investigar eficiência, desempenho, risco e competitividade dessas instituições dentro do sistema financeiro nacional. Diversos estudos já evidenciaram que a análise quantitativa, amparada em bases extensas e precisas, é o meio mais robusto para identificar padrões, testar hipóteses e propor soluções voltadas para o desenvolvimento e regulação do setor bancário e cooperativista. O uso intensivo de dados provenientes de fontes institucionais, como o Banco Central do Brasil [Bacen], possibilita pesquisas sobre influências das cooperativas de crédito em taxas de juros, análise de liquidez, avaliação de concentração bancária, fusões e incorporações, entre outras questões relevantes para o ambiente financeiro nacional.</w:t>
+          <w:color w:val="000000"/>
+          <w:shd w:fill="FFFFFF" w:val="clear"/>
+        </w:rPr>
+        <w:t>acadêmica sobre bancos e cooperativas de crédito depende fundamentalmente do acesso a dados financeiros confiáveis, granulares e atualizados, pois são esses dados que permitem investigar eficiência, desempenho, risco e competitividade dessas instituições dentro do sistema financeiro nacional. Diversos estudos já evidenciaram que a análise quantitativa, amparada em bases extensas e precisas, é o meio mais robusto para identificar padrões, testar hipóteses e propor soluções voltadas para o desenvolvimento e regulação do setor bancário e cooperativista. O uso intensivo de dados provenientes de fontes institucionais, como o Banco Central do Brasil [Bacen], possibilita pesquisas sobre influências das cooperativas de crédito em taxas de juros, análise de liquidez, avaliação de concentração bancária, fusões e incorporações, entre outras questões relevantes para o ambiente financeiro nacional.</w:t>
       </w:r>
     </w:p>
     <w:p>
@@ -913,20 +857,6 @@
       <w:r>
         <w:rPr/>
         <w:t xml:space="preserve">Tendo em vista os pontos apresentados, o objetivo deste trabalho foi criar um pacote em R, nomeado de bacenR, para baixar informações sobre Instruções Normativas que regem a regulação e fiscalização das instituições financeiras, os Balanços e Balancetes das mesmas, informações sobre as carteiras de crédito ativas de cada instituição e dados sobre o endereço das instituições financeiras ativas em cada período, de forma que os dados obtidos sejam facilmente tratados e organizados. </w:t>
-      </w:r>
-    </w:p>
-    <w:p>
-      <w:pPr>
-        <w:pStyle w:val="BodyText"/>
-        <w:widowControl/>
-        <w:bidi w:val="0"/>
-        <w:spacing w:lineRule="auto" w:line="360" w:before="0" w:after="140"/>
-        <w:ind w:firstLine="737" w:left="0" w:right="0"/>
-        <w:jc w:val="both"/>
-        <w:rPr/>
-      </w:pPr>
-      <w:r>
-        <w:rPr/>
       </w:r>
     </w:p>
     <w:p>
@@ -987,27 +917,16 @@
       </w:pPr>
       <w:r>
         <w:rPr/>
-        <w:t>O desenvolvimento do pacote ocorreu em etapas. Inicialmente, definiu-se o escopo do projeto, contemplando o idioma a ser utilizado, as principais funcionalidades a serem implementadas e o cronograma de execução. Em seguida, criou-se um “</w:t>
-      </w:r>
-      <w:r>
-        <w:rPr>
-          <w:rStyle w:val="Emphasis"/>
-          <w:i w:val="false"/>
-          <w:iCs w:val="false"/>
-        </w:rPr>
-        <w:t>GitHub Project”</w:t>
-      </w:r>
-      <w:r>
-        <w:rPr>
-          <w:rStyle w:val="FootnoteReference"/>
-          <w:i w:val="false"/>
-          <w:iCs w:val="false"/>
-        </w:rPr>
-        <w:footnoteReference w:id="5"/>
-      </w:r>
-      <w:r>
-        <w:rPr/>
-        <w:t xml:space="preserve"> com o propósito de aprimorar a gestão do desenvolvimento, distribuir as tarefas, acompanhar o progresso das implementações e planejar as próximas etapas.</w:t>
+        <w:t xml:space="preserve">O desenvolvimento do pacote ocorreu em etapas seguindo o que foi apresentado por </w:t>
+      </w:r>
+      <w:r>
+        <w:rPr>
+          <w:rFonts w:eastAsia="Times New Roman"/>
+          <w:b w:val="false"/>
+          <w:bCs w:val="false"/>
+          <w:lang w:eastAsia="pt-BR"/>
+        </w:rPr>
+        <w:t>Wickham e Bryan (2023), que são: 1) Configurações iniciais (ambiente); 2) Componentes do pacote (código, dados e outros); 3) Matadados (descrição, dependências e licença); 4) Testagem; 5) Documentação, e; 6) Manutenção.</w:t>
       </w:r>
     </w:p>
     <w:p>
@@ -1022,8 +941,37 @@
         <w:rPr/>
       </w:pPr>
       <w:r>
-        <w:rPr/>
-        <w:t>Com a estrutura organizacional estabelecida, iniciou-se a fase de codificação do pacote. As funções previstas tinham como finalidades: (1) realizar o “download” das normas publicadas pelo Banco Central do Brasil e de suas respectivas alterações; (2) extrair o texto integral dessas normas; (3) obter os balanços e balancetes das instituições financeiras; e (4) processar esses dados, preparando-os para posterior análise.</w:t>
+        <w:rPr>
+          <w:rFonts w:eastAsia="Times New Roman"/>
+          <w:b w:val="false"/>
+          <w:bCs w:val="false"/>
+          <w:lang w:eastAsia="pt-BR"/>
+        </w:rPr>
+        <w:t>Desta forma, como passo inicial</w:t>
+      </w:r>
+      <w:r>
+        <w:rPr/>
+        <w:t>, definiu-se o escopo do projeto, contemplando o idioma a ser utilizado, as principais funcionalidades a serem implementadas e o cronograma de execução. Em seguida, criou-se um “</w:t>
+      </w:r>
+      <w:r>
+        <w:rPr>
+          <w:rStyle w:val="Emphasis"/>
+          <w:i w:val="false"/>
+          <w:iCs w:val="false"/>
+        </w:rPr>
+        <w:t>GitHub Project”</w:t>
+      </w:r>
+      <w:r>
+        <w:rPr>
+          <w:rStyle w:val="FootnoteReference"/>
+          <w:i w:val="false"/>
+          <w:iCs w:val="false"/>
+        </w:rPr>
+        <w:footnoteReference w:id="5"/>
+      </w:r>
+      <w:r>
+        <w:rPr/>
+        <w:t xml:space="preserve"> com o propósito de aprimorar a gestão do desenvolvimento, distribuir as tarefas, acompanhar o progresso das implementações e planejar as próximas etapas.</w:t>
       </w:r>
     </w:p>
     <w:p>
@@ -1039,7 +987,7 @@
       </w:pPr>
       <w:r>
         <w:rPr/>
-        <w:t>Na sequência, procedeu-se à análise dos componentes estruturais do pacote, que são compostos pelo código-fonte, pela bases de dados, pelos diretórios e pelas referências bibliográficas, a fim de assegurar sua consistência e coerência interna. Concluída essa verificação, elaboraram-se os metadados, que contemplaram a descrição detalhada do pacote, suas dependências, a estrutura organizacional do projeto conforme as boas práticas de desenvolvimento e a definição da licença de uso. Como, por exemplo, os pacotes que o usuário precisa ter instalado para que o bacenR funcione, são: `dplyr`, `fs`, `glue`, `httr`, `janitor`,  `jsonlite`, `lifecycle`, `purrr`, `readr`, `rlang`, `stringr`, `tibble`, `tidyr`, `tools`, `utils` e `xml2`. Além disso, o R precisa estar na versão 4.1 ou superior.</w:t>
+        <w:t>Com a estrutura organizacional estabelecida, iniciou-se a fase de codificação do pacote. As funções previstas tinham como finalidades: (1) realizar o “download” das normas publicadas pelo Banco Central do Brasil e de suas respectivas alterações; (2) extrair o texto integral dessas normas; (3) obter os balanços e balancetes das instituições financeiras; e (4) processar esses dados, preparando-os para posterior análise.</w:t>
       </w:r>
     </w:p>
     <w:p>
@@ -1055,19 +1003,7 @@
       </w:pPr>
       <w:r>
         <w:rPr/>
-        <w:t>Com a estrutura final consolidada, iniciou-se a fase de testes. Cada função foi submetida a testes individuais com a utilização dos pacotes `testethat` e `devtools`, utilizando diferentes parâmetros com o objetivo de verificar a robustez e o comportamento do código. Os erros identificados foram corrigidos iterativamente, implicando ajustes tanto na codificação quanto na documentação e nas dependências declaradas. Após a aprovação em todos os testes, incluindo o “</w:t>
-      </w:r>
-      <w:r>
-        <w:rPr>
-          <w:rStyle w:val="Emphasis"/>
-          <w:i w:val="false"/>
-          <w:iCs w:val="false"/>
-        </w:rPr>
-        <w:t>R CMD CHECK”</w:t>
-      </w:r>
-      <w:r>
-        <w:rPr/>
-        <w:t xml:space="preserve"> executado por meio da integração com o “GitHub”, iniciou-se o processo de documentação formal, com a ajuda do pacote `usethis`. Todas as funções foram descritas detalhadamente, com a exposição de seus objetivos, parâmetros, resultados esperados e respectivas fontes de dados, de modo a garantir total transparência e compreensibilidade ao usuário final.</w:t>
+        <w:t>Na sequência, procedeu-se à análise dos componentes estruturais do pacote, que são compostos pelo código-fonte, pela bases de dados, pelos diretórios e pelas referências bibliográficas, a fim de assegurar sua consistência e coerência interna. Concluída essa verificação, elaboraram-se os metadados, que contemplaram a descrição detalhada do pacote, suas dependências, a estrutura organizacional do projeto conforme as boas práticas de desenvolvimento e a definição da licença de uso. Como, por exemplo, os pacotes que o usuário precisa ter instalado para que o bacenR funcione, são: `dplyr`, `fs`, `glue`, `httr`, `janitor`,  `jsonlite`, `lifecycle`, `purrr`, `readr`, `rlang`, `stringr`, `tibble`, `tidyr`, `tools`, `utils` e `xml2`. Além disso, o R precisa estar na versão 4.1 ou superior.</w:t>
       </w:r>
     </w:p>
     <w:p>
@@ -1083,7 +1019,7 @@
       </w:pPr>
       <w:r>
         <w:rPr/>
-        <w:t>Com o pacote finalizado, procedeu-se à sua disponibilização no “</w:t>
+        <w:t>Com a estrutura final consolidada, iniciou-se a fase de testes. Cada função foi submetida a testes individuais com a utilização dos pacotes `testethat` e `devtools`, utilizando diferentes parâmetros com o objetivo de verificar a robustez e o comportamento do código. Os erros identificados foram corrigidos iterativamente, implicando ajustes tanto na codificação quanto na documentação e nas dependências declaradas. Após a aprovação em todos os testes, incluindo o “</w:t>
       </w:r>
       <w:r>
         <w:rPr>
@@ -1091,53 +1027,11 @@
           <w:i w:val="false"/>
           <w:iCs w:val="false"/>
         </w:rPr>
-        <w:t>GitHub”</w:t>
-      </w:r>
-      <w:r>
-        <w:rPr>
-          <w:rStyle w:val="FootnoteReference"/>
-          <w:i w:val="false"/>
-          <w:iCs w:val="false"/>
-        </w:rPr>
-        <w:footnoteReference w:id="6"/>
-      </w:r>
-      <w:r>
-        <w:rPr/>
-        <w:t xml:space="preserve">, acompanhada de um arquivo </w:t>
-      </w:r>
-      <w:r>
-        <w:rPr>
-          <w:rStyle w:val="Emphasis"/>
-          <w:i w:val="false"/>
-          <w:iCs w:val="false"/>
-        </w:rPr>
-        <w:t>README.md</w:t>
-      </w:r>
-      <w:r>
-        <w:rPr/>
-        <w:t xml:space="preserve"> contendo instruções para instalação, explicação sobre o funcionamento e exemplos de uso das funções implementadas. A versão lançada, denominada </w:t>
-      </w:r>
-      <w:r>
-        <w:rPr>
-          <w:rStyle w:val="Strong"/>
-          <w:b w:val="false"/>
-          <w:bCs w:val="false"/>
-        </w:rPr>
-        <w:t>bacenR v0.1.0</w:t>
-      </w:r>
-      <w:r>
-        <w:rPr/>
-        <w:t>, foi classificada como versão beta, uma vez que, apesar dos testes realizados, ainda poderiam ser identificados erros residuais. Para ampliar a fase de validação, o pacote foi também divulgado em redes sociais (WhatsApp, Twitter/X e LinkedIn). Com várias pessoas utilizando, foi possível obter feedbacks para a identificar falhas, propor melhorias e definir novas funcionalidades a serem incorporadas. O usuário também pode dar sua opinião, tirar dúvidas e sugerir melhorias através das “issues” do “Github”</w:t>
-      </w:r>
-      <w:r>
-        <w:rPr>
-          <w:rStyle w:val="FootnoteReference"/>
-        </w:rPr>
-        <w:footnoteReference w:id="7"/>
-      </w:r>
-      <w:r>
-        <w:rPr/>
-        <w:t>.</w:t>
+        <w:t>R CMD CHECK”</w:t>
+      </w:r>
+      <w:r>
+        <w:rPr/>
+        <w:t xml:space="preserve"> executado por meio da integração com o “GitHub”, iniciou-se o processo de documentação formal, com a ajuda do pacote `usethis`. Todas as funções foram descritas detalhadamente, com a exposição de seus objetivos, parâmetros, resultados esperados e respectivas fontes de dados, de modo a garantir total transparência e compreensibilidade ao usuário final.</w:t>
       </w:r>
     </w:p>
     <w:p>
@@ -1153,17 +1047,61 @@
       </w:pPr>
       <w:r>
         <w:rPr/>
-        <w:t>Após os feedbacks, as funções foram ajustadas e novas funções foram adicionadas, seguindo a necessidade dos usuários. Estas novas funções possuíam o objetivo de coletar dados do IFdata</w:t>
+        <w:t>Com o pacote finalizado, procedeu-se à sua disponibilização no “</w:t>
+      </w:r>
+      <w:r>
+        <w:rPr>
+          <w:rStyle w:val="Emphasis"/>
+          <w:i w:val="false"/>
+          <w:iCs w:val="false"/>
+        </w:rPr>
+        <w:t>GitHub”</w:t>
       </w:r>
       <w:r>
         <w:rPr>
           <w:rStyle w:val="FootnoteReference"/>
-        </w:rPr>
-        <w:footnoteReference w:id="8"/>
-      </w:r>
-      <w:r>
-        <w:rPr/>
-        <w:t xml:space="preserve"> sobre as carteiras de crédito ativas das instituições financeiras e o endereço das instituições autorizadas.</w:t>
+          <w:i w:val="false"/>
+          <w:iCs w:val="false"/>
+        </w:rPr>
+        <w:footnoteReference w:id="6"/>
+      </w:r>
+      <w:r>
+        <w:rPr/>
+        <w:t xml:space="preserve">, acompanhada de um arquivo </w:t>
+      </w:r>
+      <w:r>
+        <w:rPr>
+          <w:rStyle w:val="Emphasis"/>
+          <w:i w:val="false"/>
+          <w:iCs w:val="false"/>
+        </w:rPr>
+        <w:t>README.md</w:t>
+      </w:r>
+      <w:r>
+        <w:rPr/>
+        <w:t xml:space="preserve"> contendo instruções para instalação, explicação sobre o funcionamento e exemplos de uso das funções implementadas. A versão lançada, denominada </w:t>
+      </w:r>
+      <w:r>
+        <w:rPr>
+          <w:rStyle w:val="Strong"/>
+          <w:b w:val="false"/>
+          <w:bCs w:val="false"/>
+        </w:rPr>
+        <w:t>bacenR v0.1.0</w:t>
+      </w:r>
+      <w:r>
+        <w:rPr/>
+        <w:t>, foi classificada como versão beta, uma vez que, apesar dos testes realizados, ainda poderiam ser identificados erros residuais. Para ampliar a fase de validação, o pacote foi também divulgado em redes sociais (WhatsApp, Twitter/X e LinkedIn). Com várias pessoas utilizando, foi possível obter feedbacks para a identificar falhas, propor melhorias e definir novas funcionalidades a serem incorporadas. O usuário também pode dar sua opinião, tirar dúvidas e sugerir melhorias através das “issues” do “Github”</w:t>
+      </w:r>
+      <w:r>
+        <w:rPr>
+          <w:rStyle w:val="FootnoteReference"/>
+        </w:rPr>
+        <w:footnoteReference w:id="7"/>
+      </w:r>
+      <w:r>
+        <w:rPr/>
+        <w:t>.</w:t>
       </w:r>
     </w:p>
     <w:p>
@@ -1179,6 +1117,32 @@
       </w:pPr>
       <w:r>
         <w:rPr/>
+        <w:t>Após os feedbacks, as funções foram ajustadas e novas funções foram adicionadas, seguindo a necessidade dos usuários. Estas novas funções possuíam o objetivo de coletar dados do IFdata</w:t>
+      </w:r>
+      <w:r>
+        <w:rPr>
+          <w:rStyle w:val="FootnoteReference"/>
+        </w:rPr>
+        <w:footnoteReference w:id="8"/>
+      </w:r>
+      <w:r>
+        <w:rPr/>
+        <w:t xml:space="preserve"> sobre as carteiras de crédito ativas das instituições financeiras e o endereço das instituições autorizadas.</w:t>
+      </w:r>
+    </w:p>
+    <w:p>
+      <w:pPr>
+        <w:pStyle w:val="BodyText"/>
+        <w:widowControl/>
+        <w:suppressAutoHyphens w:val="true"/>
+        <w:bidi w:val="0"/>
+        <w:spacing w:lineRule="auto" w:line="360" w:before="0" w:after="140"/>
+        <w:ind w:firstLine="680" w:left="0" w:right="0"/>
+        <w:jc w:val="both"/>
+        <w:rPr/>
+      </w:pPr>
+      <w:r>
+        <w:rPr/>
         <w:t>Após uma série de testes e melhorias, já na versão 0.3.1, o pacote foi submetido à avaliação do “</w:t>
       </w:r>
       <w:r>
@@ -1286,7 +1250,7 @@
       </w:pPr>
       <w:r>
         <w:drawing>
-          <wp:anchor behindDoc="0" distT="0" distB="0" distL="0" distR="0" simplePos="0" locked="0" layoutInCell="0" allowOverlap="1" relativeHeight="36">
+          <wp:anchor behindDoc="0" distT="0" distB="0" distL="0" distR="0" simplePos="0" locked="0" layoutInCell="0" allowOverlap="1" relativeHeight="38">
             <wp:simplePos x="0" y="0"/>
             <wp:positionH relativeFrom="column">
               <wp:align>center</wp:align>
@@ -1519,7 +1483,7 @@
       </w:pPr>
       <w:r>
         <w:drawing>
-          <wp:anchor behindDoc="0" distT="0" distB="0" distL="0" distR="0" simplePos="0" locked="0" layoutInCell="0" allowOverlap="1" relativeHeight="38">
+          <wp:anchor behindDoc="0" distT="0" distB="0" distL="0" distR="0" simplePos="0" locked="0" layoutInCell="0" allowOverlap="1" relativeHeight="40">
             <wp:simplePos x="0" y="0"/>
             <wp:positionH relativeFrom="column">
               <wp:align>center</wp:align>
@@ -1782,7 +1746,7 @@
       </w:pPr>
       <w:r>
         <w:drawing>
-          <wp:anchor behindDoc="0" distT="0" distB="0" distL="0" distR="0" simplePos="0" locked="0" layoutInCell="0" allowOverlap="1" relativeHeight="37">
+          <wp:anchor behindDoc="0" distT="0" distB="0" distL="0" distR="0" simplePos="0" locked="0" layoutInCell="0" allowOverlap="1" relativeHeight="39">
             <wp:simplePos x="0" y="0"/>
             <wp:positionH relativeFrom="column">
               <wp:align>center</wp:align>
@@ -1960,7 +1924,23 @@
           <w:color w:val="000000"/>
           <w:shd w:fill="FFFFFF" w:val="clear"/>
         </w:rPr>
-        <w:t>Com a adição destas funções, o pacote foi considerado com conteúdo suficiente para ser lançado em sua versão oficial através do CRAN. Para isso, foi criado um “vignettes”, que é um arquivo com a descrição do pacote e exemplos de uso, assim como o README.md do Github. Desta forma, a árvore de diretório final está representada na Figura  4.</w:t>
+        <w:t>Na Figura 4 estão a descrição das funções e alterações feitas de uma versão para a outra até a versão da publicação, sendo que estas informações estão no arquivo “news” disponível no repositório do GitHub</w:t>
+      </w:r>
+      <w:r>
+        <w:rPr>
+          <w:rStyle w:val="FootnoteReference"/>
+          <w:color w:val="000000"/>
+          <w:shd w:fill="FFFFFF" w:val="clear"/>
+        </w:rPr>
+        <w:footnoteReference w:id="13"/>
+      </w:r>
+      <w:r>
+        <w:rPr>
+          <w:rStyle w:val="normaltextrun"/>
+          <w:color w:val="000000"/>
+          <w:shd w:fill="FFFFFF" w:val="clear"/>
+        </w:rPr>
+        <w:t>.</w:t>
       </w:r>
     </w:p>
     <w:p>
@@ -1976,12 +1956,19 @@
         </w:rPr>
       </w:pPr>
       <w:r>
-        <w:rPr/>
         <w:drawing>
-          <wp:inline distT="0" distB="0" distL="0" distR="0">
-            <wp:extent cx="2105660" cy="6156960"/>
+          <wp:anchor behindDoc="0" distT="0" distB="0" distL="0" distR="0" simplePos="0" locked="0" layoutInCell="0" allowOverlap="1" relativeHeight="51">
+            <wp:simplePos x="0" y="0"/>
+            <wp:positionH relativeFrom="column">
+              <wp:align>center</wp:align>
+            </wp:positionH>
+            <wp:positionV relativeFrom="paragraph">
+              <wp:posOffset>635</wp:posOffset>
+            </wp:positionV>
+            <wp:extent cx="5759450" cy="6447155"/>
             <wp:effectExtent l="0" t="0" r="0" b="0"/>
-            <wp:docPr id="4" name="Image3" descr=""/>
+            <wp:wrapSquare wrapText="largest"/>
+            <wp:docPr id="4" name="Image5" descr=""/>
             <wp:cNvGraphicFramePr>
               <a:graphicFrameLocks xmlns:a="http://schemas.openxmlformats.org/drawingml/2006/main" noChangeAspect="1"/>
             </wp:cNvGraphicFramePr>
@@ -1989,13 +1976,116 @@
               <a:graphicData uri="http://schemas.openxmlformats.org/drawingml/2006/picture">
                 <pic:pic xmlns:pic="http://schemas.openxmlformats.org/drawingml/2006/picture">
                   <pic:nvPicPr>
-                    <pic:cNvPr id="4" name="Image3" descr=""/>
+                    <pic:cNvPr id="4" name="Image5" descr=""/>
                     <pic:cNvPicPr>
                       <a:picLocks noChangeAspect="1" noChangeArrowheads="1"/>
                     </pic:cNvPicPr>
                   </pic:nvPicPr>
                   <pic:blipFill>
                     <a:blip r:embed="rId5"/>
+                    <a:stretch>
+                      <a:fillRect/>
+                    </a:stretch>
+                  </pic:blipFill>
+                  <pic:spPr bwMode="auto">
+                    <a:xfrm>
+                      <a:off x="0" y="0"/>
+                      <a:ext cx="5759450" cy="6447155"/>
+                    </a:xfrm>
+                    <a:prstGeom prst="rect">
+                      <a:avLst/>
+                    </a:prstGeom>
+                  </pic:spPr>
+                </pic:pic>
+              </a:graphicData>
+            </a:graphic>
+          </wp:anchor>
+        </w:drawing>
+      </w:r>
+      <w:r>
+        <w:rPr>
+          <w:rStyle w:val="normaltextrun"/>
+          <w:color w:val="000000"/>
+          <w:shd w:fill="FFFFFF" w:val="clear"/>
+        </w:rPr>
+        <w:t>Figura 4. Arquivo “NEWS” que apresenta as mudanças de uma versão para outra.</w:t>
+      </w:r>
+    </w:p>
+    <w:p>
+      <w:pPr>
+        <w:pStyle w:val="ListParagraph"/>
+        <w:spacing w:lineRule="auto" w:line="360"/>
+        <w:ind w:firstLine="709" w:left="0"/>
+        <w:jc w:val="both"/>
+        <w:rPr>
+          <w:rStyle w:val="normaltextrun"/>
+          <w:color w:val="000000"/>
+          <w:shd w:fill="FFFFFF" w:val="clear"/>
+        </w:rPr>
+      </w:pPr>
+      <w:r>
+        <w:rPr>
+          <w:rStyle w:val="normaltextrun"/>
+          <w:color w:val="000000"/>
+          <w:shd w:fill="FFFFFF" w:val="clear"/>
+        </w:rPr>
+        <w:t>Fonte: Resultados originais da pesquisa</w:t>
+      </w:r>
+    </w:p>
+    <w:p>
+      <w:pPr>
+        <w:pStyle w:val="ListParagraph"/>
+        <w:spacing w:lineRule="auto" w:line="360"/>
+        <w:ind w:firstLine="709" w:left="0"/>
+        <w:jc w:val="both"/>
+        <w:rPr>
+          <w:rStyle w:val="normaltextrun"/>
+          <w:color w:val="000000"/>
+          <w:shd w:fill="FFFFFF" w:val="clear"/>
+        </w:rPr>
+      </w:pPr>
+      <w:r>
+        <w:rPr>
+          <w:rStyle w:val="normaltextrun"/>
+          <w:color w:val="000000"/>
+          <w:shd w:fill="FFFFFF" w:val="clear"/>
+        </w:rPr>
+        <w:t>Com a adição destas funções, o pacote foi considerado com conteúdo suficiente para ser lançado em sua versão oficial através do CRAN. Para isso, foi criado um “vignettes”, que é um arquivo com a descrição do pacote e exemplos de uso, assim como o README.md do Github. Desta forma, a árvore de diretório final está representada na Figura  5.</w:t>
+      </w:r>
+    </w:p>
+    <w:p>
+      <w:pPr>
+        <w:pStyle w:val="ListParagraph"/>
+        <w:spacing w:lineRule="auto" w:line="360"/>
+        <w:ind w:firstLine="709" w:left="0"/>
+        <w:jc w:val="both"/>
+        <w:rPr>
+          <w:rStyle w:val="normaltextrun"/>
+          <w:color w:val="000000"/>
+          <w:shd w:fill="FFFFFF" w:val="clear"/>
+        </w:rPr>
+      </w:pPr>
+      <w:r>
+        <w:rPr/>
+        <w:drawing>
+          <wp:inline distT="0" distB="0" distL="0" distR="0">
+            <wp:extent cx="2105660" cy="6156960"/>
+            <wp:effectExtent l="0" t="0" r="0" b="0"/>
+            <wp:docPr id="5" name="Image3" descr=""/>
+            <wp:cNvGraphicFramePr>
+              <a:graphicFrameLocks xmlns:a="http://schemas.openxmlformats.org/drawingml/2006/main" noChangeAspect="1"/>
+            </wp:cNvGraphicFramePr>
+            <a:graphic xmlns:a="http://schemas.openxmlformats.org/drawingml/2006/main">
+              <a:graphicData uri="http://schemas.openxmlformats.org/drawingml/2006/picture">
+                <pic:pic xmlns:pic="http://schemas.openxmlformats.org/drawingml/2006/picture">
+                  <pic:nvPicPr>
+                    <pic:cNvPr id="5" name="Image3" descr=""/>
+                    <pic:cNvPicPr>
+                      <a:picLocks noChangeAspect="1" noChangeArrowheads="1"/>
+                    </pic:cNvPicPr>
+                  </pic:nvPicPr>
+                  <pic:blipFill>
+                    <a:blip r:embed="rId6"/>
                     <a:stretch>
                       <a:fillRect/>
                     </a:stretch>
@@ -2034,7 +2124,7 @@
           <w:color w:val="000000"/>
           <w:shd w:fill="FFFFFF" w:val="clear"/>
         </w:rPr>
-        <w:t>Figura 4. Árvore de diretório do pacote bacenR</w:t>
+        <w:t>Figura 5. Árvore de diretório do pacote bacenR</w:t>
       </w:r>
     </w:p>
     <w:p>
@@ -2114,7 +2204,7 @@
           <w:color w:val="000000"/>
           <w:shd w:fill="FFFFFF" w:val="clear"/>
         </w:rPr>
-        <w:footnoteReference w:id="13"/>
+        <w:footnoteReference w:id="14"/>
       </w:r>
       <w:r>
         <w:rPr>
@@ -2130,15 +2220,15 @@
           <w:color w:val="000000"/>
           <w:shd w:fill="FFFFFF" w:val="clear"/>
         </w:rPr>
-        <w:footnoteReference w:id="14"/>
-      </w:r>
-      <w:r>
-        <w:rPr>
-          <w:rStyle w:val="normaltextrun"/>
-          <w:color w:val="000000"/>
-          <w:shd w:fill="FFFFFF" w:val="clear"/>
-        </w:rPr>
-        <w:t xml:space="preserve"> ficou de acordo com a Figura 5.</w:t>
+        <w:footnoteReference w:id="15"/>
+      </w:r>
+      <w:r>
+        <w:rPr>
+          <w:rStyle w:val="normaltextrun"/>
+          <w:color w:val="000000"/>
+          <w:shd w:fill="FFFFFF" w:val="clear"/>
+        </w:rPr>
+        <w:t xml:space="preserve"> ficou de acordo com a Figura 6.</w:t>
       </w:r>
     </w:p>
     <w:p>
@@ -2155,7 +2245,7 @@
       </w:pPr>
       <w:r>
         <w:drawing>
-          <wp:anchor behindDoc="0" distT="0" distB="0" distL="0" distR="0" simplePos="0" locked="0" layoutInCell="0" allowOverlap="1" relativeHeight="39">
+          <wp:anchor behindDoc="0" distT="0" distB="0" distL="0" distR="0" simplePos="0" locked="0" layoutInCell="0" allowOverlap="1" relativeHeight="41">
             <wp:simplePos x="0" y="0"/>
             <wp:positionH relativeFrom="column">
               <wp:align>center</wp:align>
@@ -2166,7 +2256,7 @@
             <wp:extent cx="5759450" cy="4700270"/>
             <wp:effectExtent l="0" t="0" r="0" b="0"/>
             <wp:wrapSquare wrapText="largest"/>
-            <wp:docPr id="5" name="Image4" descr=""/>
+            <wp:docPr id="6" name="Image4" descr=""/>
             <wp:cNvGraphicFramePr>
               <a:graphicFrameLocks xmlns:a="http://schemas.openxmlformats.org/drawingml/2006/main" noChangeAspect="1"/>
             </wp:cNvGraphicFramePr>
@@ -2174,13 +2264,13 @@
               <a:graphicData uri="http://schemas.openxmlformats.org/drawingml/2006/picture">
                 <pic:pic xmlns:pic="http://schemas.openxmlformats.org/drawingml/2006/picture">
                   <pic:nvPicPr>
-                    <pic:cNvPr id="5" name="Image4" descr=""/>
+                    <pic:cNvPr id="6" name="Image4" descr=""/>
                     <pic:cNvPicPr>
                       <a:picLocks noChangeAspect="1" noChangeArrowheads="1"/>
                     </pic:cNvPicPr>
                   </pic:nvPicPr>
                   <pic:blipFill>
-                    <a:blip r:embed="rId6"/>
+                    <a:blip r:embed="rId7"/>
                     <a:stretch>
                       <a:fillRect/>
                     </a:stretch>
@@ -2206,7 +2296,7 @@
           <w:color w:val="000000"/>
           <w:shd w:fill="FFFFFF" w:val="clear"/>
         </w:rPr>
-        <w:t xml:space="preserve">Figura 5. Vignettes do pacote bacenR no </w:t>
+        <w:t xml:space="preserve">Figura 6. Vignettes do pacote bacenR no </w:t>
       </w:r>
       <w:r>
         <w:rPr>
@@ -2286,7 +2376,7 @@
           <w:color w:val="000000"/>
           <w:shd w:fill="FFFFFF" w:val="clear"/>
         </w:rPr>
-        <w:t xml:space="preserve">Enquanto o README.md do GitHub do pacote está de acordo com a Figura 6. Foi adicionada a instrução de que a instalação da versão estável deverá ser realizada através do comando install.packages(“bacenR”), para que seja instalada a versão disponibilizada no </w:t>
+        <w:t xml:space="preserve">Enquanto o README.md do GitHub do pacote está de acordo com a Figura 7. Foi adicionada a instrução de que a instalação da versão estável deverá ser realizada através do comando install.packages(“bacenR”), para que seja instalada a versão disponibilizada no </w:t>
       </w:r>
       <w:r>
         <w:rPr>
@@ -2322,7 +2412,7 @@
       </w:pPr>
       <w:r>
         <w:drawing>
-          <wp:anchor behindDoc="0" distT="0" distB="0" distL="0" distR="0" simplePos="0" locked="0" layoutInCell="0" allowOverlap="1" relativeHeight="48">
+          <wp:anchor behindDoc="0" distT="0" distB="0" distL="0" distR="0" simplePos="0" locked="0" layoutInCell="0" allowOverlap="1" relativeHeight="50">
             <wp:simplePos x="0" y="0"/>
             <wp:positionH relativeFrom="column">
               <wp:align>center</wp:align>
@@ -2333,7 +2423,7 @@
             <wp:extent cx="5759450" cy="3272790"/>
             <wp:effectExtent l="0" t="0" r="0" b="0"/>
             <wp:wrapSquare wrapText="largest"/>
-            <wp:docPr id="6" name="Image2" descr=""/>
+            <wp:docPr id="7" name="Image2" descr=""/>
             <wp:cNvGraphicFramePr>
               <a:graphicFrameLocks xmlns:a="http://schemas.openxmlformats.org/drawingml/2006/main" noChangeAspect="1"/>
             </wp:cNvGraphicFramePr>
@@ -2341,13 +2431,13 @@
               <a:graphicData uri="http://schemas.openxmlformats.org/drawingml/2006/picture">
                 <pic:pic xmlns:pic="http://schemas.openxmlformats.org/drawingml/2006/picture">
                   <pic:nvPicPr>
-                    <pic:cNvPr id="6" name="Image2" descr=""/>
+                    <pic:cNvPr id="7" name="Image2" descr=""/>
                     <pic:cNvPicPr>
                       <a:picLocks noChangeAspect="1" noChangeArrowheads="1"/>
                     </pic:cNvPicPr>
                   </pic:nvPicPr>
                   <pic:blipFill>
-                    <a:blip r:embed="rId7"/>
+                    <a:blip r:embed="rId8"/>
                     <a:stretch>
                       <a:fillRect/>
                     </a:stretch>
@@ -2373,7 +2463,7 @@
           <w:color w:val="000000"/>
           <w:shd w:fill="FFFFFF" w:val="clear"/>
         </w:rPr>
-        <w:t>Figura 6. README do pacote bacenR em sua versão estável</w:t>
+        <w:t>Figura 7. README do pacote bacenR em sua versão estável</w:t>
       </w:r>
     </w:p>
     <w:p>
@@ -2459,7 +2549,7 @@
           <w:color w:val="000000"/>
           <w:shd w:fill="FFFFFF" w:val="clear"/>
         </w:rPr>
-        <w:footnoteReference w:id="15"/>
+        <w:footnoteReference w:id="16"/>
       </w:r>
       <w:r>
         <w:rPr>
@@ -2493,14 +2583,14 @@
           <w:color w:val="000000"/>
           <w:shd w:fill="FFFFFF" w:val="clear"/>
         </w:rPr>
-        <w:footnoteReference w:id="16"/>
-      </w:r>
-      <w:r>
-        <w:rPr>
-          <w:color w:val="000000"/>
-          <w:shd w:fill="FFFFFF" w:val="clear"/>
-        </w:rPr>
-        <w:t xml:space="preserve"> e tratá-los para que eles possam ser utilizados sem muito esforço pelo usuário. A Figura 7 apresenta a descrição de cada parâmetro utilizado e a Figura 8 apresenta o uso das funções e seus resultados. </w:t>
+        <w:footnoteReference w:id="17"/>
+      </w:r>
+      <w:r>
+        <w:rPr>
+          <w:color w:val="000000"/>
+          <w:shd w:fill="FFFFFF" w:val="clear"/>
+        </w:rPr>
+        <w:t xml:space="preserve"> e tratá-los para que eles possam ser utilizados sem muito esforço pelo usuário. A Figura 8 apresenta a descrição de cada parâmetro utilizado e a Figura 9 apresenta o uso das funções e seus resultados. </w:t>
       </w:r>
     </w:p>
     <w:p>
@@ -2516,7 +2606,7 @@
       </w:pPr>
       <w:r>
         <w:drawing>
-          <wp:anchor behindDoc="0" distT="0" distB="0" distL="0" distR="0" simplePos="0" locked="0" layoutInCell="0" allowOverlap="1" relativeHeight="40">
+          <wp:anchor behindDoc="0" distT="0" distB="0" distL="0" distR="0" simplePos="0" locked="0" layoutInCell="0" allowOverlap="1" relativeHeight="42">
             <wp:simplePos x="0" y="0"/>
             <wp:positionH relativeFrom="column">
               <wp:align>center</wp:align>
@@ -2527,7 +2617,7 @@
             <wp:extent cx="5759450" cy="1991995"/>
             <wp:effectExtent l="0" t="0" r="0" b="0"/>
             <wp:wrapSquare wrapText="largest"/>
-            <wp:docPr id="7" name="Image6" descr=""/>
+            <wp:docPr id="8" name="Image6" descr=""/>
             <wp:cNvGraphicFramePr>
               <a:graphicFrameLocks xmlns:a="http://schemas.openxmlformats.org/drawingml/2006/main" noChangeAspect="1"/>
             </wp:cNvGraphicFramePr>
@@ -2535,13 +2625,13 @@
               <a:graphicData uri="http://schemas.openxmlformats.org/drawingml/2006/picture">
                 <pic:pic xmlns:pic="http://schemas.openxmlformats.org/drawingml/2006/picture">
                   <pic:nvPicPr>
-                    <pic:cNvPr id="7" name="Image6" descr=""/>
+                    <pic:cNvPr id="8" name="Image6" descr=""/>
                     <pic:cNvPicPr>
                       <a:picLocks noChangeAspect="1" noChangeArrowheads="1"/>
                     </pic:cNvPicPr>
                   </pic:nvPicPr>
                   <pic:blipFill>
-                    <a:blip r:embed="rId8"/>
+                    <a:blip r:embed="rId9"/>
                     <a:stretch>
                       <a:fillRect/>
                     </a:stretch>
@@ -2567,7 +2657,7 @@
           <w:color w:val="000000"/>
           <w:shd w:fill="FFFFFF" w:val="clear"/>
         </w:rPr>
-        <w:t>Figura 7. Descrição dos parâmetros da função get_balance_sheets()</w:t>
+        <w:t>Figura 8. Descrição dos parâmetros da função get_balance_sheets()</w:t>
       </w:r>
     </w:p>
     <w:p>
@@ -2603,7 +2693,7 @@
       </w:pPr>
       <w:r>
         <w:drawing>
-          <wp:anchor behindDoc="0" distT="0" distB="0" distL="0" distR="0" simplePos="0" locked="0" layoutInCell="0" allowOverlap="1" relativeHeight="41">
+          <wp:anchor behindDoc="0" distT="0" distB="0" distL="0" distR="0" simplePos="0" locked="0" layoutInCell="0" allowOverlap="1" relativeHeight="43">
             <wp:simplePos x="0" y="0"/>
             <wp:positionH relativeFrom="column">
               <wp:align>center</wp:align>
@@ -2614,7 +2704,7 @@
             <wp:extent cx="5759450" cy="4826635"/>
             <wp:effectExtent l="0" t="0" r="0" b="0"/>
             <wp:wrapSquare wrapText="largest"/>
-            <wp:docPr id="8" name="Image7" descr=""/>
+            <wp:docPr id="9" name="Image7" descr=""/>
             <wp:cNvGraphicFramePr>
               <a:graphicFrameLocks xmlns:a="http://schemas.openxmlformats.org/drawingml/2006/main" noChangeAspect="1"/>
             </wp:cNvGraphicFramePr>
@@ -2622,13 +2712,13 @@
               <a:graphicData uri="http://schemas.openxmlformats.org/drawingml/2006/picture">
                 <pic:pic xmlns:pic="http://schemas.openxmlformats.org/drawingml/2006/picture">
                   <pic:nvPicPr>
-                    <pic:cNvPr id="8" name="Image7" descr=""/>
+                    <pic:cNvPr id="9" name="Image7" descr=""/>
                     <pic:cNvPicPr>
                       <a:picLocks noChangeAspect="1" noChangeArrowheads="1"/>
                     </pic:cNvPicPr>
                   </pic:nvPicPr>
                   <pic:blipFill>
-                    <a:blip r:embed="rId9"/>
+                    <a:blip r:embed="rId10"/>
                     <a:stretch>
                       <a:fillRect/>
                     </a:stretch>
@@ -2654,7 +2744,7 @@
           <w:color w:val="000000"/>
           <w:shd w:fill="FFFFFF" w:val="clear"/>
         </w:rPr>
-        <w:t>Figura 8. Resultados das funções get_balance_sheets() e tidy_balance_sheets()</w:t>
+        <w:t>Figura 9. Resultados das funções get_balance_sheets() e tidy_balance_sheets()</w:t>
       </w:r>
     </w:p>
     <w:p>
@@ -2739,14 +2829,14 @@
           <w:color w:val="000000"/>
           <w:shd w:fill="FFFFFF" w:val="clear"/>
         </w:rPr>
-        <w:footnoteReference w:id="17"/>
-      </w:r>
-      <w:r>
-        <w:rPr>
-          <w:color w:val="000000"/>
-          <w:shd w:fill="FFFFFF" w:val="clear"/>
-        </w:rPr>
-        <w:t>. A Figura 9 apresenta os parâmetros utilizados para baixar as informações e a Figura 10 apresenta as variáveis obtidas.</w:t>
+        <w:footnoteReference w:id="18"/>
+      </w:r>
+      <w:r>
+        <w:rPr>
+          <w:color w:val="000000"/>
+          <w:shd w:fill="FFFFFF" w:val="clear"/>
+        </w:rPr>
+        <w:t>. A Figura 10 apresenta os parâmetros utilizados para baixar as informações e a Figura 11 apresenta as variáveis obtidas.</w:t>
       </w:r>
     </w:p>
     <w:p>
@@ -2762,7 +2852,7 @@
       </w:pPr>
       <w:r>
         <w:drawing>
-          <wp:anchor behindDoc="0" distT="0" distB="0" distL="0" distR="0" simplePos="0" locked="0" layoutInCell="0" allowOverlap="1" relativeHeight="43">
+          <wp:anchor behindDoc="0" distT="0" distB="0" distL="0" distR="0" simplePos="0" locked="0" layoutInCell="0" allowOverlap="1" relativeHeight="45">
             <wp:simplePos x="0" y="0"/>
             <wp:positionH relativeFrom="column">
               <wp:align>center</wp:align>
@@ -2773,7 +2863,7 @@
             <wp:extent cx="5759450" cy="1214120"/>
             <wp:effectExtent l="0" t="0" r="0" b="0"/>
             <wp:wrapSquare wrapText="largest"/>
-            <wp:docPr id="9" name="Image9" descr=""/>
+            <wp:docPr id="10" name="Image9" descr=""/>
             <wp:cNvGraphicFramePr>
               <a:graphicFrameLocks xmlns:a="http://schemas.openxmlformats.org/drawingml/2006/main" noChangeAspect="1"/>
             </wp:cNvGraphicFramePr>
@@ -2781,13 +2871,13 @@
               <a:graphicData uri="http://schemas.openxmlformats.org/drawingml/2006/picture">
                 <pic:pic xmlns:pic="http://schemas.openxmlformats.org/drawingml/2006/picture">
                   <pic:nvPicPr>
-                    <pic:cNvPr id="9" name="Image9" descr=""/>
+                    <pic:cNvPr id="10" name="Image9" descr=""/>
                     <pic:cNvPicPr>
                       <a:picLocks noChangeAspect="1" noChangeArrowheads="1"/>
                     </pic:cNvPicPr>
                   </pic:nvPicPr>
                   <pic:blipFill>
-                    <a:blip r:embed="rId10"/>
+                    <a:blip r:embed="rId11"/>
                     <a:stretch>
                       <a:fillRect/>
                     </a:stretch>
@@ -2812,7 +2902,7 @@
           <w:color w:val="000000"/>
           <w:shd w:fill="FFFFFF" w:val="clear"/>
         </w:rPr>
-        <w:t>Figura 9. Parâmetros da função get_institutions()</w:t>
+        <w:t>Figura 10. Parâmetros da função get_institutions()</w:t>
       </w:r>
     </w:p>
     <w:p>
@@ -2873,7 +2963,7 @@
       </w:r>
       <w:r>
         <w:drawing>
-          <wp:anchor behindDoc="0" distT="0" distB="0" distL="0" distR="0" simplePos="0" locked="0" layoutInCell="0" allowOverlap="1" relativeHeight="42">
+          <wp:anchor behindDoc="0" distT="0" distB="0" distL="0" distR="0" simplePos="0" locked="0" layoutInCell="0" allowOverlap="1" relativeHeight="44">
             <wp:simplePos x="0" y="0"/>
             <wp:positionH relativeFrom="column">
               <wp:align>center</wp:align>
@@ -2884,7 +2974,7 @@
             <wp:extent cx="5759450" cy="1600835"/>
             <wp:effectExtent l="0" t="0" r="0" b="0"/>
             <wp:wrapSquare wrapText="largest"/>
-            <wp:docPr id="10" name="Image8" descr=""/>
+            <wp:docPr id="11" name="Image8" descr=""/>
             <wp:cNvGraphicFramePr>
               <a:graphicFrameLocks xmlns:a="http://schemas.openxmlformats.org/drawingml/2006/main" noChangeAspect="1"/>
             </wp:cNvGraphicFramePr>
@@ -2892,13 +2982,13 @@
               <a:graphicData uri="http://schemas.openxmlformats.org/drawingml/2006/picture">
                 <pic:pic xmlns:pic="http://schemas.openxmlformats.org/drawingml/2006/picture">
                   <pic:nvPicPr>
-                    <pic:cNvPr id="10" name="Image8" descr=""/>
+                    <pic:cNvPr id="11" name="Image8" descr=""/>
                     <pic:cNvPicPr>
                       <a:picLocks noChangeAspect="1" noChangeArrowheads="1"/>
                     </pic:cNvPicPr>
                   </pic:nvPicPr>
                   <pic:blipFill>
-                    <a:blip r:embed="rId11"/>
+                    <a:blip r:embed="rId12"/>
                     <a:stretch>
                       <a:fillRect/>
                     </a:stretch>
@@ -2924,7 +3014,7 @@
           <w:color w:val="000000"/>
           <w:shd w:fill="FFFFFF" w:val="clear"/>
         </w:rPr>
-        <w:t>igura 10.  Resultados das funções  get_institutions() e tidy_institutions()</w:t>
+        <w:t>igura 11.  Resultados das funções  get_institutions() e tidy_institutions()</w:t>
       </w:r>
     </w:p>
     <w:p>
@@ -2982,7 +3072,7 @@
           <w:color w:val="000000"/>
           <w:shd w:fill="FFFFFF" w:val="clear"/>
         </w:rPr>
-        <w:t>Os parâmetros das funções get_normative_data() e get_normative_txt() são mais simples, sendo necessários apenas os termos que desejam ser buscados e as datas de início e fim. A Figura 11 apresenta um exemplo de seus usos, mostrando quais são as variáveis baixadas.</w:t>
+        <w:t>Os parâmetros das funções get_normative_data() e get_normative_txt() são mais simples, sendo necessários apenas os termos que desejam ser buscados e as datas de início e fim. A Figura 12 apresenta um exemplo de seus usos, mostrando quais são as variáveis baixadas.</w:t>
       </w:r>
     </w:p>
     <w:p>
@@ -2998,7 +3088,7 @@
       </w:pPr>
       <w:r>
         <w:drawing>
-          <wp:anchor behindDoc="0" distT="0" distB="0" distL="0" distR="0" simplePos="0" locked="0" layoutInCell="0" allowOverlap="1" relativeHeight="44">
+          <wp:anchor behindDoc="0" distT="0" distB="0" distL="0" distR="0" simplePos="0" locked="0" layoutInCell="0" allowOverlap="1" relativeHeight="46">
             <wp:simplePos x="0" y="0"/>
             <wp:positionH relativeFrom="column">
               <wp:posOffset>38100</wp:posOffset>
@@ -3009,7 +3099,7 @@
             <wp:extent cx="5759450" cy="1821815"/>
             <wp:effectExtent l="0" t="0" r="0" b="0"/>
             <wp:wrapSquare wrapText="largest"/>
-            <wp:docPr id="11" name="Image10" descr=""/>
+            <wp:docPr id="12" name="Image10" descr=""/>
             <wp:cNvGraphicFramePr>
               <a:graphicFrameLocks xmlns:a="http://schemas.openxmlformats.org/drawingml/2006/main" noChangeAspect="1"/>
             </wp:cNvGraphicFramePr>
@@ -3017,13 +3107,13 @@
               <a:graphicData uri="http://schemas.openxmlformats.org/drawingml/2006/picture">
                 <pic:pic xmlns:pic="http://schemas.openxmlformats.org/drawingml/2006/picture">
                   <pic:nvPicPr>
-                    <pic:cNvPr id="11" name="Image10" descr=""/>
+                    <pic:cNvPr id="12" name="Image10" descr=""/>
                     <pic:cNvPicPr>
                       <a:picLocks noChangeAspect="1" noChangeArrowheads="1"/>
                     </pic:cNvPicPr>
                   </pic:nvPicPr>
                   <pic:blipFill>
-                    <a:blip r:embed="rId12"/>
+                    <a:blip r:embed="rId13"/>
                     <a:stretch>
                       <a:fillRect/>
                     </a:stretch>
@@ -3049,7 +3139,7 @@
           <w:color w:val="000000"/>
           <w:shd w:fill="FFFFFF" w:val="clear"/>
         </w:rPr>
-        <w:t>Figura 11. Resultados das funções get_normative_data() e get_normative_txt().</w:t>
+        <w:t>Figura 12. Resultados das funções get_normative_data() e get_normative_txt().</w:t>
       </w:r>
     </w:p>
     <w:p>
@@ -3151,14 +3241,14 @@
           <w:color w:val="000000"/>
           <w:shd w:fill="FFFFFF" w:val="clear"/>
         </w:rPr>
-        <w:footnoteReference w:id="18"/>
-      </w:r>
-      <w:r>
-        <w:rPr>
-          <w:color w:val="000000"/>
-          <w:shd w:fill="FFFFFF" w:val="clear"/>
-        </w:rPr>
-        <w:t>. Na Figura 12 são apresentados os parâmetros da função get_ifdata_reports.</w:t>
+        <w:footnoteReference w:id="19"/>
+      </w:r>
+      <w:r>
+        <w:rPr>
+          <w:color w:val="000000"/>
+          <w:shd w:fill="FFFFFF" w:val="clear"/>
+        </w:rPr>
+        <w:t>. Na Figura 13 são apresentados os parâmetros da função get_ifdata_reports.</w:t>
       </w:r>
     </w:p>
     <w:p>
@@ -3174,7 +3264,7 @@
       </w:pPr>
       <w:r>
         <w:drawing>
-          <wp:anchor behindDoc="0" distT="0" distB="0" distL="0" distR="0" simplePos="0" locked="0" layoutInCell="0" allowOverlap="1" relativeHeight="46">
+          <wp:anchor behindDoc="0" distT="0" distB="0" distL="0" distR="0" simplePos="0" locked="0" layoutInCell="0" allowOverlap="1" relativeHeight="48">
             <wp:simplePos x="0" y="0"/>
             <wp:positionH relativeFrom="column">
               <wp:align>center</wp:align>
@@ -3185,7 +3275,7 @@
             <wp:extent cx="5759450" cy="1367155"/>
             <wp:effectExtent l="0" t="0" r="0" b="0"/>
             <wp:wrapSquare wrapText="largest"/>
-            <wp:docPr id="12" name="Image12" descr=""/>
+            <wp:docPr id="13" name="Image12" descr=""/>
             <wp:cNvGraphicFramePr>
               <a:graphicFrameLocks xmlns:a="http://schemas.openxmlformats.org/drawingml/2006/main" noChangeAspect="1"/>
             </wp:cNvGraphicFramePr>
@@ -3193,13 +3283,13 @@
               <a:graphicData uri="http://schemas.openxmlformats.org/drawingml/2006/picture">
                 <pic:pic xmlns:pic="http://schemas.openxmlformats.org/drawingml/2006/picture">
                   <pic:nvPicPr>
-                    <pic:cNvPr id="12" name="Image12" descr=""/>
+                    <pic:cNvPr id="13" name="Image12" descr=""/>
                     <pic:cNvPicPr>
                       <a:picLocks noChangeAspect="1" noChangeArrowheads="1"/>
                     </pic:cNvPicPr>
                   </pic:nvPicPr>
                   <pic:blipFill>
-                    <a:blip r:embed="rId13"/>
+                    <a:blip r:embed="rId14"/>
                     <a:stretch>
                       <a:fillRect/>
                     </a:stretch>
@@ -3225,7 +3315,7 @@
           <w:color w:val="000000"/>
           <w:shd w:fill="FFFFFF" w:val="clear"/>
         </w:rPr>
-        <w:t>Figura 12. Parâmetros da função  get_ifdata_reports</w:t>
+        <w:t>Figura 13. Parâmetros da função  get_ifdata_reports</w:t>
       </w:r>
     </w:p>
     <w:p>
@@ -3301,7 +3391,7 @@
           <w:color w:val="000000"/>
           <w:shd w:fill="FFFFFF" w:val="clear"/>
         </w:rPr>
-        <w:t>Quanto ao uso, serão apresentados respectivamente get_ifdata_reports e get_ifdata_registry, na Figura 13 e na Figura 14.</w:t>
+        <w:t>Quanto ao uso, serão apresentados respectivamente get_ifdata_reports e get_ifdata_registry, na Figura 14 e na Figura 15.</w:t>
       </w:r>
     </w:p>
     <w:p>
@@ -3360,7 +3450,7 @@
       </w:r>
       <w:r>
         <w:drawing>
-          <wp:anchor behindDoc="0" distT="0" distB="0" distL="0" distR="0" simplePos="0" locked="0" layoutInCell="0" allowOverlap="1" relativeHeight="47">
+          <wp:anchor behindDoc="0" distT="0" distB="0" distL="0" distR="0" simplePos="0" locked="0" layoutInCell="0" allowOverlap="1" relativeHeight="49">
             <wp:simplePos x="0" y="0"/>
             <wp:positionH relativeFrom="column">
               <wp:align>center</wp:align>
@@ -3371,7 +3461,7 @@
             <wp:extent cx="5759450" cy="1202055"/>
             <wp:effectExtent l="0" t="0" r="0" b="0"/>
             <wp:wrapSquare wrapText="largest"/>
-            <wp:docPr id="13" name="Image13" descr=""/>
+            <wp:docPr id="14" name="Image13" descr=""/>
             <wp:cNvGraphicFramePr>
               <a:graphicFrameLocks xmlns:a="http://schemas.openxmlformats.org/drawingml/2006/main" noChangeAspect="1"/>
             </wp:cNvGraphicFramePr>
@@ -3379,13 +3469,13 @@
               <a:graphicData uri="http://schemas.openxmlformats.org/drawingml/2006/picture">
                 <pic:pic xmlns:pic="http://schemas.openxmlformats.org/drawingml/2006/picture">
                   <pic:nvPicPr>
-                    <pic:cNvPr id="13" name="Image13" descr=""/>
+                    <pic:cNvPr id="14" name="Image13" descr=""/>
                     <pic:cNvPicPr>
                       <a:picLocks noChangeAspect="1" noChangeArrowheads="1"/>
                     </pic:cNvPicPr>
                   </pic:nvPicPr>
                   <pic:blipFill>
-                    <a:blip r:embed="rId14"/>
+                    <a:blip r:embed="rId15"/>
                     <a:stretch>
                       <a:fillRect/>
                     </a:stretch>
@@ -3484,7 +3574,7 @@
       </w:pPr>
       <w:r>
         <w:drawing>
-          <wp:anchor behindDoc="0" distT="0" distB="0" distL="0" distR="0" simplePos="0" locked="0" layoutInCell="0" allowOverlap="1" relativeHeight="45">
+          <wp:anchor behindDoc="0" distT="0" distB="0" distL="0" distR="0" simplePos="0" locked="0" layoutInCell="0" allowOverlap="1" relativeHeight="47">
             <wp:simplePos x="0" y="0"/>
             <wp:positionH relativeFrom="column">
               <wp:align>center</wp:align>
@@ -3495,7 +3585,7 @@
             <wp:extent cx="5759450" cy="1026795"/>
             <wp:effectExtent l="0" t="0" r="0" b="0"/>
             <wp:wrapSquare wrapText="largest"/>
-            <wp:docPr id="14" name="Image11" descr=""/>
+            <wp:docPr id="15" name="Image11" descr=""/>
             <wp:cNvGraphicFramePr>
               <a:graphicFrameLocks xmlns:a="http://schemas.openxmlformats.org/drawingml/2006/main" noChangeAspect="1"/>
             </wp:cNvGraphicFramePr>
@@ -3503,13 +3593,13 @@
               <a:graphicData uri="http://schemas.openxmlformats.org/drawingml/2006/picture">
                 <pic:pic xmlns:pic="http://schemas.openxmlformats.org/drawingml/2006/picture">
                   <pic:nvPicPr>
-                    <pic:cNvPr id="14" name="Image11" descr=""/>
+                    <pic:cNvPr id="15" name="Image11" descr=""/>
                     <pic:cNvPicPr>
                       <a:picLocks noChangeAspect="1" noChangeArrowheads="1"/>
                     </pic:cNvPicPr>
                   </pic:nvPicPr>
                   <pic:blipFill>
-                    <a:blip r:embed="rId15"/>
+                    <a:blip r:embed="rId16"/>
                     <a:stretch>
                       <a:fillRect/>
                     </a:stretch>
@@ -3609,6 +3699,26 @@
       </w:pPr>
       <w:r>
         <w:rPr>
+          <w:rStyle w:val="normaltextrun"/>
+          <w:color w:val="000000"/>
+          <w:shd w:fill="FFFFFF" w:val="clear"/>
+        </w:rPr>
+        <w:t>Com essas funções do pacote bacenR, as possibilidades de estudos e análises de dados são diversas. É possível pensar em algumas pesquisas, como: em quais estados estão localizados os maiores bancos? Quais cidades possuem mais bancos? Qual a relação entre bancos e cooperativas por cidade? Qual a idade média de cada instituição? Em qual estado estão se criando mais instituições e qual o tipo delas? Quais instituições estão crescendo mais? Esse crescimento está em algum quartil específico? Em alguma região específica? Durante qual período houve maior crescimento? Bancos e cooperativas de crédito possuem as mesmas carteiras de crédito? Quais as diferenças? Isso difere por região ou idade da instituição? Quais marcos regulatórios podem explicar esses dados? Dentre outras.</w:t>
+      </w:r>
+    </w:p>
+    <w:p>
+      <w:pPr>
+        <w:pStyle w:val="ListParagraph"/>
+        <w:spacing w:lineRule="auto" w:line="360"/>
+        <w:ind w:firstLine="709" w:left="0"/>
+        <w:rPr>
+          <w:rStyle w:val="normaltextrun"/>
+          <w:color w:val="000000"/>
+          <w:shd w:fill="FFFFFF" w:val="clear"/>
+        </w:rPr>
+      </w:pPr>
+      <w:r>
+        <w:rPr>
           <w:color w:val="000000"/>
           <w:shd w:fill="FFFFFF" w:val="clear"/>
         </w:rPr>
@@ -3644,7 +3754,15 @@
       </w:pPr>
       <w:r>
         <w:rPr/>
-        <w:t>O pacote bacenR se mostrou útil, permitindo que o usuário colete e trate diversos dados diferentes fornecidos pelo Bacen. Com poucas linhas de código é possível baixar uma quantidade expressiva de dados, o que faz com que o usuário passe menos tempo coletando os dados e mais tempo trabalhando neles. Com a publicação nas redes sociais para divulgar o pacote foi percebido que isso é de interesse principalmente de pesquisadores e pessoas que tem pouco conhecimento em programação.</w:t>
+        <w:t xml:space="preserve">O pacote bacenR se mostrou útil, permitindo que o usuário colete e trate diversos dados diferentes fornecidos pelo Bacen. Com poucas linhas de código é possível baixar uma quantidade expressiva de dados, </w:t>
+      </w:r>
+      <w:r>
+        <w:rPr/>
+        <w:t xml:space="preserve">de vários anos de uma única vez, permitindo análises espaciais e temporais, </w:t>
+      </w:r>
+      <w:r>
+        <w:rPr/>
+        <w:t>o que faz com que o usuário passe menos tempo coletando os dados e mais tempo trabalhando neles. Com a publicação nas redes sociais para divulgar o pacote foi percebido que isso é de interesse principalmente de pesquisadores e pessoas que tem pouco conhecimento em programação.</w:t>
       </w:r>
     </w:p>
     <w:p>
@@ -3661,7 +3779,11 @@
       </w:pPr>
       <w:r>
         <w:rPr/>
-        <w:t>Ainda existe espaço para melhorias no pacote, como melhorar as mensagens de erros e avisos, melhorar textos dos vignettes das funções e trazer um dicionário nativo para alguns dados,  além de outras funções para coletar novos dados.</w:t>
+        <w:t xml:space="preserve">Ainda existe espaço para melhorias no pacote, como melhorar as mensagens de erros e avisos, melhorar textos dos vignettes das funções e trazer um dicionário nativo para alguns dados,  além de outras funções para coletar novos dados. </w:t>
+      </w:r>
+      <w:r>
+        <w:rPr/>
+        <w:t>Outro ponto é a criação de uma interface em shiny para que usuários sem conhecimento de programação possam baixar os dados de uma forma mais fácil.</w:t>
       </w:r>
     </w:p>
     <w:p>
@@ -3749,7 +3871,7 @@
         </w:rPr>
         <w:t xml:space="preserve"> 72 (1): 80–88. </w:t>
       </w:r>
-      <w:hyperlink r:id="rId16">
+      <w:hyperlink r:id="rId17">
         <w:r>
           <w:rPr>
             <w:rStyle w:val="Hyperlink"/>
@@ -3795,7 +3917,7 @@
         </w:rPr>
         <w:t xml:space="preserve"> 6 (March): e3192v2. </w:t>
       </w:r>
-      <w:hyperlink r:id="rId17">
+      <w:hyperlink r:id="rId18">
         <w:r>
           <w:rPr>
             <w:rStyle w:val="Hyperlink"/>
@@ -3841,7 +3963,7 @@
         </w:rPr>
         <w:t xml:space="preserve"> 10 (2): 558–63. </w:t>
       </w:r>
-      <w:hyperlink r:id="rId18">
+      <w:hyperlink r:id="rId19">
         <w:r>
           <w:rPr>
             <w:rStyle w:val="Hyperlink"/>
@@ -4003,12 +4125,12 @@
       </w:r>
     </w:p>
     <w:sectPr>
-      <w:headerReference w:type="even" r:id="rId19"/>
-      <w:headerReference w:type="default" r:id="rId20"/>
-      <w:headerReference w:type="first" r:id="rId21"/>
-      <w:footerReference w:type="even" r:id="rId22"/>
-      <w:footerReference w:type="default" r:id="rId23"/>
-      <w:footerReference w:type="first" r:id="rId24"/>
+      <w:headerReference w:type="even" r:id="rId20"/>
+      <w:headerReference w:type="default" r:id="rId21"/>
+      <w:headerReference w:type="first" r:id="rId22"/>
+      <w:footerReference w:type="even" r:id="rId23"/>
+      <w:footerReference w:type="default" r:id="rId24"/>
+      <w:footerReference w:type="first" r:id="rId25"/>
       <w:footnotePr>
         <w:numFmt w:val="decimal"/>
       </w:footnotePr>
@@ -4029,7 +4151,7 @@
   <w:comment w:id="0" w:author="Autor desconhecido" w:date="2026-01-12T10:37:59Z" w:initials="">
     <w:p>
       <w:pPr>
-        <w:overflowPunct w:val="true"/>
+        <w:overflowPunct w:val="false"/>
         <w:spacing w:lineRule="auto" w:line="240"/>
         <w:jc w:val="left"/>
         <w:rPr/>
@@ -4046,7 +4168,7 @@
     </w:p>
     <w:p>
       <w:pPr>
-        <w:overflowPunct w:val="false"/>
+        <w:overflowPunct w:val="true"/>
         <w:spacing w:lineRule="auto" w:line="240"/>
         <w:jc w:val="left"/>
         <w:rPr/>
@@ -4062,7 +4184,7 @@
     </w:p>
     <w:p>
       <w:pPr>
-        <w:overflowPunct w:val="false"/>
+        <w:overflowPunct w:val="true"/>
         <w:spacing w:lineRule="auto" w:line="240"/>
         <w:jc w:val="left"/>
         <w:rPr/>
@@ -4090,7 +4212,7 @@
     </w:p>
     <w:p>
       <w:pPr>
-        <w:overflowPunct w:val="false"/>
+        <w:overflowPunct w:val="true"/>
         <w:spacing w:lineRule="auto" w:line="240"/>
         <w:jc w:val="left"/>
         <w:rPr/>
@@ -4106,7 +4228,7 @@
     </w:p>
     <w:p>
       <w:pPr>
-        <w:overflowPunct w:val="true"/>
+        <w:overflowPunct w:val="false"/>
         <w:spacing w:lineRule="auto" w:line="240"/>
         <w:jc w:val="left"/>
         <w:rPr/>
@@ -4125,7 +4247,7 @@
     </w:p>
     <w:p>
       <w:pPr>
-        <w:overflowPunct w:val="false"/>
+        <w:overflowPunct w:val="true"/>
         <w:spacing w:lineRule="auto" w:line="240"/>
         <w:jc w:val="left"/>
         <w:rPr/>
@@ -4141,7 +4263,7 @@
     </w:p>
     <w:p>
       <w:pPr>
-        <w:overflowPunct w:val="false"/>
+        <w:overflowPunct w:val="true"/>
         <w:spacing w:lineRule="auto" w:line="240"/>
         <w:jc w:val="left"/>
         <w:rPr/>
@@ -4157,7 +4279,7 @@
     </w:p>
     <w:p>
       <w:pPr>
-        <w:overflowPunct w:val="true"/>
+        <w:overflowPunct w:val="false"/>
         <w:spacing w:lineRule="auto" w:line="240"/>
         <w:jc w:val="left"/>
         <w:rPr/>
@@ -4169,6 +4291,25 @@
           <w:szCs w:val="24"/>
           <w:lang w:val="en-US" w:eastAsia="en-US" w:bidi="en-US"/>
         </w:rPr>
+      </w:r>
+    </w:p>
+  </w:comment>
+  <w:comment w:id="1" w:author="Unknown Author" w:date="2026-03-10T21:41:27Z" w:initials="">
+    <w:p>
+      <w:pPr>
+        <w:overflowPunct w:val="true"/>
+        <w:spacing w:lineRule="auto" w:line="240"/>
+        <w:jc w:val="left"/>
+        <w:rPr/>
+      </w:pPr>
+      <w:r>
+        <w:rPr>
+          <w:rFonts w:ascii="Liberation Serif" w:hAnsi="Liberation Serif" w:eastAsia="DejaVu Sans" w:cs="Noto Sans Arabic UI"/>
+          <w:sz w:val="24"/>
+          <w:szCs w:val="24"/>
+          <w:lang w:val="en-US" w:eastAsia="en-US" w:bidi="en-US"/>
+        </w:rPr>
+        <w:t>Trazer referências aqui</w:t>
       </w:r>
     </w:p>
   </w:comment>
@@ -4226,7 +4367,7 @@
         <w:sz w:val="18"/>
         <w:szCs w:val="18"/>
       </w:rPr>
-      <w:t>16</w:t>
+      <w:t>17</w:t>
     </w:r>
     <w:r>
       <w:rPr>
@@ -4285,7 +4426,7 @@
         <w:sz w:val="18"/>
         <w:szCs w:val="18"/>
       </w:rPr>
-      <w:t>16</w:t>
+      <w:t>17</w:t>
     </w:r>
     <w:r>
       <w:rPr>
@@ -4604,12 +4745,35 @@
             <w:rStyle w:val="Hyperlink"/>
           </w:rPr>
           <w:tab/>
+          <w:t>https://github.com/rtheodoro/bacenR/blob/main/NEWS.md</w:t>
+        </w:r>
+      </w:hyperlink>
+    </w:p>
+  </w:footnote>
+  <w:footnote w:id="14">
+    <w:p>
+      <w:pPr>
+        <w:pStyle w:val="FootnoteText"/>
+        <w:rPr/>
+      </w:pPr>
+      <w:r>
+        <w:rPr>
+          <w:rStyle w:val="FootnoteCharacters"/>
+        </w:rPr>
+        <w:footnoteRef/>
+      </w:r>
+      <w:hyperlink r:id="rId13">
+        <w:r>
+          <w:rPr>
+            <w:rStyle w:val="Hyperlink"/>
+          </w:rPr>
+          <w:tab/>
           <w:t>https://cran.r-project.org/web/packages/bacenR/index.html</w:t>
         </w:r>
       </w:hyperlink>
     </w:p>
   </w:footnote>
-  <w:footnote w:id="14">
+  <w:footnote w:id="15">
     <w:p>
       <w:pPr>
         <w:pStyle w:val="FootnoteText"/>
@@ -4621,7 +4785,7 @@
         </w:rPr>
         <w:footnoteRef/>
       </w:r>
-      <w:hyperlink r:id="rId13">
+      <w:hyperlink r:id="rId14">
         <w:r>
           <w:rPr>
             <w:rStyle w:val="Hyperlink"/>
@@ -4632,7 +4796,7 @@
       </w:hyperlink>
     </w:p>
   </w:footnote>
-  <w:footnote w:id="15">
+  <w:footnote w:id="16">
     <w:p>
       <w:pPr>
         <w:pStyle w:val="FootnoteText"/>
@@ -4651,7 +4815,7 @@
       </w:r>
     </w:p>
   </w:footnote>
-  <w:footnote w:id="16">
+  <w:footnote w:id="17">
     <w:p>
       <w:pPr>
         <w:pStyle w:val="FootnoteText"/>
@@ -4663,7 +4827,7 @@
         </w:rPr>
         <w:footnoteRef/>
       </w:r>
-      <w:hyperlink r:id="rId14">
+      <w:hyperlink r:id="rId15">
         <w:r>
           <w:rPr>
             <w:rStyle w:val="Hyperlink"/>
@@ -4674,7 +4838,7 @@
       </w:hyperlink>
     </w:p>
   </w:footnote>
-  <w:footnote w:id="17">
+  <w:footnote w:id="18">
     <w:p>
       <w:pPr>
         <w:pStyle w:val="FootnoteText"/>
@@ -4686,7 +4850,7 @@
         </w:rPr>
         <w:footnoteRef/>
       </w:r>
-      <w:hyperlink r:id="rId15">
+      <w:hyperlink r:id="rId16">
         <w:r>
           <w:rPr>
             <w:rStyle w:val="Hyperlink"/>
@@ -4697,7 +4861,7 @@
       </w:hyperlink>
     </w:p>
   </w:footnote>
-  <w:footnote w:id="18">
+  <w:footnote w:id="19">
     <w:p>
       <w:pPr>
         <w:pStyle w:val="FootnoteText"/>
@@ -4769,7 +4933,7 @@
     </w:pPr>
     <w:r>
       <w:drawing>
-        <wp:anchor behindDoc="0" distT="0" distB="0" distL="114300" distR="114300" simplePos="0" locked="0" layoutInCell="0" allowOverlap="1" relativeHeight="35">
+        <wp:anchor behindDoc="0" distT="0" distB="0" distL="114300" distR="114300" simplePos="0" locked="0" layoutInCell="0" allowOverlap="1" relativeHeight="37">
           <wp:simplePos x="0" y="0"/>
           <wp:positionH relativeFrom="margin">
             <wp:posOffset>5029200</wp:posOffset>
@@ -4782,13 +4946,13 @@
           <wp:wrapThrough wrapText="bothSides">
             <wp:wrapPolygon edited="0">
               <wp:start x="-8" y="0"/>
-              <wp:lineTo x="-8" y="20665"/>
-              <wp:lineTo x="21008" y="20665"/>
-              <wp:lineTo x="21008" y="0"/>
+              <wp:lineTo x="-8" y="20659"/>
+              <wp:lineTo x="20999" y="20659"/>
+              <wp:lineTo x="20999" y="0"/>
               <wp:lineTo x="-8" y="0"/>
             </wp:wrapPolygon>
           </wp:wrapThrough>
-          <wp:docPr id="15" name="Imagem 1803984902" descr="Desenho com traços pretos em fundo branco&#10;&#10;Descrição gerada automaticamente com confiança média"/>
+          <wp:docPr id="16" name="Imagem 1803984902" descr="Desenho com traços pretos em fundo branco&#10;&#10;Descrição gerada automaticamente com confiança média"/>
           <wp:cNvGraphicFramePr>
             <a:graphicFrameLocks xmlns:a="http://schemas.openxmlformats.org/drawingml/2006/main" noChangeAspect="1"/>
           </wp:cNvGraphicFramePr>
@@ -4796,7 +4960,7 @@
             <a:graphicData uri="http://schemas.openxmlformats.org/drawingml/2006/picture">
               <pic:pic xmlns:pic="http://schemas.openxmlformats.org/drawingml/2006/picture">
                 <pic:nvPicPr>
-                  <pic:cNvPr id="15" name="Imagem 1803984902" descr="Desenho com traços pretos em fundo branco&#10;&#10;Descrição gerada automaticamente com confiança média"/>
+                  <pic:cNvPr id="16" name="Imagem 1803984902" descr="Desenho com traços pretos em fundo branco&#10;&#10;Descrição gerada automaticamente com confiança média"/>
                   <pic:cNvPicPr>
                     <a:picLocks noChangeAspect="1" noChangeArrowheads="1"/>
                   </pic:cNvPicPr>
@@ -4844,7 +5008,7 @@
       <mc:AlternateContent>
         <mc:Choice Requires="wps">
           <w:drawing>
-            <wp:anchor behindDoc="1" distT="1905" distB="1905" distL="1905" distR="1905" simplePos="0" locked="0" layoutInCell="0" allowOverlap="1" relativeHeight="19" wp14:anchorId="34FDC6CC">
+            <wp:anchor behindDoc="1" distT="1905" distB="1905" distL="1905" distR="1905" simplePos="0" locked="0" layoutInCell="0" allowOverlap="1" relativeHeight="20" wp14:anchorId="34FDC6CC">
               <wp:simplePos x="0" y="0"/>
               <wp:positionH relativeFrom="margin">
                 <wp:align>right</wp:align>
@@ -4855,7 +5019,7 @@
               <wp:extent cx="5753100" cy="0"/>
               <wp:effectExtent l="1905" t="1905" r="1905" b="1905"/>
               <wp:wrapNone/>
-              <wp:docPr id="16" name="Conector reto 844941520"/>
+              <wp:docPr id="17" name="Conector reto 844941520"/>
               <a:graphic xmlns:a="http://schemas.openxmlformats.org/drawingml/2006/main">
                 <a:graphicData uri="http://schemas.microsoft.com/office/word/2010/wordprocessingShape">
                   <wps:wsp>
@@ -4935,7 +5099,7 @@
     </w:pPr>
     <w:r>
       <w:drawing>
-        <wp:anchor behindDoc="0" distT="0" distB="0" distL="114300" distR="114300" simplePos="0" locked="0" layoutInCell="0" allowOverlap="1" relativeHeight="35">
+        <wp:anchor behindDoc="0" distT="0" distB="0" distL="114300" distR="114300" simplePos="0" locked="0" layoutInCell="0" allowOverlap="1" relativeHeight="37">
           <wp:simplePos x="0" y="0"/>
           <wp:positionH relativeFrom="margin">
             <wp:posOffset>5029200</wp:posOffset>
@@ -4948,13 +5112,13 @@
           <wp:wrapThrough wrapText="bothSides">
             <wp:wrapPolygon edited="0">
               <wp:start x="-8" y="0"/>
-              <wp:lineTo x="-8" y="20665"/>
-              <wp:lineTo x="21008" y="20665"/>
-              <wp:lineTo x="21008" y="0"/>
+              <wp:lineTo x="-8" y="20659"/>
+              <wp:lineTo x="20999" y="20659"/>
+              <wp:lineTo x="20999" y="0"/>
               <wp:lineTo x="-8" y="0"/>
             </wp:wrapPolygon>
           </wp:wrapThrough>
-          <wp:docPr id="17" name="Imagem 1803984902" descr="Desenho com traços pretos em fundo branco&#10;&#10;Descrição gerada automaticamente com confiança média"/>
+          <wp:docPr id="18" name="Imagem 1803984902" descr="Desenho com traços pretos em fundo branco&#10;&#10;Descrição gerada automaticamente com confiança média"/>
           <wp:cNvGraphicFramePr>
             <a:graphicFrameLocks xmlns:a="http://schemas.openxmlformats.org/drawingml/2006/main" noChangeAspect="1"/>
           </wp:cNvGraphicFramePr>
@@ -4962,7 +5126,7 @@
             <a:graphicData uri="http://schemas.openxmlformats.org/drawingml/2006/picture">
               <pic:pic xmlns:pic="http://schemas.openxmlformats.org/drawingml/2006/picture">
                 <pic:nvPicPr>
-                  <pic:cNvPr id="17" name="Imagem 1803984902" descr="Desenho com traços pretos em fundo branco&#10;&#10;Descrição gerada automaticamente com confiança média"/>
+                  <pic:cNvPr id="18" name="Imagem 1803984902" descr="Desenho com traços pretos em fundo branco&#10;&#10;Descrição gerada automaticamente com confiança média"/>
                   <pic:cNvPicPr>
                     <a:picLocks noChangeAspect="1" noChangeArrowheads="1"/>
                   </pic:cNvPicPr>
@@ -5010,7 +5174,7 @@
       <mc:AlternateContent>
         <mc:Choice Requires="wps">
           <w:drawing>
-            <wp:anchor behindDoc="1" distT="1905" distB="1905" distL="1905" distR="1905" simplePos="0" locked="0" layoutInCell="0" allowOverlap="1" relativeHeight="19" wp14:anchorId="34FDC6CC">
+            <wp:anchor behindDoc="1" distT="1905" distB="1905" distL="1905" distR="1905" simplePos="0" locked="0" layoutInCell="0" allowOverlap="1" relativeHeight="20" wp14:anchorId="34FDC6CC">
               <wp:simplePos x="0" y="0"/>
               <wp:positionH relativeFrom="margin">
                 <wp:align>right</wp:align>
@@ -5021,7 +5185,7 @@
               <wp:extent cx="5753100" cy="0"/>
               <wp:effectExtent l="1905" t="1905" r="1905" b="1905"/>
               <wp:wrapNone/>
-              <wp:docPr id="18" name="Conector reto 844941520"/>
+              <wp:docPr id="19" name="Conector reto 844941520"/>
               <a:graphic xmlns:a="http://schemas.openxmlformats.org/drawingml/2006/main">
                 <a:graphicData uri="http://schemas.microsoft.com/office/word/2010/wordprocessingShape">
                   <wps:wsp>
@@ -6211,6 +6375,16 @@
       <w:szCs w:val="20"/>
     </w:rPr>
   </w:style>
+  <w:style w:type="paragraph" w:styleId="Comment">
+    <w:name w:val="Comment"/>
+    <w:basedOn w:val="Normal"/>
+    <w:qFormat/>
+    <w:pPr/>
+    <w:rPr>
+      <w:sz w:val="20"/>
+      <w:szCs w:val="20"/>
+    </w:rPr>
+  </w:style>
   <w:style w:type="numbering" w:styleId="Semlista" w:default="1">
     <w:name w:val="Sem lista"/>
     <w:uiPriority w:val="99"/>

</xml_diff>